<commit_message>
Quiz: add 5 multiple-choice questions, one cell style (left-aligned, vertically centred), cleaner layout
Co-Authored-By: Claude Opus 5.5 <noreply@anthropic.com>
Claude-Session: https://claude.ai/code/session_01LaT1EarAMnh5opQoFahNzN
</commit_message>
<xml_diff>
--- a/output/chem-u02/Unit 2 Quiz A.docx
+++ b/output/chem-u02/Unit 2 Quiz A.docx
@@ -202,7 +202,7 @@
                 <w:sz w:val="15"/>
                 <w:u w:val="none"/>
               </w:rPr>
-              <w:t>SCORE  / 16</w:t>
+              <w:t>SCORE  / 21</w:t>
             </w:r>
           </w:p>
         </w:tc>
@@ -237,450 +237,28 @@
             <w:tcBorders>
               <w:left w:val="single" w:sz="18" w:color="A3E635"/>
             </w:tcBorders>
+            <w:vAlign w:val="center"/>
+            <w:tcMar>
+              <w:top w:w="30" w:type="dxa"/>
+              <w:left w:w="60" w:type="dxa"/>
+              <w:bottom w:w="30" w:type="dxa"/>
+              <w:right w:w="60" w:type="dxa"/>
+            </w:tcMar>
           </w:tcPr>
           <w:p>
             <w:pPr>
-              <w:spacing w:after="40" w:before="0"/>
+              <w:spacing w:after="0"/>
+              <w:jc w:val="left"/>
             </w:pPr>
             <w:r>
               <w:rPr>
                 <w:rFonts w:ascii="Trade Gothic Next" w:hAnsi="Trade Gothic Next"/>
                 <w:b w:val="0"/>
+                <w:color w:val="14161B"/>
                 <w:sz w:val="19"/>
-              </w:rPr>
-              <w:t>You may use your periodic table. Draw an arrow for every electron in the orbital diagrams.</w:t>
-            </w:r>
-          </w:p>
-        </w:tc>
-      </w:tr>
-    </w:tbl>
-    <w:p>
-      <w:pPr>
-        <w:spacing w:before="0" w:after="0" w:line="100" w:lineRule="exact"/>
-      </w:pPr>
-      <w:r>
-        <w:rPr>
-          <w:rFonts w:ascii="Trade Gothic Next" w:hAnsi="Trade Gothic Next"/>
-          <w:sz w:val="6"/>
-        </w:rPr>
-      </w:r>
-    </w:p>
-    <w:tbl>
-      <w:tblPr>
-        <w:tblW w:type="auto" w:w="0"/>
-        <w:jc w:val="left"/>
-        <w:tblLayout w:type="fixed"/>
-        <w:tblLook w:firstColumn="1" w:firstRow="1" w:lastColumn="0" w:lastRow="0" w:noHBand="0" w:noVBand="1" w:val="04A0"/>
-        <w:tblLayout w:type="fixed"/>
-      </w:tblPr>
-      <w:tblGrid>
-        <w:gridCol w:w="10800"/>
-      </w:tblGrid>
-      <w:tr>
-        <w:tc>
-          <w:tcPr>
-            <w:tcW w:type="dxa" w:w="10800"/>
-            <w:tcBorders>
-              <w:top w:val="single" w:sz="12" w:color="14161B"/>
-            </w:tcBorders>
-          </w:tcPr>
-          <w:p>
-            <w:pPr>
-              <w:spacing w:after="40" w:before="0"/>
-            </w:pPr>
-            <w:r>
-              <w:rPr>
-                <w:rFonts w:ascii="Trade Gothic Next" w:hAnsi="Trade Gothic Next"/>
-                <w:b/>
-                <w:color w:val="4D730E"/>
-                <w:sz w:val="15"/>
-                <w:spacing w:val="26"/>
-              </w:rPr>
-              <w:t>PART 1  ·  LONGHAND CONFIGURATION AND ORBITAL DIAGRAM</w:t>
-            </w:r>
-          </w:p>
-        </w:tc>
-      </w:tr>
-    </w:tbl>
-    <w:p>
-      <w:pPr>
-        <w:spacing w:before="0" w:after="0" w:line="80" w:lineRule="exact"/>
-      </w:pPr>
-      <w:r>
-        <w:rPr>
-          <w:rFonts w:ascii="Trade Gothic Next" w:hAnsi="Trade Gothic Next"/>
-          <w:sz w:val="4"/>
-        </w:rPr>
-      </w:r>
-    </w:p>
-    <w:tbl>
-      <w:tblPr>
-        <w:tblW w:type="auto" w:w="0"/>
-        <w:jc w:val="left"/>
-        <w:tblLayout w:type="fixed"/>
-        <w:tblLook w:firstColumn="1" w:firstRow="1" w:lastColumn="0" w:lastRow="0" w:noHBand="0" w:noVBand="1" w:val="04A0"/>
-        <w:tblLayout w:type="fixed"/>
-      </w:tblPr>
-      <w:tblGrid>
-        <w:gridCol w:w="10800"/>
-      </w:tblGrid>
-      <w:tr>
-        <w:trPr>
-          <w:cantSplit/>
-        </w:trPr>
-        <w:tc>
-          <w:tcPr>
-            <w:tcW w:type="dxa" w:w="10800"/>
-            <w:tcBorders>
-              <w:top w:val="single" w:sz="6" w:color="C8CDC2"/>
-              <w:left w:val="single" w:sz="6" w:color="C8CDC2"/>
-              <w:bottom w:val="single" w:sz="6" w:color="C8CDC2"/>
-              <w:right w:val="single" w:sz="6" w:color="C8CDC2"/>
-            </w:tcBorders>
-          </w:tcPr>
-          <w:p>
-            <w:pPr>
-              <w:tabs>
-                <w:tab w:pos="10224" w:val="right"/>
-              </w:tabs>
-              <w:spacing w:after="40"/>
-            </w:pPr>
-            <w:r>
-              <w:rPr>
-                <w:rFonts w:ascii="Trade Gothic Next" w:hAnsi="Trade Gothic Next"/>
-                <w:b/>
-                <w:color w:val="4D730E"/>
-                <w:sz w:val="21"/>
                 <w:u w:val="none"/>
               </w:rPr>
-              <w:t xml:space="preserve">1   </w:t>
-            </w:r>
-            <w:r>
-              <w:rPr>
-                <w:rFonts w:ascii="Trade Gothic Next" w:hAnsi="Trade Gothic Next"/>
-                <w:b/>
-                <w:color w:val="14161B"/>
-                <w:sz w:val="21"/>
-                <w:u w:val="none"/>
-              </w:rPr>
-              <w:t>Selenium, Se</w:t>
-            </w:r>
-            <w:r>
-              <w:rPr>
-                <w:rFonts w:ascii="Trade Gothic Next" w:hAnsi="Trade Gothic Next"/>
-                <w:b w:val="0"/>
-                <w:sz w:val="18"/>
-                <w:u w:val="none"/>
-              </w:rPr>
-              <w:tab/>
-            </w:r>
-            <w:r>
-              <w:rPr>
-                <w:rFonts w:ascii="Trade Gothic Next" w:hAnsi="Trade Gothic Next"/>
-                <w:b/>
-                <w:color w:val="55604F"/>
-                <w:sz w:val="16"/>
-                <w:u w:val="none"/>
-              </w:rPr>
-              <w:t>4 pts</w:t>
-            </w:r>
-          </w:p>
-          <w:tbl>
-            <w:tblPr>
-              <w:tblW w:type="auto" w:w="0"/>
-              <w:tblLayout w:type="fixed"/>
-              <w:tblLook w:firstColumn="1" w:firstRow="1" w:lastColumn="0" w:lastRow="0" w:noHBand="0" w:noVBand="1" w:val="04A0"/>
-              <w:tblLayout w:type="fixed"/>
-            </w:tblPr>
-            <w:tblGrid>
-              <w:gridCol w:w="2304"/>
-              <w:gridCol w:w="7920"/>
-            </w:tblGrid>
-            <w:tr>
-              <w:trPr>
-                <w:cantSplit/>
-                <w:trHeight w:val="518" w:hRule="atLeast"/>
-              </w:trPr>
-              <w:tc>
-                <w:tcPr>
-                  <w:tcW w:type="dxa" w:w="2304"/>
-                  <w:vAlign w:val="bottom"/>
-                  <w:tcMar>
-                    <w:top w:w="0" w:type="dxa"/>
-                    <w:left w:w="0" w:type="dxa"/>
-                    <w:bottom w:w="10" w:type="dxa"/>
-                    <w:right w:w="0" w:type="dxa"/>
-                  </w:tcMar>
-                </w:tcPr>
-                <w:p>
-                  <w:pPr>
-                    <w:spacing w:after="0"/>
-                  </w:pPr>
-                  <w:r>
-                    <w:rPr>
-                      <w:rFonts w:ascii="Trade Gothic Next" w:hAnsi="Trade Gothic Next"/>
-                      <w:b/>
-                      <w:color w:val="14161B"/>
-                      <w:sz w:val="18"/>
-                      <w:u w:val="none"/>
-                    </w:rPr>
-                    <w:t>Electron configuration</w:t>
-                  </w:r>
-                </w:p>
-              </w:tc>
-              <w:tc>
-                <w:tcPr>
-                  <w:tcW w:type="dxa" w:w="7920"/>
-                  <w:vAlign w:val="bottom"/>
-                  <w:tcMar>
-                    <w:top w:w="0" w:type="dxa"/>
-                    <w:left w:w="0" w:type="dxa"/>
-                    <w:bottom w:w="10" w:type="dxa"/>
-                    <w:right w:w="0" w:type="dxa"/>
-                  </w:tcMar>
-                  <w:tcBorders>
-                    <w:bottom w:val="single" w:sz="6" w:color="C8CDC2"/>
-                  </w:tcBorders>
-                </w:tcPr>
-                <w:p>
-                  <w:pPr>
-                    <w:spacing w:after="0"/>
-                  </w:pPr>
-                </w:p>
-              </w:tc>
-            </w:tr>
-          </w:tbl>
-          <w:p>
-            <w:pPr>
-              <w:spacing w:before="0" w:after="0" w:line="20" w:lineRule="exact"/>
-            </w:pPr>
-          </w:p>
-          <w:p>
-            <w:pPr>
-              <w:spacing w:before="0" w:after="0" w:line="80" w:lineRule="exact"/>
-            </w:pPr>
-            <w:r>
-              <w:rPr>
-                <w:rFonts w:ascii="Trade Gothic Next" w:hAnsi="Trade Gothic Next"/>
-                <w:sz w:val="2"/>
-              </w:rPr>
-            </w:r>
-          </w:p>
-          <w:p>
-            <w:pPr>
-              <w:spacing w:after="40" w:before="0"/>
-            </w:pPr>
-            <w:r>
-              <w:rPr>
-                <w:rFonts w:ascii="Trade Gothic Next" w:hAnsi="Trade Gothic Next"/>
-                <w:b/>
-                <w:color w:val="55604F"/>
-                <w:sz w:val="17"/>
-              </w:rPr>
-              <w:t>Orbital diagram</w:t>
-            </w:r>
-          </w:p>
-          <w:p>
-            <w:pPr>
-              <w:spacing w:before="0" w:after="0" w:line="1680" w:lineRule="exact"/>
-            </w:pPr>
-            <w:r>
-              <w:rPr>
-                <w:rFonts w:ascii="Trade Gothic Next" w:hAnsi="Trade Gothic Next"/>
-                <w:sz w:val="2"/>
-              </w:rPr>
-            </w:r>
-          </w:p>
-        </w:tc>
-      </w:tr>
-    </w:tbl>
-    <w:p>
-      <w:pPr>
-        <w:spacing w:before="0" w:after="0" w:line="80" w:lineRule="exact"/>
-      </w:pPr>
-      <w:r>
-        <w:rPr>
-          <w:rFonts w:ascii="Trade Gothic Next" w:hAnsi="Trade Gothic Next"/>
-          <w:sz w:val="4"/>
-        </w:rPr>
-      </w:r>
-    </w:p>
-    <w:tbl>
-      <w:tblPr>
-        <w:tblW w:type="auto" w:w="0"/>
-        <w:jc w:val="left"/>
-        <w:tblLayout w:type="fixed"/>
-        <w:tblLook w:firstColumn="1" w:firstRow="1" w:lastColumn="0" w:lastRow="0" w:noHBand="0" w:noVBand="1" w:val="04A0"/>
-        <w:tblLayout w:type="fixed"/>
-      </w:tblPr>
-      <w:tblGrid>
-        <w:gridCol w:w="10800"/>
-      </w:tblGrid>
-      <w:tr>
-        <w:trPr>
-          <w:cantSplit/>
-        </w:trPr>
-        <w:tc>
-          <w:tcPr>
-            <w:tcW w:type="dxa" w:w="10800"/>
-            <w:tcBorders>
-              <w:top w:val="single" w:sz="6" w:color="C8CDC2"/>
-              <w:left w:val="single" w:sz="6" w:color="C8CDC2"/>
-              <w:bottom w:val="single" w:sz="6" w:color="C8CDC2"/>
-              <w:right w:val="single" w:sz="6" w:color="C8CDC2"/>
-            </w:tcBorders>
-          </w:tcPr>
-          <w:p>
-            <w:pPr>
-              <w:tabs>
-                <w:tab w:pos="10224" w:val="right"/>
-              </w:tabs>
-              <w:spacing w:after="40"/>
-            </w:pPr>
-            <w:r>
-              <w:rPr>
-                <w:rFonts w:ascii="Trade Gothic Next" w:hAnsi="Trade Gothic Next"/>
-                <w:b/>
-                <w:color w:val="4D730E"/>
-                <w:sz w:val="21"/>
-                <w:u w:val="none"/>
-              </w:rPr>
-              <w:t xml:space="preserve">2   </w:t>
-            </w:r>
-            <w:r>
-              <w:rPr>
-                <w:rFonts w:ascii="Trade Gothic Next" w:hAnsi="Trade Gothic Next"/>
-                <w:b/>
-                <w:color w:val="14161B"/>
-                <w:sz w:val="21"/>
-                <w:u w:val="none"/>
-              </w:rPr>
-              <w:t>Phosphorus, P</w:t>
-            </w:r>
-            <w:r>
-              <w:rPr>
-                <w:rFonts w:ascii="Trade Gothic Next" w:hAnsi="Trade Gothic Next"/>
-                <w:b w:val="0"/>
-                <w:sz w:val="18"/>
-                <w:u w:val="none"/>
-              </w:rPr>
-              <w:tab/>
-            </w:r>
-            <w:r>
-              <w:rPr>
-                <w:rFonts w:ascii="Trade Gothic Next" w:hAnsi="Trade Gothic Next"/>
-                <w:b/>
-                <w:color w:val="55604F"/>
-                <w:sz w:val="16"/>
-                <w:u w:val="none"/>
-              </w:rPr>
-              <w:t>4 pts</w:t>
-            </w:r>
-          </w:p>
-          <w:tbl>
-            <w:tblPr>
-              <w:tblW w:type="auto" w:w="0"/>
-              <w:tblLayout w:type="fixed"/>
-              <w:tblLook w:firstColumn="1" w:firstRow="1" w:lastColumn="0" w:lastRow="0" w:noHBand="0" w:noVBand="1" w:val="04A0"/>
-              <w:tblLayout w:type="fixed"/>
-            </w:tblPr>
-            <w:tblGrid>
-              <w:gridCol w:w="2304"/>
-              <w:gridCol w:w="7920"/>
-            </w:tblGrid>
-            <w:tr>
-              <w:trPr>
-                <w:cantSplit/>
-                <w:trHeight w:val="518" w:hRule="atLeast"/>
-              </w:trPr>
-              <w:tc>
-                <w:tcPr>
-                  <w:tcW w:type="dxa" w:w="2304"/>
-                  <w:vAlign w:val="bottom"/>
-                  <w:tcMar>
-                    <w:top w:w="0" w:type="dxa"/>
-                    <w:left w:w="0" w:type="dxa"/>
-                    <w:bottom w:w="10" w:type="dxa"/>
-                    <w:right w:w="0" w:type="dxa"/>
-                  </w:tcMar>
-                </w:tcPr>
-                <w:p>
-                  <w:pPr>
-                    <w:spacing w:after="0"/>
-                  </w:pPr>
-                  <w:r>
-                    <w:rPr>
-                      <w:rFonts w:ascii="Trade Gothic Next" w:hAnsi="Trade Gothic Next"/>
-                      <w:b/>
-                      <w:color w:val="14161B"/>
-                      <w:sz w:val="18"/>
-                      <w:u w:val="none"/>
-                    </w:rPr>
-                    <w:t>Electron configuration</w:t>
-                  </w:r>
-                </w:p>
-              </w:tc>
-              <w:tc>
-                <w:tcPr>
-                  <w:tcW w:type="dxa" w:w="7920"/>
-                  <w:vAlign w:val="bottom"/>
-                  <w:tcMar>
-                    <w:top w:w="0" w:type="dxa"/>
-                    <w:left w:w="0" w:type="dxa"/>
-                    <w:bottom w:w="10" w:type="dxa"/>
-                    <w:right w:w="0" w:type="dxa"/>
-                  </w:tcMar>
-                  <w:tcBorders>
-                    <w:bottom w:val="single" w:sz="6" w:color="C8CDC2"/>
-                  </w:tcBorders>
-                </w:tcPr>
-                <w:p>
-                  <w:pPr>
-                    <w:spacing w:after="0"/>
-                  </w:pPr>
-                </w:p>
-              </w:tc>
-            </w:tr>
-          </w:tbl>
-          <w:p>
-            <w:pPr>
-              <w:spacing w:before="0" w:after="0" w:line="20" w:lineRule="exact"/>
-            </w:pPr>
-          </w:p>
-          <w:p>
-            <w:pPr>
-              <w:spacing w:before="0" w:after="0" w:line="80" w:lineRule="exact"/>
-            </w:pPr>
-            <w:r>
-              <w:rPr>
-                <w:rFonts w:ascii="Trade Gothic Next" w:hAnsi="Trade Gothic Next"/>
-                <w:sz w:val="2"/>
-              </w:rPr>
-            </w:r>
-          </w:p>
-          <w:p>
-            <w:pPr>
-              <w:spacing w:after="40" w:before="0"/>
-            </w:pPr>
-            <w:r>
-              <w:rPr>
-                <w:rFonts w:ascii="Trade Gothic Next" w:hAnsi="Trade Gothic Next"/>
-                <w:b/>
-                <w:color w:val="55604F"/>
-                <w:sz w:val="17"/>
-              </w:rPr>
-              <w:t>Orbital diagram</w:t>
-            </w:r>
-          </w:p>
-          <w:p>
-            <w:pPr>
-              <w:spacing w:before="0" w:after="0" w:line="1680" w:lineRule="exact"/>
-            </w:pPr>
-            <w:r>
-              <w:rPr>
-                <w:rFonts w:ascii="Trade Gothic Next" w:hAnsi="Trade Gothic Next"/>
-                <w:sz w:val="2"/>
-              </w:rPr>
+              <w:t>You may use your periodic table. Circle one letter for each multiple-choice question. Draw an arrow for every electron in the orbital diagrams.</w:t>
             </w:r>
           </w:p>
         </w:tc>
@@ -700,61 +278,96 @@
     <w:tbl>
       <w:tblPr>
         <w:tblW w:type="auto" w:w="0"/>
-        <w:jc w:val="left"/>
         <w:tblLayout w:type="fixed"/>
         <w:tblLook w:firstColumn="1" w:firstRow="1" w:lastColumn="0" w:lastRow="0" w:noHBand="0" w:noVBand="1" w:val="04A0"/>
         <w:tblLayout w:type="fixed"/>
       </w:tblPr>
       <w:tblGrid>
-        <w:gridCol w:w="10800"/>
+        <w:gridCol w:w="9072"/>
+        <w:gridCol w:w="1728"/>
       </w:tblGrid>
       <w:tr>
         <w:tc>
           <w:tcPr>
-            <w:tcW w:type="dxa" w:w="10800"/>
+            <w:tcW w:type="dxa" w:w="9072"/>
             <w:tcBorders>
               <w:top w:val="single" w:sz="12" w:color="14161B"/>
+              <w:bottom w:val="single" w:sz="18" w:color="A3E635"/>
             </w:tcBorders>
+            <w:vAlign w:val="center"/>
+            <w:tcMar>
+              <w:top w:w="30" w:type="dxa"/>
+              <w:left w:w="0" w:type="dxa"/>
+              <w:bottom w:w="30" w:type="dxa"/>
+              <w:right w:w="60" w:type="dxa"/>
+            </w:tcMar>
           </w:tcPr>
           <w:p>
             <w:pPr>
-              <w:spacing w:after="40" w:before="0"/>
+              <w:keepNext/>
+              <w:spacing w:after="0"/>
+              <w:jc w:val="left"/>
             </w:pPr>
             <w:r>
               <w:rPr>
                 <w:rFonts w:ascii="Trade Gothic Next" w:hAnsi="Trade Gothic Next"/>
                 <w:b/>
-                <w:color w:val="4D730E"/>
-                <w:sz w:val="15"/>
-                <w:spacing w:val="26"/>
+                <w:color w:val="14161B"/>
+                <w:sz w:val="18"/>
+                <w:u w:val="none"/>
               </w:rPr>
-              <w:t>PART 2  ·  NOBLE-GAS SHORTHAND</w:t>
+              <w:t>PART 1  ·  MULTIPLE CHOICE</w:t>
+            </w:r>
+          </w:p>
+        </w:tc>
+        <w:tc>
+          <w:tcPr>
+            <w:tcW w:type="dxa" w:w="1728"/>
+            <w:tcBorders>
+              <w:top w:val="single" w:sz="12" w:color="14161B"/>
+              <w:bottom w:val="single" w:sz="18" w:color="A3E635"/>
+            </w:tcBorders>
+            <w:vAlign w:val="center"/>
+            <w:tcMar>
+              <w:top w:w="30" w:type="dxa"/>
+              <w:left w:w="60" w:type="dxa"/>
+              <w:bottom w:w="30" w:type="dxa"/>
+              <w:right w:w="60" w:type="dxa"/>
+            </w:tcMar>
+          </w:tcPr>
+          <w:p>
+            <w:pPr>
+              <w:keepNext/>
+              <w:spacing w:after="0"/>
+              <w:jc w:val="right"/>
+            </w:pPr>
+            <w:r>
+              <w:rPr>
+                <w:rFonts w:ascii="Trade Gothic Next" w:hAnsi="Trade Gothic Next"/>
+                <w:b/>
+                <w:color w:val="55604F"/>
+                <w:sz w:val="17"/>
+                <w:u w:val="none"/>
+              </w:rPr>
+              <w:t>5 pts</w:t>
             </w:r>
           </w:p>
         </w:tc>
       </w:tr>
     </w:tbl>
-    <w:p>
-      <w:pPr>
-        <w:spacing w:before="0" w:after="0" w:line="80" w:lineRule="exact"/>
-      </w:pPr>
-      <w:r>
-        <w:rPr>
-          <w:rFonts w:ascii="Trade Gothic Next" w:hAnsi="Trade Gothic Next"/>
-          <w:sz w:val="4"/>
-        </w:rPr>
-      </w:r>
-    </w:p>
     <w:tbl>
       <w:tblPr>
         <w:tblW w:type="auto" w:w="0"/>
-        <w:jc w:val="left"/>
         <w:tblLayout w:type="fixed"/>
         <w:tblLook w:firstColumn="1" w:firstRow="1" w:lastColumn="0" w:lastRow="0" w:noHBand="0" w:noVBand="1" w:val="04A0"/>
         <w:tblLayout w:type="fixed"/>
       </w:tblPr>
       <w:tblGrid>
-        <w:gridCol w:w="10800"/>
+        <w:gridCol w:w="648"/>
+        <w:gridCol w:w="2534"/>
+        <w:gridCol w:w="2534"/>
+        <w:gridCol w:w="2534"/>
+        <w:gridCol w:w="2549"/>
       </w:tblGrid>
       <w:tr>
         <w:trPr>
@@ -762,166 +375,258 @@
         </w:trPr>
         <w:tc>
           <w:tcPr>
-            <w:tcW w:type="dxa" w:w="10800"/>
+            <w:tcW w:type="dxa" w:w="648"/>
+            <w:vMerge w:val="restart"/>
+            <w:vAlign w:val="center"/>
+            <w:tcMar>
+              <w:top w:w="40" w:type="dxa"/>
+              <w:left w:w="60" w:type="dxa"/>
+              <w:bottom w:w="40" w:type="dxa"/>
+              <w:right w:w="60" w:type="dxa"/>
+            </w:tcMar>
             <w:tcBorders>
-              <w:top w:val="single" w:sz="6" w:color="C8CDC2"/>
-              <w:left w:val="single" w:sz="6" w:color="C8CDC2"/>
-              <w:bottom w:val="single" w:sz="6" w:color="C8CDC2"/>
-              <w:right w:val="single" w:sz="6" w:color="C8CDC2"/>
+              <w:bottom w:val="single" w:sz="4" w:color="C8CDC2"/>
             </w:tcBorders>
           </w:tcPr>
           <w:p>
             <w:pPr>
-              <w:tabs>
-                <w:tab w:pos="10224" w:val="right"/>
-              </w:tabs>
-              <w:spacing w:after="40"/>
+              <w:keepNext/>
+              <w:spacing w:after="0"/>
+              <w:jc w:val="left"/>
             </w:pPr>
             <w:r>
               <w:rPr>
                 <w:rFonts w:ascii="Trade Gothic Next" w:hAnsi="Trade Gothic Next"/>
                 <w:b/>
                 <w:color w:val="4D730E"/>
-                <w:sz w:val="21"/>
+                <w:sz w:val="22"/>
                 <w:u w:val="none"/>
               </w:rPr>
-              <w:t xml:space="preserve">3   </w:t>
+              <w:t>1</w:t>
             </w:r>
+          </w:p>
+        </w:tc>
+        <w:tc>
+          <w:tcPr>
+            <w:tcW w:type="dxa" w:w="10151"/>
+            <w:gridSpan w:val="4"/>
+            <w:vAlign w:val="center"/>
+            <w:tcMar>
+              <w:top w:w="50" w:type="dxa"/>
+              <w:left w:w="60" w:type="dxa"/>
+              <w:bottom w:w="20" w:type="dxa"/>
+              <w:right w:w="60" w:type="dxa"/>
+            </w:tcMar>
+          </w:tcPr>
+          <w:p>
+            <w:pPr>
+              <w:keepNext/>
+              <w:spacing w:after="0"/>
+              <w:jc w:val="left"/>
+            </w:pPr>
             <w:r>
               <w:rPr>
                 <w:rFonts w:ascii="Trade Gothic Next" w:hAnsi="Trade Gothic Next"/>
                 <w:b/>
                 <w:color w:val="14161B"/>
-                <w:sz w:val="21"/>
+                <w:sz w:val="20"/>
                 <w:u w:val="none"/>
               </w:rPr>
-              <w:t>Iron, Fe</w:t>
+              <w:t>Which rule says electrons fill the lowest-energy sublevel first?</w:t>
+            </w:r>
+          </w:p>
+        </w:tc>
+      </w:tr>
+      <w:tr>
+        <w:trPr>
+          <w:cantSplit/>
+        </w:trPr>
+        <w:tc>
+          <w:tcPr>
+            <w:tcW w:type="dxa" w:w="648"/>
+            <w:vMerge/>
+          </w:tcPr>
+          <w:p/>
+        </w:tc>
+        <w:tc>
+          <w:tcPr>
+            <w:tcW w:type="dxa" w:w="2534"/>
+            <w:vAlign w:val="center"/>
+            <w:tcMar>
+              <w:top w:w="20" w:type="dxa"/>
+              <w:left w:w="60" w:type="dxa"/>
+              <w:bottom w:w="60" w:type="dxa"/>
+              <w:right w:w="60" w:type="dxa"/>
+            </w:tcMar>
+            <w:tcBorders>
+              <w:bottom w:val="single" w:sz="4" w:color="C8CDC2"/>
+            </w:tcBorders>
+          </w:tcPr>
+          <w:p>
+            <w:pPr>
+              <w:spacing w:after="0"/>
+              <w:jc w:val="left"/>
+            </w:pPr>
+            <w:r>
+              <w:rPr>
+                <w:rFonts w:ascii="Trade Gothic Next" w:hAnsi="Trade Gothic Next"/>
+                <w:b/>
+                <w:color w:val="4D730E"/>
+                <w:sz w:val="20"/>
+                <w:u w:val="none"/>
+              </w:rPr>
+              <w:t xml:space="preserve">A   </w:t>
             </w:r>
             <w:r>
               <w:rPr>
                 <w:rFonts w:ascii="Trade Gothic Next" w:hAnsi="Trade Gothic Next"/>
                 <w:b w:val="0"/>
-                <w:sz w:val="18"/>
+                <w:color w:val="14161B"/>
+                <w:sz w:val="20"/>
                 <w:u w:val="none"/>
               </w:rPr>
-              <w:tab/>
+              <w:t>Aufbau principle</w:t>
+            </w:r>
+          </w:p>
+        </w:tc>
+        <w:tc>
+          <w:tcPr>
+            <w:tcW w:type="dxa" w:w="2534"/>
+            <w:vAlign w:val="center"/>
+            <w:tcMar>
+              <w:top w:w="20" w:type="dxa"/>
+              <w:left w:w="60" w:type="dxa"/>
+              <w:bottom w:w="60" w:type="dxa"/>
+              <w:right w:w="60" w:type="dxa"/>
+            </w:tcMar>
+            <w:tcBorders>
+              <w:bottom w:val="single" w:sz="4" w:color="C8CDC2"/>
+            </w:tcBorders>
+          </w:tcPr>
+          <w:p>
+            <w:pPr>
+              <w:spacing w:after="0"/>
+              <w:jc w:val="left"/>
+            </w:pPr>
+            <w:r>
+              <w:rPr>
+                <w:rFonts w:ascii="Trade Gothic Next" w:hAnsi="Trade Gothic Next"/>
+                <w:b/>
+                <w:color w:val="4D730E"/>
+                <w:sz w:val="20"/>
+                <w:u w:val="none"/>
+              </w:rPr>
+              <w:t xml:space="preserve">B   </w:t>
             </w:r>
             <w:r>
               <w:rPr>
                 <w:rFonts w:ascii="Trade Gothic Next" w:hAnsi="Trade Gothic Next"/>
-                <w:b/>
-                <w:color w:val="55604F"/>
-                <w:sz w:val="16"/>
+                <w:b w:val="0"/>
+                <w:color w:val="14161B"/>
+                <w:sz w:val="20"/>
                 <w:u w:val="none"/>
               </w:rPr>
-              <w:t>2 pts</w:t>
+              <w:t>Pauli exclusion</w:t>
             </w:r>
           </w:p>
-          <w:tbl>
-            <w:tblPr>
-              <w:tblW w:type="auto" w:w="0"/>
-              <w:tblLayout w:type="fixed"/>
-              <w:tblLook w:firstColumn="1" w:firstRow="1" w:lastColumn="0" w:lastRow="0" w:noHBand="0" w:noVBand="1" w:val="04A0"/>
-              <w:tblLayout w:type="fixed"/>
-            </w:tblPr>
-            <w:tblGrid>
-              <w:gridCol w:w="1584"/>
-              <w:gridCol w:w="8640"/>
-            </w:tblGrid>
-            <w:tr>
-              <w:trPr>
-                <w:cantSplit/>
-                <w:trHeight w:val="547" w:hRule="atLeast"/>
-              </w:trPr>
-              <w:tc>
-                <w:tcPr>
-                  <w:tcW w:type="dxa" w:w="1584"/>
-                  <w:vAlign w:val="bottom"/>
-                  <w:tcMar>
-                    <w:top w:w="0" w:type="dxa"/>
-                    <w:left w:w="0" w:type="dxa"/>
-                    <w:bottom w:w="10" w:type="dxa"/>
-                    <w:right w:w="0" w:type="dxa"/>
-                  </w:tcMar>
-                </w:tcPr>
-                <w:p>
-                  <w:pPr>
-                    <w:spacing w:after="0"/>
-                  </w:pPr>
-                  <w:r>
-                    <w:rPr>
-                      <w:rFonts w:ascii="Trade Gothic Next" w:hAnsi="Trade Gothic Next"/>
-                      <w:b/>
-                      <w:color w:val="14161B"/>
-                      <w:sz w:val="18"/>
-                      <w:u w:val="none"/>
-                    </w:rPr>
-                    <w:t>Shorthand</w:t>
-                  </w:r>
-                </w:p>
-              </w:tc>
-              <w:tc>
-                <w:tcPr>
-                  <w:tcW w:type="dxa" w:w="8640"/>
-                  <w:vAlign w:val="bottom"/>
-                  <w:tcMar>
-                    <w:top w:w="0" w:type="dxa"/>
-                    <w:left w:w="0" w:type="dxa"/>
-                    <w:bottom w:w="10" w:type="dxa"/>
-                    <w:right w:w="0" w:type="dxa"/>
-                  </w:tcMar>
-                  <w:tcBorders>
-                    <w:bottom w:val="single" w:sz="6" w:color="C8CDC2"/>
-                  </w:tcBorders>
-                </w:tcPr>
-                <w:p>
-                  <w:pPr>
-                    <w:spacing w:after="0"/>
-                  </w:pPr>
-                </w:p>
-              </w:tc>
-            </w:tr>
-          </w:tbl>
+        </w:tc>
+        <w:tc>
+          <w:tcPr>
+            <w:tcW w:type="dxa" w:w="2534"/>
+            <w:vAlign w:val="center"/>
+            <w:tcMar>
+              <w:top w:w="20" w:type="dxa"/>
+              <w:left w:w="60" w:type="dxa"/>
+              <w:bottom w:w="60" w:type="dxa"/>
+              <w:right w:w="60" w:type="dxa"/>
+            </w:tcMar>
+            <w:tcBorders>
+              <w:bottom w:val="single" w:sz="4" w:color="C8CDC2"/>
+            </w:tcBorders>
+          </w:tcPr>
           <w:p>
             <w:pPr>
-              <w:spacing w:before="0" w:after="0" w:line="20" w:lineRule="exact"/>
-            </w:pPr>
-          </w:p>
-          <w:p>
-            <w:pPr>
-              <w:spacing w:before="0" w:after="0" w:line="60" w:lineRule="exact"/>
+              <w:spacing w:after="0"/>
+              <w:jc w:val="left"/>
             </w:pPr>
             <w:r>
               <w:rPr>
                 <w:rFonts w:ascii="Trade Gothic Next" w:hAnsi="Trade Gothic Next"/>
-                <w:sz w:val="2"/>
+                <w:b/>
+                <w:color w:val="4D730E"/>
+                <w:sz w:val="20"/>
+                <w:u w:val="none"/>
               </w:rPr>
+              <w:t xml:space="preserve">C   </w:t>
+            </w:r>
+            <w:r>
+              <w:rPr>
+                <w:rFonts w:ascii="Trade Gothic Next" w:hAnsi="Trade Gothic Next"/>
+                <w:b w:val="0"/>
+                <w:color w:val="14161B"/>
+                <w:sz w:val="20"/>
+                <w:u w:val="none"/>
+              </w:rPr>
+              <w:t>Hund's rule</w:t>
+            </w:r>
+          </w:p>
+        </w:tc>
+        <w:tc>
+          <w:tcPr>
+            <w:tcW w:type="dxa" w:w="2549"/>
+            <w:vAlign w:val="center"/>
+            <w:tcMar>
+              <w:top w:w="20" w:type="dxa"/>
+              <w:left w:w="60" w:type="dxa"/>
+              <w:bottom w:w="60" w:type="dxa"/>
+              <w:right w:w="60" w:type="dxa"/>
+            </w:tcMar>
+            <w:tcBorders>
+              <w:bottom w:val="single" w:sz="4" w:color="C8CDC2"/>
+            </w:tcBorders>
+          </w:tcPr>
+          <w:p>
+            <w:pPr>
+              <w:spacing w:after="0"/>
+              <w:jc w:val="left"/>
+            </w:pPr>
+            <w:r>
+              <w:rPr>
+                <w:rFonts w:ascii="Trade Gothic Next" w:hAnsi="Trade Gothic Next"/>
+                <w:b/>
+                <w:color w:val="4D730E"/>
+                <w:sz w:val="20"/>
+                <w:u w:val="none"/>
+              </w:rPr>
+              <w:t xml:space="preserve">D   </w:t>
+            </w:r>
+            <w:r>
+              <w:rPr>
+                <w:rFonts w:ascii="Trade Gothic Next" w:hAnsi="Trade Gothic Next"/>
+                <w:b w:val="0"/>
+                <w:color w:val="14161B"/>
+                <w:sz w:val="20"/>
+                <w:u w:val="none"/>
+              </w:rPr>
+              <w:t>Bohr model</w:t>
             </w:r>
           </w:p>
         </w:tc>
       </w:tr>
     </w:tbl>
-    <w:p>
-      <w:pPr>
-        <w:spacing w:before="0" w:after="0" w:line="80" w:lineRule="exact"/>
-      </w:pPr>
-      <w:r>
-        <w:rPr>
-          <w:rFonts w:ascii="Trade Gothic Next" w:hAnsi="Trade Gothic Next"/>
-          <w:sz w:val="4"/>
-        </w:rPr>
-      </w:r>
-    </w:p>
     <w:tbl>
       <w:tblPr>
         <w:tblW w:type="auto" w:w="0"/>
-        <w:jc w:val="left"/>
         <w:tblLayout w:type="fixed"/>
         <w:tblLook w:firstColumn="1" w:firstRow="1" w:lastColumn="0" w:lastRow="0" w:noHBand="0" w:noVBand="1" w:val="04A0"/>
         <w:tblLayout w:type="fixed"/>
       </w:tblPr>
       <w:tblGrid>
-        <w:gridCol w:w="10800"/>
+        <w:gridCol w:w="648"/>
+        <w:gridCol w:w="2534"/>
+        <w:gridCol w:w="2534"/>
+        <w:gridCol w:w="2534"/>
+        <w:gridCol w:w="2549"/>
       </w:tblGrid>
       <w:tr>
         <w:trPr>
@@ -929,140 +634,1038 @@
         </w:trPr>
         <w:tc>
           <w:tcPr>
-            <w:tcW w:type="dxa" w:w="10800"/>
+            <w:tcW w:type="dxa" w:w="648"/>
+            <w:vMerge w:val="restart"/>
+            <w:vAlign w:val="center"/>
+            <w:tcMar>
+              <w:top w:w="40" w:type="dxa"/>
+              <w:left w:w="60" w:type="dxa"/>
+              <w:bottom w:w="40" w:type="dxa"/>
+              <w:right w:w="60" w:type="dxa"/>
+            </w:tcMar>
             <w:tcBorders>
-              <w:top w:val="single" w:sz="6" w:color="C8CDC2"/>
-              <w:left w:val="single" w:sz="6" w:color="C8CDC2"/>
-              <w:bottom w:val="single" w:sz="6" w:color="C8CDC2"/>
-              <w:right w:val="single" w:sz="6" w:color="C8CDC2"/>
+              <w:bottom w:val="single" w:sz="4" w:color="C8CDC2"/>
             </w:tcBorders>
           </w:tcPr>
           <w:p>
             <w:pPr>
-              <w:tabs>
-                <w:tab w:pos="10224" w:val="right"/>
-              </w:tabs>
-              <w:spacing w:after="40"/>
+              <w:keepNext/>
+              <w:spacing w:after="0"/>
+              <w:jc w:val="left"/>
             </w:pPr>
             <w:r>
               <w:rPr>
                 <w:rFonts w:ascii="Trade Gothic Next" w:hAnsi="Trade Gothic Next"/>
                 <w:b/>
                 <w:color w:val="4D730E"/>
-                <w:sz w:val="21"/>
+                <w:sz w:val="22"/>
                 <w:u w:val="none"/>
               </w:rPr>
-              <w:t xml:space="preserve">4   </w:t>
+              <w:t>2</w:t>
+            </w:r>
+          </w:p>
+        </w:tc>
+        <w:tc>
+          <w:tcPr>
+            <w:tcW w:type="dxa" w:w="10151"/>
+            <w:gridSpan w:val="4"/>
+            <w:vAlign w:val="center"/>
+            <w:tcMar>
+              <w:top w:w="50" w:type="dxa"/>
+              <w:left w:w="60" w:type="dxa"/>
+              <w:bottom w:w="20" w:type="dxa"/>
+              <w:right w:w="60" w:type="dxa"/>
+            </w:tcMar>
+          </w:tcPr>
+          <w:p>
+            <w:pPr>
+              <w:keepNext/>
+              <w:spacing w:after="0"/>
+              <w:jc w:val="left"/>
+            </w:pPr>
+            <w:r>
+              <w:rPr>
+                <w:rFonts w:ascii="Trade Gothic Next" w:hAnsi="Trade Gothic Next"/>
+                <w:b/>
+                <w:color w:val="14161B"/>
+                <w:sz w:val="20"/>
+                <w:u w:val="none"/>
+              </w:rPr>
+              <w:t>Which orbital diagram for nitrogen's 2p</w:t>
             </w:r>
             <w:r>
               <w:rPr>
                 <w:rFonts w:ascii="Trade Gothic Next" w:hAnsi="Trade Gothic Next"/>
                 <w:b/>
                 <w:color w:val="14161B"/>
-                <w:sz w:val="21"/>
+                <w:sz w:val="20"/>
+                <w:u w:val="none"/>
+                <w:vertAlign w:val="superscript"/>
+              </w:rPr>
+              <w:t>3</w:t>
+            </w:r>
+            <w:r>
+              <w:rPr>
+                <w:rFonts w:ascii="Trade Gothic Next" w:hAnsi="Trade Gothic Next"/>
+                <w:b/>
+                <w:color w:val="14161B"/>
+                <w:sz w:val="20"/>
                 <w:u w:val="none"/>
               </w:rPr>
-              <w:t>Tin, Sn</w:t>
+              <w:t xml:space="preserve"> follows Hund's rule?</w:t>
+            </w:r>
+          </w:p>
+        </w:tc>
+      </w:tr>
+      <w:tr>
+        <w:trPr>
+          <w:cantSplit/>
+        </w:trPr>
+        <w:tc>
+          <w:tcPr>
+            <w:tcW w:type="dxa" w:w="648"/>
+            <w:vMerge/>
+          </w:tcPr>
+          <w:p/>
+        </w:tc>
+        <w:tc>
+          <w:tcPr>
+            <w:tcW w:type="dxa" w:w="2534"/>
+            <w:vAlign w:val="center"/>
+            <w:tcMar>
+              <w:top w:w="20" w:type="dxa"/>
+              <w:left w:w="60" w:type="dxa"/>
+              <w:bottom w:w="60" w:type="dxa"/>
+              <w:right w:w="60" w:type="dxa"/>
+            </w:tcMar>
+            <w:tcBorders>
+              <w:bottom w:val="single" w:sz="4" w:color="C8CDC2"/>
+            </w:tcBorders>
+          </w:tcPr>
+          <w:p>
+            <w:pPr>
+              <w:spacing w:after="0"/>
+              <w:jc w:val="left"/>
+            </w:pPr>
+            <w:r>
+              <w:rPr>
+                <w:rFonts w:ascii="Trade Gothic Next" w:hAnsi="Trade Gothic Next"/>
+                <w:b/>
+                <w:color w:val="4D730E"/>
+                <w:sz w:val="20"/>
+                <w:u w:val="none"/>
+              </w:rPr>
+              <w:t xml:space="preserve">A   </w:t>
             </w:r>
             <w:r>
               <w:rPr>
                 <w:rFonts w:ascii="Trade Gothic Next" w:hAnsi="Trade Gothic Next"/>
                 <w:b w:val="0"/>
-                <w:sz w:val="18"/>
+                <w:color w:val="14161B"/>
+                <w:sz w:val="20"/>
                 <w:u w:val="none"/>
               </w:rPr>
-              <w:tab/>
+              <w:t>[↑↓] [↑] [   ]</w:t>
+            </w:r>
+          </w:p>
+        </w:tc>
+        <w:tc>
+          <w:tcPr>
+            <w:tcW w:type="dxa" w:w="2534"/>
+            <w:vAlign w:val="center"/>
+            <w:tcMar>
+              <w:top w:w="20" w:type="dxa"/>
+              <w:left w:w="60" w:type="dxa"/>
+              <w:bottom w:w="60" w:type="dxa"/>
+              <w:right w:w="60" w:type="dxa"/>
+            </w:tcMar>
+            <w:tcBorders>
+              <w:bottom w:val="single" w:sz="4" w:color="C8CDC2"/>
+            </w:tcBorders>
+          </w:tcPr>
+          <w:p>
+            <w:pPr>
+              <w:spacing w:after="0"/>
+              <w:jc w:val="left"/>
+            </w:pPr>
+            <w:r>
+              <w:rPr>
+                <w:rFonts w:ascii="Trade Gothic Next" w:hAnsi="Trade Gothic Next"/>
+                <w:b/>
+                <w:color w:val="4D730E"/>
+                <w:sz w:val="20"/>
+                <w:u w:val="none"/>
+              </w:rPr>
+              <w:t xml:space="preserve">B   </w:t>
             </w:r>
             <w:r>
               <w:rPr>
                 <w:rFonts w:ascii="Trade Gothic Next" w:hAnsi="Trade Gothic Next"/>
-                <w:b/>
-                <w:color w:val="55604F"/>
-                <w:sz w:val="16"/>
+                <w:b w:val="0"/>
+                <w:color w:val="14161B"/>
+                <w:sz w:val="20"/>
                 <w:u w:val="none"/>
               </w:rPr>
-              <w:t>2 pts</w:t>
+              <w:t>[↑] [↓] [↑]</w:t>
             </w:r>
           </w:p>
-          <w:tbl>
-            <w:tblPr>
-              <w:tblW w:type="auto" w:w="0"/>
-              <w:tblLayout w:type="fixed"/>
-              <w:tblLook w:firstColumn="1" w:firstRow="1" w:lastColumn="0" w:lastRow="0" w:noHBand="0" w:noVBand="1" w:val="04A0"/>
-              <w:tblLayout w:type="fixed"/>
-            </w:tblPr>
-            <w:tblGrid>
-              <w:gridCol w:w="1584"/>
-              <w:gridCol w:w="8640"/>
-            </w:tblGrid>
-            <w:tr>
-              <w:trPr>
-                <w:cantSplit/>
-                <w:trHeight w:val="547" w:hRule="atLeast"/>
-              </w:trPr>
-              <w:tc>
-                <w:tcPr>
-                  <w:tcW w:type="dxa" w:w="1584"/>
-                  <w:vAlign w:val="bottom"/>
-                  <w:tcMar>
-                    <w:top w:w="0" w:type="dxa"/>
-                    <w:left w:w="0" w:type="dxa"/>
-                    <w:bottom w:w="10" w:type="dxa"/>
-                    <w:right w:w="0" w:type="dxa"/>
-                  </w:tcMar>
-                </w:tcPr>
-                <w:p>
-                  <w:pPr>
-                    <w:spacing w:after="0"/>
-                  </w:pPr>
-                  <w:r>
-                    <w:rPr>
-                      <w:rFonts w:ascii="Trade Gothic Next" w:hAnsi="Trade Gothic Next"/>
-                      <w:b/>
-                      <w:color w:val="14161B"/>
-                      <w:sz w:val="18"/>
-                      <w:u w:val="none"/>
-                    </w:rPr>
-                    <w:t>Shorthand</w:t>
-                  </w:r>
-                </w:p>
-              </w:tc>
-              <w:tc>
-                <w:tcPr>
-                  <w:tcW w:type="dxa" w:w="8640"/>
-                  <w:vAlign w:val="bottom"/>
-                  <w:tcMar>
-                    <w:top w:w="0" w:type="dxa"/>
-                    <w:left w:w="0" w:type="dxa"/>
-                    <w:bottom w:w="10" w:type="dxa"/>
-                    <w:right w:w="0" w:type="dxa"/>
-                  </w:tcMar>
-                  <w:tcBorders>
-                    <w:bottom w:val="single" w:sz="6" w:color="C8CDC2"/>
-                  </w:tcBorders>
-                </w:tcPr>
-                <w:p>
-                  <w:pPr>
-                    <w:spacing w:after="0"/>
-                  </w:pPr>
-                </w:p>
-              </w:tc>
-            </w:tr>
-          </w:tbl>
+        </w:tc>
+        <w:tc>
+          <w:tcPr>
+            <w:tcW w:type="dxa" w:w="2534"/>
+            <w:vAlign w:val="center"/>
+            <w:tcMar>
+              <w:top w:w="20" w:type="dxa"/>
+              <w:left w:w="60" w:type="dxa"/>
+              <w:bottom w:w="60" w:type="dxa"/>
+              <w:right w:w="60" w:type="dxa"/>
+            </w:tcMar>
+            <w:tcBorders>
+              <w:bottom w:val="single" w:sz="4" w:color="C8CDC2"/>
+            </w:tcBorders>
+          </w:tcPr>
           <w:p>
             <w:pPr>
-              <w:spacing w:before="0" w:after="0" w:line="20" w:lineRule="exact"/>
-            </w:pPr>
-          </w:p>
-          <w:p>
-            <w:pPr>
-              <w:spacing w:before="0" w:after="0" w:line="60" w:lineRule="exact"/>
+              <w:spacing w:after="0"/>
+              <w:jc w:val="left"/>
             </w:pPr>
             <w:r>
               <w:rPr>
                 <w:rFonts w:ascii="Trade Gothic Next" w:hAnsi="Trade Gothic Next"/>
-                <w:sz w:val="2"/>
+                <w:b/>
+                <w:color w:val="4D730E"/>
+                <w:sz w:val="20"/>
+                <w:u w:val="none"/>
               </w:rPr>
+              <w:t xml:space="preserve">C   </w:t>
+            </w:r>
+            <w:r>
+              <w:rPr>
+                <w:rFonts w:ascii="Trade Gothic Next" w:hAnsi="Trade Gothic Next"/>
+                <w:b w:val="0"/>
+                <w:color w:val="14161B"/>
+                <w:sz w:val="20"/>
+                <w:u w:val="none"/>
+              </w:rPr>
+              <w:t>[↑] [↑] [↑]</w:t>
+            </w:r>
+          </w:p>
+        </w:tc>
+        <w:tc>
+          <w:tcPr>
+            <w:tcW w:type="dxa" w:w="2549"/>
+            <w:vAlign w:val="center"/>
+            <w:tcMar>
+              <w:top w:w="20" w:type="dxa"/>
+              <w:left w:w="60" w:type="dxa"/>
+              <w:bottom w:w="60" w:type="dxa"/>
+              <w:right w:w="60" w:type="dxa"/>
+            </w:tcMar>
+            <w:tcBorders>
+              <w:bottom w:val="single" w:sz="4" w:color="C8CDC2"/>
+            </w:tcBorders>
+          </w:tcPr>
+          <w:p>
+            <w:pPr>
+              <w:spacing w:after="0"/>
+              <w:jc w:val="left"/>
+            </w:pPr>
+            <w:r>
+              <w:rPr>
+                <w:rFonts w:ascii="Trade Gothic Next" w:hAnsi="Trade Gothic Next"/>
+                <w:b/>
+                <w:color w:val="4D730E"/>
+                <w:sz w:val="20"/>
+                <w:u w:val="none"/>
+              </w:rPr>
+              <w:t xml:space="preserve">D   </w:t>
+            </w:r>
+            <w:r>
+              <w:rPr>
+                <w:rFonts w:ascii="Trade Gothic Next" w:hAnsi="Trade Gothic Next"/>
+                <w:b w:val="0"/>
+                <w:color w:val="14161B"/>
+                <w:sz w:val="20"/>
+                <w:u w:val="none"/>
+              </w:rPr>
+              <w:t>[↑↓] [   ] [↑]</w:t>
+            </w:r>
+          </w:p>
+        </w:tc>
+      </w:tr>
+    </w:tbl>
+    <w:tbl>
+      <w:tblPr>
+        <w:tblW w:type="auto" w:w="0"/>
+        <w:tblLayout w:type="fixed"/>
+        <w:tblLook w:firstColumn="1" w:firstRow="1" w:lastColumn="0" w:lastRow="0" w:noHBand="0" w:noVBand="1" w:val="04A0"/>
+        <w:tblLayout w:type="fixed"/>
+      </w:tblPr>
+      <w:tblGrid>
+        <w:gridCol w:w="648"/>
+        <w:gridCol w:w="2534"/>
+        <w:gridCol w:w="2534"/>
+        <w:gridCol w:w="2534"/>
+        <w:gridCol w:w="2549"/>
+      </w:tblGrid>
+      <w:tr>
+        <w:trPr>
+          <w:cantSplit/>
+        </w:trPr>
+        <w:tc>
+          <w:tcPr>
+            <w:tcW w:type="dxa" w:w="648"/>
+            <w:vMerge w:val="restart"/>
+            <w:vAlign w:val="center"/>
+            <w:tcMar>
+              <w:top w:w="40" w:type="dxa"/>
+              <w:left w:w="60" w:type="dxa"/>
+              <w:bottom w:w="40" w:type="dxa"/>
+              <w:right w:w="60" w:type="dxa"/>
+            </w:tcMar>
+            <w:tcBorders>
+              <w:bottom w:val="single" w:sz="4" w:color="C8CDC2"/>
+            </w:tcBorders>
+          </w:tcPr>
+          <w:p>
+            <w:pPr>
+              <w:keepNext/>
+              <w:spacing w:after="0"/>
+              <w:jc w:val="left"/>
+            </w:pPr>
+            <w:r>
+              <w:rPr>
+                <w:rFonts w:ascii="Trade Gothic Next" w:hAnsi="Trade Gothic Next"/>
+                <w:b/>
+                <w:color w:val="4D730E"/>
+                <w:sz w:val="22"/>
+                <w:u w:val="none"/>
+              </w:rPr>
+              <w:t>3</w:t>
+            </w:r>
+          </w:p>
+        </w:tc>
+        <w:tc>
+          <w:tcPr>
+            <w:tcW w:type="dxa" w:w="10151"/>
+            <w:gridSpan w:val="4"/>
+            <w:vAlign w:val="center"/>
+            <w:tcMar>
+              <w:top w:w="50" w:type="dxa"/>
+              <w:left w:w="60" w:type="dxa"/>
+              <w:bottom w:w="20" w:type="dxa"/>
+              <w:right w:w="60" w:type="dxa"/>
+            </w:tcMar>
+          </w:tcPr>
+          <w:p>
+            <w:pPr>
+              <w:keepNext/>
+              <w:spacing w:after="0"/>
+              <w:jc w:val="left"/>
+            </w:pPr>
+            <w:r>
+              <w:rPr>
+                <w:rFonts w:ascii="Trade Gothic Next" w:hAnsi="Trade Gothic Next"/>
+                <w:b/>
+                <w:color w:val="14161B"/>
+                <w:sz w:val="20"/>
+                <w:u w:val="none"/>
+              </w:rPr>
+              <w:t>How many electrons can a p sublevel hold?</w:t>
+            </w:r>
+          </w:p>
+        </w:tc>
+      </w:tr>
+      <w:tr>
+        <w:trPr>
+          <w:cantSplit/>
+        </w:trPr>
+        <w:tc>
+          <w:tcPr>
+            <w:tcW w:type="dxa" w:w="648"/>
+            <w:vMerge/>
+          </w:tcPr>
+          <w:p/>
+        </w:tc>
+        <w:tc>
+          <w:tcPr>
+            <w:tcW w:type="dxa" w:w="2534"/>
+            <w:vAlign w:val="center"/>
+            <w:tcMar>
+              <w:top w:w="20" w:type="dxa"/>
+              <w:left w:w="60" w:type="dxa"/>
+              <w:bottom w:w="60" w:type="dxa"/>
+              <w:right w:w="60" w:type="dxa"/>
+            </w:tcMar>
+            <w:tcBorders>
+              <w:bottom w:val="single" w:sz="4" w:color="C8CDC2"/>
+            </w:tcBorders>
+          </w:tcPr>
+          <w:p>
+            <w:pPr>
+              <w:spacing w:after="0"/>
+              <w:jc w:val="left"/>
+            </w:pPr>
+            <w:r>
+              <w:rPr>
+                <w:rFonts w:ascii="Trade Gothic Next" w:hAnsi="Trade Gothic Next"/>
+                <w:b/>
+                <w:color w:val="4D730E"/>
+                <w:sz w:val="20"/>
+                <w:u w:val="none"/>
+              </w:rPr>
+              <w:t xml:space="preserve">A   </w:t>
+            </w:r>
+            <w:r>
+              <w:rPr>
+                <w:rFonts w:ascii="Trade Gothic Next" w:hAnsi="Trade Gothic Next"/>
+                <w:b w:val="0"/>
+                <w:color w:val="14161B"/>
+                <w:sz w:val="20"/>
+                <w:u w:val="none"/>
+              </w:rPr>
+              <w:t>3</w:t>
+            </w:r>
+          </w:p>
+        </w:tc>
+        <w:tc>
+          <w:tcPr>
+            <w:tcW w:type="dxa" w:w="2534"/>
+            <w:vAlign w:val="center"/>
+            <w:tcMar>
+              <w:top w:w="20" w:type="dxa"/>
+              <w:left w:w="60" w:type="dxa"/>
+              <w:bottom w:w="60" w:type="dxa"/>
+              <w:right w:w="60" w:type="dxa"/>
+            </w:tcMar>
+            <w:tcBorders>
+              <w:bottom w:val="single" w:sz="4" w:color="C8CDC2"/>
+            </w:tcBorders>
+          </w:tcPr>
+          <w:p>
+            <w:pPr>
+              <w:spacing w:after="0"/>
+              <w:jc w:val="left"/>
+            </w:pPr>
+            <w:r>
+              <w:rPr>
+                <w:rFonts w:ascii="Trade Gothic Next" w:hAnsi="Trade Gothic Next"/>
+                <w:b/>
+                <w:color w:val="4D730E"/>
+                <w:sz w:val="20"/>
+                <w:u w:val="none"/>
+              </w:rPr>
+              <w:t xml:space="preserve">B   </w:t>
+            </w:r>
+            <w:r>
+              <w:rPr>
+                <w:rFonts w:ascii="Trade Gothic Next" w:hAnsi="Trade Gothic Next"/>
+                <w:b w:val="0"/>
+                <w:color w:val="14161B"/>
+                <w:sz w:val="20"/>
+                <w:u w:val="none"/>
+              </w:rPr>
+              <w:t>6</w:t>
+            </w:r>
+          </w:p>
+        </w:tc>
+        <w:tc>
+          <w:tcPr>
+            <w:tcW w:type="dxa" w:w="2534"/>
+            <w:vAlign w:val="center"/>
+            <w:tcMar>
+              <w:top w:w="20" w:type="dxa"/>
+              <w:left w:w="60" w:type="dxa"/>
+              <w:bottom w:w="60" w:type="dxa"/>
+              <w:right w:w="60" w:type="dxa"/>
+            </w:tcMar>
+            <w:tcBorders>
+              <w:bottom w:val="single" w:sz="4" w:color="C8CDC2"/>
+            </w:tcBorders>
+          </w:tcPr>
+          <w:p>
+            <w:pPr>
+              <w:spacing w:after="0"/>
+              <w:jc w:val="left"/>
+            </w:pPr>
+            <w:r>
+              <w:rPr>
+                <w:rFonts w:ascii="Trade Gothic Next" w:hAnsi="Trade Gothic Next"/>
+                <w:b/>
+                <w:color w:val="4D730E"/>
+                <w:sz w:val="20"/>
+                <w:u w:val="none"/>
+              </w:rPr>
+              <w:t xml:space="preserve">C   </w:t>
+            </w:r>
+            <w:r>
+              <w:rPr>
+                <w:rFonts w:ascii="Trade Gothic Next" w:hAnsi="Trade Gothic Next"/>
+                <w:b w:val="0"/>
+                <w:color w:val="14161B"/>
+                <w:sz w:val="20"/>
+                <w:u w:val="none"/>
+              </w:rPr>
+              <w:t>2</w:t>
+            </w:r>
+          </w:p>
+        </w:tc>
+        <w:tc>
+          <w:tcPr>
+            <w:tcW w:type="dxa" w:w="2549"/>
+            <w:vAlign w:val="center"/>
+            <w:tcMar>
+              <w:top w:w="20" w:type="dxa"/>
+              <w:left w:w="60" w:type="dxa"/>
+              <w:bottom w:w="60" w:type="dxa"/>
+              <w:right w:w="60" w:type="dxa"/>
+            </w:tcMar>
+            <w:tcBorders>
+              <w:bottom w:val="single" w:sz="4" w:color="C8CDC2"/>
+            </w:tcBorders>
+          </w:tcPr>
+          <w:p>
+            <w:pPr>
+              <w:spacing w:after="0"/>
+              <w:jc w:val="left"/>
+            </w:pPr>
+            <w:r>
+              <w:rPr>
+                <w:rFonts w:ascii="Trade Gothic Next" w:hAnsi="Trade Gothic Next"/>
+                <w:b/>
+                <w:color w:val="4D730E"/>
+                <w:sz w:val="20"/>
+                <w:u w:val="none"/>
+              </w:rPr>
+              <w:t xml:space="preserve">D   </w:t>
+            </w:r>
+            <w:r>
+              <w:rPr>
+                <w:rFonts w:ascii="Trade Gothic Next" w:hAnsi="Trade Gothic Next"/>
+                <w:b w:val="0"/>
+                <w:color w:val="14161B"/>
+                <w:sz w:val="20"/>
+                <w:u w:val="none"/>
+              </w:rPr>
+              <w:t>10</w:t>
+            </w:r>
+          </w:p>
+        </w:tc>
+      </w:tr>
+    </w:tbl>
+    <w:tbl>
+      <w:tblPr>
+        <w:tblW w:type="auto" w:w="0"/>
+        <w:tblLayout w:type="fixed"/>
+        <w:tblLook w:firstColumn="1" w:firstRow="1" w:lastColumn="0" w:lastRow="0" w:noHBand="0" w:noVBand="1" w:val="04A0"/>
+        <w:tblLayout w:type="fixed"/>
+      </w:tblPr>
+      <w:tblGrid>
+        <w:gridCol w:w="648"/>
+        <w:gridCol w:w="2534"/>
+        <w:gridCol w:w="2534"/>
+        <w:gridCol w:w="2534"/>
+        <w:gridCol w:w="2549"/>
+      </w:tblGrid>
+      <w:tr>
+        <w:trPr>
+          <w:cantSplit/>
+        </w:trPr>
+        <w:tc>
+          <w:tcPr>
+            <w:tcW w:type="dxa" w:w="648"/>
+            <w:vMerge w:val="restart"/>
+            <w:vAlign w:val="center"/>
+            <w:tcMar>
+              <w:top w:w="40" w:type="dxa"/>
+              <w:left w:w="60" w:type="dxa"/>
+              <w:bottom w:w="40" w:type="dxa"/>
+              <w:right w:w="60" w:type="dxa"/>
+            </w:tcMar>
+            <w:tcBorders>
+              <w:bottom w:val="single" w:sz="4" w:color="C8CDC2"/>
+            </w:tcBorders>
+          </w:tcPr>
+          <w:p>
+            <w:pPr>
+              <w:keepNext/>
+              <w:spacing w:after="0"/>
+              <w:jc w:val="left"/>
+            </w:pPr>
+            <w:r>
+              <w:rPr>
+                <w:rFonts w:ascii="Trade Gothic Next" w:hAnsi="Trade Gothic Next"/>
+                <w:b/>
+                <w:color w:val="4D730E"/>
+                <w:sz w:val="22"/>
+                <w:u w:val="none"/>
+              </w:rPr>
+              <w:t>4</w:t>
+            </w:r>
+          </w:p>
+        </w:tc>
+        <w:tc>
+          <w:tcPr>
+            <w:tcW w:type="dxa" w:w="10151"/>
+            <w:gridSpan w:val="4"/>
+            <w:vAlign w:val="center"/>
+            <w:tcMar>
+              <w:top w:w="50" w:type="dxa"/>
+              <w:left w:w="60" w:type="dxa"/>
+              <w:bottom w:w="20" w:type="dxa"/>
+              <w:right w:w="60" w:type="dxa"/>
+            </w:tcMar>
+          </w:tcPr>
+          <w:p>
+            <w:pPr>
+              <w:keepNext/>
+              <w:spacing w:after="0"/>
+              <w:jc w:val="left"/>
+            </w:pPr>
+            <w:r>
+              <w:rPr>
+                <w:rFonts w:ascii="Trade Gothic Next" w:hAnsi="Trade Gothic Next"/>
+                <w:b/>
+                <w:color w:val="14161B"/>
+                <w:sz w:val="20"/>
+                <w:u w:val="none"/>
+              </w:rPr>
+              <w:t>An atom gains 2 electrons. What is the charge of its ion?</w:t>
+            </w:r>
+          </w:p>
+        </w:tc>
+      </w:tr>
+      <w:tr>
+        <w:trPr>
+          <w:cantSplit/>
+        </w:trPr>
+        <w:tc>
+          <w:tcPr>
+            <w:tcW w:type="dxa" w:w="648"/>
+            <w:vMerge/>
+          </w:tcPr>
+          <w:p/>
+        </w:tc>
+        <w:tc>
+          <w:tcPr>
+            <w:tcW w:type="dxa" w:w="2534"/>
+            <w:vAlign w:val="center"/>
+            <w:tcMar>
+              <w:top w:w="20" w:type="dxa"/>
+              <w:left w:w="60" w:type="dxa"/>
+              <w:bottom w:w="60" w:type="dxa"/>
+              <w:right w:w="60" w:type="dxa"/>
+            </w:tcMar>
+            <w:tcBorders>
+              <w:bottom w:val="single" w:sz="4" w:color="C8CDC2"/>
+            </w:tcBorders>
+          </w:tcPr>
+          <w:p>
+            <w:pPr>
+              <w:spacing w:after="0"/>
+              <w:jc w:val="left"/>
+            </w:pPr>
+            <w:r>
+              <w:rPr>
+                <w:rFonts w:ascii="Trade Gothic Next" w:hAnsi="Trade Gothic Next"/>
+                <w:b/>
+                <w:color w:val="4D730E"/>
+                <w:sz w:val="20"/>
+                <w:u w:val="none"/>
+              </w:rPr>
+              <w:t xml:space="preserve">A   </w:t>
+            </w:r>
+            <w:r>
+              <w:rPr>
+                <w:rFonts w:ascii="Trade Gothic Next" w:hAnsi="Trade Gothic Next"/>
+                <w:b w:val="0"/>
+                <w:color w:val="14161B"/>
+                <w:sz w:val="20"/>
+                <w:u w:val="none"/>
+              </w:rPr>
+              <w:t>2+</w:t>
+            </w:r>
+          </w:p>
+        </w:tc>
+        <w:tc>
+          <w:tcPr>
+            <w:tcW w:type="dxa" w:w="2534"/>
+            <w:vAlign w:val="center"/>
+            <w:tcMar>
+              <w:top w:w="20" w:type="dxa"/>
+              <w:left w:w="60" w:type="dxa"/>
+              <w:bottom w:w="60" w:type="dxa"/>
+              <w:right w:w="60" w:type="dxa"/>
+            </w:tcMar>
+            <w:tcBorders>
+              <w:bottom w:val="single" w:sz="4" w:color="C8CDC2"/>
+            </w:tcBorders>
+          </w:tcPr>
+          <w:p>
+            <w:pPr>
+              <w:spacing w:after="0"/>
+              <w:jc w:val="left"/>
+            </w:pPr>
+            <w:r>
+              <w:rPr>
+                <w:rFonts w:ascii="Trade Gothic Next" w:hAnsi="Trade Gothic Next"/>
+                <w:b/>
+                <w:color w:val="4D730E"/>
+                <w:sz w:val="20"/>
+                <w:u w:val="none"/>
+              </w:rPr>
+              <w:t xml:space="preserve">B   </w:t>
+            </w:r>
+            <w:r>
+              <w:rPr>
+                <w:rFonts w:ascii="Trade Gothic Next" w:hAnsi="Trade Gothic Next"/>
+                <w:b w:val="0"/>
+                <w:color w:val="14161B"/>
+                <w:sz w:val="20"/>
+                <w:u w:val="none"/>
+              </w:rPr>
+              <w:t>0</w:t>
+            </w:r>
+          </w:p>
+        </w:tc>
+        <w:tc>
+          <w:tcPr>
+            <w:tcW w:type="dxa" w:w="2534"/>
+            <w:vAlign w:val="center"/>
+            <w:tcMar>
+              <w:top w:w="20" w:type="dxa"/>
+              <w:left w:w="60" w:type="dxa"/>
+              <w:bottom w:w="60" w:type="dxa"/>
+              <w:right w:w="60" w:type="dxa"/>
+            </w:tcMar>
+            <w:tcBorders>
+              <w:bottom w:val="single" w:sz="4" w:color="C8CDC2"/>
+            </w:tcBorders>
+          </w:tcPr>
+          <w:p>
+            <w:pPr>
+              <w:spacing w:after="0"/>
+              <w:jc w:val="left"/>
+            </w:pPr>
+            <w:r>
+              <w:rPr>
+                <w:rFonts w:ascii="Trade Gothic Next" w:hAnsi="Trade Gothic Next"/>
+                <w:b/>
+                <w:color w:val="4D730E"/>
+                <w:sz w:val="20"/>
+                <w:u w:val="none"/>
+              </w:rPr>
+              <w:t xml:space="preserve">C   </w:t>
+            </w:r>
+            <w:r>
+              <w:rPr>
+                <w:rFonts w:ascii="Trade Gothic Next" w:hAnsi="Trade Gothic Next"/>
+                <w:b w:val="0"/>
+                <w:color w:val="14161B"/>
+                <w:sz w:val="20"/>
+                <w:u w:val="none"/>
+              </w:rPr>
+              <w:t>6−</w:t>
+            </w:r>
+          </w:p>
+        </w:tc>
+        <w:tc>
+          <w:tcPr>
+            <w:tcW w:type="dxa" w:w="2549"/>
+            <w:vAlign w:val="center"/>
+            <w:tcMar>
+              <w:top w:w="20" w:type="dxa"/>
+              <w:left w:w="60" w:type="dxa"/>
+              <w:bottom w:w="60" w:type="dxa"/>
+              <w:right w:w="60" w:type="dxa"/>
+            </w:tcMar>
+            <w:tcBorders>
+              <w:bottom w:val="single" w:sz="4" w:color="C8CDC2"/>
+            </w:tcBorders>
+          </w:tcPr>
+          <w:p>
+            <w:pPr>
+              <w:spacing w:after="0"/>
+              <w:jc w:val="left"/>
+            </w:pPr>
+            <w:r>
+              <w:rPr>
+                <w:rFonts w:ascii="Trade Gothic Next" w:hAnsi="Trade Gothic Next"/>
+                <w:b/>
+                <w:color w:val="4D730E"/>
+                <w:sz w:val="20"/>
+                <w:u w:val="none"/>
+              </w:rPr>
+              <w:t xml:space="preserve">D   </w:t>
+            </w:r>
+            <w:r>
+              <w:rPr>
+                <w:rFonts w:ascii="Trade Gothic Next" w:hAnsi="Trade Gothic Next"/>
+                <w:b w:val="0"/>
+                <w:color w:val="14161B"/>
+                <w:sz w:val="20"/>
+                <w:u w:val="none"/>
+              </w:rPr>
+              <w:t>2−</w:t>
+            </w:r>
+          </w:p>
+        </w:tc>
+      </w:tr>
+    </w:tbl>
+    <w:tbl>
+      <w:tblPr>
+        <w:tblW w:type="auto" w:w="0"/>
+        <w:tblLayout w:type="fixed"/>
+        <w:tblLook w:firstColumn="1" w:firstRow="1" w:lastColumn="0" w:lastRow="0" w:noHBand="0" w:noVBand="1" w:val="04A0"/>
+        <w:tblLayout w:type="fixed"/>
+      </w:tblPr>
+      <w:tblGrid>
+        <w:gridCol w:w="648"/>
+        <w:gridCol w:w="2534"/>
+        <w:gridCol w:w="2534"/>
+        <w:gridCol w:w="2534"/>
+        <w:gridCol w:w="2549"/>
+      </w:tblGrid>
+      <w:tr>
+        <w:trPr>
+          <w:cantSplit/>
+        </w:trPr>
+        <w:tc>
+          <w:tcPr>
+            <w:tcW w:type="dxa" w:w="648"/>
+            <w:vMerge w:val="restart"/>
+            <w:vAlign w:val="center"/>
+            <w:tcMar>
+              <w:top w:w="40" w:type="dxa"/>
+              <w:left w:w="60" w:type="dxa"/>
+              <w:bottom w:w="40" w:type="dxa"/>
+              <w:right w:w="60" w:type="dxa"/>
+            </w:tcMar>
+            <w:tcBorders>
+              <w:bottom w:val="single" w:sz="4" w:color="C8CDC2"/>
+            </w:tcBorders>
+          </w:tcPr>
+          <w:p>
+            <w:pPr>
+              <w:keepNext/>
+              <w:spacing w:after="0"/>
+              <w:jc w:val="left"/>
+            </w:pPr>
+            <w:r>
+              <w:rPr>
+                <w:rFonts w:ascii="Trade Gothic Next" w:hAnsi="Trade Gothic Next"/>
+                <w:b/>
+                <w:color w:val="4D730E"/>
+                <w:sz w:val="22"/>
+                <w:u w:val="none"/>
+              </w:rPr>
+              <w:t>5</w:t>
+            </w:r>
+          </w:p>
+        </w:tc>
+        <w:tc>
+          <w:tcPr>
+            <w:tcW w:type="dxa" w:w="10151"/>
+            <w:gridSpan w:val="4"/>
+            <w:vAlign w:val="center"/>
+            <w:tcMar>
+              <w:top w:w="50" w:type="dxa"/>
+              <w:left w:w="60" w:type="dxa"/>
+              <w:bottom w:w="20" w:type="dxa"/>
+              <w:right w:w="60" w:type="dxa"/>
+            </w:tcMar>
+          </w:tcPr>
+          <w:p>
+            <w:pPr>
+              <w:keepNext/>
+              <w:spacing w:after="0"/>
+              <w:jc w:val="left"/>
+            </w:pPr>
+            <w:r>
+              <w:rPr>
+                <w:rFonts w:ascii="Trade Gothic Next" w:hAnsi="Trade Gothic Next"/>
+                <w:b/>
+                <w:color w:val="14161B"/>
+                <w:sz w:val="20"/>
+                <w:u w:val="none"/>
+              </w:rPr>
+              <w:t>Which sublevel fills right after 4s?</w:t>
+            </w:r>
+          </w:p>
+        </w:tc>
+      </w:tr>
+      <w:tr>
+        <w:trPr>
+          <w:cantSplit/>
+        </w:trPr>
+        <w:tc>
+          <w:tcPr>
+            <w:tcW w:type="dxa" w:w="648"/>
+            <w:vMerge/>
+          </w:tcPr>
+          <w:p/>
+        </w:tc>
+        <w:tc>
+          <w:tcPr>
+            <w:tcW w:type="dxa" w:w="2534"/>
+            <w:vAlign w:val="center"/>
+            <w:tcMar>
+              <w:top w:w="20" w:type="dxa"/>
+              <w:left w:w="60" w:type="dxa"/>
+              <w:bottom w:w="60" w:type="dxa"/>
+              <w:right w:w="60" w:type="dxa"/>
+            </w:tcMar>
+            <w:tcBorders>
+              <w:bottom w:val="single" w:sz="4" w:color="C8CDC2"/>
+            </w:tcBorders>
+          </w:tcPr>
+          <w:p>
+            <w:pPr>
+              <w:spacing w:after="0"/>
+              <w:jc w:val="left"/>
+            </w:pPr>
+            <w:r>
+              <w:rPr>
+                <w:rFonts w:ascii="Trade Gothic Next" w:hAnsi="Trade Gothic Next"/>
+                <w:b/>
+                <w:color w:val="4D730E"/>
+                <w:sz w:val="20"/>
+                <w:u w:val="none"/>
+              </w:rPr>
+              <w:t xml:space="preserve">A   </w:t>
+            </w:r>
+            <w:r>
+              <w:rPr>
+                <w:rFonts w:ascii="Trade Gothic Next" w:hAnsi="Trade Gothic Next"/>
+                <w:b w:val="0"/>
+                <w:color w:val="14161B"/>
+                <w:sz w:val="20"/>
+                <w:u w:val="none"/>
+              </w:rPr>
+              <w:t>4p</w:t>
+            </w:r>
+          </w:p>
+        </w:tc>
+        <w:tc>
+          <w:tcPr>
+            <w:tcW w:type="dxa" w:w="2534"/>
+            <w:vAlign w:val="center"/>
+            <w:tcMar>
+              <w:top w:w="20" w:type="dxa"/>
+              <w:left w:w="60" w:type="dxa"/>
+              <w:bottom w:w="60" w:type="dxa"/>
+              <w:right w:w="60" w:type="dxa"/>
+            </w:tcMar>
+            <w:tcBorders>
+              <w:bottom w:val="single" w:sz="4" w:color="C8CDC2"/>
+            </w:tcBorders>
+          </w:tcPr>
+          <w:p>
+            <w:pPr>
+              <w:spacing w:after="0"/>
+              <w:jc w:val="left"/>
+            </w:pPr>
+            <w:r>
+              <w:rPr>
+                <w:rFonts w:ascii="Trade Gothic Next" w:hAnsi="Trade Gothic Next"/>
+                <w:b/>
+                <w:color w:val="4D730E"/>
+                <w:sz w:val="20"/>
+                <w:u w:val="none"/>
+              </w:rPr>
+              <w:t xml:space="preserve">B   </w:t>
+            </w:r>
+            <w:r>
+              <w:rPr>
+                <w:rFonts w:ascii="Trade Gothic Next" w:hAnsi="Trade Gothic Next"/>
+                <w:b w:val="0"/>
+                <w:color w:val="14161B"/>
+                <w:sz w:val="20"/>
+                <w:u w:val="none"/>
+              </w:rPr>
+              <w:t>3d</w:t>
+            </w:r>
+          </w:p>
+        </w:tc>
+        <w:tc>
+          <w:tcPr>
+            <w:tcW w:type="dxa" w:w="2534"/>
+            <w:vAlign w:val="center"/>
+            <w:tcMar>
+              <w:top w:w="20" w:type="dxa"/>
+              <w:left w:w="60" w:type="dxa"/>
+              <w:bottom w:w="60" w:type="dxa"/>
+              <w:right w:w="60" w:type="dxa"/>
+            </w:tcMar>
+            <w:tcBorders>
+              <w:bottom w:val="single" w:sz="4" w:color="C8CDC2"/>
+            </w:tcBorders>
+          </w:tcPr>
+          <w:p>
+            <w:pPr>
+              <w:spacing w:after="0"/>
+              <w:jc w:val="left"/>
+            </w:pPr>
+            <w:r>
+              <w:rPr>
+                <w:rFonts w:ascii="Trade Gothic Next" w:hAnsi="Trade Gothic Next"/>
+                <w:b/>
+                <w:color w:val="4D730E"/>
+                <w:sz w:val="20"/>
+                <w:u w:val="none"/>
+              </w:rPr>
+              <w:t xml:space="preserve">C   </w:t>
+            </w:r>
+            <w:r>
+              <w:rPr>
+                <w:rFonts w:ascii="Trade Gothic Next" w:hAnsi="Trade Gothic Next"/>
+                <w:b w:val="0"/>
+                <w:color w:val="14161B"/>
+                <w:sz w:val="20"/>
+                <w:u w:val="none"/>
+              </w:rPr>
+              <w:t>4d</w:t>
+            </w:r>
+          </w:p>
+        </w:tc>
+        <w:tc>
+          <w:tcPr>
+            <w:tcW w:type="dxa" w:w="2549"/>
+            <w:vAlign w:val="center"/>
+            <w:tcMar>
+              <w:top w:w="20" w:type="dxa"/>
+              <w:left w:w="60" w:type="dxa"/>
+              <w:bottom w:w="60" w:type="dxa"/>
+              <w:right w:w="60" w:type="dxa"/>
+            </w:tcMar>
+            <w:tcBorders>
+              <w:bottom w:val="single" w:sz="4" w:color="C8CDC2"/>
+            </w:tcBorders>
+          </w:tcPr>
+          <w:p>
+            <w:pPr>
+              <w:spacing w:after="0"/>
+              <w:jc w:val="left"/>
+            </w:pPr>
+            <w:r>
+              <w:rPr>
+                <w:rFonts w:ascii="Trade Gothic Next" w:hAnsi="Trade Gothic Next"/>
+                <w:b/>
+                <w:color w:val="4D730E"/>
+                <w:sz w:val="20"/>
+                <w:u w:val="none"/>
+              </w:rPr>
+              <w:t xml:space="preserve">D   </w:t>
+            </w:r>
+            <w:r>
+              <w:rPr>
+                <w:rFonts w:ascii="Trade Gothic Next" w:hAnsi="Trade Gothic Next"/>
+                <w:b w:val="0"/>
+                <w:color w:val="14161B"/>
+                <w:sz w:val="20"/>
+                <w:u w:val="none"/>
+              </w:rPr>
+              <w:t>5s</w:t>
             </w:r>
           </w:p>
         </w:tc>
@@ -1082,48 +1685,310 @@
     <w:tbl>
       <w:tblPr>
         <w:tblW w:type="auto" w:w="0"/>
-        <w:jc w:val="left"/>
         <w:tblLayout w:type="fixed"/>
         <w:tblLook w:firstColumn="1" w:firstRow="1" w:lastColumn="0" w:lastRow="0" w:noHBand="0" w:noVBand="1" w:val="04A0"/>
         <w:tblLayout w:type="fixed"/>
       </w:tblPr>
       <w:tblGrid>
-        <w:gridCol w:w="10800"/>
+        <w:gridCol w:w="9072"/>
+        <w:gridCol w:w="1728"/>
       </w:tblGrid>
       <w:tr>
         <w:tc>
           <w:tcPr>
-            <w:tcW w:type="dxa" w:w="10800"/>
+            <w:tcW w:type="dxa" w:w="9072"/>
             <w:tcBorders>
               <w:top w:val="single" w:sz="12" w:color="14161B"/>
+              <w:bottom w:val="single" w:sz="18" w:color="A3E635"/>
+            </w:tcBorders>
+            <w:vAlign w:val="center"/>
+            <w:tcMar>
+              <w:top w:w="30" w:type="dxa"/>
+              <w:left w:w="0" w:type="dxa"/>
+              <w:bottom w:w="30" w:type="dxa"/>
+              <w:right w:w="60" w:type="dxa"/>
+            </w:tcMar>
+          </w:tcPr>
+          <w:p>
+            <w:pPr>
+              <w:keepNext/>
+              <w:spacing w:after="0"/>
+              <w:jc w:val="left"/>
+            </w:pPr>
+            <w:r>
+              <w:rPr>
+                <w:rFonts w:ascii="Trade Gothic Next" w:hAnsi="Trade Gothic Next"/>
+                <w:b/>
+                <w:color w:val="14161B"/>
+                <w:sz w:val="18"/>
+                <w:u w:val="none"/>
+              </w:rPr>
+              <w:t>PART 2  ·  LONGHAND CONFIGURATION AND ORBITAL DIAGRAM</w:t>
+            </w:r>
+          </w:p>
+        </w:tc>
+        <w:tc>
+          <w:tcPr>
+            <w:tcW w:type="dxa" w:w="1728"/>
+            <w:tcBorders>
+              <w:top w:val="single" w:sz="12" w:color="14161B"/>
+              <w:bottom w:val="single" w:sz="18" w:color="A3E635"/>
+            </w:tcBorders>
+            <w:vAlign w:val="center"/>
+            <w:tcMar>
+              <w:top w:w="30" w:type="dxa"/>
+              <w:left w:w="60" w:type="dxa"/>
+              <w:bottom w:w="30" w:type="dxa"/>
+              <w:right w:w="60" w:type="dxa"/>
+            </w:tcMar>
+          </w:tcPr>
+          <w:p>
+            <w:pPr>
+              <w:keepNext/>
+              <w:spacing w:after="0"/>
+              <w:jc w:val="right"/>
+            </w:pPr>
+            <w:r>
+              <w:rPr>
+                <w:rFonts w:ascii="Trade Gothic Next" w:hAnsi="Trade Gothic Next"/>
+                <w:b/>
+                <w:color w:val="55604F"/>
+                <w:sz w:val="17"/>
+                <w:u w:val="none"/>
+              </w:rPr>
+              <w:t>8 pts</w:t>
+            </w:r>
+          </w:p>
+        </w:tc>
+      </w:tr>
+    </w:tbl>
+    <w:tbl>
+      <w:tblPr>
+        <w:tblW w:type="auto" w:w="0"/>
+        <w:tblLayout w:type="fixed"/>
+        <w:tblLook w:firstColumn="1" w:firstRow="1" w:lastColumn="0" w:lastRow="0" w:noHBand="0" w:noVBand="1" w:val="04A0"/>
+        <w:tblLayout w:type="fixed"/>
+      </w:tblPr>
+      <w:tblGrid>
+        <w:gridCol w:w="648"/>
+        <w:gridCol w:w="2520"/>
+        <w:gridCol w:w="7632"/>
+      </w:tblGrid>
+      <w:tr>
+        <w:trPr>
+          <w:cantSplit/>
+        </w:trPr>
+        <w:tc>
+          <w:tcPr>
+            <w:tcW w:type="dxa" w:w="648"/>
+            <w:vMerge w:val="restart"/>
+            <w:vAlign w:val="center"/>
+            <w:tcMar>
+              <w:top w:w="40" w:type="dxa"/>
+              <w:left w:w="60" w:type="dxa"/>
+              <w:bottom w:w="40" w:type="dxa"/>
+              <w:right w:w="60" w:type="dxa"/>
+            </w:tcMar>
+            <w:tcBorders>
+              <w:bottom w:val="single" w:sz="4" w:color="C8CDC2"/>
             </w:tcBorders>
           </w:tcPr>
           <w:p>
             <w:pPr>
-              <w:spacing w:after="40" w:before="0"/>
+              <w:spacing w:after="0"/>
+              <w:jc w:val="left"/>
             </w:pPr>
             <w:r>
               <w:rPr>
                 <w:rFonts w:ascii="Trade Gothic Next" w:hAnsi="Trade Gothic Next"/>
                 <w:b/>
                 <w:color w:val="4D730E"/>
-                <w:sz w:val="15"/>
-                <w:spacing w:val="26"/>
+                <w:sz w:val="22"/>
+                <w:u w:val="none"/>
               </w:rPr>
-              <w:t>PART 3  ·  CHARGE OF THE ION EACH ATOM FORMS</w:t>
+              <w:t>6</w:t>
             </w:r>
+          </w:p>
+        </w:tc>
+        <w:tc>
+          <w:tcPr>
+            <w:tcW w:type="dxa" w:w="10152"/>
+            <w:gridSpan w:val="2"/>
+            <w:vAlign w:val="center"/>
+            <w:tcMar>
+              <w:top w:w="50" w:type="dxa"/>
+              <w:left w:w="60" w:type="dxa"/>
+              <w:bottom w:w="10" w:type="dxa"/>
+              <w:right w:w="60" w:type="dxa"/>
+            </w:tcMar>
+          </w:tcPr>
+          <w:p>
+            <w:pPr>
+              <w:keepNext/>
+              <w:spacing w:after="0"/>
+              <w:jc w:val="left"/>
+            </w:pPr>
+            <w:r>
+              <w:rPr>
+                <w:rFonts w:ascii="Trade Gothic Next" w:hAnsi="Trade Gothic Next"/>
+                <w:b/>
+                <w:color w:val="14161B"/>
+                <w:sz w:val="21"/>
+                <w:u w:val="none"/>
+              </w:rPr>
+              <w:t>Selenium, Se</w:t>
+            </w:r>
+            <w:r>
+              <w:rPr>
+                <w:rFonts w:ascii="Trade Gothic Next" w:hAnsi="Trade Gothic Next"/>
+                <w:b w:val="0"/>
+                <w:color w:val="55604F"/>
+                <w:sz w:val="16"/>
+                <w:u w:val="none"/>
+              </w:rPr>
+              <w:t xml:space="preserve">     4 pts: 2 configuration, 2 diagram</w:t>
+            </w:r>
+          </w:p>
+        </w:tc>
+      </w:tr>
+      <w:tr>
+        <w:trPr>
+          <w:cantSplit/>
+        </w:trPr>
+        <w:tc>
+          <w:tcPr>
+            <w:tcW w:type="dxa" w:w="648"/>
+            <w:vMerge/>
+          </w:tcPr>
+          <w:p/>
+        </w:tc>
+        <w:tc>
+          <w:tcPr>
+            <w:tcW w:type="dxa" w:w="2520"/>
+            <w:vAlign w:val="center"/>
+            <w:tcMar>
+              <w:top w:w="40" w:type="dxa"/>
+              <w:left w:w="60" w:type="dxa"/>
+              <w:bottom w:w="40" w:type="dxa"/>
+              <w:right w:w="60" w:type="dxa"/>
+            </w:tcMar>
+          </w:tcPr>
+          <w:p>
+            <w:pPr>
+              <w:keepNext/>
+              <w:spacing w:after="0"/>
+              <w:jc w:val="left"/>
+            </w:pPr>
+            <w:r>
+              <w:rPr>
+                <w:rFonts w:ascii="Trade Gothic Next" w:hAnsi="Trade Gothic Next"/>
+                <w:b/>
+                <w:color w:val="14161B"/>
+                <w:sz w:val="18"/>
+                <w:u w:val="none"/>
+              </w:rPr>
+              <w:t>Electron configuration</w:t>
+            </w:r>
+          </w:p>
+        </w:tc>
+        <w:tc>
+          <w:tcPr>
+            <w:tcW w:type="dxa" w:w="7632"/>
+            <w:vAlign w:val="center"/>
+            <w:tcMar>
+              <w:top w:w="40" w:type="dxa"/>
+              <w:left w:w="60" w:type="dxa"/>
+              <w:bottom w:w="40" w:type="dxa"/>
+              <w:right w:w="60" w:type="dxa"/>
+            </w:tcMar>
+            <w:tcBorders>
+              <w:bottom w:val="single" w:sz="4" w:color="C8CDC2"/>
+            </w:tcBorders>
+          </w:tcPr>
+          <w:p>
+            <w:pPr>
+              <w:spacing w:after="0"/>
+              <w:jc w:val="left"/>
+            </w:pPr>
+          </w:p>
+        </w:tc>
+      </w:tr>
+      <w:tr>
+        <w:trPr>
+          <w:cantSplit/>
+          <w:cantSplit/>
+          <w:trHeight w:val="1224" w:hRule="atLeast"/>
+        </w:trPr>
+        <w:tc>
+          <w:tcPr>
+            <w:tcW w:type="dxa" w:w="648"/>
+            <w:vMerge/>
+          </w:tcPr>
+          <w:p/>
+        </w:tc>
+        <w:tc>
+          <w:tcPr>
+            <w:tcW w:type="dxa" w:w="2520"/>
+            <w:vAlign w:val="center"/>
+            <w:tcMar>
+              <w:top w:w="40" w:type="dxa"/>
+              <w:left w:w="60" w:type="dxa"/>
+              <w:bottom w:w="40" w:type="dxa"/>
+              <w:right w:w="60" w:type="dxa"/>
+            </w:tcMar>
+          </w:tcPr>
+          <w:p>
+            <w:pPr>
+              <w:keepNext w:val="0"/>
+              <w:spacing w:after="0"/>
+              <w:jc w:val="left"/>
+            </w:pPr>
+            <w:r>
+              <w:rPr>
+                <w:rFonts w:ascii="Trade Gothic Next" w:hAnsi="Trade Gothic Next"/>
+                <w:b/>
+                <w:color w:val="14161B"/>
+                <w:sz w:val="18"/>
+                <w:u w:val="none"/>
+              </w:rPr>
+              <w:t>Orbital diagram</w:t>
+            </w:r>
+          </w:p>
+        </w:tc>
+        <w:tc>
+          <w:tcPr>
+            <w:tcW w:type="dxa" w:w="7632"/>
+            <w:vAlign w:val="center"/>
+            <w:tcMar>
+              <w:top w:w="40" w:type="dxa"/>
+              <w:left w:w="60" w:type="dxa"/>
+              <w:bottom w:w="40" w:type="dxa"/>
+              <w:right w:w="60" w:type="dxa"/>
+            </w:tcMar>
+            <w:tcBorders>
+              <w:top w:val="single" w:sz="4" w:color="C8CDC2"/>
+              <w:left w:val="single" w:sz="4" w:color="C8CDC2"/>
+              <w:bottom w:val="single" w:sz="4" w:color="C8CDC2"/>
+              <w:right w:val="single" w:sz="4" w:color="C8CDC2"/>
+            </w:tcBorders>
+          </w:tcPr>
+          <w:p>
+            <w:pPr>
+              <w:spacing w:after="0"/>
+              <w:jc w:val="left"/>
+            </w:pPr>
           </w:p>
         </w:tc>
       </w:tr>
     </w:tbl>
     <w:p>
       <w:pPr>
-        <w:spacing w:before="0" w:after="0" w:line="80" w:lineRule="exact"/>
+        <w:spacing w:before="0" w:after="0" w:line="40" w:lineRule="exact"/>
       </w:pPr>
       <w:r>
         <w:rPr>
           <w:rFonts w:ascii="Trade Gothic Next" w:hAnsi="Trade Gothic Next"/>
-          <w:sz w:val="4"/>
+          <w:sz w:val="2"/>
         </w:rPr>
       </w:r>
     </w:p>
@@ -1135,49 +2000,673 @@
         <w:tblLayout w:type="fixed"/>
       </w:tblPr>
       <w:tblGrid>
-        <w:gridCol w:w="5400"/>
-        <w:gridCol w:w="5400"/>
+        <w:gridCol w:w="648"/>
+        <w:gridCol w:w="2520"/>
+        <w:gridCol w:w="7632"/>
       </w:tblGrid>
       <w:tr>
         <w:trPr>
           <w:cantSplit/>
-          <w:trHeight w:val="892" w:hRule="atLeast"/>
-          <w:cantSplit/>
-          <w:trHeight w:val="892" w:hRule="atLeast"/>
         </w:trPr>
         <w:tc>
           <w:tcPr>
-            <w:tcW w:type="dxa" w:w="5400"/>
-            <w:tcBorders>
-              <w:top w:val="single" w:sz="6" w:color="C8CDC2"/>
-              <w:left w:val="single" w:sz="6" w:color="C8CDC2"/>
-              <w:bottom w:val="single" w:sz="6" w:color="C8CDC2"/>
-              <w:right w:val="single" w:sz="6" w:color="C8CDC2"/>
-            </w:tcBorders>
+            <w:tcW w:type="dxa" w:w="648"/>
+            <w:vMerge w:val="restart"/>
+            <w:vAlign w:val="center"/>
             <w:tcMar>
               <w:top w:w="40" w:type="dxa"/>
-              <w:left w:w="80" w:type="dxa"/>
+              <w:left w:w="60" w:type="dxa"/>
               <w:bottom w:w="40" w:type="dxa"/>
-              <w:right w:w="80" w:type="dxa"/>
+              <w:right w:w="60" w:type="dxa"/>
             </w:tcMar>
+            <w:tcBorders>
+              <w:bottom w:val="single" w:sz="4" w:color="C8CDC2"/>
+            </w:tcBorders>
           </w:tcPr>
           <w:p>
             <w:pPr>
-              <w:tabs>
-                <w:tab w:pos="10224" w:val="right"/>
-              </w:tabs>
-              <w:spacing w:after="40"/>
+              <w:spacing w:after="0"/>
+              <w:jc w:val="left"/>
             </w:pPr>
             <w:r>
               <w:rPr>
                 <w:rFonts w:ascii="Trade Gothic Next" w:hAnsi="Trade Gothic Next"/>
                 <w:b/>
                 <w:color w:val="4D730E"/>
+                <w:sz w:val="22"/>
+                <w:u w:val="none"/>
+              </w:rPr>
+              <w:t>7</w:t>
+            </w:r>
+          </w:p>
+        </w:tc>
+        <w:tc>
+          <w:tcPr>
+            <w:tcW w:type="dxa" w:w="10152"/>
+            <w:gridSpan w:val="2"/>
+            <w:vAlign w:val="center"/>
+            <w:tcMar>
+              <w:top w:w="50" w:type="dxa"/>
+              <w:left w:w="60" w:type="dxa"/>
+              <w:bottom w:w="10" w:type="dxa"/>
+              <w:right w:w="60" w:type="dxa"/>
+            </w:tcMar>
+          </w:tcPr>
+          <w:p>
+            <w:pPr>
+              <w:keepNext/>
+              <w:spacing w:after="0"/>
+              <w:jc w:val="left"/>
+            </w:pPr>
+            <w:r>
+              <w:rPr>
+                <w:rFonts w:ascii="Trade Gothic Next" w:hAnsi="Trade Gothic Next"/>
+                <w:b/>
+                <w:color w:val="14161B"/>
                 <w:sz w:val="21"/>
                 <w:u w:val="none"/>
               </w:rPr>
-              <w:t xml:space="preserve">5   </w:t>
+              <w:t>Phosphorus, P</w:t>
             </w:r>
+            <w:r>
+              <w:rPr>
+                <w:rFonts w:ascii="Trade Gothic Next" w:hAnsi="Trade Gothic Next"/>
+                <w:b w:val="0"/>
+                <w:color w:val="55604F"/>
+                <w:sz w:val="16"/>
+                <w:u w:val="none"/>
+              </w:rPr>
+              <w:t xml:space="preserve">     4 pts: 2 configuration, 2 diagram</w:t>
+            </w:r>
+          </w:p>
+        </w:tc>
+      </w:tr>
+      <w:tr>
+        <w:trPr>
+          <w:cantSplit/>
+        </w:trPr>
+        <w:tc>
+          <w:tcPr>
+            <w:tcW w:type="dxa" w:w="648"/>
+            <w:vMerge/>
+          </w:tcPr>
+          <w:p/>
+        </w:tc>
+        <w:tc>
+          <w:tcPr>
+            <w:tcW w:type="dxa" w:w="2520"/>
+            <w:vAlign w:val="center"/>
+            <w:tcMar>
+              <w:top w:w="40" w:type="dxa"/>
+              <w:left w:w="60" w:type="dxa"/>
+              <w:bottom w:w="40" w:type="dxa"/>
+              <w:right w:w="60" w:type="dxa"/>
+            </w:tcMar>
+          </w:tcPr>
+          <w:p>
+            <w:pPr>
+              <w:keepNext/>
+              <w:spacing w:after="0"/>
+              <w:jc w:val="left"/>
+            </w:pPr>
+            <w:r>
+              <w:rPr>
+                <w:rFonts w:ascii="Trade Gothic Next" w:hAnsi="Trade Gothic Next"/>
+                <w:b/>
+                <w:color w:val="14161B"/>
+                <w:sz w:val="18"/>
+                <w:u w:val="none"/>
+              </w:rPr>
+              <w:t>Electron configuration</w:t>
+            </w:r>
+          </w:p>
+        </w:tc>
+        <w:tc>
+          <w:tcPr>
+            <w:tcW w:type="dxa" w:w="7632"/>
+            <w:vAlign w:val="center"/>
+            <w:tcMar>
+              <w:top w:w="40" w:type="dxa"/>
+              <w:left w:w="60" w:type="dxa"/>
+              <w:bottom w:w="40" w:type="dxa"/>
+              <w:right w:w="60" w:type="dxa"/>
+            </w:tcMar>
+            <w:tcBorders>
+              <w:bottom w:val="single" w:sz="4" w:color="C8CDC2"/>
+            </w:tcBorders>
+          </w:tcPr>
+          <w:p>
+            <w:pPr>
+              <w:spacing w:after="0"/>
+              <w:jc w:val="left"/>
+            </w:pPr>
+          </w:p>
+        </w:tc>
+      </w:tr>
+      <w:tr>
+        <w:trPr>
+          <w:cantSplit/>
+          <w:cantSplit/>
+          <w:trHeight w:val="1224" w:hRule="atLeast"/>
+        </w:trPr>
+        <w:tc>
+          <w:tcPr>
+            <w:tcW w:type="dxa" w:w="648"/>
+            <w:vMerge/>
+          </w:tcPr>
+          <w:p/>
+        </w:tc>
+        <w:tc>
+          <w:tcPr>
+            <w:tcW w:type="dxa" w:w="2520"/>
+            <w:vAlign w:val="center"/>
+            <w:tcMar>
+              <w:top w:w="40" w:type="dxa"/>
+              <w:left w:w="60" w:type="dxa"/>
+              <w:bottom w:w="40" w:type="dxa"/>
+              <w:right w:w="60" w:type="dxa"/>
+            </w:tcMar>
+          </w:tcPr>
+          <w:p>
+            <w:pPr>
+              <w:keepNext w:val="0"/>
+              <w:spacing w:after="0"/>
+              <w:jc w:val="left"/>
+            </w:pPr>
+            <w:r>
+              <w:rPr>
+                <w:rFonts w:ascii="Trade Gothic Next" w:hAnsi="Trade Gothic Next"/>
+                <w:b/>
+                <w:color w:val="14161B"/>
+                <w:sz w:val="18"/>
+                <w:u w:val="none"/>
+              </w:rPr>
+              <w:t>Orbital diagram</w:t>
+            </w:r>
+          </w:p>
+        </w:tc>
+        <w:tc>
+          <w:tcPr>
+            <w:tcW w:type="dxa" w:w="7632"/>
+            <w:vAlign w:val="center"/>
+            <w:tcMar>
+              <w:top w:w="40" w:type="dxa"/>
+              <w:left w:w="60" w:type="dxa"/>
+              <w:bottom w:w="40" w:type="dxa"/>
+              <w:right w:w="60" w:type="dxa"/>
+            </w:tcMar>
+            <w:tcBorders>
+              <w:top w:val="single" w:sz="4" w:color="C8CDC2"/>
+              <w:left w:val="single" w:sz="4" w:color="C8CDC2"/>
+              <w:bottom w:val="single" w:sz="4" w:color="C8CDC2"/>
+              <w:right w:val="single" w:sz="4" w:color="C8CDC2"/>
+            </w:tcBorders>
+          </w:tcPr>
+          <w:p>
+            <w:pPr>
+              <w:spacing w:after="0"/>
+              <w:jc w:val="left"/>
+            </w:pPr>
+          </w:p>
+        </w:tc>
+      </w:tr>
+    </w:tbl>
+    <w:p>
+      <w:pPr>
+        <w:spacing w:before="0" w:after="0" w:line="40" w:lineRule="exact"/>
+      </w:pPr>
+      <w:r>
+        <w:rPr>
+          <w:rFonts w:ascii="Trade Gothic Next" w:hAnsi="Trade Gothic Next"/>
+          <w:sz w:val="2"/>
+        </w:rPr>
+      </w:r>
+    </w:p>
+    <w:p>
+      <w:pPr>
+        <w:spacing w:before="0" w:after="0" w:line="120" w:lineRule="exact"/>
+      </w:pPr>
+      <w:r>
+        <w:rPr>
+          <w:rFonts w:ascii="Trade Gothic Next" w:hAnsi="Trade Gothic Next"/>
+          <w:sz w:val="8"/>
+        </w:rPr>
+      </w:r>
+    </w:p>
+    <w:tbl>
+      <w:tblPr>
+        <w:tblW w:type="auto" w:w="0"/>
+        <w:tblLayout w:type="fixed"/>
+        <w:tblLook w:firstColumn="1" w:firstRow="1" w:lastColumn="0" w:lastRow="0" w:noHBand="0" w:noVBand="1" w:val="04A0"/>
+        <w:tblLayout w:type="fixed"/>
+      </w:tblPr>
+      <w:tblGrid>
+        <w:gridCol w:w="9072"/>
+        <w:gridCol w:w="1728"/>
+      </w:tblGrid>
+      <w:tr>
+        <w:tc>
+          <w:tcPr>
+            <w:tcW w:type="dxa" w:w="9072"/>
+            <w:tcBorders>
+              <w:top w:val="single" w:sz="12" w:color="14161B"/>
+              <w:bottom w:val="single" w:sz="18" w:color="A3E635"/>
+            </w:tcBorders>
+            <w:vAlign w:val="center"/>
+            <w:tcMar>
+              <w:top w:w="30" w:type="dxa"/>
+              <w:left w:w="0" w:type="dxa"/>
+              <w:bottom w:w="30" w:type="dxa"/>
+              <w:right w:w="60" w:type="dxa"/>
+            </w:tcMar>
+          </w:tcPr>
+          <w:p>
+            <w:pPr>
+              <w:keepNext/>
+              <w:spacing w:after="0"/>
+              <w:jc w:val="left"/>
+            </w:pPr>
+            <w:r>
+              <w:rPr>
+                <w:rFonts w:ascii="Trade Gothic Next" w:hAnsi="Trade Gothic Next"/>
+                <w:b/>
+                <w:color w:val="14161B"/>
+                <w:sz w:val="18"/>
+                <w:u w:val="none"/>
+              </w:rPr>
+              <w:t>PART 3  ·  NOBLE-GAS SHORTHAND</w:t>
+            </w:r>
+          </w:p>
+        </w:tc>
+        <w:tc>
+          <w:tcPr>
+            <w:tcW w:type="dxa" w:w="1728"/>
+            <w:tcBorders>
+              <w:top w:val="single" w:sz="12" w:color="14161B"/>
+              <w:bottom w:val="single" w:sz="18" w:color="A3E635"/>
+            </w:tcBorders>
+            <w:vAlign w:val="center"/>
+            <w:tcMar>
+              <w:top w:w="30" w:type="dxa"/>
+              <w:left w:w="60" w:type="dxa"/>
+              <w:bottom w:w="30" w:type="dxa"/>
+              <w:right w:w="60" w:type="dxa"/>
+            </w:tcMar>
+          </w:tcPr>
+          <w:p>
+            <w:pPr>
+              <w:keepNext/>
+              <w:spacing w:after="0"/>
+              <w:jc w:val="right"/>
+            </w:pPr>
+            <w:r>
+              <w:rPr>
+                <w:rFonts w:ascii="Trade Gothic Next" w:hAnsi="Trade Gothic Next"/>
+                <w:b/>
+                <w:color w:val="55604F"/>
+                <w:sz w:val="17"/>
+                <w:u w:val="none"/>
+              </w:rPr>
+              <w:t>4 pts</w:t>
+            </w:r>
+          </w:p>
+        </w:tc>
+      </w:tr>
+    </w:tbl>
+    <w:tbl>
+      <w:tblPr>
+        <w:tblW w:type="auto" w:w="0"/>
+        <w:tblLayout w:type="fixed"/>
+        <w:tblLook w:firstColumn="1" w:firstRow="1" w:lastColumn="0" w:lastRow="0" w:noHBand="0" w:noVBand="1" w:val="04A0"/>
+        <w:tblLayout w:type="fixed"/>
+      </w:tblPr>
+      <w:tblGrid>
+        <w:gridCol w:w="648"/>
+        <w:gridCol w:w="2520"/>
+        <w:gridCol w:w="7632"/>
+      </w:tblGrid>
+      <w:tr>
+        <w:trPr>
+          <w:cantSplit/>
+          <w:trHeight w:val="648" w:hRule="atLeast"/>
+        </w:trPr>
+        <w:tc>
+          <w:tcPr>
+            <w:tcW w:type="dxa" w:w="648"/>
+            <w:vAlign w:val="center"/>
+            <w:tcMar>
+              <w:top w:w="40" w:type="dxa"/>
+              <w:left w:w="60" w:type="dxa"/>
+              <w:bottom w:w="40" w:type="dxa"/>
+              <w:right w:w="60" w:type="dxa"/>
+            </w:tcMar>
+            <w:tcBorders>
+              <w:bottom w:val="single" w:sz="4" w:color="C8CDC2"/>
+            </w:tcBorders>
+          </w:tcPr>
+          <w:p>
+            <w:pPr>
+              <w:spacing w:after="0"/>
+              <w:jc w:val="left"/>
+            </w:pPr>
+            <w:r>
+              <w:rPr>
+                <w:rFonts w:ascii="Trade Gothic Next" w:hAnsi="Trade Gothic Next"/>
+                <w:b/>
+                <w:color w:val="4D730E"/>
+                <w:sz w:val="22"/>
+                <w:u w:val="none"/>
+              </w:rPr>
+              <w:t>8</w:t>
+            </w:r>
+          </w:p>
+        </w:tc>
+        <w:tc>
+          <w:tcPr>
+            <w:tcW w:type="dxa" w:w="2520"/>
+            <w:vAlign w:val="center"/>
+            <w:tcMar>
+              <w:top w:w="40" w:type="dxa"/>
+              <w:left w:w="60" w:type="dxa"/>
+              <w:bottom w:w="40" w:type="dxa"/>
+              <w:right w:w="60" w:type="dxa"/>
+            </w:tcMar>
+            <w:tcBorders>
+              <w:bottom w:val="single" w:sz="4" w:color="C8CDC2"/>
+            </w:tcBorders>
+          </w:tcPr>
+          <w:p>
+            <w:pPr>
+              <w:spacing w:after="0"/>
+              <w:jc w:val="left"/>
+            </w:pPr>
+            <w:r>
+              <w:rPr>
+                <w:rFonts w:ascii="Trade Gothic Next" w:hAnsi="Trade Gothic Next"/>
+                <w:b/>
+                <w:color w:val="14161B"/>
+                <w:sz w:val="21"/>
+                <w:u w:val="none"/>
+              </w:rPr>
+              <w:t>Iron, Fe</w:t>
+            </w:r>
+          </w:p>
+        </w:tc>
+        <w:tc>
+          <w:tcPr>
+            <w:tcW w:type="dxa" w:w="7632"/>
+            <w:vAlign w:val="center"/>
+            <w:tcMar>
+              <w:top w:w="40" w:type="dxa"/>
+              <w:left w:w="60" w:type="dxa"/>
+              <w:bottom w:w="40" w:type="dxa"/>
+              <w:right w:w="60" w:type="dxa"/>
+            </w:tcMar>
+            <w:tcBorders>
+              <w:bottom w:val="single" w:sz="4" w:color="C8CDC2"/>
+            </w:tcBorders>
+          </w:tcPr>
+          <w:p>
+            <w:pPr>
+              <w:spacing w:after="0"/>
+              <w:jc w:val="left"/>
+            </w:pPr>
+          </w:p>
+        </w:tc>
+      </w:tr>
+      <w:tr>
+        <w:trPr>
+          <w:cantSplit/>
+          <w:trHeight w:val="648" w:hRule="atLeast"/>
+        </w:trPr>
+        <w:tc>
+          <w:tcPr>
+            <w:tcW w:type="dxa" w:w="648"/>
+            <w:vAlign w:val="center"/>
+            <w:tcMar>
+              <w:top w:w="40" w:type="dxa"/>
+              <w:left w:w="60" w:type="dxa"/>
+              <w:bottom w:w="40" w:type="dxa"/>
+              <w:right w:w="60" w:type="dxa"/>
+            </w:tcMar>
+            <w:tcBorders>
+              <w:bottom w:val="single" w:sz="4" w:color="C8CDC2"/>
+            </w:tcBorders>
+          </w:tcPr>
+          <w:p>
+            <w:pPr>
+              <w:spacing w:after="0"/>
+              <w:jc w:val="left"/>
+            </w:pPr>
+            <w:r>
+              <w:rPr>
+                <w:rFonts w:ascii="Trade Gothic Next" w:hAnsi="Trade Gothic Next"/>
+                <w:b/>
+                <w:color w:val="4D730E"/>
+                <w:sz w:val="22"/>
+                <w:u w:val="none"/>
+              </w:rPr>
+              <w:t>9</w:t>
+            </w:r>
+          </w:p>
+        </w:tc>
+        <w:tc>
+          <w:tcPr>
+            <w:tcW w:type="dxa" w:w="2520"/>
+            <w:vAlign w:val="center"/>
+            <w:tcMar>
+              <w:top w:w="40" w:type="dxa"/>
+              <w:left w:w="60" w:type="dxa"/>
+              <w:bottom w:w="40" w:type="dxa"/>
+              <w:right w:w="60" w:type="dxa"/>
+            </w:tcMar>
+            <w:tcBorders>
+              <w:bottom w:val="single" w:sz="4" w:color="C8CDC2"/>
+            </w:tcBorders>
+          </w:tcPr>
+          <w:p>
+            <w:pPr>
+              <w:spacing w:after="0"/>
+              <w:jc w:val="left"/>
+            </w:pPr>
+            <w:r>
+              <w:rPr>
+                <w:rFonts w:ascii="Trade Gothic Next" w:hAnsi="Trade Gothic Next"/>
+                <w:b/>
+                <w:color w:val="14161B"/>
+                <w:sz w:val="21"/>
+                <w:u w:val="none"/>
+              </w:rPr>
+              <w:t>Tin, Sn</w:t>
+            </w:r>
+          </w:p>
+        </w:tc>
+        <w:tc>
+          <w:tcPr>
+            <w:tcW w:type="dxa" w:w="7632"/>
+            <w:vAlign w:val="center"/>
+            <w:tcMar>
+              <w:top w:w="40" w:type="dxa"/>
+              <w:left w:w="60" w:type="dxa"/>
+              <w:bottom w:w="40" w:type="dxa"/>
+              <w:right w:w="60" w:type="dxa"/>
+            </w:tcMar>
+            <w:tcBorders>
+              <w:bottom w:val="single" w:sz="4" w:color="C8CDC2"/>
+            </w:tcBorders>
+          </w:tcPr>
+          <w:p>
+            <w:pPr>
+              <w:spacing w:after="0"/>
+              <w:jc w:val="left"/>
+            </w:pPr>
+          </w:p>
+        </w:tc>
+      </w:tr>
+    </w:tbl>
+    <w:p>
+      <w:pPr>
+        <w:spacing w:before="0" w:after="0" w:line="120" w:lineRule="exact"/>
+      </w:pPr>
+      <w:r>
+        <w:rPr>
+          <w:rFonts w:ascii="Trade Gothic Next" w:hAnsi="Trade Gothic Next"/>
+          <w:sz w:val="8"/>
+        </w:rPr>
+      </w:r>
+    </w:p>
+    <w:tbl>
+      <w:tblPr>
+        <w:tblW w:type="auto" w:w="0"/>
+        <w:tblLayout w:type="fixed"/>
+        <w:tblLook w:firstColumn="1" w:firstRow="1" w:lastColumn="0" w:lastRow="0" w:noHBand="0" w:noVBand="1" w:val="04A0"/>
+        <w:tblLayout w:type="fixed"/>
+      </w:tblPr>
+      <w:tblGrid>
+        <w:gridCol w:w="9072"/>
+        <w:gridCol w:w="1728"/>
+      </w:tblGrid>
+      <w:tr>
+        <w:tc>
+          <w:tcPr>
+            <w:tcW w:type="dxa" w:w="9072"/>
+            <w:tcBorders>
+              <w:top w:val="single" w:sz="12" w:color="14161B"/>
+              <w:bottom w:val="single" w:sz="18" w:color="A3E635"/>
+            </w:tcBorders>
+            <w:vAlign w:val="center"/>
+            <w:tcMar>
+              <w:top w:w="30" w:type="dxa"/>
+              <w:left w:w="0" w:type="dxa"/>
+              <w:bottom w:w="30" w:type="dxa"/>
+              <w:right w:w="60" w:type="dxa"/>
+            </w:tcMar>
+          </w:tcPr>
+          <w:p>
+            <w:pPr>
+              <w:keepNext/>
+              <w:spacing w:after="0"/>
+              <w:jc w:val="left"/>
+            </w:pPr>
+            <w:r>
+              <w:rPr>
+                <w:rFonts w:ascii="Trade Gothic Next" w:hAnsi="Trade Gothic Next"/>
+                <w:b/>
+                <w:color w:val="14161B"/>
+                <w:sz w:val="18"/>
+                <w:u w:val="none"/>
+              </w:rPr>
+              <w:t>PART 4  ·  CHARGE OF THE ION EACH ATOM FORMS</w:t>
+            </w:r>
+          </w:p>
+        </w:tc>
+        <w:tc>
+          <w:tcPr>
+            <w:tcW w:type="dxa" w:w="1728"/>
+            <w:tcBorders>
+              <w:top w:val="single" w:sz="12" w:color="14161B"/>
+              <w:bottom w:val="single" w:sz="18" w:color="A3E635"/>
+            </w:tcBorders>
+            <w:vAlign w:val="center"/>
+            <w:tcMar>
+              <w:top w:w="30" w:type="dxa"/>
+              <w:left w:w="60" w:type="dxa"/>
+              <w:bottom w:w="30" w:type="dxa"/>
+              <w:right w:w="60" w:type="dxa"/>
+            </w:tcMar>
+          </w:tcPr>
+          <w:p>
+            <w:pPr>
+              <w:keepNext/>
+              <w:spacing w:after="0"/>
+              <w:jc w:val="right"/>
+            </w:pPr>
+            <w:r>
+              <w:rPr>
+                <w:rFonts w:ascii="Trade Gothic Next" w:hAnsi="Trade Gothic Next"/>
+                <w:b/>
+                <w:color w:val="55604F"/>
+                <w:sz w:val="17"/>
+                <w:u w:val="none"/>
+              </w:rPr>
+              <w:t>4 pts</w:t>
+            </w:r>
+          </w:p>
+        </w:tc>
+      </w:tr>
+    </w:tbl>
+    <w:tbl>
+      <w:tblPr>
+        <w:tblW w:type="auto" w:w="0"/>
+        <w:tblLayout w:type="fixed"/>
+        <w:tblLook w:firstColumn="1" w:firstRow="1" w:lastColumn="0" w:lastRow="0" w:noHBand="0" w:noVBand="1" w:val="04A0"/>
+        <w:tblLayout w:type="fixed"/>
+      </w:tblPr>
+      <w:tblGrid>
+        <w:gridCol w:w="648"/>
+        <w:gridCol w:w="2232"/>
+        <w:gridCol w:w="2520"/>
+        <w:gridCol w:w="648"/>
+        <w:gridCol w:w="2232"/>
+        <w:gridCol w:w="2520"/>
+      </w:tblGrid>
+      <w:tr>
+        <w:trPr>
+          <w:cantSplit/>
+          <w:trHeight w:val="648" w:hRule="atLeast"/>
+          <w:cantSplit/>
+          <w:trHeight w:val="648" w:hRule="atLeast"/>
+        </w:trPr>
+        <w:tc>
+          <w:tcPr>
+            <w:tcW w:type="dxa" w:w="648"/>
+            <w:vAlign w:val="center"/>
+            <w:tcMar>
+              <w:top w:w="40" w:type="dxa"/>
+              <w:left w:w="60" w:type="dxa"/>
+              <w:bottom w:w="40" w:type="dxa"/>
+              <w:right w:w="60" w:type="dxa"/>
+            </w:tcMar>
+            <w:tcBorders>
+              <w:bottom w:val="single" w:sz="4" w:color="C8CDC2"/>
+            </w:tcBorders>
+          </w:tcPr>
+          <w:p>
+            <w:pPr>
+              <w:spacing w:after="0"/>
+              <w:jc w:val="left"/>
+            </w:pPr>
+            <w:r>
+              <w:rPr>
+                <w:rFonts w:ascii="Trade Gothic Next" w:hAnsi="Trade Gothic Next"/>
+                <w:b/>
+                <w:color w:val="4D730E"/>
+                <w:sz w:val="22"/>
+                <w:u w:val="none"/>
+              </w:rPr>
+              <w:t>10</w:t>
+            </w:r>
+          </w:p>
+        </w:tc>
+        <w:tc>
+          <w:tcPr>
+            <w:tcW w:type="dxa" w:w="2232"/>
+            <w:vAlign w:val="center"/>
+            <w:tcMar>
+              <w:top w:w="40" w:type="dxa"/>
+              <w:left w:w="60" w:type="dxa"/>
+              <w:bottom w:w="40" w:type="dxa"/>
+              <w:right w:w="60" w:type="dxa"/>
+            </w:tcMar>
+            <w:tcBorders>
+              <w:bottom w:val="single" w:sz="4" w:color="C8CDC2"/>
+            </w:tcBorders>
+          </w:tcPr>
+          <w:p>
+            <w:pPr>
+              <w:spacing w:after="0"/>
+              <w:jc w:val="left"/>
+            </w:pPr>
             <w:r>
               <w:rPr>
                 <w:rFonts w:ascii="Trade Gothic Next" w:hAnsi="Trade Gothic Next"/>
@@ -1188,85 +2677,89 @@
               </w:rPr>
               <w:t>Sodium, Na</w:t>
             </w:r>
+          </w:p>
+        </w:tc>
+        <w:tc>
+          <w:tcPr>
+            <w:tcW w:type="dxa" w:w="2520"/>
+            <w:vAlign w:val="center"/>
+            <w:tcMar>
+              <w:top w:w="40" w:type="dxa"/>
+              <w:left w:w="60" w:type="dxa"/>
+              <w:bottom w:w="40" w:type="dxa"/>
+              <w:right w:w="60" w:type="dxa"/>
+            </w:tcMar>
+            <w:tcBorders>
+              <w:bottom w:val="single" w:sz="4" w:color="C8CDC2"/>
+            </w:tcBorders>
+          </w:tcPr>
+          <w:p>
+            <w:pPr>
+              <w:spacing w:after="0"/>
+              <w:jc w:val="left"/>
+            </w:pPr>
             <w:r>
               <w:rPr>
                 <w:rFonts w:ascii="Trade Gothic Next" w:hAnsi="Trade Gothic Next"/>
                 <w:b w:val="0"/>
-                <w:sz w:val="18"/>
+                <w:color w:val="55604F"/>
+                <w:sz w:val="17"/>
                 <w:u w:val="none"/>
               </w:rPr>
-              <w:tab/>
-            </w:r>
-            <w:r>
-              <w:rPr>
-                <w:rFonts w:ascii="Trade Gothic Next" w:hAnsi="Trade Gothic Next"/>
-                <w:b/>
-                <w:color w:val="55604F"/>
-                <w:sz w:val="16"/>
-                <w:u w:val="none"/>
-              </w:rPr>
-              <w:t>1 pt</w:t>
-            </w:r>
-          </w:p>
-          <w:p>
-            <w:pPr>
-              <w:spacing w:after="0"/>
-            </w:pPr>
-            <w:r>
-              <w:rPr>
-                <w:rFonts w:ascii="Trade Gothic Next" w:hAnsi="Trade Gothic Next"/>
-                <w:b/>
-                <w:color w:val="14161B"/>
-                <w:sz w:val="18"/>
-                <w:u w:val="none"/>
-              </w:rPr>
-              <w:t xml:space="preserve">Charge of its ion  </w:t>
-            </w:r>
-            <w:r>
-              <w:rPr>
-                <w:rFonts w:ascii="Trade Gothic Next" w:hAnsi="Trade Gothic Next"/>
-                <w:b w:val="0"/>
-                <w:color w:val="14161B"/>
-                <w:sz w:val="20"/>
-                <w:u w:val="none"/>
-              </w:rPr>
-              <w:t>__________</w:t>
+              <w:t xml:space="preserve">charge  </w:t>
             </w:r>
           </w:p>
         </w:tc>
         <w:tc>
           <w:tcPr>
-            <w:tcW w:type="dxa" w:w="5400"/>
-            <w:tcBorders>
-              <w:top w:val="single" w:sz="6" w:color="C8CDC2"/>
-              <w:left w:val="single" w:sz="6" w:color="C8CDC2"/>
-              <w:bottom w:val="single" w:sz="6" w:color="C8CDC2"/>
-              <w:right w:val="single" w:sz="6" w:color="C8CDC2"/>
-            </w:tcBorders>
+            <w:tcW w:type="dxa" w:w="648"/>
+            <w:vAlign w:val="center"/>
             <w:tcMar>
               <w:top w:w="40" w:type="dxa"/>
-              <w:left w:w="80" w:type="dxa"/>
+              <w:left w:w="60" w:type="dxa"/>
               <w:bottom w:w="40" w:type="dxa"/>
-              <w:right w:w="80" w:type="dxa"/>
+              <w:right w:w="60" w:type="dxa"/>
             </w:tcMar>
+            <w:tcBorders>
+              <w:bottom w:val="single" w:sz="4" w:color="C8CDC2"/>
+            </w:tcBorders>
           </w:tcPr>
           <w:p>
             <w:pPr>
-              <w:tabs>
-                <w:tab w:pos="10224" w:val="right"/>
-              </w:tabs>
-              <w:spacing w:after="40"/>
+              <w:spacing w:after="0"/>
+              <w:jc w:val="left"/>
             </w:pPr>
             <w:r>
               <w:rPr>
                 <w:rFonts w:ascii="Trade Gothic Next" w:hAnsi="Trade Gothic Next"/>
                 <w:b/>
                 <w:color w:val="4D730E"/>
-                <w:sz w:val="21"/>
+                <w:sz w:val="22"/>
                 <w:u w:val="none"/>
               </w:rPr>
-              <w:t xml:space="preserve">6   </w:t>
+              <w:t>11</w:t>
             </w:r>
+          </w:p>
+        </w:tc>
+        <w:tc>
+          <w:tcPr>
+            <w:tcW w:type="dxa" w:w="2232"/>
+            <w:vAlign w:val="center"/>
+            <w:tcMar>
+              <w:top w:w="40" w:type="dxa"/>
+              <w:left w:w="60" w:type="dxa"/>
+              <w:bottom w:w="40" w:type="dxa"/>
+              <w:right w:w="60" w:type="dxa"/>
+            </w:tcMar>
+            <w:tcBorders>
+              <w:bottom w:val="single" w:sz="4" w:color="C8CDC2"/>
+            </w:tcBorders>
+          </w:tcPr>
+          <w:p>
+            <w:pPr>
+              <w:spacing w:after="0"/>
+              <w:jc w:val="left"/>
+            </w:pPr>
             <w:r>
               <w:rPr>
                 <w:rFonts w:ascii="Trade Gothic Next" w:hAnsi="Trade Gothic Next"/>
@@ -1277,49 +2770,36 @@
               </w:rPr>
               <w:t>Oxygen, O</w:t>
             </w:r>
+          </w:p>
+        </w:tc>
+        <w:tc>
+          <w:tcPr>
+            <w:tcW w:type="dxa" w:w="2520"/>
+            <w:vAlign w:val="center"/>
+            <w:tcMar>
+              <w:top w:w="40" w:type="dxa"/>
+              <w:left w:w="60" w:type="dxa"/>
+              <w:bottom w:w="40" w:type="dxa"/>
+              <w:right w:w="60" w:type="dxa"/>
+            </w:tcMar>
+            <w:tcBorders>
+              <w:bottom w:val="single" w:sz="4" w:color="C8CDC2"/>
+            </w:tcBorders>
+          </w:tcPr>
+          <w:p>
+            <w:pPr>
+              <w:spacing w:after="0"/>
+              <w:jc w:val="left"/>
+            </w:pPr>
             <w:r>
               <w:rPr>
                 <w:rFonts w:ascii="Trade Gothic Next" w:hAnsi="Trade Gothic Next"/>
                 <w:b w:val="0"/>
-                <w:sz w:val="18"/>
+                <w:color w:val="55604F"/>
+                <w:sz w:val="17"/>
                 <w:u w:val="none"/>
               </w:rPr>
-              <w:tab/>
-            </w:r>
-            <w:r>
-              <w:rPr>
-                <w:rFonts w:ascii="Trade Gothic Next" w:hAnsi="Trade Gothic Next"/>
-                <w:b/>
-                <w:color w:val="55604F"/>
-                <w:sz w:val="16"/>
-                <w:u w:val="none"/>
-              </w:rPr>
-              <w:t>1 pt</w:t>
-            </w:r>
-          </w:p>
-          <w:p>
-            <w:pPr>
-              <w:spacing w:after="0"/>
-            </w:pPr>
-            <w:r>
-              <w:rPr>
-                <w:rFonts w:ascii="Trade Gothic Next" w:hAnsi="Trade Gothic Next"/>
-                <w:b/>
-                <w:color w:val="14161B"/>
-                <w:sz w:val="18"/>
-                <w:u w:val="none"/>
-              </w:rPr>
-              <w:t xml:space="preserve">Charge of its ion  </w:t>
-            </w:r>
-            <w:r>
-              <w:rPr>
-                <w:rFonts w:ascii="Trade Gothic Next" w:hAnsi="Trade Gothic Next"/>
-                <w:b w:val="0"/>
-                <w:color w:val="14161B"/>
-                <w:sz w:val="20"/>
-                <w:u w:val="none"/>
-              </w:rPr>
-              <w:t>__________</w:t>
+              <w:t xml:space="preserve">charge  </w:t>
             </w:r>
           </w:p>
         </w:tc>
@@ -1327,43 +2807,60 @@
       <w:tr>
         <w:trPr>
           <w:cantSplit/>
-          <w:trHeight w:val="892" w:hRule="atLeast"/>
+          <w:trHeight w:val="648" w:hRule="atLeast"/>
           <w:cantSplit/>
-          <w:trHeight w:val="892" w:hRule="atLeast"/>
+          <w:trHeight w:val="648" w:hRule="atLeast"/>
         </w:trPr>
         <w:tc>
           <w:tcPr>
-            <w:tcW w:type="dxa" w:w="5400"/>
-            <w:tcBorders>
-              <w:top w:val="single" w:sz="6" w:color="C8CDC2"/>
-              <w:left w:val="single" w:sz="6" w:color="C8CDC2"/>
-              <w:bottom w:val="single" w:sz="6" w:color="C8CDC2"/>
-              <w:right w:val="single" w:sz="6" w:color="C8CDC2"/>
-            </w:tcBorders>
+            <w:tcW w:type="dxa" w:w="648"/>
+            <w:vAlign w:val="center"/>
             <w:tcMar>
               <w:top w:w="40" w:type="dxa"/>
-              <w:left w:w="80" w:type="dxa"/>
+              <w:left w:w="60" w:type="dxa"/>
               <w:bottom w:w="40" w:type="dxa"/>
-              <w:right w:w="80" w:type="dxa"/>
+              <w:right w:w="60" w:type="dxa"/>
             </w:tcMar>
+            <w:tcBorders>
+              <w:bottom w:val="single" w:sz="4" w:color="C8CDC2"/>
+            </w:tcBorders>
           </w:tcPr>
           <w:p>
             <w:pPr>
-              <w:tabs>
-                <w:tab w:pos="10224" w:val="right"/>
-              </w:tabs>
-              <w:spacing w:after="40"/>
+              <w:spacing w:after="0"/>
+              <w:jc w:val="left"/>
             </w:pPr>
             <w:r>
               <w:rPr>
                 <w:rFonts w:ascii="Trade Gothic Next" w:hAnsi="Trade Gothic Next"/>
                 <w:b/>
                 <w:color w:val="4D730E"/>
-                <w:sz w:val="21"/>
+                <w:sz w:val="22"/>
                 <w:u w:val="none"/>
               </w:rPr>
-              <w:t xml:space="preserve">7   </w:t>
+              <w:t>12</w:t>
             </w:r>
+          </w:p>
+        </w:tc>
+        <w:tc>
+          <w:tcPr>
+            <w:tcW w:type="dxa" w:w="2232"/>
+            <w:vAlign w:val="center"/>
+            <w:tcMar>
+              <w:top w:w="40" w:type="dxa"/>
+              <w:left w:w="60" w:type="dxa"/>
+              <w:bottom w:w="40" w:type="dxa"/>
+              <w:right w:w="60" w:type="dxa"/>
+            </w:tcMar>
+            <w:tcBorders>
+              <w:bottom w:val="single" w:sz="4" w:color="C8CDC2"/>
+            </w:tcBorders>
+          </w:tcPr>
+          <w:p>
+            <w:pPr>
+              <w:spacing w:after="0"/>
+              <w:jc w:val="left"/>
+            </w:pPr>
             <w:r>
               <w:rPr>
                 <w:rFonts w:ascii="Trade Gothic Next" w:hAnsi="Trade Gothic Next"/>
@@ -1374,85 +2871,89 @@
               </w:rPr>
               <w:t>Magnesium, Mg</w:t>
             </w:r>
+          </w:p>
+        </w:tc>
+        <w:tc>
+          <w:tcPr>
+            <w:tcW w:type="dxa" w:w="2520"/>
+            <w:vAlign w:val="center"/>
+            <w:tcMar>
+              <w:top w:w="40" w:type="dxa"/>
+              <w:left w:w="60" w:type="dxa"/>
+              <w:bottom w:w="40" w:type="dxa"/>
+              <w:right w:w="60" w:type="dxa"/>
+            </w:tcMar>
+            <w:tcBorders>
+              <w:bottom w:val="single" w:sz="4" w:color="C8CDC2"/>
+            </w:tcBorders>
+          </w:tcPr>
+          <w:p>
+            <w:pPr>
+              <w:spacing w:after="0"/>
+              <w:jc w:val="left"/>
+            </w:pPr>
             <w:r>
               <w:rPr>
                 <w:rFonts w:ascii="Trade Gothic Next" w:hAnsi="Trade Gothic Next"/>
                 <w:b w:val="0"/>
-                <w:sz w:val="18"/>
+                <w:color w:val="55604F"/>
+                <w:sz w:val="17"/>
                 <w:u w:val="none"/>
               </w:rPr>
-              <w:tab/>
-            </w:r>
-            <w:r>
-              <w:rPr>
-                <w:rFonts w:ascii="Trade Gothic Next" w:hAnsi="Trade Gothic Next"/>
-                <w:b/>
-                <w:color w:val="55604F"/>
-                <w:sz w:val="16"/>
-                <w:u w:val="none"/>
-              </w:rPr>
-              <w:t>1 pt</w:t>
-            </w:r>
-          </w:p>
-          <w:p>
-            <w:pPr>
-              <w:spacing w:after="0"/>
-            </w:pPr>
-            <w:r>
-              <w:rPr>
-                <w:rFonts w:ascii="Trade Gothic Next" w:hAnsi="Trade Gothic Next"/>
-                <w:b/>
-                <w:color w:val="14161B"/>
-                <w:sz w:val="18"/>
-                <w:u w:val="none"/>
-              </w:rPr>
-              <w:t xml:space="preserve">Charge of its ion  </w:t>
-            </w:r>
-            <w:r>
-              <w:rPr>
-                <w:rFonts w:ascii="Trade Gothic Next" w:hAnsi="Trade Gothic Next"/>
-                <w:b w:val="0"/>
-                <w:color w:val="14161B"/>
-                <w:sz w:val="20"/>
-                <w:u w:val="none"/>
-              </w:rPr>
-              <w:t>__________</w:t>
+              <w:t xml:space="preserve">charge  </w:t>
             </w:r>
           </w:p>
         </w:tc>
         <w:tc>
           <w:tcPr>
-            <w:tcW w:type="dxa" w:w="5400"/>
-            <w:tcBorders>
-              <w:top w:val="single" w:sz="6" w:color="C8CDC2"/>
-              <w:left w:val="single" w:sz="6" w:color="C8CDC2"/>
-              <w:bottom w:val="single" w:sz="6" w:color="C8CDC2"/>
-              <w:right w:val="single" w:sz="6" w:color="C8CDC2"/>
-            </w:tcBorders>
+            <w:tcW w:type="dxa" w:w="648"/>
+            <w:vAlign w:val="center"/>
             <w:tcMar>
               <w:top w:w="40" w:type="dxa"/>
-              <w:left w:w="80" w:type="dxa"/>
+              <w:left w:w="60" w:type="dxa"/>
               <w:bottom w:w="40" w:type="dxa"/>
-              <w:right w:w="80" w:type="dxa"/>
+              <w:right w:w="60" w:type="dxa"/>
             </w:tcMar>
+            <w:tcBorders>
+              <w:bottom w:val="single" w:sz="4" w:color="C8CDC2"/>
+            </w:tcBorders>
           </w:tcPr>
           <w:p>
             <w:pPr>
-              <w:tabs>
-                <w:tab w:pos="10224" w:val="right"/>
-              </w:tabs>
-              <w:spacing w:after="40"/>
+              <w:spacing w:after="0"/>
+              <w:jc w:val="left"/>
             </w:pPr>
             <w:r>
               <w:rPr>
                 <w:rFonts w:ascii="Trade Gothic Next" w:hAnsi="Trade Gothic Next"/>
                 <w:b/>
                 <w:color w:val="4D730E"/>
-                <w:sz w:val="21"/>
+                <w:sz w:val="22"/>
                 <w:u w:val="none"/>
               </w:rPr>
-              <w:t xml:space="preserve">8   </w:t>
+              <w:t>13</w:t>
             </w:r>
+          </w:p>
+        </w:tc>
+        <w:tc>
+          <w:tcPr>
+            <w:tcW w:type="dxa" w:w="2232"/>
+            <w:vAlign w:val="center"/>
+            <w:tcMar>
+              <w:top w:w="40" w:type="dxa"/>
+              <w:left w:w="60" w:type="dxa"/>
+              <w:bottom w:w="40" w:type="dxa"/>
+              <w:right w:w="60" w:type="dxa"/>
+            </w:tcMar>
+            <w:tcBorders>
+              <w:bottom w:val="single" w:sz="4" w:color="C8CDC2"/>
+            </w:tcBorders>
+          </w:tcPr>
+          <w:p>
+            <w:pPr>
+              <w:spacing w:after="0"/>
+              <w:jc w:val="left"/>
+            </w:pPr>
             <w:r>
               <w:rPr>
                 <w:rFonts w:ascii="Trade Gothic Next" w:hAnsi="Trade Gothic Next"/>
@@ -1463,49 +2964,36 @@
               </w:rPr>
               <w:t>Chlorine, Cl</w:t>
             </w:r>
+          </w:p>
+        </w:tc>
+        <w:tc>
+          <w:tcPr>
+            <w:tcW w:type="dxa" w:w="2520"/>
+            <w:vAlign w:val="center"/>
+            <w:tcMar>
+              <w:top w:w="40" w:type="dxa"/>
+              <w:left w:w="60" w:type="dxa"/>
+              <w:bottom w:w="40" w:type="dxa"/>
+              <w:right w:w="60" w:type="dxa"/>
+            </w:tcMar>
+            <w:tcBorders>
+              <w:bottom w:val="single" w:sz="4" w:color="C8CDC2"/>
+            </w:tcBorders>
+          </w:tcPr>
+          <w:p>
+            <w:pPr>
+              <w:spacing w:after="0"/>
+              <w:jc w:val="left"/>
+            </w:pPr>
             <w:r>
               <w:rPr>
                 <w:rFonts w:ascii="Trade Gothic Next" w:hAnsi="Trade Gothic Next"/>
                 <w:b w:val="0"/>
-                <w:sz w:val="18"/>
+                <w:color w:val="55604F"/>
+                <w:sz w:val="17"/>
                 <w:u w:val="none"/>
               </w:rPr>
-              <w:tab/>
-            </w:r>
-            <w:r>
-              <w:rPr>
-                <w:rFonts w:ascii="Trade Gothic Next" w:hAnsi="Trade Gothic Next"/>
-                <w:b/>
-                <w:color w:val="55604F"/>
-                <w:sz w:val="16"/>
-                <w:u w:val="none"/>
-              </w:rPr>
-              <w:t>1 pt</w:t>
-            </w:r>
-          </w:p>
-          <w:p>
-            <w:pPr>
-              <w:spacing w:after="0"/>
-            </w:pPr>
-            <w:r>
-              <w:rPr>
-                <w:rFonts w:ascii="Trade Gothic Next" w:hAnsi="Trade Gothic Next"/>
-                <w:b/>
-                <w:color w:val="14161B"/>
-                <w:sz w:val="18"/>
-                <w:u w:val="none"/>
-              </w:rPr>
-              <w:t xml:space="preserve">Charge of its ion  </w:t>
-            </w:r>
-            <w:r>
-              <w:rPr>
-                <w:rFonts w:ascii="Trade Gothic Next" w:hAnsi="Trade Gothic Next"/>
-                <w:b w:val="0"/>
-                <w:color w:val="14161B"/>
-                <w:sz w:val="20"/>
-                <w:u w:val="none"/>
-              </w:rPr>
-              <w:t>__________</w:t>
+              <w:t xml:space="preserve">charge  </w:t>
             </w:r>
           </w:p>
         </w:tc>

</xml_diff>

<commit_message>
Quiz rebuilt to Matt's spec: 3 MC, 2 longhand with diagrams, 2 shorthand, 4 ions (two +, two -) with cation/anion; element tiles; overseer review fixes
Study guide items swapped so no quiz element repeats (Kr, Si, Ba, O, Rb, F).

Co-Authored-By: Claude Opus 5.5 <noreply@anthropic.com>
Claude-Session: https://claude.ai/code/session_01LaT1EarAMnh5opQoFahNzN
</commit_message>
<xml_diff>
--- a/output/chem-u02/Unit 2 Quiz A.docx
+++ b/output/chem-u02/Unit 2 Quiz A.docx
@@ -202,7 +202,7 @@
                 <w:sz w:val="15"/>
                 <w:u w:val="none"/>
               </w:rPr>
-              <w:t>SCORE  / 21</w:t>
+              <w:t>SCORE  / 23</w:t>
             </w:r>
           </w:p>
         </w:tc>
@@ -239,9 +239,9 @@
             </w:tcBorders>
             <w:vAlign w:val="center"/>
             <w:tcMar>
-              <w:top w:w="30" w:type="dxa"/>
+              <w:top w:w="20" w:type="dxa"/>
               <w:left w:w="60" w:type="dxa"/>
-              <w:bottom w:w="30" w:type="dxa"/>
+              <w:bottom w:w="20" w:type="dxa"/>
               <w:right w:w="60" w:type="dxa"/>
             </w:tcMar>
           </w:tcPr>
@@ -258,7 +258,7 @@
                 <w:sz w:val="19"/>
                 <w:u w:val="none"/>
               </w:rPr>
-              <w:t>You may use your periodic table. Circle one letter for each multiple-choice question. Draw an arrow for every electron in the orbital diagrams.</w:t>
+              <w:t>Use your periodic table.  Circle one letter for each multiple-choice question.  Draw an arrow for every electron.</w:t>
             </w:r>
           </w:p>
         </w:tc>
@@ -349,7 +349,7 @@
                 <w:sz w:val="17"/>
                 <w:u w:val="none"/>
               </w:rPr>
-              <w:t>5 pts</w:t>
+              <w:t>3 pts</w:t>
             </w:r>
           </w:p>
         </w:tc>
@@ -380,17 +380,13 @@
             <w:vAlign w:val="center"/>
             <w:tcMar>
               <w:top w:w="40" w:type="dxa"/>
-              <w:left w:w="60" w:type="dxa"/>
+              <w:left w:w="20" w:type="dxa"/>
               <w:bottom w:w="40" w:type="dxa"/>
-              <w:right w:w="60" w:type="dxa"/>
+              <w:right w:w="20" w:type="dxa"/>
             </w:tcMar>
-            <w:tcBorders>
-              <w:bottom w:val="single" w:sz="4" w:color="C8CDC2"/>
-            </w:tcBorders>
           </w:tcPr>
           <w:p>
             <w:pPr>
-              <w:keepNext/>
               <w:spacing w:after="0"/>
               <w:jc w:val="left"/>
             </w:pPr>
@@ -399,7 +395,7 @@
                 <w:rFonts w:ascii="Trade Gothic Next" w:hAnsi="Trade Gothic Next"/>
                 <w:b/>
                 <w:color w:val="4D730E"/>
-                <w:sz w:val="22"/>
+                <w:sz w:val="26"/>
                 <w:u w:val="none"/>
               </w:rPr>
               <w:t>1</w:t>
@@ -414,7 +410,7 @@
             <w:tcMar>
               <w:top w:w="50" w:type="dxa"/>
               <w:left w:w="60" w:type="dxa"/>
-              <w:bottom w:w="20" w:type="dxa"/>
+              <w:bottom w:w="10" w:type="dxa"/>
               <w:right w:w="60" w:type="dxa"/>
             </w:tcMar>
           </w:tcPr>
@@ -429,7 +425,7 @@
                 <w:rFonts w:ascii="Trade Gothic Next" w:hAnsi="Trade Gothic Next"/>
                 <w:b/>
                 <w:color w:val="14161B"/>
-                <w:sz w:val="20"/>
+                <w:sz w:val="21"/>
                 <w:u w:val="none"/>
               </w:rPr>
               <w:t>Which rule says electrons fill the lowest-energy sublevel first?</w:t>
@@ -453,14 +449,11 @@
             <w:tcW w:type="dxa" w:w="2534"/>
             <w:vAlign w:val="center"/>
             <w:tcMar>
-              <w:top w:w="20" w:type="dxa"/>
+              <w:top w:w="10" w:type="dxa"/>
               <w:left w:w="60" w:type="dxa"/>
-              <w:bottom w:w="60" w:type="dxa"/>
+              <w:bottom w:w="50" w:type="dxa"/>
               <w:right w:w="60" w:type="dxa"/>
             </w:tcMar>
-            <w:tcBorders>
-              <w:bottom w:val="single" w:sz="4" w:color="C8CDC2"/>
-            </w:tcBorders>
           </w:tcPr>
           <w:p>
             <w:pPr>
@@ -472,7 +465,7 @@
                 <w:rFonts w:ascii="Trade Gothic Next" w:hAnsi="Trade Gothic Next"/>
                 <w:b/>
                 <w:color w:val="4D730E"/>
-                <w:sz w:val="20"/>
+                <w:sz w:val="21"/>
                 <w:u w:val="none"/>
               </w:rPr>
               <w:t xml:space="preserve">A   </w:t>
@@ -482,7 +475,7 @@
                 <w:rFonts w:ascii="Trade Gothic Next" w:hAnsi="Trade Gothic Next"/>
                 <w:b w:val="0"/>
                 <w:color w:val="14161B"/>
-                <w:sz w:val="20"/>
+                <w:sz w:val="21"/>
                 <w:u w:val="none"/>
               </w:rPr>
               <w:t>Aufbau principle</w:t>
@@ -494,14 +487,11 @@
             <w:tcW w:type="dxa" w:w="2534"/>
             <w:vAlign w:val="center"/>
             <w:tcMar>
-              <w:top w:w="20" w:type="dxa"/>
+              <w:top w:w="10" w:type="dxa"/>
               <w:left w:w="60" w:type="dxa"/>
-              <w:bottom w:w="60" w:type="dxa"/>
+              <w:bottom w:w="50" w:type="dxa"/>
               <w:right w:w="60" w:type="dxa"/>
             </w:tcMar>
-            <w:tcBorders>
-              <w:bottom w:val="single" w:sz="4" w:color="C8CDC2"/>
-            </w:tcBorders>
           </w:tcPr>
           <w:p>
             <w:pPr>
@@ -513,7 +503,7 @@
                 <w:rFonts w:ascii="Trade Gothic Next" w:hAnsi="Trade Gothic Next"/>
                 <w:b/>
                 <w:color w:val="4D730E"/>
-                <w:sz w:val="20"/>
+                <w:sz w:val="21"/>
                 <w:u w:val="none"/>
               </w:rPr>
               <w:t xml:space="preserve">B   </w:t>
@@ -523,7 +513,7 @@
                 <w:rFonts w:ascii="Trade Gothic Next" w:hAnsi="Trade Gothic Next"/>
                 <w:b w:val="0"/>
                 <w:color w:val="14161B"/>
-                <w:sz w:val="20"/>
+                <w:sz w:val="21"/>
                 <w:u w:val="none"/>
               </w:rPr>
               <w:t>Pauli exclusion</w:t>
@@ -535,14 +525,11 @@
             <w:tcW w:type="dxa" w:w="2534"/>
             <w:vAlign w:val="center"/>
             <w:tcMar>
-              <w:top w:w="20" w:type="dxa"/>
+              <w:top w:w="10" w:type="dxa"/>
               <w:left w:w="60" w:type="dxa"/>
-              <w:bottom w:w="60" w:type="dxa"/>
+              <w:bottom w:w="50" w:type="dxa"/>
               <w:right w:w="60" w:type="dxa"/>
             </w:tcMar>
-            <w:tcBorders>
-              <w:bottom w:val="single" w:sz="4" w:color="C8CDC2"/>
-            </w:tcBorders>
           </w:tcPr>
           <w:p>
             <w:pPr>
@@ -554,7 +541,7 @@
                 <w:rFonts w:ascii="Trade Gothic Next" w:hAnsi="Trade Gothic Next"/>
                 <w:b/>
                 <w:color w:val="4D730E"/>
-                <w:sz w:val="20"/>
+                <w:sz w:val="21"/>
                 <w:u w:val="none"/>
               </w:rPr>
               <w:t xml:space="preserve">C   </w:t>
@@ -564,7 +551,7 @@
                 <w:rFonts w:ascii="Trade Gothic Next" w:hAnsi="Trade Gothic Next"/>
                 <w:b w:val="0"/>
                 <w:color w:val="14161B"/>
-                <w:sz w:val="20"/>
+                <w:sz w:val="21"/>
                 <w:u w:val="none"/>
               </w:rPr>
               <w:t>Hund's rule</w:t>
@@ -576,14 +563,11 @@
             <w:tcW w:type="dxa" w:w="2549"/>
             <w:vAlign w:val="center"/>
             <w:tcMar>
-              <w:top w:w="20" w:type="dxa"/>
+              <w:top w:w="10" w:type="dxa"/>
               <w:left w:w="60" w:type="dxa"/>
-              <w:bottom w:w="60" w:type="dxa"/>
+              <w:bottom w:w="50" w:type="dxa"/>
               <w:right w:w="60" w:type="dxa"/>
             </w:tcMar>
-            <w:tcBorders>
-              <w:bottom w:val="single" w:sz="4" w:color="C8CDC2"/>
-            </w:tcBorders>
           </w:tcPr>
           <w:p>
             <w:pPr>
@@ -595,7 +579,7 @@
                 <w:rFonts w:ascii="Trade Gothic Next" w:hAnsi="Trade Gothic Next"/>
                 <w:b/>
                 <w:color w:val="4D730E"/>
-                <w:sz w:val="20"/>
+                <w:sz w:val="21"/>
                 <w:u w:val="none"/>
               </w:rPr>
               <w:t xml:space="preserve">D   </w:t>
@@ -605,7 +589,7 @@
                 <w:rFonts w:ascii="Trade Gothic Next" w:hAnsi="Trade Gothic Next"/>
                 <w:b w:val="0"/>
                 <w:color w:val="14161B"/>
-                <w:sz w:val="20"/>
+                <w:sz w:val="21"/>
                 <w:u w:val="none"/>
               </w:rPr>
               <w:t>Bohr model</w:t>
@@ -639,17 +623,13 @@
             <w:vAlign w:val="center"/>
             <w:tcMar>
               <w:top w:w="40" w:type="dxa"/>
-              <w:left w:w="60" w:type="dxa"/>
+              <w:left w:w="20" w:type="dxa"/>
               <w:bottom w:w="40" w:type="dxa"/>
-              <w:right w:w="60" w:type="dxa"/>
+              <w:right w:w="20" w:type="dxa"/>
             </w:tcMar>
-            <w:tcBorders>
-              <w:bottom w:val="single" w:sz="4" w:color="C8CDC2"/>
-            </w:tcBorders>
           </w:tcPr>
           <w:p>
             <w:pPr>
-              <w:keepNext/>
               <w:spacing w:after="0"/>
               <w:jc w:val="left"/>
             </w:pPr>
@@ -658,7 +638,7 @@
                 <w:rFonts w:ascii="Trade Gothic Next" w:hAnsi="Trade Gothic Next"/>
                 <w:b/>
                 <w:color w:val="4D730E"/>
-                <w:sz w:val="22"/>
+                <w:sz w:val="26"/>
                 <w:u w:val="none"/>
               </w:rPr>
               <w:t>2</w:t>
@@ -673,7 +653,7 @@
             <w:tcMar>
               <w:top w:w="50" w:type="dxa"/>
               <w:left w:w="60" w:type="dxa"/>
-              <w:bottom w:w="20" w:type="dxa"/>
+              <w:bottom w:w="10" w:type="dxa"/>
               <w:right w:w="60" w:type="dxa"/>
             </w:tcMar>
           </w:tcPr>
@@ -688,7 +668,7 @@
                 <w:rFonts w:ascii="Trade Gothic Next" w:hAnsi="Trade Gothic Next"/>
                 <w:b/>
                 <w:color w:val="14161B"/>
-                <w:sz w:val="20"/>
+                <w:sz w:val="21"/>
                 <w:u w:val="none"/>
               </w:rPr>
               <w:t>Which orbital diagram for nitrogen's 2p</w:t>
@@ -698,7 +678,7 @@
                 <w:rFonts w:ascii="Trade Gothic Next" w:hAnsi="Trade Gothic Next"/>
                 <w:b/>
                 <w:color w:val="14161B"/>
-                <w:sz w:val="20"/>
+                <w:sz w:val="21"/>
                 <w:u w:val="none"/>
                 <w:vertAlign w:val="superscript"/>
               </w:rPr>
@@ -709,7 +689,7 @@
                 <w:rFonts w:ascii="Trade Gothic Next" w:hAnsi="Trade Gothic Next"/>
                 <w:b/>
                 <w:color w:val="14161B"/>
-                <w:sz w:val="20"/>
+                <w:sz w:val="21"/>
                 <w:u w:val="none"/>
               </w:rPr>
               <w:t xml:space="preserve"> follows Hund's rule?</w:t>
@@ -733,14 +713,11 @@
             <w:tcW w:type="dxa" w:w="2534"/>
             <w:vAlign w:val="center"/>
             <w:tcMar>
-              <w:top w:w="20" w:type="dxa"/>
+              <w:top w:w="10" w:type="dxa"/>
               <w:left w:w="60" w:type="dxa"/>
-              <w:bottom w:w="60" w:type="dxa"/>
+              <w:bottom w:w="50" w:type="dxa"/>
               <w:right w:w="60" w:type="dxa"/>
             </w:tcMar>
-            <w:tcBorders>
-              <w:bottom w:val="single" w:sz="4" w:color="C8CDC2"/>
-            </w:tcBorders>
           </w:tcPr>
           <w:p>
             <w:pPr>
@@ -752,21 +729,127 @@
                 <w:rFonts w:ascii="Trade Gothic Next" w:hAnsi="Trade Gothic Next"/>
                 <w:b/>
                 <w:color w:val="4D730E"/>
-                <w:sz w:val="20"/>
+                <w:sz w:val="21"/>
                 <w:u w:val="none"/>
               </w:rPr>
               <w:t xml:space="preserve">A   </w:t>
             </w:r>
-            <w:r>
-              <w:rPr>
-                <w:rFonts w:ascii="Trade Gothic Next" w:hAnsi="Trade Gothic Next"/>
-                <w:b w:val="0"/>
-                <w:color w:val="14161B"/>
-                <w:sz w:val="20"/>
-                <w:u w:val="none"/>
-              </w:rPr>
-              <w:t>[↑↓] [↑] [   ]</w:t>
-            </w:r>
+          </w:p>
+          <w:tbl>
+            <w:tblPr>
+              <w:tblW w:type="auto" w:w="0"/>
+              <w:tblLayout w:type="fixed"/>
+              <w:tblLook w:firstColumn="1" w:firstRow="1" w:lastColumn="0" w:lastRow="0" w:noHBand="0" w:noVBand="1" w:val="04A0"/>
+              <w:tblLayout w:type="fixed"/>
+            </w:tblPr>
+            <w:tblGrid>
+              <w:gridCol w:w="432"/>
+              <w:gridCol w:w="432"/>
+              <w:gridCol w:w="432"/>
+            </w:tblGrid>
+            <w:tr>
+              <w:trPr>
+                <w:cantSplit/>
+                <w:trHeight w:val="388" w:hRule="atLeast"/>
+              </w:trPr>
+              <w:tc>
+                <w:tcPr>
+                  <w:tcW w:type="dxa" w:w="432"/>
+                  <w:tcBorders>
+                    <w:top w:val="single" w:sz="6" w:color="14161B"/>
+                    <w:left w:val="single" w:sz="6" w:color="14161B"/>
+                    <w:bottom w:val="single" w:sz="6" w:color="14161B"/>
+                    <w:right w:val="single" w:sz="6" w:color="14161B"/>
+                  </w:tcBorders>
+                  <w:vAlign w:val="center"/>
+                  <w:tcMar>
+                    <w:top w:w="0" w:type="dxa"/>
+                    <w:left w:w="0" w:type="dxa"/>
+                    <w:bottom w:w="0" w:type="dxa"/>
+                    <w:right w:w="0" w:type="dxa"/>
+                  </w:tcMar>
+                </w:tcPr>
+                <w:p>
+                  <w:pPr>
+                    <w:spacing w:after="0"/>
+                    <w:jc w:val="center"/>
+                  </w:pPr>
+                  <w:r>
+                    <w:rPr>
+                      <w:rFonts w:ascii="Trade Gothic Next" w:hAnsi="Trade Gothic Next"/>
+                      <w:b/>
+                      <w:color w:val="14161B"/>
+                      <w:sz w:val="21"/>
+                      <w:u w:val="none"/>
+                    </w:rPr>
+                    <w:t>↑↓</w:t>
+                  </w:r>
+                </w:p>
+              </w:tc>
+              <w:tc>
+                <w:tcPr>
+                  <w:tcW w:type="dxa" w:w="432"/>
+                  <w:tcBorders>
+                    <w:top w:val="single" w:sz="6" w:color="14161B"/>
+                    <w:left w:val="single" w:sz="6" w:color="14161B"/>
+                    <w:bottom w:val="single" w:sz="6" w:color="14161B"/>
+                    <w:right w:val="single" w:sz="6" w:color="14161B"/>
+                  </w:tcBorders>
+                  <w:vAlign w:val="center"/>
+                  <w:tcMar>
+                    <w:top w:w="0" w:type="dxa"/>
+                    <w:left w:w="0" w:type="dxa"/>
+                    <w:bottom w:w="0" w:type="dxa"/>
+                    <w:right w:w="0" w:type="dxa"/>
+                  </w:tcMar>
+                </w:tcPr>
+                <w:p>
+                  <w:pPr>
+                    <w:spacing w:after="0"/>
+                    <w:jc w:val="center"/>
+                  </w:pPr>
+                  <w:r>
+                    <w:rPr>
+                      <w:rFonts w:ascii="Trade Gothic Next" w:hAnsi="Trade Gothic Next"/>
+                      <w:b/>
+                      <w:color w:val="14161B"/>
+                      <w:sz w:val="21"/>
+                      <w:u w:val="none"/>
+                    </w:rPr>
+                    <w:t>↑</w:t>
+                  </w:r>
+                </w:p>
+              </w:tc>
+              <w:tc>
+                <w:tcPr>
+                  <w:tcW w:type="dxa" w:w="432"/>
+                  <w:tcBorders>
+                    <w:top w:val="single" w:sz="6" w:color="14161B"/>
+                    <w:left w:val="single" w:sz="6" w:color="14161B"/>
+                    <w:bottom w:val="single" w:sz="6" w:color="14161B"/>
+                    <w:right w:val="single" w:sz="6" w:color="14161B"/>
+                  </w:tcBorders>
+                  <w:vAlign w:val="center"/>
+                  <w:tcMar>
+                    <w:top w:w="0" w:type="dxa"/>
+                    <w:left w:w="0" w:type="dxa"/>
+                    <w:bottom w:w="0" w:type="dxa"/>
+                    <w:right w:w="0" w:type="dxa"/>
+                  </w:tcMar>
+                </w:tcPr>
+                <w:p>
+                  <w:pPr>
+                    <w:spacing w:after="0"/>
+                    <w:jc w:val="center"/>
+                  </w:pPr>
+                </w:p>
+              </w:tc>
+            </w:tr>
+          </w:tbl>
+          <w:p>
+            <w:pPr>
+              <w:spacing w:before="0" w:after="0" w:line="20" w:lineRule="exact"/>
+            </w:pPr>
           </w:p>
         </w:tc>
         <w:tc>
@@ -774,14 +857,11 @@
             <w:tcW w:type="dxa" w:w="2534"/>
             <w:vAlign w:val="center"/>
             <w:tcMar>
-              <w:top w:w="20" w:type="dxa"/>
+              <w:top w:w="10" w:type="dxa"/>
               <w:left w:w="60" w:type="dxa"/>
-              <w:bottom w:w="60" w:type="dxa"/>
+              <w:bottom w:w="50" w:type="dxa"/>
               <w:right w:w="60" w:type="dxa"/>
             </w:tcMar>
-            <w:tcBorders>
-              <w:bottom w:val="single" w:sz="4" w:color="C8CDC2"/>
-            </w:tcBorders>
           </w:tcPr>
           <w:p>
             <w:pPr>
@@ -793,21 +873,137 @@
                 <w:rFonts w:ascii="Trade Gothic Next" w:hAnsi="Trade Gothic Next"/>
                 <w:b/>
                 <w:color w:val="4D730E"/>
-                <w:sz w:val="20"/>
+                <w:sz w:val="21"/>
                 <w:u w:val="none"/>
               </w:rPr>
               <w:t xml:space="preserve">B   </w:t>
             </w:r>
-            <w:r>
-              <w:rPr>
-                <w:rFonts w:ascii="Trade Gothic Next" w:hAnsi="Trade Gothic Next"/>
-                <w:b w:val="0"/>
-                <w:color w:val="14161B"/>
-                <w:sz w:val="20"/>
-                <w:u w:val="none"/>
-              </w:rPr>
-              <w:t>[↑] [↓] [↑]</w:t>
-            </w:r>
+          </w:p>
+          <w:tbl>
+            <w:tblPr>
+              <w:tblW w:type="auto" w:w="0"/>
+              <w:tblLayout w:type="fixed"/>
+              <w:tblLook w:firstColumn="1" w:firstRow="1" w:lastColumn="0" w:lastRow="0" w:noHBand="0" w:noVBand="1" w:val="04A0"/>
+              <w:tblLayout w:type="fixed"/>
+            </w:tblPr>
+            <w:tblGrid>
+              <w:gridCol w:w="432"/>
+              <w:gridCol w:w="432"/>
+              <w:gridCol w:w="432"/>
+            </w:tblGrid>
+            <w:tr>
+              <w:trPr>
+                <w:cantSplit/>
+                <w:trHeight w:val="388" w:hRule="atLeast"/>
+              </w:trPr>
+              <w:tc>
+                <w:tcPr>
+                  <w:tcW w:type="dxa" w:w="432"/>
+                  <w:tcBorders>
+                    <w:top w:val="single" w:sz="6" w:color="14161B"/>
+                    <w:left w:val="single" w:sz="6" w:color="14161B"/>
+                    <w:bottom w:val="single" w:sz="6" w:color="14161B"/>
+                    <w:right w:val="single" w:sz="6" w:color="14161B"/>
+                  </w:tcBorders>
+                  <w:vAlign w:val="center"/>
+                  <w:tcMar>
+                    <w:top w:w="0" w:type="dxa"/>
+                    <w:left w:w="0" w:type="dxa"/>
+                    <w:bottom w:w="0" w:type="dxa"/>
+                    <w:right w:w="0" w:type="dxa"/>
+                  </w:tcMar>
+                </w:tcPr>
+                <w:p>
+                  <w:pPr>
+                    <w:spacing w:after="0"/>
+                    <w:jc w:val="center"/>
+                  </w:pPr>
+                  <w:r>
+                    <w:rPr>
+                      <w:rFonts w:ascii="Trade Gothic Next" w:hAnsi="Trade Gothic Next"/>
+                      <w:b/>
+                      <w:color w:val="14161B"/>
+                      <w:sz w:val="21"/>
+                      <w:u w:val="none"/>
+                    </w:rPr>
+                    <w:t>↑</w:t>
+                  </w:r>
+                </w:p>
+              </w:tc>
+              <w:tc>
+                <w:tcPr>
+                  <w:tcW w:type="dxa" w:w="432"/>
+                  <w:tcBorders>
+                    <w:top w:val="single" w:sz="6" w:color="14161B"/>
+                    <w:left w:val="single" w:sz="6" w:color="14161B"/>
+                    <w:bottom w:val="single" w:sz="6" w:color="14161B"/>
+                    <w:right w:val="single" w:sz="6" w:color="14161B"/>
+                  </w:tcBorders>
+                  <w:vAlign w:val="center"/>
+                  <w:tcMar>
+                    <w:top w:w="0" w:type="dxa"/>
+                    <w:left w:w="0" w:type="dxa"/>
+                    <w:bottom w:w="0" w:type="dxa"/>
+                    <w:right w:w="0" w:type="dxa"/>
+                  </w:tcMar>
+                </w:tcPr>
+                <w:p>
+                  <w:pPr>
+                    <w:spacing w:after="0"/>
+                    <w:jc w:val="center"/>
+                  </w:pPr>
+                  <w:r>
+                    <w:rPr>
+                      <w:rFonts w:ascii="Trade Gothic Next" w:hAnsi="Trade Gothic Next"/>
+                      <w:b/>
+                      <w:color w:val="14161B"/>
+                      <w:sz w:val="21"/>
+                      <w:u w:val="none"/>
+                    </w:rPr>
+                    <w:t>↓</w:t>
+                  </w:r>
+                </w:p>
+              </w:tc>
+              <w:tc>
+                <w:tcPr>
+                  <w:tcW w:type="dxa" w:w="432"/>
+                  <w:tcBorders>
+                    <w:top w:val="single" w:sz="6" w:color="14161B"/>
+                    <w:left w:val="single" w:sz="6" w:color="14161B"/>
+                    <w:bottom w:val="single" w:sz="6" w:color="14161B"/>
+                    <w:right w:val="single" w:sz="6" w:color="14161B"/>
+                  </w:tcBorders>
+                  <w:vAlign w:val="center"/>
+                  <w:tcMar>
+                    <w:top w:w="0" w:type="dxa"/>
+                    <w:left w:w="0" w:type="dxa"/>
+                    <w:bottom w:w="0" w:type="dxa"/>
+                    <w:right w:w="0" w:type="dxa"/>
+                  </w:tcMar>
+                </w:tcPr>
+                <w:p>
+                  <w:pPr>
+                    <w:spacing w:after="0"/>
+                    <w:jc w:val="center"/>
+                  </w:pPr>
+                  <w:r>
+                    <w:rPr>
+                      <w:rFonts w:ascii="Trade Gothic Next" w:hAnsi="Trade Gothic Next"/>
+                      <w:b/>
+                      <w:color w:val="14161B"/>
+                      <w:sz w:val="21"/>
+                      <w:u w:val="none"/>
+                    </w:rPr>
+                    <w:t>↑</w:t>
+                  </w:r>
+                </w:p>
+              </w:tc>
+            </w:tr>
+          </w:tbl>
+          <w:p>
+            <w:pPr>
+              <w:spacing w:before="0" w:after="0" w:line="20" w:lineRule="exact"/>
+            </w:pPr>
           </w:p>
         </w:tc>
         <w:tc>
@@ -815,14 +1011,11 @@
             <w:tcW w:type="dxa" w:w="2534"/>
             <w:vAlign w:val="center"/>
             <w:tcMar>
-              <w:top w:w="20" w:type="dxa"/>
+              <w:top w:w="10" w:type="dxa"/>
               <w:left w:w="60" w:type="dxa"/>
-              <w:bottom w:w="60" w:type="dxa"/>
+              <w:bottom w:w="50" w:type="dxa"/>
               <w:right w:w="60" w:type="dxa"/>
             </w:tcMar>
-            <w:tcBorders>
-              <w:bottom w:val="single" w:sz="4" w:color="C8CDC2"/>
-            </w:tcBorders>
           </w:tcPr>
           <w:p>
             <w:pPr>
@@ -834,21 +1027,137 @@
                 <w:rFonts w:ascii="Trade Gothic Next" w:hAnsi="Trade Gothic Next"/>
                 <w:b/>
                 <w:color w:val="4D730E"/>
-                <w:sz w:val="20"/>
+                <w:sz w:val="21"/>
                 <w:u w:val="none"/>
               </w:rPr>
               <w:t xml:space="preserve">C   </w:t>
             </w:r>
-            <w:r>
-              <w:rPr>
-                <w:rFonts w:ascii="Trade Gothic Next" w:hAnsi="Trade Gothic Next"/>
-                <w:b w:val="0"/>
-                <w:color w:val="14161B"/>
-                <w:sz w:val="20"/>
-                <w:u w:val="none"/>
-              </w:rPr>
-              <w:t>[↑] [↑] [↑]</w:t>
-            </w:r>
+          </w:p>
+          <w:tbl>
+            <w:tblPr>
+              <w:tblW w:type="auto" w:w="0"/>
+              <w:tblLayout w:type="fixed"/>
+              <w:tblLook w:firstColumn="1" w:firstRow="1" w:lastColumn="0" w:lastRow="0" w:noHBand="0" w:noVBand="1" w:val="04A0"/>
+              <w:tblLayout w:type="fixed"/>
+            </w:tblPr>
+            <w:tblGrid>
+              <w:gridCol w:w="432"/>
+              <w:gridCol w:w="432"/>
+              <w:gridCol w:w="432"/>
+            </w:tblGrid>
+            <w:tr>
+              <w:trPr>
+                <w:cantSplit/>
+                <w:trHeight w:val="388" w:hRule="atLeast"/>
+              </w:trPr>
+              <w:tc>
+                <w:tcPr>
+                  <w:tcW w:type="dxa" w:w="432"/>
+                  <w:tcBorders>
+                    <w:top w:val="single" w:sz="6" w:color="14161B"/>
+                    <w:left w:val="single" w:sz="6" w:color="14161B"/>
+                    <w:bottom w:val="single" w:sz="6" w:color="14161B"/>
+                    <w:right w:val="single" w:sz="6" w:color="14161B"/>
+                  </w:tcBorders>
+                  <w:vAlign w:val="center"/>
+                  <w:tcMar>
+                    <w:top w:w="0" w:type="dxa"/>
+                    <w:left w:w="0" w:type="dxa"/>
+                    <w:bottom w:w="0" w:type="dxa"/>
+                    <w:right w:w="0" w:type="dxa"/>
+                  </w:tcMar>
+                </w:tcPr>
+                <w:p>
+                  <w:pPr>
+                    <w:spacing w:after="0"/>
+                    <w:jc w:val="center"/>
+                  </w:pPr>
+                  <w:r>
+                    <w:rPr>
+                      <w:rFonts w:ascii="Trade Gothic Next" w:hAnsi="Trade Gothic Next"/>
+                      <w:b/>
+                      <w:color w:val="14161B"/>
+                      <w:sz w:val="21"/>
+                      <w:u w:val="none"/>
+                    </w:rPr>
+                    <w:t>↑</w:t>
+                  </w:r>
+                </w:p>
+              </w:tc>
+              <w:tc>
+                <w:tcPr>
+                  <w:tcW w:type="dxa" w:w="432"/>
+                  <w:tcBorders>
+                    <w:top w:val="single" w:sz="6" w:color="14161B"/>
+                    <w:left w:val="single" w:sz="6" w:color="14161B"/>
+                    <w:bottom w:val="single" w:sz="6" w:color="14161B"/>
+                    <w:right w:val="single" w:sz="6" w:color="14161B"/>
+                  </w:tcBorders>
+                  <w:vAlign w:val="center"/>
+                  <w:tcMar>
+                    <w:top w:w="0" w:type="dxa"/>
+                    <w:left w:w="0" w:type="dxa"/>
+                    <w:bottom w:w="0" w:type="dxa"/>
+                    <w:right w:w="0" w:type="dxa"/>
+                  </w:tcMar>
+                </w:tcPr>
+                <w:p>
+                  <w:pPr>
+                    <w:spacing w:after="0"/>
+                    <w:jc w:val="center"/>
+                  </w:pPr>
+                  <w:r>
+                    <w:rPr>
+                      <w:rFonts w:ascii="Trade Gothic Next" w:hAnsi="Trade Gothic Next"/>
+                      <w:b/>
+                      <w:color w:val="14161B"/>
+                      <w:sz w:val="21"/>
+                      <w:u w:val="none"/>
+                    </w:rPr>
+                    <w:t>↑</w:t>
+                  </w:r>
+                </w:p>
+              </w:tc>
+              <w:tc>
+                <w:tcPr>
+                  <w:tcW w:type="dxa" w:w="432"/>
+                  <w:tcBorders>
+                    <w:top w:val="single" w:sz="6" w:color="14161B"/>
+                    <w:left w:val="single" w:sz="6" w:color="14161B"/>
+                    <w:bottom w:val="single" w:sz="6" w:color="14161B"/>
+                    <w:right w:val="single" w:sz="6" w:color="14161B"/>
+                  </w:tcBorders>
+                  <w:vAlign w:val="center"/>
+                  <w:tcMar>
+                    <w:top w:w="0" w:type="dxa"/>
+                    <w:left w:w="0" w:type="dxa"/>
+                    <w:bottom w:w="0" w:type="dxa"/>
+                    <w:right w:w="0" w:type="dxa"/>
+                  </w:tcMar>
+                </w:tcPr>
+                <w:p>
+                  <w:pPr>
+                    <w:spacing w:after="0"/>
+                    <w:jc w:val="center"/>
+                  </w:pPr>
+                  <w:r>
+                    <w:rPr>
+                      <w:rFonts w:ascii="Trade Gothic Next" w:hAnsi="Trade Gothic Next"/>
+                      <w:b/>
+                      <w:color w:val="14161B"/>
+                      <w:sz w:val="21"/>
+                      <w:u w:val="none"/>
+                    </w:rPr>
+                    <w:t>↑</w:t>
+                  </w:r>
+                </w:p>
+              </w:tc>
+            </w:tr>
+          </w:tbl>
+          <w:p>
+            <w:pPr>
+              <w:spacing w:before="0" w:after="0" w:line="20" w:lineRule="exact"/>
+            </w:pPr>
           </w:p>
         </w:tc>
         <w:tc>
@@ -856,14 +1165,11 @@
             <w:tcW w:type="dxa" w:w="2549"/>
             <w:vAlign w:val="center"/>
             <w:tcMar>
-              <w:top w:w="20" w:type="dxa"/>
+              <w:top w:w="10" w:type="dxa"/>
               <w:left w:w="60" w:type="dxa"/>
-              <w:bottom w:w="60" w:type="dxa"/>
+              <w:bottom w:w="50" w:type="dxa"/>
               <w:right w:w="60" w:type="dxa"/>
             </w:tcMar>
-            <w:tcBorders>
-              <w:bottom w:val="single" w:sz="4" w:color="C8CDC2"/>
-            </w:tcBorders>
           </w:tcPr>
           <w:p>
             <w:pPr>
@@ -875,21 +1181,127 @@
                 <w:rFonts w:ascii="Trade Gothic Next" w:hAnsi="Trade Gothic Next"/>
                 <w:b/>
                 <w:color w:val="4D730E"/>
-                <w:sz w:val="20"/>
+                <w:sz w:val="21"/>
                 <w:u w:val="none"/>
               </w:rPr>
               <w:t xml:space="preserve">D   </w:t>
             </w:r>
-            <w:r>
-              <w:rPr>
-                <w:rFonts w:ascii="Trade Gothic Next" w:hAnsi="Trade Gothic Next"/>
-                <w:b w:val="0"/>
-                <w:color w:val="14161B"/>
-                <w:sz w:val="20"/>
-                <w:u w:val="none"/>
-              </w:rPr>
-              <w:t>[↑↓] [   ] [↑]</w:t>
-            </w:r>
+          </w:p>
+          <w:tbl>
+            <w:tblPr>
+              <w:tblW w:type="auto" w:w="0"/>
+              <w:tblLayout w:type="fixed"/>
+              <w:tblLook w:firstColumn="1" w:firstRow="1" w:lastColumn="0" w:lastRow="0" w:noHBand="0" w:noVBand="1" w:val="04A0"/>
+              <w:tblLayout w:type="fixed"/>
+            </w:tblPr>
+            <w:tblGrid>
+              <w:gridCol w:w="432"/>
+              <w:gridCol w:w="432"/>
+              <w:gridCol w:w="432"/>
+            </w:tblGrid>
+            <w:tr>
+              <w:trPr>
+                <w:cantSplit/>
+                <w:trHeight w:val="388" w:hRule="atLeast"/>
+              </w:trPr>
+              <w:tc>
+                <w:tcPr>
+                  <w:tcW w:type="dxa" w:w="432"/>
+                  <w:tcBorders>
+                    <w:top w:val="single" w:sz="6" w:color="14161B"/>
+                    <w:left w:val="single" w:sz="6" w:color="14161B"/>
+                    <w:bottom w:val="single" w:sz="6" w:color="14161B"/>
+                    <w:right w:val="single" w:sz="6" w:color="14161B"/>
+                  </w:tcBorders>
+                  <w:vAlign w:val="center"/>
+                  <w:tcMar>
+                    <w:top w:w="0" w:type="dxa"/>
+                    <w:left w:w="0" w:type="dxa"/>
+                    <w:bottom w:w="0" w:type="dxa"/>
+                    <w:right w:w="0" w:type="dxa"/>
+                  </w:tcMar>
+                </w:tcPr>
+                <w:p>
+                  <w:pPr>
+                    <w:spacing w:after="0"/>
+                    <w:jc w:val="center"/>
+                  </w:pPr>
+                  <w:r>
+                    <w:rPr>
+                      <w:rFonts w:ascii="Trade Gothic Next" w:hAnsi="Trade Gothic Next"/>
+                      <w:b/>
+                      <w:color w:val="14161B"/>
+                      <w:sz w:val="21"/>
+                      <w:u w:val="none"/>
+                    </w:rPr>
+                    <w:t>↑↓</w:t>
+                  </w:r>
+                </w:p>
+              </w:tc>
+              <w:tc>
+                <w:tcPr>
+                  <w:tcW w:type="dxa" w:w="432"/>
+                  <w:tcBorders>
+                    <w:top w:val="single" w:sz="6" w:color="14161B"/>
+                    <w:left w:val="single" w:sz="6" w:color="14161B"/>
+                    <w:bottom w:val="single" w:sz="6" w:color="14161B"/>
+                    <w:right w:val="single" w:sz="6" w:color="14161B"/>
+                  </w:tcBorders>
+                  <w:vAlign w:val="center"/>
+                  <w:tcMar>
+                    <w:top w:w="0" w:type="dxa"/>
+                    <w:left w:w="0" w:type="dxa"/>
+                    <w:bottom w:w="0" w:type="dxa"/>
+                    <w:right w:w="0" w:type="dxa"/>
+                  </w:tcMar>
+                </w:tcPr>
+                <w:p>
+                  <w:pPr>
+                    <w:spacing w:after="0"/>
+                    <w:jc w:val="center"/>
+                  </w:pPr>
+                </w:p>
+              </w:tc>
+              <w:tc>
+                <w:tcPr>
+                  <w:tcW w:type="dxa" w:w="432"/>
+                  <w:tcBorders>
+                    <w:top w:val="single" w:sz="6" w:color="14161B"/>
+                    <w:left w:val="single" w:sz="6" w:color="14161B"/>
+                    <w:bottom w:val="single" w:sz="6" w:color="14161B"/>
+                    <w:right w:val="single" w:sz="6" w:color="14161B"/>
+                  </w:tcBorders>
+                  <w:vAlign w:val="center"/>
+                  <w:tcMar>
+                    <w:top w:w="0" w:type="dxa"/>
+                    <w:left w:w="0" w:type="dxa"/>
+                    <w:bottom w:w="0" w:type="dxa"/>
+                    <w:right w:w="0" w:type="dxa"/>
+                  </w:tcMar>
+                </w:tcPr>
+                <w:p>
+                  <w:pPr>
+                    <w:spacing w:after="0"/>
+                    <w:jc w:val="center"/>
+                  </w:pPr>
+                  <w:r>
+                    <w:rPr>
+                      <w:rFonts w:ascii="Trade Gothic Next" w:hAnsi="Trade Gothic Next"/>
+                      <w:b/>
+                      <w:color w:val="14161B"/>
+                      <w:sz w:val="21"/>
+                      <w:u w:val="none"/>
+                    </w:rPr>
+                    <w:t>↑</w:t>
+                  </w:r>
+                </w:p>
+              </w:tc>
+            </w:tr>
+          </w:tbl>
+          <w:p>
+            <w:pPr>
+              <w:spacing w:before="0" w:after="0" w:line="20" w:lineRule="exact"/>
+            </w:pPr>
           </w:p>
         </w:tc>
       </w:tr>
@@ -919,17 +1331,13 @@
             <w:vAlign w:val="center"/>
             <w:tcMar>
               <w:top w:w="40" w:type="dxa"/>
-              <w:left w:w="60" w:type="dxa"/>
+              <w:left w:w="20" w:type="dxa"/>
               <w:bottom w:w="40" w:type="dxa"/>
-              <w:right w:w="60" w:type="dxa"/>
+              <w:right w:w="20" w:type="dxa"/>
             </w:tcMar>
-            <w:tcBorders>
-              <w:bottom w:val="single" w:sz="4" w:color="C8CDC2"/>
-            </w:tcBorders>
           </w:tcPr>
           <w:p>
             <w:pPr>
-              <w:keepNext/>
               <w:spacing w:after="0"/>
               <w:jc w:val="left"/>
             </w:pPr>
@@ -938,7 +1346,7 @@
                 <w:rFonts w:ascii="Trade Gothic Next" w:hAnsi="Trade Gothic Next"/>
                 <w:b/>
                 <w:color w:val="4D730E"/>
-                <w:sz w:val="22"/>
+                <w:sz w:val="26"/>
                 <w:u w:val="none"/>
               </w:rPr>
               <w:t>3</w:t>
@@ -953,7 +1361,7 @@
             <w:tcMar>
               <w:top w:w="50" w:type="dxa"/>
               <w:left w:w="60" w:type="dxa"/>
-              <w:bottom w:w="20" w:type="dxa"/>
+              <w:bottom w:w="10" w:type="dxa"/>
               <w:right w:w="60" w:type="dxa"/>
             </w:tcMar>
           </w:tcPr>
@@ -968,525 +1376,7 @@
                 <w:rFonts w:ascii="Trade Gothic Next" w:hAnsi="Trade Gothic Next"/>
                 <w:b/>
                 <w:color w:val="14161B"/>
-                <w:sz w:val="20"/>
-                <w:u w:val="none"/>
-              </w:rPr>
-              <w:t>How many electrons can a p sublevel hold?</w:t>
-            </w:r>
-          </w:p>
-        </w:tc>
-      </w:tr>
-      <w:tr>
-        <w:trPr>
-          <w:cantSplit/>
-        </w:trPr>
-        <w:tc>
-          <w:tcPr>
-            <w:tcW w:type="dxa" w:w="648"/>
-            <w:vMerge/>
-          </w:tcPr>
-          <w:p/>
-        </w:tc>
-        <w:tc>
-          <w:tcPr>
-            <w:tcW w:type="dxa" w:w="2534"/>
-            <w:vAlign w:val="center"/>
-            <w:tcMar>
-              <w:top w:w="20" w:type="dxa"/>
-              <w:left w:w="60" w:type="dxa"/>
-              <w:bottom w:w="60" w:type="dxa"/>
-              <w:right w:w="60" w:type="dxa"/>
-            </w:tcMar>
-            <w:tcBorders>
-              <w:bottom w:val="single" w:sz="4" w:color="C8CDC2"/>
-            </w:tcBorders>
-          </w:tcPr>
-          <w:p>
-            <w:pPr>
-              <w:spacing w:after="0"/>
-              <w:jc w:val="left"/>
-            </w:pPr>
-            <w:r>
-              <w:rPr>
-                <w:rFonts w:ascii="Trade Gothic Next" w:hAnsi="Trade Gothic Next"/>
-                <w:b/>
-                <w:color w:val="4D730E"/>
-                <w:sz w:val="20"/>
-                <w:u w:val="none"/>
-              </w:rPr>
-              <w:t xml:space="preserve">A   </w:t>
-            </w:r>
-            <w:r>
-              <w:rPr>
-                <w:rFonts w:ascii="Trade Gothic Next" w:hAnsi="Trade Gothic Next"/>
-                <w:b w:val="0"/>
-                <w:color w:val="14161B"/>
-                <w:sz w:val="20"/>
-                <w:u w:val="none"/>
-              </w:rPr>
-              <w:t>3</w:t>
-            </w:r>
-          </w:p>
-        </w:tc>
-        <w:tc>
-          <w:tcPr>
-            <w:tcW w:type="dxa" w:w="2534"/>
-            <w:vAlign w:val="center"/>
-            <w:tcMar>
-              <w:top w:w="20" w:type="dxa"/>
-              <w:left w:w="60" w:type="dxa"/>
-              <w:bottom w:w="60" w:type="dxa"/>
-              <w:right w:w="60" w:type="dxa"/>
-            </w:tcMar>
-            <w:tcBorders>
-              <w:bottom w:val="single" w:sz="4" w:color="C8CDC2"/>
-            </w:tcBorders>
-          </w:tcPr>
-          <w:p>
-            <w:pPr>
-              <w:spacing w:after="0"/>
-              <w:jc w:val="left"/>
-            </w:pPr>
-            <w:r>
-              <w:rPr>
-                <w:rFonts w:ascii="Trade Gothic Next" w:hAnsi="Trade Gothic Next"/>
-                <w:b/>
-                <w:color w:val="4D730E"/>
-                <w:sz w:val="20"/>
-                <w:u w:val="none"/>
-              </w:rPr>
-              <w:t xml:space="preserve">B   </w:t>
-            </w:r>
-            <w:r>
-              <w:rPr>
-                <w:rFonts w:ascii="Trade Gothic Next" w:hAnsi="Trade Gothic Next"/>
-                <w:b w:val="0"/>
-                <w:color w:val="14161B"/>
-                <w:sz w:val="20"/>
-                <w:u w:val="none"/>
-              </w:rPr>
-              <w:t>6</w:t>
-            </w:r>
-          </w:p>
-        </w:tc>
-        <w:tc>
-          <w:tcPr>
-            <w:tcW w:type="dxa" w:w="2534"/>
-            <w:vAlign w:val="center"/>
-            <w:tcMar>
-              <w:top w:w="20" w:type="dxa"/>
-              <w:left w:w="60" w:type="dxa"/>
-              <w:bottom w:w="60" w:type="dxa"/>
-              <w:right w:w="60" w:type="dxa"/>
-            </w:tcMar>
-            <w:tcBorders>
-              <w:bottom w:val="single" w:sz="4" w:color="C8CDC2"/>
-            </w:tcBorders>
-          </w:tcPr>
-          <w:p>
-            <w:pPr>
-              <w:spacing w:after="0"/>
-              <w:jc w:val="left"/>
-            </w:pPr>
-            <w:r>
-              <w:rPr>
-                <w:rFonts w:ascii="Trade Gothic Next" w:hAnsi="Trade Gothic Next"/>
-                <w:b/>
-                <w:color w:val="4D730E"/>
-                <w:sz w:val="20"/>
-                <w:u w:val="none"/>
-              </w:rPr>
-              <w:t xml:space="preserve">C   </w:t>
-            </w:r>
-            <w:r>
-              <w:rPr>
-                <w:rFonts w:ascii="Trade Gothic Next" w:hAnsi="Trade Gothic Next"/>
-                <w:b w:val="0"/>
-                <w:color w:val="14161B"/>
-                <w:sz w:val="20"/>
-                <w:u w:val="none"/>
-              </w:rPr>
-              <w:t>2</w:t>
-            </w:r>
-          </w:p>
-        </w:tc>
-        <w:tc>
-          <w:tcPr>
-            <w:tcW w:type="dxa" w:w="2549"/>
-            <w:vAlign w:val="center"/>
-            <w:tcMar>
-              <w:top w:w="20" w:type="dxa"/>
-              <w:left w:w="60" w:type="dxa"/>
-              <w:bottom w:w="60" w:type="dxa"/>
-              <w:right w:w="60" w:type="dxa"/>
-            </w:tcMar>
-            <w:tcBorders>
-              <w:bottom w:val="single" w:sz="4" w:color="C8CDC2"/>
-            </w:tcBorders>
-          </w:tcPr>
-          <w:p>
-            <w:pPr>
-              <w:spacing w:after="0"/>
-              <w:jc w:val="left"/>
-            </w:pPr>
-            <w:r>
-              <w:rPr>
-                <w:rFonts w:ascii="Trade Gothic Next" w:hAnsi="Trade Gothic Next"/>
-                <w:b/>
-                <w:color w:val="4D730E"/>
-                <w:sz w:val="20"/>
-                <w:u w:val="none"/>
-              </w:rPr>
-              <w:t xml:space="preserve">D   </w:t>
-            </w:r>
-            <w:r>
-              <w:rPr>
-                <w:rFonts w:ascii="Trade Gothic Next" w:hAnsi="Trade Gothic Next"/>
-                <w:b w:val="0"/>
-                <w:color w:val="14161B"/>
-                <w:sz w:val="20"/>
-                <w:u w:val="none"/>
-              </w:rPr>
-              <w:t>10</w:t>
-            </w:r>
-          </w:p>
-        </w:tc>
-      </w:tr>
-    </w:tbl>
-    <w:tbl>
-      <w:tblPr>
-        <w:tblW w:type="auto" w:w="0"/>
-        <w:tblLayout w:type="fixed"/>
-        <w:tblLook w:firstColumn="1" w:firstRow="1" w:lastColumn="0" w:lastRow="0" w:noHBand="0" w:noVBand="1" w:val="04A0"/>
-        <w:tblLayout w:type="fixed"/>
-      </w:tblPr>
-      <w:tblGrid>
-        <w:gridCol w:w="648"/>
-        <w:gridCol w:w="2534"/>
-        <w:gridCol w:w="2534"/>
-        <w:gridCol w:w="2534"/>
-        <w:gridCol w:w="2549"/>
-      </w:tblGrid>
-      <w:tr>
-        <w:trPr>
-          <w:cantSplit/>
-        </w:trPr>
-        <w:tc>
-          <w:tcPr>
-            <w:tcW w:type="dxa" w:w="648"/>
-            <w:vMerge w:val="restart"/>
-            <w:vAlign w:val="center"/>
-            <w:tcMar>
-              <w:top w:w="40" w:type="dxa"/>
-              <w:left w:w="60" w:type="dxa"/>
-              <w:bottom w:w="40" w:type="dxa"/>
-              <w:right w:w="60" w:type="dxa"/>
-            </w:tcMar>
-            <w:tcBorders>
-              <w:bottom w:val="single" w:sz="4" w:color="C8CDC2"/>
-            </w:tcBorders>
-          </w:tcPr>
-          <w:p>
-            <w:pPr>
-              <w:keepNext/>
-              <w:spacing w:after="0"/>
-              <w:jc w:val="left"/>
-            </w:pPr>
-            <w:r>
-              <w:rPr>
-                <w:rFonts w:ascii="Trade Gothic Next" w:hAnsi="Trade Gothic Next"/>
-                <w:b/>
-                <w:color w:val="4D730E"/>
-                <w:sz w:val="22"/>
-                <w:u w:val="none"/>
-              </w:rPr>
-              <w:t>4</w:t>
-            </w:r>
-          </w:p>
-        </w:tc>
-        <w:tc>
-          <w:tcPr>
-            <w:tcW w:type="dxa" w:w="10151"/>
-            <w:gridSpan w:val="4"/>
-            <w:vAlign w:val="center"/>
-            <w:tcMar>
-              <w:top w:w="50" w:type="dxa"/>
-              <w:left w:w="60" w:type="dxa"/>
-              <w:bottom w:w="20" w:type="dxa"/>
-              <w:right w:w="60" w:type="dxa"/>
-            </w:tcMar>
-          </w:tcPr>
-          <w:p>
-            <w:pPr>
-              <w:keepNext/>
-              <w:spacing w:after="0"/>
-              <w:jc w:val="left"/>
-            </w:pPr>
-            <w:r>
-              <w:rPr>
-                <w:rFonts w:ascii="Trade Gothic Next" w:hAnsi="Trade Gothic Next"/>
-                <w:b/>
-                <w:color w:val="14161B"/>
-                <w:sz w:val="20"/>
-                <w:u w:val="none"/>
-              </w:rPr>
-              <w:t>An atom gains 2 electrons. What is the charge of its ion?</w:t>
-            </w:r>
-          </w:p>
-        </w:tc>
-      </w:tr>
-      <w:tr>
-        <w:trPr>
-          <w:cantSplit/>
-        </w:trPr>
-        <w:tc>
-          <w:tcPr>
-            <w:tcW w:type="dxa" w:w="648"/>
-            <w:vMerge/>
-          </w:tcPr>
-          <w:p/>
-        </w:tc>
-        <w:tc>
-          <w:tcPr>
-            <w:tcW w:type="dxa" w:w="2534"/>
-            <w:vAlign w:val="center"/>
-            <w:tcMar>
-              <w:top w:w="20" w:type="dxa"/>
-              <w:left w:w="60" w:type="dxa"/>
-              <w:bottom w:w="60" w:type="dxa"/>
-              <w:right w:w="60" w:type="dxa"/>
-            </w:tcMar>
-            <w:tcBorders>
-              <w:bottom w:val="single" w:sz="4" w:color="C8CDC2"/>
-            </w:tcBorders>
-          </w:tcPr>
-          <w:p>
-            <w:pPr>
-              <w:spacing w:after="0"/>
-              <w:jc w:val="left"/>
-            </w:pPr>
-            <w:r>
-              <w:rPr>
-                <w:rFonts w:ascii="Trade Gothic Next" w:hAnsi="Trade Gothic Next"/>
-                <w:b/>
-                <w:color w:val="4D730E"/>
-                <w:sz w:val="20"/>
-                <w:u w:val="none"/>
-              </w:rPr>
-              <w:t xml:space="preserve">A   </w:t>
-            </w:r>
-            <w:r>
-              <w:rPr>
-                <w:rFonts w:ascii="Trade Gothic Next" w:hAnsi="Trade Gothic Next"/>
-                <w:b w:val="0"/>
-                <w:color w:val="14161B"/>
-                <w:sz w:val="20"/>
-                <w:u w:val="none"/>
-              </w:rPr>
-              <w:t>2+</w:t>
-            </w:r>
-          </w:p>
-        </w:tc>
-        <w:tc>
-          <w:tcPr>
-            <w:tcW w:type="dxa" w:w="2534"/>
-            <w:vAlign w:val="center"/>
-            <w:tcMar>
-              <w:top w:w="20" w:type="dxa"/>
-              <w:left w:w="60" w:type="dxa"/>
-              <w:bottom w:w="60" w:type="dxa"/>
-              <w:right w:w="60" w:type="dxa"/>
-            </w:tcMar>
-            <w:tcBorders>
-              <w:bottom w:val="single" w:sz="4" w:color="C8CDC2"/>
-            </w:tcBorders>
-          </w:tcPr>
-          <w:p>
-            <w:pPr>
-              <w:spacing w:after="0"/>
-              <w:jc w:val="left"/>
-            </w:pPr>
-            <w:r>
-              <w:rPr>
-                <w:rFonts w:ascii="Trade Gothic Next" w:hAnsi="Trade Gothic Next"/>
-                <w:b/>
-                <w:color w:val="4D730E"/>
-                <w:sz w:val="20"/>
-                <w:u w:val="none"/>
-              </w:rPr>
-              <w:t xml:space="preserve">B   </w:t>
-            </w:r>
-            <w:r>
-              <w:rPr>
-                <w:rFonts w:ascii="Trade Gothic Next" w:hAnsi="Trade Gothic Next"/>
-                <w:b w:val="0"/>
-                <w:color w:val="14161B"/>
-                <w:sz w:val="20"/>
-                <w:u w:val="none"/>
-              </w:rPr>
-              <w:t>0</w:t>
-            </w:r>
-          </w:p>
-        </w:tc>
-        <w:tc>
-          <w:tcPr>
-            <w:tcW w:type="dxa" w:w="2534"/>
-            <w:vAlign w:val="center"/>
-            <w:tcMar>
-              <w:top w:w="20" w:type="dxa"/>
-              <w:left w:w="60" w:type="dxa"/>
-              <w:bottom w:w="60" w:type="dxa"/>
-              <w:right w:w="60" w:type="dxa"/>
-            </w:tcMar>
-            <w:tcBorders>
-              <w:bottom w:val="single" w:sz="4" w:color="C8CDC2"/>
-            </w:tcBorders>
-          </w:tcPr>
-          <w:p>
-            <w:pPr>
-              <w:spacing w:after="0"/>
-              <w:jc w:val="left"/>
-            </w:pPr>
-            <w:r>
-              <w:rPr>
-                <w:rFonts w:ascii="Trade Gothic Next" w:hAnsi="Trade Gothic Next"/>
-                <w:b/>
-                <w:color w:val="4D730E"/>
-                <w:sz w:val="20"/>
-                <w:u w:val="none"/>
-              </w:rPr>
-              <w:t xml:space="preserve">C   </w:t>
-            </w:r>
-            <w:r>
-              <w:rPr>
-                <w:rFonts w:ascii="Trade Gothic Next" w:hAnsi="Trade Gothic Next"/>
-                <w:b w:val="0"/>
-                <w:color w:val="14161B"/>
-                <w:sz w:val="20"/>
-                <w:u w:val="none"/>
-              </w:rPr>
-              <w:t>6−</w:t>
-            </w:r>
-          </w:p>
-        </w:tc>
-        <w:tc>
-          <w:tcPr>
-            <w:tcW w:type="dxa" w:w="2549"/>
-            <w:vAlign w:val="center"/>
-            <w:tcMar>
-              <w:top w:w="20" w:type="dxa"/>
-              <w:left w:w="60" w:type="dxa"/>
-              <w:bottom w:w="60" w:type="dxa"/>
-              <w:right w:w="60" w:type="dxa"/>
-            </w:tcMar>
-            <w:tcBorders>
-              <w:bottom w:val="single" w:sz="4" w:color="C8CDC2"/>
-            </w:tcBorders>
-          </w:tcPr>
-          <w:p>
-            <w:pPr>
-              <w:spacing w:after="0"/>
-              <w:jc w:val="left"/>
-            </w:pPr>
-            <w:r>
-              <w:rPr>
-                <w:rFonts w:ascii="Trade Gothic Next" w:hAnsi="Trade Gothic Next"/>
-                <w:b/>
-                <w:color w:val="4D730E"/>
-                <w:sz w:val="20"/>
-                <w:u w:val="none"/>
-              </w:rPr>
-              <w:t xml:space="preserve">D   </w:t>
-            </w:r>
-            <w:r>
-              <w:rPr>
-                <w:rFonts w:ascii="Trade Gothic Next" w:hAnsi="Trade Gothic Next"/>
-                <w:b w:val="0"/>
-                <w:color w:val="14161B"/>
-                <w:sz w:val="20"/>
-                <w:u w:val="none"/>
-              </w:rPr>
-              <w:t>2−</w:t>
-            </w:r>
-          </w:p>
-        </w:tc>
-      </w:tr>
-    </w:tbl>
-    <w:tbl>
-      <w:tblPr>
-        <w:tblW w:type="auto" w:w="0"/>
-        <w:tblLayout w:type="fixed"/>
-        <w:tblLook w:firstColumn="1" w:firstRow="1" w:lastColumn="0" w:lastRow="0" w:noHBand="0" w:noVBand="1" w:val="04A0"/>
-        <w:tblLayout w:type="fixed"/>
-      </w:tblPr>
-      <w:tblGrid>
-        <w:gridCol w:w="648"/>
-        <w:gridCol w:w="2534"/>
-        <w:gridCol w:w="2534"/>
-        <w:gridCol w:w="2534"/>
-        <w:gridCol w:w="2549"/>
-      </w:tblGrid>
-      <w:tr>
-        <w:trPr>
-          <w:cantSplit/>
-        </w:trPr>
-        <w:tc>
-          <w:tcPr>
-            <w:tcW w:type="dxa" w:w="648"/>
-            <w:vMerge w:val="restart"/>
-            <w:vAlign w:val="center"/>
-            <w:tcMar>
-              <w:top w:w="40" w:type="dxa"/>
-              <w:left w:w="60" w:type="dxa"/>
-              <w:bottom w:w="40" w:type="dxa"/>
-              <w:right w:w="60" w:type="dxa"/>
-            </w:tcMar>
-            <w:tcBorders>
-              <w:bottom w:val="single" w:sz="4" w:color="C8CDC2"/>
-            </w:tcBorders>
-          </w:tcPr>
-          <w:p>
-            <w:pPr>
-              <w:keepNext/>
-              <w:spacing w:after="0"/>
-              <w:jc w:val="left"/>
-            </w:pPr>
-            <w:r>
-              <w:rPr>
-                <w:rFonts w:ascii="Trade Gothic Next" w:hAnsi="Trade Gothic Next"/>
-                <w:b/>
-                <w:color w:val="4D730E"/>
-                <w:sz w:val="22"/>
-                <w:u w:val="none"/>
-              </w:rPr>
-              <w:t>5</w:t>
-            </w:r>
-          </w:p>
-        </w:tc>
-        <w:tc>
-          <w:tcPr>
-            <w:tcW w:type="dxa" w:w="10151"/>
-            <w:gridSpan w:val="4"/>
-            <w:vAlign w:val="center"/>
-            <w:tcMar>
-              <w:top w:w="50" w:type="dxa"/>
-              <w:left w:w="60" w:type="dxa"/>
-              <w:bottom w:w="20" w:type="dxa"/>
-              <w:right w:w="60" w:type="dxa"/>
-            </w:tcMar>
-          </w:tcPr>
-          <w:p>
-            <w:pPr>
-              <w:keepNext/>
-              <w:spacing w:after="0"/>
-              <w:jc w:val="left"/>
-            </w:pPr>
-            <w:r>
-              <w:rPr>
-                <w:rFonts w:ascii="Trade Gothic Next" w:hAnsi="Trade Gothic Next"/>
-                <w:b/>
-                <w:color w:val="14161B"/>
-                <w:sz w:val="20"/>
+                <w:sz w:val="21"/>
                 <w:u w:val="none"/>
               </w:rPr>
               <w:t>Which sublevel fills right after 4s?</w:t>
@@ -1510,14 +1400,11 @@
             <w:tcW w:type="dxa" w:w="2534"/>
             <w:vAlign w:val="center"/>
             <w:tcMar>
-              <w:top w:w="20" w:type="dxa"/>
+              <w:top w:w="10" w:type="dxa"/>
               <w:left w:w="60" w:type="dxa"/>
-              <w:bottom w:w="60" w:type="dxa"/>
+              <w:bottom w:w="50" w:type="dxa"/>
               <w:right w:w="60" w:type="dxa"/>
             </w:tcMar>
-            <w:tcBorders>
-              <w:bottom w:val="single" w:sz="4" w:color="C8CDC2"/>
-            </w:tcBorders>
           </w:tcPr>
           <w:p>
             <w:pPr>
@@ -1529,7 +1416,7 @@
                 <w:rFonts w:ascii="Trade Gothic Next" w:hAnsi="Trade Gothic Next"/>
                 <w:b/>
                 <w:color w:val="4D730E"/>
-                <w:sz w:val="20"/>
+                <w:sz w:val="21"/>
                 <w:u w:val="none"/>
               </w:rPr>
               <w:t xml:space="preserve">A   </w:t>
@@ -1539,7 +1426,7 @@
                 <w:rFonts w:ascii="Trade Gothic Next" w:hAnsi="Trade Gothic Next"/>
                 <w:b w:val="0"/>
                 <w:color w:val="14161B"/>
-                <w:sz w:val="20"/>
+                <w:sz w:val="21"/>
                 <w:u w:val="none"/>
               </w:rPr>
               <w:t>4p</w:t>
@@ -1551,14 +1438,11 @@
             <w:tcW w:type="dxa" w:w="2534"/>
             <w:vAlign w:val="center"/>
             <w:tcMar>
-              <w:top w:w="20" w:type="dxa"/>
+              <w:top w:w="10" w:type="dxa"/>
               <w:left w:w="60" w:type="dxa"/>
-              <w:bottom w:w="60" w:type="dxa"/>
+              <w:bottom w:w="50" w:type="dxa"/>
               <w:right w:w="60" w:type="dxa"/>
             </w:tcMar>
-            <w:tcBorders>
-              <w:bottom w:val="single" w:sz="4" w:color="C8CDC2"/>
-            </w:tcBorders>
           </w:tcPr>
           <w:p>
             <w:pPr>
@@ -1570,7 +1454,7 @@
                 <w:rFonts w:ascii="Trade Gothic Next" w:hAnsi="Trade Gothic Next"/>
                 <w:b/>
                 <w:color w:val="4D730E"/>
-                <w:sz w:val="20"/>
+                <w:sz w:val="21"/>
                 <w:u w:val="none"/>
               </w:rPr>
               <w:t xml:space="preserve">B   </w:t>
@@ -1580,7 +1464,7 @@
                 <w:rFonts w:ascii="Trade Gothic Next" w:hAnsi="Trade Gothic Next"/>
                 <w:b w:val="0"/>
                 <w:color w:val="14161B"/>
-                <w:sz w:val="20"/>
+                <w:sz w:val="21"/>
                 <w:u w:val="none"/>
               </w:rPr>
               <w:t>3d</w:t>
@@ -1592,14 +1476,11 @@
             <w:tcW w:type="dxa" w:w="2534"/>
             <w:vAlign w:val="center"/>
             <w:tcMar>
-              <w:top w:w="20" w:type="dxa"/>
+              <w:top w:w="10" w:type="dxa"/>
               <w:left w:w="60" w:type="dxa"/>
-              <w:bottom w:w="60" w:type="dxa"/>
+              <w:bottom w:w="50" w:type="dxa"/>
               <w:right w:w="60" w:type="dxa"/>
             </w:tcMar>
-            <w:tcBorders>
-              <w:bottom w:val="single" w:sz="4" w:color="C8CDC2"/>
-            </w:tcBorders>
           </w:tcPr>
           <w:p>
             <w:pPr>
@@ -1611,7 +1492,7 @@
                 <w:rFonts w:ascii="Trade Gothic Next" w:hAnsi="Trade Gothic Next"/>
                 <w:b/>
                 <w:color w:val="4D730E"/>
-                <w:sz w:val="20"/>
+                <w:sz w:val="21"/>
                 <w:u w:val="none"/>
               </w:rPr>
               <w:t xml:space="preserve">C   </w:t>
@@ -1621,7 +1502,7 @@
                 <w:rFonts w:ascii="Trade Gothic Next" w:hAnsi="Trade Gothic Next"/>
                 <w:b w:val="0"/>
                 <w:color w:val="14161B"/>
-                <w:sz w:val="20"/>
+                <w:sz w:val="21"/>
                 <w:u w:val="none"/>
               </w:rPr>
               <w:t>4d</w:t>
@@ -1633,14 +1514,11 @@
             <w:tcW w:type="dxa" w:w="2549"/>
             <w:vAlign w:val="center"/>
             <w:tcMar>
-              <w:top w:w="20" w:type="dxa"/>
+              <w:top w:w="10" w:type="dxa"/>
               <w:left w:w="60" w:type="dxa"/>
-              <w:bottom w:w="60" w:type="dxa"/>
+              <w:bottom w:w="50" w:type="dxa"/>
               <w:right w:w="60" w:type="dxa"/>
             </w:tcMar>
-            <w:tcBorders>
-              <w:bottom w:val="single" w:sz="4" w:color="C8CDC2"/>
-            </w:tcBorders>
           </w:tcPr>
           <w:p>
             <w:pPr>
@@ -1652,7 +1530,7 @@
                 <w:rFonts w:ascii="Trade Gothic Next" w:hAnsi="Trade Gothic Next"/>
                 <w:b/>
                 <w:color w:val="4D730E"/>
-                <w:sz w:val="20"/>
+                <w:sz w:val="21"/>
                 <w:u w:val="none"/>
               </w:rPr>
               <w:t xml:space="preserve">D   </w:t>
@@ -1662,7 +1540,7 @@
                 <w:rFonts w:ascii="Trade Gothic Next" w:hAnsi="Trade Gothic Next"/>
                 <w:b w:val="0"/>
                 <w:color w:val="14161B"/>
-                <w:sz w:val="20"/>
+                <w:sz w:val="21"/>
                 <w:u w:val="none"/>
               </w:rPr>
               <w:t>5s</w:t>
@@ -1723,7 +1601,7 @@
                 <w:sz w:val="18"/>
                 <w:u w:val="none"/>
               </w:rPr>
-              <w:t>PART 2  ·  LONGHAND CONFIGURATION AND ORBITAL DIAGRAM</w:t>
+              <w:t>PART 2  ·  LONGHAND CONFIGURATION  +  ORBITAL DIAGRAM</w:t>
             </w:r>
           </w:p>
         </w:tc>
@@ -1762,228 +1640,9 @@
         </w:tc>
       </w:tr>
     </w:tbl>
-    <w:tbl>
-      <w:tblPr>
-        <w:tblW w:type="auto" w:w="0"/>
-        <w:tblLayout w:type="fixed"/>
-        <w:tblLook w:firstColumn="1" w:firstRow="1" w:lastColumn="0" w:lastRow="0" w:noHBand="0" w:noVBand="1" w:val="04A0"/>
-        <w:tblLayout w:type="fixed"/>
-      </w:tblPr>
-      <w:tblGrid>
-        <w:gridCol w:w="648"/>
-        <w:gridCol w:w="2520"/>
-        <w:gridCol w:w="7632"/>
-      </w:tblGrid>
-      <w:tr>
-        <w:trPr>
-          <w:cantSplit/>
-        </w:trPr>
-        <w:tc>
-          <w:tcPr>
-            <w:tcW w:type="dxa" w:w="648"/>
-            <w:vMerge w:val="restart"/>
-            <w:vAlign w:val="center"/>
-            <w:tcMar>
-              <w:top w:w="40" w:type="dxa"/>
-              <w:left w:w="60" w:type="dxa"/>
-              <w:bottom w:w="40" w:type="dxa"/>
-              <w:right w:w="60" w:type="dxa"/>
-            </w:tcMar>
-            <w:tcBorders>
-              <w:bottom w:val="single" w:sz="4" w:color="C8CDC2"/>
-            </w:tcBorders>
-          </w:tcPr>
-          <w:p>
-            <w:pPr>
-              <w:spacing w:after="0"/>
-              <w:jc w:val="left"/>
-            </w:pPr>
-            <w:r>
-              <w:rPr>
-                <w:rFonts w:ascii="Trade Gothic Next" w:hAnsi="Trade Gothic Next"/>
-                <w:b/>
-                <w:color w:val="4D730E"/>
-                <w:sz w:val="22"/>
-                <w:u w:val="none"/>
-              </w:rPr>
-              <w:t>6</w:t>
-            </w:r>
-          </w:p>
-        </w:tc>
-        <w:tc>
-          <w:tcPr>
-            <w:tcW w:type="dxa" w:w="10152"/>
-            <w:gridSpan w:val="2"/>
-            <w:vAlign w:val="center"/>
-            <w:tcMar>
-              <w:top w:w="50" w:type="dxa"/>
-              <w:left w:w="60" w:type="dxa"/>
-              <w:bottom w:w="10" w:type="dxa"/>
-              <w:right w:w="60" w:type="dxa"/>
-            </w:tcMar>
-          </w:tcPr>
-          <w:p>
-            <w:pPr>
-              <w:keepNext/>
-              <w:spacing w:after="0"/>
-              <w:jc w:val="left"/>
-            </w:pPr>
-            <w:r>
-              <w:rPr>
-                <w:rFonts w:ascii="Trade Gothic Next" w:hAnsi="Trade Gothic Next"/>
-                <w:b/>
-                <w:color w:val="14161B"/>
-                <w:sz w:val="21"/>
-                <w:u w:val="none"/>
-              </w:rPr>
-              <w:t>Selenium, Se</w:t>
-            </w:r>
-            <w:r>
-              <w:rPr>
-                <w:rFonts w:ascii="Trade Gothic Next" w:hAnsi="Trade Gothic Next"/>
-                <w:b w:val="0"/>
-                <w:color w:val="55604F"/>
-                <w:sz w:val="16"/>
-                <w:u w:val="none"/>
-              </w:rPr>
-              <w:t xml:space="preserve">     4 pts: 2 configuration, 2 diagram</w:t>
-            </w:r>
-          </w:p>
-        </w:tc>
-      </w:tr>
-      <w:tr>
-        <w:trPr>
-          <w:cantSplit/>
-        </w:trPr>
-        <w:tc>
-          <w:tcPr>
-            <w:tcW w:type="dxa" w:w="648"/>
-            <w:vMerge/>
-          </w:tcPr>
-          <w:p/>
-        </w:tc>
-        <w:tc>
-          <w:tcPr>
-            <w:tcW w:type="dxa" w:w="2520"/>
-            <w:vAlign w:val="center"/>
-            <w:tcMar>
-              <w:top w:w="40" w:type="dxa"/>
-              <w:left w:w="60" w:type="dxa"/>
-              <w:bottom w:w="40" w:type="dxa"/>
-              <w:right w:w="60" w:type="dxa"/>
-            </w:tcMar>
-          </w:tcPr>
-          <w:p>
-            <w:pPr>
-              <w:keepNext/>
-              <w:spacing w:after="0"/>
-              <w:jc w:val="left"/>
-            </w:pPr>
-            <w:r>
-              <w:rPr>
-                <w:rFonts w:ascii="Trade Gothic Next" w:hAnsi="Trade Gothic Next"/>
-                <w:b/>
-                <w:color w:val="14161B"/>
-                <w:sz w:val="18"/>
-                <w:u w:val="none"/>
-              </w:rPr>
-              <w:t>Electron configuration</w:t>
-            </w:r>
-          </w:p>
-        </w:tc>
-        <w:tc>
-          <w:tcPr>
-            <w:tcW w:type="dxa" w:w="7632"/>
-            <w:vAlign w:val="center"/>
-            <w:tcMar>
-              <w:top w:w="40" w:type="dxa"/>
-              <w:left w:w="60" w:type="dxa"/>
-              <w:bottom w:w="40" w:type="dxa"/>
-              <w:right w:w="60" w:type="dxa"/>
-            </w:tcMar>
-            <w:tcBorders>
-              <w:bottom w:val="single" w:sz="4" w:color="C8CDC2"/>
-            </w:tcBorders>
-          </w:tcPr>
-          <w:p>
-            <w:pPr>
-              <w:spacing w:after="0"/>
-              <w:jc w:val="left"/>
-            </w:pPr>
-          </w:p>
-        </w:tc>
-      </w:tr>
-      <w:tr>
-        <w:trPr>
-          <w:cantSplit/>
-          <w:cantSplit/>
-          <w:trHeight w:val="1224" w:hRule="atLeast"/>
-        </w:trPr>
-        <w:tc>
-          <w:tcPr>
-            <w:tcW w:type="dxa" w:w="648"/>
-            <w:vMerge/>
-          </w:tcPr>
-          <w:p/>
-        </w:tc>
-        <w:tc>
-          <w:tcPr>
-            <w:tcW w:type="dxa" w:w="2520"/>
-            <w:vAlign w:val="center"/>
-            <w:tcMar>
-              <w:top w:w="40" w:type="dxa"/>
-              <w:left w:w="60" w:type="dxa"/>
-              <w:bottom w:w="40" w:type="dxa"/>
-              <w:right w:w="60" w:type="dxa"/>
-            </w:tcMar>
-          </w:tcPr>
-          <w:p>
-            <w:pPr>
-              <w:keepNext w:val="0"/>
-              <w:spacing w:after="0"/>
-              <w:jc w:val="left"/>
-            </w:pPr>
-            <w:r>
-              <w:rPr>
-                <w:rFonts w:ascii="Trade Gothic Next" w:hAnsi="Trade Gothic Next"/>
-                <w:b/>
-                <w:color w:val="14161B"/>
-                <w:sz w:val="18"/>
-                <w:u w:val="none"/>
-              </w:rPr>
-              <w:t>Orbital diagram</w:t>
-            </w:r>
-          </w:p>
-        </w:tc>
-        <w:tc>
-          <w:tcPr>
-            <w:tcW w:type="dxa" w:w="7632"/>
-            <w:vAlign w:val="center"/>
-            <w:tcMar>
-              <w:top w:w="40" w:type="dxa"/>
-              <w:left w:w="60" w:type="dxa"/>
-              <w:bottom w:w="40" w:type="dxa"/>
-              <w:right w:w="60" w:type="dxa"/>
-            </w:tcMar>
-            <w:tcBorders>
-              <w:top w:val="single" w:sz="4" w:color="C8CDC2"/>
-              <w:left w:val="single" w:sz="4" w:color="C8CDC2"/>
-              <w:bottom w:val="single" w:sz="4" w:color="C8CDC2"/>
-              <w:right w:val="single" w:sz="4" w:color="C8CDC2"/>
-            </w:tcBorders>
-          </w:tcPr>
-          <w:p>
-            <w:pPr>
-              <w:spacing w:after="0"/>
-              <w:jc w:val="left"/>
-            </w:pPr>
-          </w:p>
-        </w:tc>
-      </w:tr>
-    </w:tbl>
     <w:p>
       <w:pPr>
-        <w:spacing w:before="0" w:after="0" w:line="40" w:lineRule="exact"/>
+        <w:spacing w:before="0" w:after="0" w:line="60" w:lineRule="exact"/>
       </w:pPr>
       <w:r>
         <w:rPr>
@@ -2001,8 +1660,8 @@
       </w:tblPr>
       <w:tblGrid>
         <w:gridCol w:w="648"/>
-        <w:gridCol w:w="2520"/>
-        <w:gridCol w:w="7632"/>
+        <w:gridCol w:w="1512"/>
+        <w:gridCol w:w="8640"/>
       </w:tblGrid>
       <w:tr>
         <w:trPr>
@@ -2011,17 +1670,13 @@
         <w:tc>
           <w:tcPr>
             <w:tcW w:type="dxa" w:w="648"/>
-            <w:vMerge w:val="restart"/>
             <w:vAlign w:val="center"/>
             <w:tcMar>
               <w:top w:w="40" w:type="dxa"/>
-              <w:left w:w="60" w:type="dxa"/>
+              <w:left w:w="20" w:type="dxa"/>
               <w:bottom w:w="40" w:type="dxa"/>
-              <w:right w:w="60" w:type="dxa"/>
+              <w:right w:w="20" w:type="dxa"/>
             </w:tcMar>
-            <w:tcBorders>
-              <w:bottom w:val="single" w:sz="4" w:color="C8CDC2"/>
-            </w:tcBorders>
           </w:tcPr>
           <w:p>
             <w:pPr>
@@ -2033,20 +1688,125 @@
                 <w:rFonts w:ascii="Trade Gothic Next" w:hAnsi="Trade Gothic Next"/>
                 <w:b/>
                 <w:color w:val="4D730E"/>
-                <w:sz w:val="22"/>
+                <w:sz w:val="26"/>
                 <w:u w:val="none"/>
               </w:rPr>
-              <w:t>7</w:t>
+              <w:t>4</w:t>
             </w:r>
           </w:p>
         </w:tc>
         <w:tc>
           <w:tcPr>
-            <w:tcW w:type="dxa" w:w="10152"/>
-            <w:gridSpan w:val="2"/>
+            <w:tcW w:type="dxa" w:w="1512"/>
             <w:vAlign w:val="center"/>
             <w:tcMar>
-              <w:top w:w="50" w:type="dxa"/>
+              <w:top w:w="40" w:type="dxa"/>
+              <w:left w:w="0" w:type="dxa"/>
+              <w:bottom w:w="40" w:type="dxa"/>
+              <w:right w:w="60" w:type="dxa"/>
+            </w:tcMar>
+          </w:tcPr>
+          <w:p>
+            <w:pPr>
+              <w:spacing w:after="0"/>
+              <w:jc w:val="left"/>
+              <w:spacing w:before="0" w:after="0" w:line="20" w:lineRule="exact"/>
+            </w:pPr>
+          </w:p>
+          <w:tbl>
+            <w:tblPr>
+              <w:tblW w:type="auto" w:w="0"/>
+              <w:tblLayout w:type="fixed"/>
+              <w:tblLook w:firstColumn="1" w:firstRow="1" w:lastColumn="0" w:lastRow="0" w:noHBand="0" w:noVBand="1" w:val="04A0"/>
+              <w:tblLayout w:type="fixed"/>
+            </w:tblPr>
+            <w:tblGrid>
+              <w:gridCol w:w="1238"/>
+            </w:tblGrid>
+            <w:tr>
+              <w:trPr>
+                <w:cantSplit/>
+                <w:trHeight w:val="1238" w:hRule="atLeast"/>
+              </w:trPr>
+              <w:tc>
+                <w:tcPr>
+                  <w:tcW w:type="dxa" w:w="1238"/>
+                  <w:tcBorders>
+                    <w:top w:val="single" w:sz="12" w:color="A3E635"/>
+                    <w:left w:val="single" w:sz="12" w:color="A3E635"/>
+                    <w:bottom w:val="single" w:sz="12" w:color="A3E635"/>
+                    <w:right w:val="single" w:sz="12" w:color="A3E635"/>
+                  </w:tcBorders>
+                  <w:tcMar>
+                    <w:top w:w="20" w:type="dxa"/>
+                    <w:left w:w="50" w:type="dxa"/>
+                    <w:bottom w:w="20" w:type="dxa"/>
+                    <w:right w:w="40" w:type="dxa"/>
+                  </w:tcMar>
+                  <w:vAlign w:val="center"/>
+                </w:tcPr>
+                <w:p>
+                  <w:pPr>
+                    <w:spacing w:after="0"/>
+                  </w:pPr>
+                  <w:r>
+                    <w:rPr>
+                      <w:rFonts w:ascii="Trade Gothic Next" w:hAnsi="Trade Gothic Next"/>
+                      <w:b/>
+                      <w:color w:val="55604F"/>
+                      <w:sz w:val="16"/>
+                      <w:u w:val="none"/>
+                    </w:rPr>
+                    <w:t>34</w:t>
+                  </w:r>
+                </w:p>
+                <w:p>
+                  <w:pPr>
+                    <w:spacing w:after="0"/>
+                    <w:jc w:val="center"/>
+                  </w:pPr>
+                  <w:r>
+                    <w:rPr>
+                      <w:rFonts w:ascii="Trade Gothic Next" w:hAnsi="Trade Gothic Next"/>
+                      <w:b/>
+                      <w:color w:val="14161B"/>
+                      <w:sz w:val="40"/>
+                      <w:u w:val="none"/>
+                    </w:rPr>
+                    <w:t>Se</w:t>
+                  </w:r>
+                </w:p>
+                <w:p>
+                  <w:pPr>
+                    <w:spacing w:after="0"/>
+                    <w:jc w:val="center"/>
+                  </w:pPr>
+                  <w:r>
+                    <w:rPr>
+                      <w:rFonts w:ascii="Trade Gothic Next" w:hAnsi="Trade Gothic Next"/>
+                      <w:b w:val="0"/>
+                      <w:color w:val="55604F"/>
+                      <w:sz w:val="16"/>
+                      <w:u w:val="none"/>
+                    </w:rPr>
+                    <w:t>Selenium</w:t>
+                  </w:r>
+                </w:p>
+              </w:tc>
+            </w:tr>
+          </w:tbl>
+          <w:p>
+            <w:pPr>
+              <w:spacing w:before="0" w:after="0" w:line="20" w:lineRule="exact"/>
+            </w:pPr>
+          </w:p>
+        </w:tc>
+        <w:tc>
+          <w:tcPr>
+            <w:tcW w:type="dxa" w:w="8640"/>
+            <w:vAlign w:val="center"/>
+            <w:tcMar>
+              <w:top w:w="10" w:type="dxa"/>
               <w:left w:w="60" w:type="dxa"/>
               <w:bottom w:w="10" w:type="dxa"/>
               <w:right w:w="60" w:type="dxa"/>
@@ -2054,158 +1814,135 @@
           </w:tcPr>
           <w:p>
             <w:pPr>
-              <w:keepNext/>
               <w:spacing w:after="0"/>
               <w:jc w:val="left"/>
+              <w:spacing w:before="0" w:after="0" w:line="20" w:lineRule="exact"/>
             </w:pPr>
-            <w:r>
-              <w:rPr>
-                <w:rFonts w:ascii="Trade Gothic Next" w:hAnsi="Trade Gothic Next"/>
-                <w:b/>
-                <w:color w:val="14161B"/>
-                <w:sz w:val="21"/>
-                <w:u w:val="none"/>
-              </w:rPr>
-              <w:t>Phosphorus, P</w:t>
-            </w:r>
-            <w:r>
-              <w:rPr>
-                <w:rFonts w:ascii="Trade Gothic Next" w:hAnsi="Trade Gothic Next"/>
-                <w:b w:val="0"/>
-                <w:color w:val="55604F"/>
-                <w:sz w:val="16"/>
-                <w:u w:val="none"/>
-              </w:rPr>
-              <w:t xml:space="preserve">     4 pts: 2 configuration, 2 diagram</w:t>
-            </w:r>
           </w:p>
-        </w:tc>
-      </w:tr>
-      <w:tr>
-        <w:trPr>
-          <w:cantSplit/>
-        </w:trPr>
-        <w:tc>
-          <w:tcPr>
-            <w:tcW w:type="dxa" w:w="648"/>
-            <w:vMerge/>
-          </w:tcPr>
-          <w:p/>
-        </w:tc>
-        <w:tc>
-          <w:tcPr>
-            <w:tcW w:type="dxa" w:w="2520"/>
-            <w:vAlign w:val="center"/>
-            <w:tcMar>
-              <w:top w:w="40" w:type="dxa"/>
-              <w:left w:w="60" w:type="dxa"/>
-              <w:bottom w:w="40" w:type="dxa"/>
-              <w:right w:w="60" w:type="dxa"/>
-            </w:tcMar>
-          </w:tcPr>
+          <w:tbl>
+            <w:tblPr>
+              <w:tblW w:type="auto" w:w="0"/>
+              <w:tblLayout w:type="fixed"/>
+              <w:tblLook w:firstColumn="1" w:firstRow="1" w:lastColumn="0" w:lastRow="0" w:noHBand="0" w:noVBand="1" w:val="04A0"/>
+              <w:tblLayout w:type="fixed"/>
+            </w:tblPr>
+            <w:tblGrid>
+              <w:gridCol w:w="2232"/>
+              <w:gridCol w:w="6264"/>
+            </w:tblGrid>
+            <w:tr>
+              <w:trPr>
+                <w:cantSplit/>
+                <w:trHeight w:val="518" w:hRule="atLeast"/>
+              </w:trPr>
+              <w:tc>
+                <w:tcPr>
+                  <w:tcW w:type="dxa" w:w="2232"/>
+                  <w:vAlign w:val="bottom"/>
+                  <w:tcMar>
+                    <w:top w:w="0" w:type="dxa"/>
+                    <w:left w:w="0" w:type="dxa"/>
+                    <w:bottom w:w="10" w:type="dxa"/>
+                    <w:right w:w="0" w:type="dxa"/>
+                  </w:tcMar>
+                </w:tcPr>
+                <w:p>
+                  <w:pPr>
+                    <w:spacing w:after="0"/>
+                  </w:pPr>
+                  <w:r>
+                    <w:rPr>
+                      <w:rFonts w:ascii="Trade Gothic Next" w:hAnsi="Trade Gothic Next"/>
+                      <w:b/>
+                      <w:color w:val="14161B"/>
+                      <w:sz w:val="18"/>
+                      <w:u w:val="none"/>
+                    </w:rPr>
+                    <w:t>Electron configuration</w:t>
+                  </w:r>
+                </w:p>
+              </w:tc>
+              <w:tc>
+                <w:tcPr>
+                  <w:tcW w:type="dxa" w:w="6264"/>
+                  <w:vAlign w:val="bottom"/>
+                  <w:tcMar>
+                    <w:top w:w="0" w:type="dxa"/>
+                    <w:left w:w="0" w:type="dxa"/>
+                    <w:bottom w:w="10" w:type="dxa"/>
+                    <w:right w:w="0" w:type="dxa"/>
+                  </w:tcMar>
+                  <w:tcBorders>
+                    <w:bottom w:val="single" w:sz="6" w:color="C8CDC2"/>
+                  </w:tcBorders>
+                </w:tcPr>
+                <w:p>
+                  <w:pPr>
+                    <w:spacing w:after="0"/>
+                  </w:pPr>
+                </w:p>
+              </w:tc>
+            </w:tr>
+          </w:tbl>
           <w:p>
             <w:pPr>
-              <w:keepNext/>
-              <w:spacing w:after="0"/>
-              <w:jc w:val="left"/>
+              <w:spacing w:before="0" w:after="0" w:line="20" w:lineRule="exact"/>
             </w:pPr>
-            <w:r>
-              <w:rPr>
-                <w:rFonts w:ascii="Trade Gothic Next" w:hAnsi="Trade Gothic Next"/>
-                <w:b/>
-                <w:color w:val="14161B"/>
-                <w:sz w:val="18"/>
-                <w:u w:val="none"/>
-              </w:rPr>
-              <w:t>Electron configuration</w:t>
-            </w:r>
           </w:p>
-        </w:tc>
-        <w:tc>
-          <w:tcPr>
-            <w:tcW w:type="dxa" w:w="7632"/>
-            <w:vAlign w:val="center"/>
-            <w:tcMar>
-              <w:top w:w="40" w:type="dxa"/>
-              <w:left w:w="60" w:type="dxa"/>
-              <w:bottom w:w="40" w:type="dxa"/>
-              <w:right w:w="60" w:type="dxa"/>
-            </w:tcMar>
-            <w:tcBorders>
-              <w:bottom w:val="single" w:sz="4" w:color="C8CDC2"/>
-            </w:tcBorders>
-          </w:tcPr>
+          <w:tbl>
+            <w:tblPr>
+              <w:tblW w:type="auto" w:w="0"/>
+              <w:tblLayout w:type="fixed"/>
+              <w:tblLook w:firstColumn="1" w:firstRow="1" w:lastColumn="0" w:lastRow="0" w:noHBand="0" w:noVBand="1" w:val="04A0"/>
+              <w:tblLayout w:type="fixed"/>
+            </w:tblPr>
+            <w:tblGrid>
+              <w:gridCol w:w="8496"/>
+            </w:tblGrid>
+            <w:tr>
+              <w:trPr>
+                <w:cantSplit/>
+                <w:trHeight w:val="1036" w:hRule="atLeast"/>
+              </w:trPr>
+              <w:tc>
+                <w:tcPr>
+                  <w:tcW w:type="dxa" w:w="8496"/>
+                  <w:tcBorders>
+                    <w:top w:val="single" w:sz="6" w:color="C8CDC2"/>
+                    <w:left w:val="single" w:sz="6" w:color="C8CDC2"/>
+                    <w:bottom w:val="single" w:sz="6" w:color="C8CDC2"/>
+                    <w:right w:val="single" w:sz="6" w:color="C8CDC2"/>
+                  </w:tcBorders>
+                  <w:vAlign w:val="center"/>
+                  <w:tcMar>
+                    <w:top w:w="20" w:type="dxa"/>
+                    <w:left w:w="60" w:type="dxa"/>
+                    <w:bottom w:w="20" w:type="dxa"/>
+                    <w:right w:w="60" w:type="dxa"/>
+                  </w:tcMar>
+                </w:tcPr>
+                <w:p>
+                  <w:pPr>
+                    <w:spacing w:after="0"/>
+                    <w:jc w:val="left"/>
+                  </w:pPr>
+                  <w:r>
+                    <w:rPr>
+                      <w:rFonts w:ascii="Trade Gothic Next" w:hAnsi="Trade Gothic Next"/>
+                      <w:b/>
+                      <w:color w:val="55604F"/>
+                      <w:sz w:val="15"/>
+                      <w:u w:val="none"/>
+                    </w:rPr>
+                    <w:t>ORBITAL DIAGRAM</w:t>
+                  </w:r>
+                </w:p>
+              </w:tc>
+            </w:tr>
+          </w:tbl>
           <w:p>
             <w:pPr>
-              <w:spacing w:after="0"/>
-              <w:jc w:val="left"/>
-            </w:pPr>
-          </w:p>
-        </w:tc>
-      </w:tr>
-      <w:tr>
-        <w:trPr>
-          <w:cantSplit/>
-          <w:cantSplit/>
-          <w:trHeight w:val="1224" w:hRule="atLeast"/>
-        </w:trPr>
-        <w:tc>
-          <w:tcPr>
-            <w:tcW w:type="dxa" w:w="648"/>
-            <w:vMerge/>
-          </w:tcPr>
-          <w:p/>
-        </w:tc>
-        <w:tc>
-          <w:tcPr>
-            <w:tcW w:type="dxa" w:w="2520"/>
-            <w:vAlign w:val="center"/>
-            <w:tcMar>
-              <w:top w:w="40" w:type="dxa"/>
-              <w:left w:w="60" w:type="dxa"/>
-              <w:bottom w:w="40" w:type="dxa"/>
-              <w:right w:w="60" w:type="dxa"/>
-            </w:tcMar>
-          </w:tcPr>
-          <w:p>
-            <w:pPr>
-              <w:keepNext w:val="0"/>
-              <w:spacing w:after="0"/>
-              <w:jc w:val="left"/>
-            </w:pPr>
-            <w:r>
-              <w:rPr>
-                <w:rFonts w:ascii="Trade Gothic Next" w:hAnsi="Trade Gothic Next"/>
-                <w:b/>
-                <w:color w:val="14161B"/>
-                <w:sz w:val="18"/>
-                <w:u w:val="none"/>
-              </w:rPr>
-              <w:t>Orbital diagram</w:t>
-            </w:r>
-          </w:p>
-        </w:tc>
-        <w:tc>
-          <w:tcPr>
-            <w:tcW w:type="dxa" w:w="7632"/>
-            <w:vAlign w:val="center"/>
-            <w:tcMar>
-              <w:top w:w="40" w:type="dxa"/>
-              <w:left w:w="60" w:type="dxa"/>
-              <w:bottom w:w="40" w:type="dxa"/>
-              <w:right w:w="60" w:type="dxa"/>
-            </w:tcMar>
-            <w:tcBorders>
-              <w:top w:val="single" w:sz="4" w:color="C8CDC2"/>
-              <w:left w:val="single" w:sz="4" w:color="C8CDC2"/>
-              <w:bottom w:val="single" w:sz="4" w:color="C8CDC2"/>
-              <w:right w:val="single" w:sz="4" w:color="C8CDC2"/>
-            </w:tcBorders>
-          </w:tcPr>
-          <w:p>
-            <w:pPr>
-              <w:spacing w:after="0"/>
-              <w:jc w:val="left"/>
+              <w:spacing w:before="0" w:after="0" w:line="20" w:lineRule="exact"/>
             </w:pPr>
           </w:p>
         </w:tc>
@@ -2213,7 +1950,7 @@
     </w:tbl>
     <w:p>
       <w:pPr>
-        <w:spacing w:before="0" w:after="0" w:line="40" w:lineRule="exact"/>
+        <w:spacing w:before="0" w:after="0" w:line="60" w:lineRule="exact"/>
       </w:pPr>
       <w:r>
         <w:rPr>
@@ -2222,6 +1959,303 @@
         </w:rPr>
       </w:r>
     </w:p>
+    <w:tbl>
+      <w:tblPr>
+        <w:tblW w:type="auto" w:w="0"/>
+        <w:tblLayout w:type="fixed"/>
+        <w:tblLook w:firstColumn="1" w:firstRow="1" w:lastColumn="0" w:lastRow="0" w:noHBand="0" w:noVBand="1" w:val="04A0"/>
+        <w:tblLayout w:type="fixed"/>
+      </w:tblPr>
+      <w:tblGrid>
+        <w:gridCol w:w="648"/>
+        <w:gridCol w:w="1512"/>
+        <w:gridCol w:w="8640"/>
+      </w:tblGrid>
+      <w:tr>
+        <w:trPr>
+          <w:cantSplit/>
+        </w:trPr>
+        <w:tc>
+          <w:tcPr>
+            <w:tcW w:type="dxa" w:w="648"/>
+            <w:vAlign w:val="center"/>
+            <w:tcMar>
+              <w:top w:w="40" w:type="dxa"/>
+              <w:left w:w="20" w:type="dxa"/>
+              <w:bottom w:w="40" w:type="dxa"/>
+              <w:right w:w="20" w:type="dxa"/>
+            </w:tcMar>
+          </w:tcPr>
+          <w:p>
+            <w:pPr>
+              <w:spacing w:after="0"/>
+              <w:jc w:val="left"/>
+            </w:pPr>
+            <w:r>
+              <w:rPr>
+                <w:rFonts w:ascii="Trade Gothic Next" w:hAnsi="Trade Gothic Next"/>
+                <w:b/>
+                <w:color w:val="4D730E"/>
+                <w:sz w:val="26"/>
+                <w:u w:val="none"/>
+              </w:rPr>
+              <w:t>5</w:t>
+            </w:r>
+          </w:p>
+        </w:tc>
+        <w:tc>
+          <w:tcPr>
+            <w:tcW w:type="dxa" w:w="1512"/>
+            <w:vAlign w:val="center"/>
+            <w:tcMar>
+              <w:top w:w="40" w:type="dxa"/>
+              <w:left w:w="0" w:type="dxa"/>
+              <w:bottom w:w="40" w:type="dxa"/>
+              <w:right w:w="60" w:type="dxa"/>
+            </w:tcMar>
+          </w:tcPr>
+          <w:p>
+            <w:pPr>
+              <w:spacing w:after="0"/>
+              <w:jc w:val="left"/>
+              <w:spacing w:before="0" w:after="0" w:line="20" w:lineRule="exact"/>
+            </w:pPr>
+          </w:p>
+          <w:tbl>
+            <w:tblPr>
+              <w:tblW w:type="auto" w:w="0"/>
+              <w:tblLayout w:type="fixed"/>
+              <w:tblLook w:firstColumn="1" w:firstRow="1" w:lastColumn="0" w:lastRow="0" w:noHBand="0" w:noVBand="1" w:val="04A0"/>
+              <w:tblLayout w:type="fixed"/>
+            </w:tblPr>
+            <w:tblGrid>
+              <w:gridCol w:w="1238"/>
+            </w:tblGrid>
+            <w:tr>
+              <w:trPr>
+                <w:cantSplit/>
+                <w:trHeight w:val="1238" w:hRule="atLeast"/>
+              </w:trPr>
+              <w:tc>
+                <w:tcPr>
+                  <w:tcW w:type="dxa" w:w="1238"/>
+                  <w:tcBorders>
+                    <w:top w:val="single" w:sz="12" w:color="A3E635"/>
+                    <w:left w:val="single" w:sz="12" w:color="A3E635"/>
+                    <w:bottom w:val="single" w:sz="12" w:color="A3E635"/>
+                    <w:right w:val="single" w:sz="12" w:color="A3E635"/>
+                  </w:tcBorders>
+                  <w:tcMar>
+                    <w:top w:w="20" w:type="dxa"/>
+                    <w:left w:w="50" w:type="dxa"/>
+                    <w:bottom w:w="20" w:type="dxa"/>
+                    <w:right w:w="40" w:type="dxa"/>
+                  </w:tcMar>
+                  <w:vAlign w:val="center"/>
+                </w:tcPr>
+                <w:p>
+                  <w:pPr>
+                    <w:spacing w:after="0"/>
+                  </w:pPr>
+                  <w:r>
+                    <w:rPr>
+                      <w:rFonts w:ascii="Trade Gothic Next" w:hAnsi="Trade Gothic Next"/>
+                      <w:b/>
+                      <w:color w:val="55604F"/>
+                      <w:sz w:val="16"/>
+                      <w:u w:val="none"/>
+                    </w:rPr>
+                    <w:t>15</w:t>
+                  </w:r>
+                </w:p>
+                <w:p>
+                  <w:pPr>
+                    <w:spacing w:after="0"/>
+                    <w:jc w:val="center"/>
+                  </w:pPr>
+                  <w:r>
+                    <w:rPr>
+                      <w:rFonts w:ascii="Trade Gothic Next" w:hAnsi="Trade Gothic Next"/>
+                      <w:b/>
+                      <w:color w:val="14161B"/>
+                      <w:sz w:val="40"/>
+                      <w:u w:val="none"/>
+                    </w:rPr>
+                    <w:t>P</w:t>
+                  </w:r>
+                </w:p>
+                <w:p>
+                  <w:pPr>
+                    <w:spacing w:after="0"/>
+                    <w:jc w:val="center"/>
+                  </w:pPr>
+                  <w:r>
+                    <w:rPr>
+                      <w:rFonts w:ascii="Trade Gothic Next" w:hAnsi="Trade Gothic Next"/>
+                      <w:b w:val="0"/>
+                      <w:color w:val="55604F"/>
+                      <w:sz w:val="16"/>
+                      <w:u w:val="none"/>
+                    </w:rPr>
+                    <w:t>Phosphorus</w:t>
+                  </w:r>
+                </w:p>
+              </w:tc>
+            </w:tr>
+          </w:tbl>
+          <w:p>
+            <w:pPr>
+              <w:spacing w:before="0" w:after="0" w:line="20" w:lineRule="exact"/>
+            </w:pPr>
+          </w:p>
+        </w:tc>
+        <w:tc>
+          <w:tcPr>
+            <w:tcW w:type="dxa" w:w="8640"/>
+            <w:vAlign w:val="center"/>
+            <w:tcMar>
+              <w:top w:w="10" w:type="dxa"/>
+              <w:left w:w="60" w:type="dxa"/>
+              <w:bottom w:w="10" w:type="dxa"/>
+              <w:right w:w="60" w:type="dxa"/>
+            </w:tcMar>
+          </w:tcPr>
+          <w:p>
+            <w:pPr>
+              <w:spacing w:after="0"/>
+              <w:jc w:val="left"/>
+              <w:spacing w:before="0" w:after="0" w:line="20" w:lineRule="exact"/>
+            </w:pPr>
+          </w:p>
+          <w:tbl>
+            <w:tblPr>
+              <w:tblW w:type="auto" w:w="0"/>
+              <w:tblLayout w:type="fixed"/>
+              <w:tblLook w:firstColumn="1" w:firstRow="1" w:lastColumn="0" w:lastRow="0" w:noHBand="0" w:noVBand="1" w:val="04A0"/>
+              <w:tblLayout w:type="fixed"/>
+            </w:tblPr>
+            <w:tblGrid>
+              <w:gridCol w:w="2232"/>
+              <w:gridCol w:w="6264"/>
+            </w:tblGrid>
+            <w:tr>
+              <w:trPr>
+                <w:cantSplit/>
+                <w:trHeight w:val="518" w:hRule="atLeast"/>
+              </w:trPr>
+              <w:tc>
+                <w:tcPr>
+                  <w:tcW w:type="dxa" w:w="2232"/>
+                  <w:vAlign w:val="bottom"/>
+                  <w:tcMar>
+                    <w:top w:w="0" w:type="dxa"/>
+                    <w:left w:w="0" w:type="dxa"/>
+                    <w:bottom w:w="10" w:type="dxa"/>
+                    <w:right w:w="0" w:type="dxa"/>
+                  </w:tcMar>
+                </w:tcPr>
+                <w:p>
+                  <w:pPr>
+                    <w:spacing w:after="0"/>
+                  </w:pPr>
+                  <w:r>
+                    <w:rPr>
+                      <w:rFonts w:ascii="Trade Gothic Next" w:hAnsi="Trade Gothic Next"/>
+                      <w:b/>
+                      <w:color w:val="14161B"/>
+                      <w:sz w:val="18"/>
+                      <w:u w:val="none"/>
+                    </w:rPr>
+                    <w:t>Electron configuration</w:t>
+                  </w:r>
+                </w:p>
+              </w:tc>
+              <w:tc>
+                <w:tcPr>
+                  <w:tcW w:type="dxa" w:w="6264"/>
+                  <w:vAlign w:val="bottom"/>
+                  <w:tcMar>
+                    <w:top w:w="0" w:type="dxa"/>
+                    <w:left w:w="0" w:type="dxa"/>
+                    <w:bottom w:w="10" w:type="dxa"/>
+                    <w:right w:w="0" w:type="dxa"/>
+                  </w:tcMar>
+                  <w:tcBorders>
+                    <w:bottom w:val="single" w:sz="6" w:color="C8CDC2"/>
+                  </w:tcBorders>
+                </w:tcPr>
+                <w:p>
+                  <w:pPr>
+                    <w:spacing w:after="0"/>
+                  </w:pPr>
+                </w:p>
+              </w:tc>
+            </w:tr>
+          </w:tbl>
+          <w:p>
+            <w:pPr>
+              <w:spacing w:before="0" w:after="0" w:line="20" w:lineRule="exact"/>
+            </w:pPr>
+          </w:p>
+          <w:tbl>
+            <w:tblPr>
+              <w:tblW w:type="auto" w:w="0"/>
+              <w:tblLayout w:type="fixed"/>
+              <w:tblLook w:firstColumn="1" w:firstRow="1" w:lastColumn="0" w:lastRow="0" w:noHBand="0" w:noVBand="1" w:val="04A0"/>
+              <w:tblLayout w:type="fixed"/>
+            </w:tblPr>
+            <w:tblGrid>
+              <w:gridCol w:w="8496"/>
+            </w:tblGrid>
+            <w:tr>
+              <w:trPr>
+                <w:cantSplit/>
+                <w:trHeight w:val="1036" w:hRule="atLeast"/>
+              </w:trPr>
+              <w:tc>
+                <w:tcPr>
+                  <w:tcW w:type="dxa" w:w="8496"/>
+                  <w:tcBorders>
+                    <w:top w:val="single" w:sz="6" w:color="C8CDC2"/>
+                    <w:left w:val="single" w:sz="6" w:color="C8CDC2"/>
+                    <w:bottom w:val="single" w:sz="6" w:color="C8CDC2"/>
+                    <w:right w:val="single" w:sz="6" w:color="C8CDC2"/>
+                  </w:tcBorders>
+                  <w:vAlign w:val="center"/>
+                  <w:tcMar>
+                    <w:top w:w="20" w:type="dxa"/>
+                    <w:left w:w="60" w:type="dxa"/>
+                    <w:bottom w:w="20" w:type="dxa"/>
+                    <w:right w:w="60" w:type="dxa"/>
+                  </w:tcMar>
+                </w:tcPr>
+                <w:p>
+                  <w:pPr>
+                    <w:spacing w:after="0"/>
+                    <w:jc w:val="left"/>
+                  </w:pPr>
+                  <w:r>
+                    <w:rPr>
+                      <w:rFonts w:ascii="Trade Gothic Next" w:hAnsi="Trade Gothic Next"/>
+                      <w:b/>
+                      <w:color w:val="55604F"/>
+                      <w:sz w:val="15"/>
+                      <w:u w:val="none"/>
+                    </w:rPr>
+                    <w:t>ORBITAL DIAGRAM</w:t>
+                  </w:r>
+                </w:p>
+              </w:tc>
+            </w:tr>
+          </w:tbl>
+          <w:p>
+            <w:pPr>
+              <w:spacing w:before="0" w:after="0" w:line="20" w:lineRule="exact"/>
+            </w:pPr>
+          </w:p>
+        </w:tc>
+      </w:tr>
+    </w:tbl>
     <w:p>
       <w:pPr>
         <w:spacing w:before="0" w:after="0" w:line="120" w:lineRule="exact"/>
@@ -2313,6 +2347,17 @@
         </w:tc>
       </w:tr>
     </w:tbl>
+    <w:p>
+      <w:pPr>
+        <w:spacing w:before="0" w:after="0" w:line="60" w:lineRule="exact"/>
+      </w:pPr>
+      <w:r>
+        <w:rPr>
+          <w:rFonts w:ascii="Trade Gothic Next" w:hAnsi="Trade Gothic Next"/>
+          <w:sz w:val="2"/>
+        </w:rPr>
+      </w:r>
+    </w:p>
     <w:tbl>
       <w:tblPr>
         <w:tblW w:type="auto" w:w="0"/>
@@ -2322,13 +2367,12 @@
       </w:tblPr>
       <w:tblGrid>
         <w:gridCol w:w="648"/>
-        <w:gridCol w:w="2520"/>
-        <w:gridCol w:w="7632"/>
+        <w:gridCol w:w="1512"/>
+        <w:gridCol w:w="8640"/>
       </w:tblGrid>
       <w:tr>
         <w:trPr>
           <w:cantSplit/>
-          <w:trHeight w:val="648" w:hRule="atLeast"/>
         </w:trPr>
         <w:tc>
           <w:tcPr>
@@ -2336,13 +2380,10 @@
             <w:vAlign w:val="center"/>
             <w:tcMar>
               <w:top w:w="40" w:type="dxa"/>
-              <w:left w:w="60" w:type="dxa"/>
+              <w:left w:w="20" w:type="dxa"/>
               <w:bottom w:w="40" w:type="dxa"/>
-              <w:right w:w="60" w:type="dxa"/>
+              <w:right w:w="20" w:type="dxa"/>
             </w:tcMar>
-            <w:tcBorders>
-              <w:bottom w:val="single" w:sz="4" w:color="C8CDC2"/>
-            </w:tcBorders>
           </w:tcPr>
           <w:p>
             <w:pPr>
@@ -2354,70 +2395,220 @@
                 <w:rFonts w:ascii="Trade Gothic Next" w:hAnsi="Trade Gothic Next"/>
                 <w:b/>
                 <w:color w:val="4D730E"/>
-                <w:sz w:val="22"/>
+                <w:sz w:val="26"/>
                 <w:u w:val="none"/>
               </w:rPr>
-              <w:t>8</w:t>
+              <w:t>6</w:t>
             </w:r>
           </w:p>
         </w:tc>
         <w:tc>
           <w:tcPr>
-            <w:tcW w:type="dxa" w:w="2520"/>
+            <w:tcW w:type="dxa" w:w="1512"/>
             <w:vAlign w:val="center"/>
             <w:tcMar>
               <w:top w:w="40" w:type="dxa"/>
-              <w:left w:w="60" w:type="dxa"/>
+              <w:left w:w="0" w:type="dxa"/>
               <w:bottom w:w="40" w:type="dxa"/>
               <w:right w:w="60" w:type="dxa"/>
             </w:tcMar>
-            <w:tcBorders>
-              <w:bottom w:val="single" w:sz="4" w:color="C8CDC2"/>
-            </w:tcBorders>
           </w:tcPr>
           <w:p>
             <w:pPr>
               <w:spacing w:after="0"/>
               <w:jc w:val="left"/>
+              <w:spacing w:before="0" w:after="0" w:line="20" w:lineRule="exact"/>
             </w:pPr>
-            <w:r>
-              <w:rPr>
-                <w:rFonts w:ascii="Trade Gothic Next" w:hAnsi="Trade Gothic Next"/>
-                <w:b/>
-                <w:color w:val="14161B"/>
-                <w:sz w:val="21"/>
-                <w:u w:val="none"/>
-              </w:rPr>
-              <w:t>Iron, Fe</w:t>
-            </w:r>
+          </w:p>
+          <w:tbl>
+            <w:tblPr>
+              <w:tblW w:type="auto" w:w="0"/>
+              <w:tblLayout w:type="fixed"/>
+              <w:tblLook w:firstColumn="1" w:firstRow="1" w:lastColumn="0" w:lastRow="0" w:noHBand="0" w:noVBand="1" w:val="04A0"/>
+              <w:tblLayout w:type="fixed"/>
+            </w:tblPr>
+            <w:tblGrid>
+              <w:gridCol w:w="1008"/>
+            </w:tblGrid>
+            <w:tr>
+              <w:trPr>
+                <w:cantSplit/>
+                <w:trHeight w:val="892" w:hRule="atLeast"/>
+              </w:trPr>
+              <w:tc>
+                <w:tcPr>
+                  <w:tcW w:type="dxa" w:w="1008"/>
+                  <w:tcBorders>
+                    <w:top w:val="single" w:sz="12" w:color="A3E635"/>
+                    <w:left w:val="single" w:sz="12" w:color="A3E635"/>
+                    <w:bottom w:val="single" w:sz="12" w:color="A3E635"/>
+                    <w:right w:val="single" w:sz="12" w:color="A3E635"/>
+                  </w:tcBorders>
+                  <w:tcMar>
+                    <w:top w:w="20" w:type="dxa"/>
+                    <w:left w:w="50" w:type="dxa"/>
+                    <w:bottom w:w="20" w:type="dxa"/>
+                    <w:right w:w="40" w:type="dxa"/>
+                  </w:tcMar>
+                  <w:vAlign w:val="center"/>
+                </w:tcPr>
+                <w:p>
+                  <w:pPr>
+                    <w:spacing w:after="0"/>
+                  </w:pPr>
+                  <w:r>
+                    <w:rPr>
+                      <w:rFonts w:ascii="Trade Gothic Next" w:hAnsi="Trade Gothic Next"/>
+                      <w:b/>
+                      <w:color w:val="55604F"/>
+                      <w:sz w:val="16"/>
+                      <w:u w:val="none"/>
+                    </w:rPr>
+                    <w:t>26</w:t>
+                  </w:r>
+                </w:p>
+                <w:p>
+                  <w:pPr>
+                    <w:spacing w:after="0"/>
+                    <w:jc w:val="center"/>
+                  </w:pPr>
+                  <w:r>
+                    <w:rPr>
+                      <w:rFonts w:ascii="Trade Gothic Next" w:hAnsi="Trade Gothic Next"/>
+                      <w:b/>
+                      <w:color w:val="14161B"/>
+                      <w:sz w:val="32"/>
+                      <w:u w:val="none"/>
+                    </w:rPr>
+                    <w:t>Fe</w:t>
+                  </w:r>
+                </w:p>
+              </w:tc>
+            </w:tr>
+          </w:tbl>
+          <w:p>
+            <w:pPr>
+              <w:spacing w:before="0" w:after="0" w:line="20" w:lineRule="exact"/>
+            </w:pPr>
           </w:p>
         </w:tc>
         <w:tc>
           <w:tcPr>
-            <w:tcW w:type="dxa" w:w="7632"/>
+            <w:tcW w:type="dxa" w:w="8640"/>
             <w:vAlign w:val="center"/>
             <w:tcMar>
-              <w:top w:w="40" w:type="dxa"/>
+              <w:top w:w="10" w:type="dxa"/>
               <w:left w:w="60" w:type="dxa"/>
-              <w:bottom w:w="40" w:type="dxa"/>
+              <w:bottom w:w="10" w:type="dxa"/>
               <w:right w:w="60" w:type="dxa"/>
             </w:tcMar>
-            <w:tcBorders>
-              <w:bottom w:val="single" w:sz="4" w:color="C8CDC2"/>
-            </w:tcBorders>
           </w:tcPr>
           <w:p>
             <w:pPr>
               <w:spacing w:after="0"/>
               <w:jc w:val="left"/>
+              <w:spacing w:before="0" w:after="0" w:line="20" w:lineRule="exact"/>
+            </w:pPr>
+          </w:p>
+          <w:tbl>
+            <w:tblPr>
+              <w:tblW w:type="auto" w:w="0"/>
+              <w:tblLayout w:type="fixed"/>
+              <w:tblLook w:firstColumn="1" w:firstRow="1" w:lastColumn="0" w:lastRow="0" w:noHBand="0" w:noVBand="1" w:val="04A0"/>
+              <w:tblLayout w:type="fixed"/>
+            </w:tblPr>
+            <w:tblGrid>
+              <w:gridCol w:w="1440"/>
+              <w:gridCol w:w="7056"/>
+            </w:tblGrid>
+            <w:tr>
+              <w:trPr>
+                <w:cantSplit/>
+                <w:trHeight w:val="633" w:hRule="atLeast"/>
+              </w:trPr>
+              <w:tc>
+                <w:tcPr>
+                  <w:tcW w:type="dxa" w:w="1440"/>
+                  <w:vAlign w:val="bottom"/>
+                  <w:tcMar>
+                    <w:top w:w="0" w:type="dxa"/>
+                    <w:left w:w="0" w:type="dxa"/>
+                    <w:bottom w:w="10" w:type="dxa"/>
+                    <w:right w:w="0" w:type="dxa"/>
+                  </w:tcMar>
+                </w:tcPr>
+                <w:p>
+                  <w:pPr>
+                    <w:spacing w:after="0"/>
+                  </w:pPr>
+                  <w:r>
+                    <w:rPr>
+                      <w:rFonts w:ascii="Trade Gothic Next" w:hAnsi="Trade Gothic Next"/>
+                      <w:b/>
+                      <w:color w:val="14161B"/>
+                      <w:sz w:val="18"/>
+                      <w:u w:val="none"/>
+                    </w:rPr>
+                    <w:t>Shorthand</w:t>
+                  </w:r>
+                </w:p>
+              </w:tc>
+              <w:tc>
+                <w:tcPr>
+                  <w:tcW w:type="dxa" w:w="7056"/>
+                  <w:vAlign w:val="bottom"/>
+                  <w:tcMar>
+                    <w:top w:w="0" w:type="dxa"/>
+                    <w:left w:w="0" w:type="dxa"/>
+                    <w:bottom w:w="10" w:type="dxa"/>
+                    <w:right w:w="0" w:type="dxa"/>
+                  </w:tcMar>
+                  <w:tcBorders>
+                    <w:bottom w:val="single" w:sz="6" w:color="C8CDC2"/>
+                  </w:tcBorders>
+                </w:tcPr>
+                <w:p>
+                  <w:pPr>
+                    <w:spacing w:after="0"/>
+                  </w:pPr>
+                </w:p>
+              </w:tc>
+            </w:tr>
+          </w:tbl>
+          <w:p>
+            <w:pPr>
+              <w:spacing w:before="0" w:after="0" w:line="20" w:lineRule="exact"/>
             </w:pPr>
           </w:p>
         </w:tc>
       </w:tr>
+    </w:tbl>
+    <w:p>
+      <w:pPr>
+        <w:spacing w:before="0" w:after="0" w:line="60" w:lineRule="exact"/>
+      </w:pPr>
+      <w:r>
+        <w:rPr>
+          <w:rFonts w:ascii="Trade Gothic Next" w:hAnsi="Trade Gothic Next"/>
+          <w:sz w:val="2"/>
+        </w:rPr>
+      </w:r>
+    </w:p>
+    <w:tbl>
+      <w:tblPr>
+        <w:tblW w:type="auto" w:w="0"/>
+        <w:tblLayout w:type="fixed"/>
+        <w:tblLook w:firstColumn="1" w:firstRow="1" w:lastColumn="0" w:lastRow="0" w:noHBand="0" w:noVBand="1" w:val="04A0"/>
+        <w:tblLayout w:type="fixed"/>
+      </w:tblPr>
+      <w:tblGrid>
+        <w:gridCol w:w="648"/>
+        <w:gridCol w:w="1512"/>
+        <w:gridCol w:w="8640"/>
+      </w:tblGrid>
       <w:tr>
         <w:trPr>
           <w:cantSplit/>
-          <w:trHeight w:val="648" w:hRule="atLeast"/>
         </w:trPr>
         <w:tc>
           <w:tcPr>
@@ -2425,13 +2616,10 @@
             <w:vAlign w:val="center"/>
             <w:tcMar>
               <w:top w:w="40" w:type="dxa"/>
-              <w:left w:w="60" w:type="dxa"/>
+              <w:left w:w="20" w:type="dxa"/>
               <w:bottom w:w="40" w:type="dxa"/>
-              <w:right w:w="60" w:type="dxa"/>
+              <w:right w:w="20" w:type="dxa"/>
             </w:tcMar>
-            <w:tcBorders>
-              <w:bottom w:val="single" w:sz="4" w:color="C8CDC2"/>
-            </w:tcBorders>
           </w:tcPr>
           <w:p>
             <w:pPr>
@@ -2443,62 +2631,189 @@
                 <w:rFonts w:ascii="Trade Gothic Next" w:hAnsi="Trade Gothic Next"/>
                 <w:b/>
                 <w:color w:val="4D730E"/>
-                <w:sz w:val="22"/>
+                <w:sz w:val="26"/>
                 <w:u w:val="none"/>
               </w:rPr>
-              <w:t>9</w:t>
+              <w:t>7</w:t>
             </w:r>
           </w:p>
         </w:tc>
         <w:tc>
           <w:tcPr>
-            <w:tcW w:type="dxa" w:w="2520"/>
+            <w:tcW w:type="dxa" w:w="1512"/>
             <w:vAlign w:val="center"/>
             <w:tcMar>
               <w:top w:w="40" w:type="dxa"/>
-              <w:left w:w="60" w:type="dxa"/>
+              <w:left w:w="0" w:type="dxa"/>
               <w:bottom w:w="40" w:type="dxa"/>
               <w:right w:w="60" w:type="dxa"/>
             </w:tcMar>
-            <w:tcBorders>
-              <w:bottom w:val="single" w:sz="4" w:color="C8CDC2"/>
-            </w:tcBorders>
           </w:tcPr>
           <w:p>
             <w:pPr>
               <w:spacing w:after="0"/>
               <w:jc w:val="left"/>
+              <w:spacing w:before="0" w:after="0" w:line="20" w:lineRule="exact"/>
             </w:pPr>
-            <w:r>
-              <w:rPr>
-                <w:rFonts w:ascii="Trade Gothic Next" w:hAnsi="Trade Gothic Next"/>
-                <w:b/>
-                <w:color w:val="14161B"/>
-                <w:sz w:val="21"/>
-                <w:u w:val="none"/>
-              </w:rPr>
-              <w:t>Tin, Sn</w:t>
-            </w:r>
+          </w:p>
+          <w:tbl>
+            <w:tblPr>
+              <w:tblW w:type="auto" w:w="0"/>
+              <w:tblLayout w:type="fixed"/>
+              <w:tblLook w:firstColumn="1" w:firstRow="1" w:lastColumn="0" w:lastRow="0" w:noHBand="0" w:noVBand="1" w:val="04A0"/>
+              <w:tblLayout w:type="fixed"/>
+            </w:tblPr>
+            <w:tblGrid>
+              <w:gridCol w:w="1008"/>
+            </w:tblGrid>
+            <w:tr>
+              <w:trPr>
+                <w:cantSplit/>
+                <w:trHeight w:val="892" w:hRule="atLeast"/>
+              </w:trPr>
+              <w:tc>
+                <w:tcPr>
+                  <w:tcW w:type="dxa" w:w="1008"/>
+                  <w:tcBorders>
+                    <w:top w:val="single" w:sz="12" w:color="A3E635"/>
+                    <w:left w:val="single" w:sz="12" w:color="A3E635"/>
+                    <w:bottom w:val="single" w:sz="12" w:color="A3E635"/>
+                    <w:right w:val="single" w:sz="12" w:color="A3E635"/>
+                  </w:tcBorders>
+                  <w:tcMar>
+                    <w:top w:w="20" w:type="dxa"/>
+                    <w:left w:w="50" w:type="dxa"/>
+                    <w:bottom w:w="20" w:type="dxa"/>
+                    <w:right w:w="40" w:type="dxa"/>
+                  </w:tcMar>
+                  <w:vAlign w:val="center"/>
+                </w:tcPr>
+                <w:p>
+                  <w:pPr>
+                    <w:spacing w:after="0"/>
+                  </w:pPr>
+                  <w:r>
+                    <w:rPr>
+                      <w:rFonts w:ascii="Trade Gothic Next" w:hAnsi="Trade Gothic Next"/>
+                      <w:b/>
+                      <w:color w:val="55604F"/>
+                      <w:sz w:val="16"/>
+                      <w:u w:val="none"/>
+                    </w:rPr>
+                    <w:t>50</w:t>
+                  </w:r>
+                </w:p>
+                <w:p>
+                  <w:pPr>
+                    <w:spacing w:after="0"/>
+                    <w:jc w:val="center"/>
+                  </w:pPr>
+                  <w:r>
+                    <w:rPr>
+                      <w:rFonts w:ascii="Trade Gothic Next" w:hAnsi="Trade Gothic Next"/>
+                      <w:b/>
+                      <w:color w:val="14161B"/>
+                      <w:sz w:val="32"/>
+                      <w:u w:val="none"/>
+                    </w:rPr>
+                    <w:t>Sn</w:t>
+                  </w:r>
+                </w:p>
+              </w:tc>
+            </w:tr>
+          </w:tbl>
+          <w:p>
+            <w:pPr>
+              <w:spacing w:before="0" w:after="0" w:line="20" w:lineRule="exact"/>
+            </w:pPr>
           </w:p>
         </w:tc>
         <w:tc>
           <w:tcPr>
-            <w:tcW w:type="dxa" w:w="7632"/>
+            <w:tcW w:type="dxa" w:w="8640"/>
             <w:vAlign w:val="center"/>
             <w:tcMar>
-              <w:top w:w="40" w:type="dxa"/>
+              <w:top w:w="10" w:type="dxa"/>
               <w:left w:w="60" w:type="dxa"/>
-              <w:bottom w:w="40" w:type="dxa"/>
+              <w:bottom w:w="10" w:type="dxa"/>
               <w:right w:w="60" w:type="dxa"/>
             </w:tcMar>
-            <w:tcBorders>
-              <w:bottom w:val="single" w:sz="4" w:color="C8CDC2"/>
-            </w:tcBorders>
           </w:tcPr>
           <w:p>
             <w:pPr>
               <w:spacing w:after="0"/>
               <w:jc w:val="left"/>
+              <w:spacing w:before="0" w:after="0" w:line="20" w:lineRule="exact"/>
+            </w:pPr>
+          </w:p>
+          <w:tbl>
+            <w:tblPr>
+              <w:tblW w:type="auto" w:w="0"/>
+              <w:tblLayout w:type="fixed"/>
+              <w:tblLook w:firstColumn="1" w:firstRow="1" w:lastColumn="0" w:lastRow="0" w:noHBand="0" w:noVBand="1" w:val="04A0"/>
+              <w:tblLayout w:type="fixed"/>
+            </w:tblPr>
+            <w:tblGrid>
+              <w:gridCol w:w="1440"/>
+              <w:gridCol w:w="7056"/>
+            </w:tblGrid>
+            <w:tr>
+              <w:trPr>
+                <w:cantSplit/>
+                <w:trHeight w:val="633" w:hRule="atLeast"/>
+              </w:trPr>
+              <w:tc>
+                <w:tcPr>
+                  <w:tcW w:type="dxa" w:w="1440"/>
+                  <w:vAlign w:val="bottom"/>
+                  <w:tcMar>
+                    <w:top w:w="0" w:type="dxa"/>
+                    <w:left w:w="0" w:type="dxa"/>
+                    <w:bottom w:w="10" w:type="dxa"/>
+                    <w:right w:w="0" w:type="dxa"/>
+                  </w:tcMar>
+                </w:tcPr>
+                <w:p>
+                  <w:pPr>
+                    <w:spacing w:after="0"/>
+                  </w:pPr>
+                  <w:r>
+                    <w:rPr>
+                      <w:rFonts w:ascii="Trade Gothic Next" w:hAnsi="Trade Gothic Next"/>
+                      <w:b/>
+                      <w:color w:val="14161B"/>
+                      <w:sz w:val="18"/>
+                      <w:u w:val="none"/>
+                    </w:rPr>
+                    <w:t>Shorthand</w:t>
+                  </w:r>
+                </w:p>
+              </w:tc>
+              <w:tc>
+                <w:tcPr>
+                  <w:tcW w:type="dxa" w:w="7056"/>
+                  <w:vAlign w:val="bottom"/>
+                  <w:tcMar>
+                    <w:top w:w="0" w:type="dxa"/>
+                    <w:left w:w="0" w:type="dxa"/>
+                    <w:bottom w:w="10" w:type="dxa"/>
+                    <w:right w:w="0" w:type="dxa"/>
+                  </w:tcMar>
+                  <w:tcBorders>
+                    <w:bottom w:val="single" w:sz="6" w:color="C8CDC2"/>
+                  </w:tcBorders>
+                </w:tcPr>
+                <w:p>
+                  <w:pPr>
+                    <w:spacing w:after="0"/>
+                  </w:pPr>
+                </w:p>
+              </w:tc>
+            </w:tr>
+          </w:tbl>
+          <w:p>
+            <w:pPr>
+              <w:spacing w:before="0" w:after="0" w:line="20" w:lineRule="exact"/>
             </w:pPr>
           </w:p>
         </w:tc>
@@ -2556,7 +2871,7 @@
                 <w:sz w:val="18"/>
                 <w:u w:val="none"/>
               </w:rPr>
-              <w:t>PART 4  ·  CHARGE OF THE ION EACH ATOM FORMS</w:t>
+              <w:t>PART 4  ·  IONS:  CHARGE, AND CATION OR ANION</w:t>
             </w:r>
           </w:p>
         </w:tc>
@@ -2589,12 +2904,23 @@
                 <w:sz w:val="17"/>
                 <w:u w:val="none"/>
               </w:rPr>
-              <w:t>4 pts</w:t>
+              <w:t>8 pts</w:t>
             </w:r>
           </w:p>
         </w:tc>
       </w:tr>
     </w:tbl>
+    <w:p>
+      <w:pPr>
+        <w:spacing w:before="0" w:after="0" w:line="60" w:lineRule="exact"/>
+      </w:pPr>
+      <w:r>
+        <w:rPr>
+          <w:rFonts w:ascii="Trade Gothic Next" w:hAnsi="Trade Gothic Next"/>
+          <w:sz w:val="2"/>
+        </w:rPr>
+      </w:r>
+    </w:p>
     <w:tbl>
       <w:tblPr>
         <w:tblW w:type="auto" w:w="0"/>
@@ -2603,33 +2929,31 @@
         <w:tblLayout w:type="fixed"/>
       </w:tblPr>
       <w:tblGrid>
-        <w:gridCol w:w="648"/>
-        <w:gridCol w:w="2232"/>
-        <w:gridCol w:w="2520"/>
-        <w:gridCol w:w="648"/>
-        <w:gridCol w:w="2232"/>
-        <w:gridCol w:w="2520"/>
+        <w:gridCol w:w="2700"/>
+        <w:gridCol w:w="2700"/>
+        <w:gridCol w:w="2700"/>
+        <w:gridCol w:w="2700"/>
       </w:tblGrid>
       <w:tr>
         <w:trPr>
           <w:cantSplit/>
-          <w:trHeight w:val="648" w:hRule="atLeast"/>
-          <w:cantSplit/>
-          <w:trHeight w:val="648" w:hRule="atLeast"/>
         </w:trPr>
         <w:tc>
           <w:tcPr>
-            <w:tcW w:type="dxa" w:w="648"/>
+            <w:tcW w:type="dxa" w:w="2700"/>
+            <w:tcBorders>
+              <w:top w:val="single" w:sz="4" w:color="C8CDC2"/>
+              <w:left w:val="single" w:sz="4" w:color="C8CDC2"/>
+              <w:bottom w:val="single" w:sz="4" w:color="C8CDC2"/>
+              <w:right w:val="single" w:sz="4" w:color="C8CDC2"/>
+            </w:tcBorders>
             <w:vAlign w:val="center"/>
             <w:tcMar>
               <w:top w:w="40" w:type="dxa"/>
-              <w:left w:w="60" w:type="dxa"/>
-              <w:bottom w:w="40" w:type="dxa"/>
+              <w:left w:w="80" w:type="dxa"/>
+              <w:bottom w:w="60" w:type="dxa"/>
               <w:right w:w="60" w:type="dxa"/>
             </w:tcMar>
-            <w:tcBorders>
-              <w:bottom w:val="single" w:sz="4" w:color="C8CDC2"/>
-            </w:tcBorders>
           </w:tcPr>
           <w:p>
             <w:pPr>
@@ -2641,88 +2965,170 @@
                 <w:rFonts w:ascii="Trade Gothic Next" w:hAnsi="Trade Gothic Next"/>
                 <w:b/>
                 <w:color w:val="4D730E"/>
-                <w:sz w:val="22"/>
+                <w:sz w:val="26"/>
                 <w:u w:val="none"/>
               </w:rPr>
-              <w:t>10</w:t>
+              <w:t>8</w:t>
             </w:r>
           </w:p>
-        </w:tc>
-        <w:tc>
-          <w:tcPr>
-            <w:tcW w:type="dxa" w:w="2232"/>
-            <w:vAlign w:val="center"/>
-            <w:tcMar>
-              <w:top w:w="40" w:type="dxa"/>
-              <w:left w:w="60" w:type="dxa"/>
-              <w:bottom w:w="40" w:type="dxa"/>
-              <w:right w:w="60" w:type="dxa"/>
-            </w:tcMar>
-            <w:tcBorders>
-              <w:bottom w:val="single" w:sz="4" w:color="C8CDC2"/>
-            </w:tcBorders>
-          </w:tcPr>
+          <w:tbl>
+            <w:tblPr>
+              <w:tblW w:type="auto" w:w="0"/>
+              <w:tblLayout w:type="fixed"/>
+              <w:tblLook w:firstColumn="1" w:firstRow="1" w:lastColumn="0" w:lastRow="0" w:noHBand="0" w:noVBand="1" w:val="04A0"/>
+              <w:tblLayout w:type="fixed"/>
+            </w:tblPr>
+            <w:tblGrid>
+              <w:gridCol w:w="1008"/>
+            </w:tblGrid>
+            <w:tr>
+              <w:trPr>
+                <w:cantSplit/>
+                <w:trHeight w:val="892" w:hRule="atLeast"/>
+              </w:trPr>
+              <w:tc>
+                <w:tcPr>
+                  <w:tcW w:type="dxa" w:w="1008"/>
+                  <w:tcBorders>
+                    <w:top w:val="single" w:sz="12" w:color="A3E635"/>
+                    <w:left w:val="single" w:sz="12" w:color="A3E635"/>
+                    <w:bottom w:val="single" w:sz="12" w:color="A3E635"/>
+                    <w:right w:val="single" w:sz="12" w:color="A3E635"/>
+                  </w:tcBorders>
+                  <w:tcMar>
+                    <w:top w:w="20" w:type="dxa"/>
+                    <w:left w:w="50" w:type="dxa"/>
+                    <w:bottom w:w="20" w:type="dxa"/>
+                    <w:right w:w="40" w:type="dxa"/>
+                  </w:tcMar>
+                  <w:vAlign w:val="center"/>
+                </w:tcPr>
+                <w:p>
+                  <w:pPr>
+                    <w:spacing w:after="0"/>
+                  </w:pPr>
+                  <w:r>
+                    <w:rPr>
+                      <w:rFonts w:ascii="Trade Gothic Next" w:hAnsi="Trade Gothic Next"/>
+                      <w:b/>
+                      <w:color w:val="55604F"/>
+                      <w:sz w:val="16"/>
+                      <w:u w:val="none"/>
+                    </w:rPr>
+                    <w:t>12</w:t>
+                  </w:r>
+                </w:p>
+                <w:p>
+                  <w:pPr>
+                    <w:spacing w:after="0"/>
+                    <w:jc w:val="center"/>
+                  </w:pPr>
+                  <w:r>
+                    <w:rPr>
+                      <w:rFonts w:ascii="Trade Gothic Next" w:hAnsi="Trade Gothic Next"/>
+                      <w:b/>
+                      <w:color w:val="14161B"/>
+                      <w:sz w:val="32"/>
+                      <w:u w:val="none"/>
+                    </w:rPr>
+                    <w:t>Mg</w:t>
+                  </w:r>
+                </w:p>
+              </w:tc>
+            </w:tr>
+          </w:tbl>
           <w:p>
             <w:pPr>
-              <w:spacing w:after="0"/>
-              <w:jc w:val="left"/>
+              <w:spacing w:before="0" w:after="0" w:line="20" w:lineRule="exact"/>
+            </w:pPr>
+          </w:p>
+          <w:p>
+            <w:pPr>
+              <w:spacing w:before="120" w:after="80"/>
             </w:pPr>
             <w:r>
               <w:rPr>
                 <w:rFonts w:ascii="Trade Gothic Next" w:hAnsi="Trade Gothic Next"/>
                 <w:b/>
                 <w:color w:val="14161B"/>
+                <w:sz w:val="18"/>
+                <w:u w:val="none"/>
+              </w:rPr>
+              <w:t xml:space="preserve">Charge  </w:t>
+            </w:r>
+            <w:r>
+              <w:rPr>
+                <w:rFonts w:ascii="Trade Gothic Next" w:hAnsi="Trade Gothic Next"/>
+                <w:b w:val="0"/>
+                <w:color w:val="14161B"/>
+                <w:sz w:val="20"/>
+                <w:u w:val="none"/>
+              </w:rPr>
+              <w:t>________</w:t>
+            </w:r>
+          </w:p>
+          <w:p>
+            <w:pPr>
+              <w:spacing w:after="0"/>
+            </w:pPr>
+            <w:r>
+              <w:rPr>
+                <w:rFonts w:ascii="Trade Gothic Next" w:hAnsi="Trade Gothic Next"/>
+                <w:b/>
+                <w:color w:val="14161B"/>
+                <w:sz w:val="18"/>
+                <w:u w:val="none"/>
+              </w:rPr>
+              <w:t xml:space="preserve">Circle  </w:t>
+            </w:r>
+            <w:r>
+              <w:rPr>
+                <w:rFonts w:ascii="Trade Gothic Next" w:hAnsi="Trade Gothic Next"/>
+                <w:b w:val="0"/>
+                <w:color w:val="14161B"/>
                 <w:sz w:val="21"/>
                 <w:u w:val="none"/>
               </w:rPr>
-              <w:t>Sodium, Na</w:t>
+              <w:t>cation</w:t>
+            </w:r>
+            <w:r>
+              <w:rPr>
+                <w:rFonts w:ascii="Trade Gothic Next" w:hAnsi="Trade Gothic Next"/>
+                <w:b w:val="0"/>
+                <w:color w:val="55604F"/>
+                <w:sz w:val="18"/>
+                <w:u w:val="none"/>
+              </w:rPr>
+              <w:t xml:space="preserve">   /   </w:t>
+            </w:r>
+            <w:r>
+              <w:rPr>
+                <w:rFonts w:ascii="Trade Gothic Next" w:hAnsi="Trade Gothic Next"/>
+                <w:b w:val="0"/>
+                <w:color w:val="14161B"/>
+                <w:sz w:val="21"/>
+                <w:u w:val="none"/>
+              </w:rPr>
+              <w:t>anion</w:t>
             </w:r>
           </w:p>
         </w:tc>
         <w:tc>
           <w:tcPr>
-            <w:tcW w:type="dxa" w:w="2520"/>
+            <w:tcW w:type="dxa" w:w="2700"/>
+            <w:tcBorders>
+              <w:top w:val="single" w:sz="4" w:color="C8CDC2"/>
+              <w:left w:val="single" w:sz="4" w:color="C8CDC2"/>
+              <w:bottom w:val="single" w:sz="4" w:color="C8CDC2"/>
+              <w:right w:val="single" w:sz="4" w:color="C8CDC2"/>
+            </w:tcBorders>
             <w:vAlign w:val="center"/>
             <w:tcMar>
               <w:top w:w="40" w:type="dxa"/>
-              <w:left w:w="60" w:type="dxa"/>
-              <w:bottom w:w="40" w:type="dxa"/>
+              <w:left w:w="80" w:type="dxa"/>
+              <w:bottom w:w="60" w:type="dxa"/>
               <w:right w:w="60" w:type="dxa"/>
             </w:tcMar>
-            <w:tcBorders>
-              <w:bottom w:val="single" w:sz="4" w:color="C8CDC2"/>
-            </w:tcBorders>
-          </w:tcPr>
-          <w:p>
-            <w:pPr>
-              <w:spacing w:after="0"/>
-              <w:jc w:val="left"/>
-            </w:pPr>
-            <w:r>
-              <w:rPr>
-                <w:rFonts w:ascii="Trade Gothic Next" w:hAnsi="Trade Gothic Next"/>
-                <w:b w:val="0"/>
-                <w:color w:val="55604F"/>
-                <w:sz w:val="17"/>
-                <w:u w:val="none"/>
-              </w:rPr>
-              <w:t xml:space="preserve">charge  </w:t>
-            </w:r>
-          </w:p>
-        </w:tc>
-        <w:tc>
-          <w:tcPr>
-            <w:tcW w:type="dxa" w:w="648"/>
-            <w:vAlign w:val="center"/>
-            <w:tcMar>
-              <w:top w:w="40" w:type="dxa"/>
-              <w:left w:w="60" w:type="dxa"/>
-              <w:bottom w:w="40" w:type="dxa"/>
-              <w:right w:w="60" w:type="dxa"/>
-            </w:tcMar>
-            <w:tcBorders>
-              <w:bottom w:val="single" w:sz="4" w:color="C8CDC2"/>
-            </w:tcBorders>
           </w:tcPr>
           <w:p>
             <w:pPr>
@@ -2734,96 +3140,170 @@
                 <w:rFonts w:ascii="Trade Gothic Next" w:hAnsi="Trade Gothic Next"/>
                 <w:b/>
                 <w:color w:val="4D730E"/>
-                <w:sz w:val="22"/>
+                <w:sz w:val="26"/>
                 <w:u w:val="none"/>
               </w:rPr>
-              <w:t>11</w:t>
+              <w:t>9</w:t>
             </w:r>
           </w:p>
-        </w:tc>
-        <w:tc>
-          <w:tcPr>
-            <w:tcW w:type="dxa" w:w="2232"/>
-            <w:vAlign w:val="center"/>
-            <w:tcMar>
-              <w:top w:w="40" w:type="dxa"/>
-              <w:left w:w="60" w:type="dxa"/>
-              <w:bottom w:w="40" w:type="dxa"/>
-              <w:right w:w="60" w:type="dxa"/>
-            </w:tcMar>
-            <w:tcBorders>
-              <w:bottom w:val="single" w:sz="4" w:color="C8CDC2"/>
-            </w:tcBorders>
-          </w:tcPr>
+          <w:tbl>
+            <w:tblPr>
+              <w:tblW w:type="auto" w:w="0"/>
+              <w:tblLayout w:type="fixed"/>
+              <w:tblLook w:firstColumn="1" w:firstRow="1" w:lastColumn="0" w:lastRow="0" w:noHBand="0" w:noVBand="1" w:val="04A0"/>
+              <w:tblLayout w:type="fixed"/>
+            </w:tblPr>
+            <w:tblGrid>
+              <w:gridCol w:w="1008"/>
+            </w:tblGrid>
+            <w:tr>
+              <w:trPr>
+                <w:cantSplit/>
+                <w:trHeight w:val="892" w:hRule="atLeast"/>
+              </w:trPr>
+              <w:tc>
+                <w:tcPr>
+                  <w:tcW w:type="dxa" w:w="1008"/>
+                  <w:tcBorders>
+                    <w:top w:val="single" w:sz="12" w:color="A3E635"/>
+                    <w:left w:val="single" w:sz="12" w:color="A3E635"/>
+                    <w:bottom w:val="single" w:sz="12" w:color="A3E635"/>
+                    <w:right w:val="single" w:sz="12" w:color="A3E635"/>
+                  </w:tcBorders>
+                  <w:tcMar>
+                    <w:top w:w="20" w:type="dxa"/>
+                    <w:left w:w="50" w:type="dxa"/>
+                    <w:bottom w:w="20" w:type="dxa"/>
+                    <w:right w:w="40" w:type="dxa"/>
+                  </w:tcMar>
+                  <w:vAlign w:val="center"/>
+                </w:tcPr>
+                <w:p>
+                  <w:pPr>
+                    <w:spacing w:after="0"/>
+                  </w:pPr>
+                  <w:r>
+                    <w:rPr>
+                      <w:rFonts w:ascii="Trade Gothic Next" w:hAnsi="Trade Gothic Next"/>
+                      <w:b/>
+                      <w:color w:val="55604F"/>
+                      <w:sz w:val="16"/>
+                      <w:u w:val="none"/>
+                    </w:rPr>
+                    <w:t>7</w:t>
+                  </w:r>
+                </w:p>
+                <w:p>
+                  <w:pPr>
+                    <w:spacing w:after="0"/>
+                    <w:jc w:val="center"/>
+                  </w:pPr>
+                  <w:r>
+                    <w:rPr>
+                      <w:rFonts w:ascii="Trade Gothic Next" w:hAnsi="Trade Gothic Next"/>
+                      <w:b/>
+                      <w:color w:val="14161B"/>
+                      <w:sz w:val="32"/>
+                      <w:u w:val="none"/>
+                    </w:rPr>
+                    <w:t>N</w:t>
+                  </w:r>
+                </w:p>
+              </w:tc>
+            </w:tr>
+          </w:tbl>
           <w:p>
             <w:pPr>
-              <w:spacing w:after="0"/>
-              <w:jc w:val="left"/>
+              <w:spacing w:before="0" w:after="0" w:line="20" w:lineRule="exact"/>
+            </w:pPr>
+          </w:p>
+          <w:p>
+            <w:pPr>
+              <w:spacing w:before="120" w:after="80"/>
             </w:pPr>
             <w:r>
               <w:rPr>
                 <w:rFonts w:ascii="Trade Gothic Next" w:hAnsi="Trade Gothic Next"/>
                 <w:b/>
                 <w:color w:val="14161B"/>
+                <w:sz w:val="18"/>
+                <w:u w:val="none"/>
+              </w:rPr>
+              <w:t xml:space="preserve">Charge  </w:t>
+            </w:r>
+            <w:r>
+              <w:rPr>
+                <w:rFonts w:ascii="Trade Gothic Next" w:hAnsi="Trade Gothic Next"/>
+                <w:b w:val="0"/>
+                <w:color w:val="14161B"/>
+                <w:sz w:val="20"/>
+                <w:u w:val="none"/>
+              </w:rPr>
+              <w:t>________</w:t>
+            </w:r>
+          </w:p>
+          <w:p>
+            <w:pPr>
+              <w:spacing w:after="0"/>
+            </w:pPr>
+            <w:r>
+              <w:rPr>
+                <w:rFonts w:ascii="Trade Gothic Next" w:hAnsi="Trade Gothic Next"/>
+                <w:b/>
+                <w:color w:val="14161B"/>
+                <w:sz w:val="18"/>
+                <w:u w:val="none"/>
+              </w:rPr>
+              <w:t xml:space="preserve">Circle  </w:t>
+            </w:r>
+            <w:r>
+              <w:rPr>
+                <w:rFonts w:ascii="Trade Gothic Next" w:hAnsi="Trade Gothic Next"/>
+                <w:b w:val="0"/>
+                <w:color w:val="14161B"/>
                 <w:sz w:val="21"/>
                 <w:u w:val="none"/>
               </w:rPr>
-              <w:t>Oxygen, O</w:t>
+              <w:t>cation</w:t>
+            </w:r>
+            <w:r>
+              <w:rPr>
+                <w:rFonts w:ascii="Trade Gothic Next" w:hAnsi="Trade Gothic Next"/>
+                <w:b w:val="0"/>
+                <w:color w:val="55604F"/>
+                <w:sz w:val="18"/>
+                <w:u w:val="none"/>
+              </w:rPr>
+              <w:t xml:space="preserve">   /   </w:t>
+            </w:r>
+            <w:r>
+              <w:rPr>
+                <w:rFonts w:ascii="Trade Gothic Next" w:hAnsi="Trade Gothic Next"/>
+                <w:b w:val="0"/>
+                <w:color w:val="14161B"/>
+                <w:sz w:val="21"/>
+                <w:u w:val="none"/>
+              </w:rPr>
+              <w:t>anion</w:t>
             </w:r>
           </w:p>
         </w:tc>
         <w:tc>
           <w:tcPr>
-            <w:tcW w:type="dxa" w:w="2520"/>
+            <w:tcW w:type="dxa" w:w="2700"/>
+            <w:tcBorders>
+              <w:top w:val="single" w:sz="4" w:color="C8CDC2"/>
+              <w:left w:val="single" w:sz="4" w:color="C8CDC2"/>
+              <w:bottom w:val="single" w:sz="4" w:color="C8CDC2"/>
+              <w:right w:val="single" w:sz="4" w:color="C8CDC2"/>
+            </w:tcBorders>
             <w:vAlign w:val="center"/>
             <w:tcMar>
               <w:top w:w="40" w:type="dxa"/>
-              <w:left w:w="60" w:type="dxa"/>
-              <w:bottom w:w="40" w:type="dxa"/>
+              <w:left w:w="80" w:type="dxa"/>
+              <w:bottom w:w="60" w:type="dxa"/>
               <w:right w:w="60" w:type="dxa"/>
             </w:tcMar>
-            <w:tcBorders>
-              <w:bottom w:val="single" w:sz="4" w:color="C8CDC2"/>
-            </w:tcBorders>
-          </w:tcPr>
-          <w:p>
-            <w:pPr>
-              <w:spacing w:after="0"/>
-              <w:jc w:val="left"/>
-            </w:pPr>
-            <w:r>
-              <w:rPr>
-                <w:rFonts w:ascii="Trade Gothic Next" w:hAnsi="Trade Gothic Next"/>
-                <w:b w:val="0"/>
-                <w:color w:val="55604F"/>
-                <w:sz w:val="17"/>
-                <w:u w:val="none"/>
-              </w:rPr>
-              <w:t xml:space="preserve">charge  </w:t>
-            </w:r>
-          </w:p>
-        </w:tc>
-      </w:tr>
-      <w:tr>
-        <w:trPr>
-          <w:cantSplit/>
-          <w:trHeight w:val="648" w:hRule="atLeast"/>
-          <w:cantSplit/>
-          <w:trHeight w:val="648" w:hRule="atLeast"/>
-        </w:trPr>
-        <w:tc>
-          <w:tcPr>
-            <w:tcW w:type="dxa" w:w="648"/>
-            <w:vAlign w:val="center"/>
-            <w:tcMar>
-              <w:top w:w="40" w:type="dxa"/>
-              <w:left w:w="60" w:type="dxa"/>
-              <w:bottom w:w="40" w:type="dxa"/>
-              <w:right w:w="60" w:type="dxa"/>
-            </w:tcMar>
-            <w:tcBorders>
-              <w:bottom w:val="single" w:sz="4" w:color="C8CDC2"/>
-            </w:tcBorders>
           </w:tcPr>
           <w:p>
             <w:pPr>
@@ -2835,88 +3315,170 @@
                 <w:rFonts w:ascii="Trade Gothic Next" w:hAnsi="Trade Gothic Next"/>
                 <w:b/>
                 <w:color w:val="4D730E"/>
-                <w:sz w:val="22"/>
+                <w:sz w:val="26"/>
                 <w:u w:val="none"/>
               </w:rPr>
-              <w:t>12</w:t>
+              <w:t>10</w:t>
             </w:r>
           </w:p>
-        </w:tc>
-        <w:tc>
-          <w:tcPr>
-            <w:tcW w:type="dxa" w:w="2232"/>
-            <w:vAlign w:val="center"/>
-            <w:tcMar>
-              <w:top w:w="40" w:type="dxa"/>
-              <w:left w:w="60" w:type="dxa"/>
-              <w:bottom w:w="40" w:type="dxa"/>
-              <w:right w:w="60" w:type="dxa"/>
-            </w:tcMar>
-            <w:tcBorders>
-              <w:bottom w:val="single" w:sz="4" w:color="C8CDC2"/>
-            </w:tcBorders>
-          </w:tcPr>
+          <w:tbl>
+            <w:tblPr>
+              <w:tblW w:type="auto" w:w="0"/>
+              <w:tblLayout w:type="fixed"/>
+              <w:tblLook w:firstColumn="1" w:firstRow="1" w:lastColumn="0" w:lastRow="0" w:noHBand="0" w:noVBand="1" w:val="04A0"/>
+              <w:tblLayout w:type="fixed"/>
+            </w:tblPr>
+            <w:tblGrid>
+              <w:gridCol w:w="1008"/>
+            </w:tblGrid>
+            <w:tr>
+              <w:trPr>
+                <w:cantSplit/>
+                <w:trHeight w:val="892" w:hRule="atLeast"/>
+              </w:trPr>
+              <w:tc>
+                <w:tcPr>
+                  <w:tcW w:type="dxa" w:w="1008"/>
+                  <w:tcBorders>
+                    <w:top w:val="single" w:sz="12" w:color="A3E635"/>
+                    <w:left w:val="single" w:sz="12" w:color="A3E635"/>
+                    <w:bottom w:val="single" w:sz="12" w:color="A3E635"/>
+                    <w:right w:val="single" w:sz="12" w:color="A3E635"/>
+                  </w:tcBorders>
+                  <w:tcMar>
+                    <w:top w:w="20" w:type="dxa"/>
+                    <w:left w:w="50" w:type="dxa"/>
+                    <w:bottom w:w="20" w:type="dxa"/>
+                    <w:right w:w="40" w:type="dxa"/>
+                  </w:tcMar>
+                  <w:vAlign w:val="center"/>
+                </w:tcPr>
+                <w:p>
+                  <w:pPr>
+                    <w:spacing w:after="0"/>
+                  </w:pPr>
+                  <w:r>
+                    <w:rPr>
+                      <w:rFonts w:ascii="Trade Gothic Next" w:hAnsi="Trade Gothic Next"/>
+                      <w:b/>
+                      <w:color w:val="55604F"/>
+                      <w:sz w:val="16"/>
+                      <w:u w:val="none"/>
+                    </w:rPr>
+                    <w:t>13</w:t>
+                  </w:r>
+                </w:p>
+                <w:p>
+                  <w:pPr>
+                    <w:spacing w:after="0"/>
+                    <w:jc w:val="center"/>
+                  </w:pPr>
+                  <w:r>
+                    <w:rPr>
+                      <w:rFonts w:ascii="Trade Gothic Next" w:hAnsi="Trade Gothic Next"/>
+                      <w:b/>
+                      <w:color w:val="14161B"/>
+                      <w:sz w:val="32"/>
+                      <w:u w:val="none"/>
+                    </w:rPr>
+                    <w:t>Al</w:t>
+                  </w:r>
+                </w:p>
+              </w:tc>
+            </w:tr>
+          </w:tbl>
           <w:p>
             <w:pPr>
-              <w:spacing w:after="0"/>
-              <w:jc w:val="left"/>
+              <w:spacing w:before="0" w:after="0" w:line="20" w:lineRule="exact"/>
+            </w:pPr>
+          </w:p>
+          <w:p>
+            <w:pPr>
+              <w:spacing w:before="120" w:after="80"/>
             </w:pPr>
             <w:r>
               <w:rPr>
                 <w:rFonts w:ascii="Trade Gothic Next" w:hAnsi="Trade Gothic Next"/>
                 <w:b/>
                 <w:color w:val="14161B"/>
+                <w:sz w:val="18"/>
+                <w:u w:val="none"/>
+              </w:rPr>
+              <w:t xml:space="preserve">Charge  </w:t>
+            </w:r>
+            <w:r>
+              <w:rPr>
+                <w:rFonts w:ascii="Trade Gothic Next" w:hAnsi="Trade Gothic Next"/>
+                <w:b w:val="0"/>
+                <w:color w:val="14161B"/>
+                <w:sz w:val="20"/>
+                <w:u w:val="none"/>
+              </w:rPr>
+              <w:t>________</w:t>
+            </w:r>
+          </w:p>
+          <w:p>
+            <w:pPr>
+              <w:spacing w:after="0"/>
+            </w:pPr>
+            <w:r>
+              <w:rPr>
+                <w:rFonts w:ascii="Trade Gothic Next" w:hAnsi="Trade Gothic Next"/>
+                <w:b/>
+                <w:color w:val="14161B"/>
+                <w:sz w:val="18"/>
+                <w:u w:val="none"/>
+              </w:rPr>
+              <w:t xml:space="preserve">Circle  </w:t>
+            </w:r>
+            <w:r>
+              <w:rPr>
+                <w:rFonts w:ascii="Trade Gothic Next" w:hAnsi="Trade Gothic Next"/>
+                <w:b w:val="0"/>
+                <w:color w:val="14161B"/>
                 <w:sz w:val="21"/>
                 <w:u w:val="none"/>
               </w:rPr>
-              <w:t>Magnesium, Mg</w:t>
+              <w:t>cation</w:t>
+            </w:r>
+            <w:r>
+              <w:rPr>
+                <w:rFonts w:ascii="Trade Gothic Next" w:hAnsi="Trade Gothic Next"/>
+                <w:b w:val="0"/>
+                <w:color w:val="55604F"/>
+                <w:sz w:val="18"/>
+                <w:u w:val="none"/>
+              </w:rPr>
+              <w:t xml:space="preserve">   /   </w:t>
+            </w:r>
+            <w:r>
+              <w:rPr>
+                <w:rFonts w:ascii="Trade Gothic Next" w:hAnsi="Trade Gothic Next"/>
+                <w:b w:val="0"/>
+                <w:color w:val="14161B"/>
+                <w:sz w:val="21"/>
+                <w:u w:val="none"/>
+              </w:rPr>
+              <w:t>anion</w:t>
             </w:r>
           </w:p>
         </w:tc>
         <w:tc>
           <w:tcPr>
-            <w:tcW w:type="dxa" w:w="2520"/>
+            <w:tcW w:type="dxa" w:w="2700"/>
+            <w:tcBorders>
+              <w:top w:val="single" w:sz="4" w:color="C8CDC2"/>
+              <w:left w:val="single" w:sz="4" w:color="C8CDC2"/>
+              <w:bottom w:val="single" w:sz="4" w:color="C8CDC2"/>
+              <w:right w:val="single" w:sz="4" w:color="C8CDC2"/>
+            </w:tcBorders>
             <w:vAlign w:val="center"/>
             <w:tcMar>
               <w:top w:w="40" w:type="dxa"/>
-              <w:left w:w="60" w:type="dxa"/>
-              <w:bottom w:w="40" w:type="dxa"/>
+              <w:left w:w="80" w:type="dxa"/>
+              <w:bottom w:w="60" w:type="dxa"/>
               <w:right w:w="60" w:type="dxa"/>
             </w:tcMar>
-            <w:tcBorders>
-              <w:bottom w:val="single" w:sz="4" w:color="C8CDC2"/>
-            </w:tcBorders>
-          </w:tcPr>
-          <w:p>
-            <w:pPr>
-              <w:spacing w:after="0"/>
-              <w:jc w:val="left"/>
-            </w:pPr>
-            <w:r>
-              <w:rPr>
-                <w:rFonts w:ascii="Trade Gothic Next" w:hAnsi="Trade Gothic Next"/>
-                <w:b w:val="0"/>
-                <w:color w:val="55604F"/>
-                <w:sz w:val="17"/>
-                <w:u w:val="none"/>
-              </w:rPr>
-              <w:t xml:space="preserve">charge  </w:t>
-            </w:r>
-          </w:p>
-        </w:tc>
-        <w:tc>
-          <w:tcPr>
-            <w:tcW w:type="dxa" w:w="648"/>
-            <w:vAlign w:val="center"/>
-            <w:tcMar>
-              <w:top w:w="40" w:type="dxa"/>
-              <w:left w:w="60" w:type="dxa"/>
-              <w:bottom w:w="40" w:type="dxa"/>
-              <w:right w:w="60" w:type="dxa"/>
-            </w:tcMar>
-            <w:tcBorders>
-              <w:bottom w:val="single" w:sz="4" w:color="C8CDC2"/>
-            </w:tcBorders>
           </w:tcPr>
           <w:p>
             <w:pPr>
@@ -2928,72 +3490,151 @@
                 <w:rFonts w:ascii="Trade Gothic Next" w:hAnsi="Trade Gothic Next"/>
                 <w:b/>
                 <w:color w:val="4D730E"/>
-                <w:sz w:val="22"/>
+                <w:sz w:val="26"/>
                 <w:u w:val="none"/>
               </w:rPr>
-              <w:t>13</w:t>
+              <w:t>11</w:t>
             </w:r>
           </w:p>
-        </w:tc>
-        <w:tc>
-          <w:tcPr>
-            <w:tcW w:type="dxa" w:w="2232"/>
-            <w:vAlign w:val="center"/>
-            <w:tcMar>
-              <w:top w:w="40" w:type="dxa"/>
-              <w:left w:w="60" w:type="dxa"/>
-              <w:bottom w:w="40" w:type="dxa"/>
-              <w:right w:w="60" w:type="dxa"/>
-            </w:tcMar>
-            <w:tcBorders>
-              <w:bottom w:val="single" w:sz="4" w:color="C8CDC2"/>
-            </w:tcBorders>
-          </w:tcPr>
+          <w:tbl>
+            <w:tblPr>
+              <w:tblW w:type="auto" w:w="0"/>
+              <w:tblLayout w:type="fixed"/>
+              <w:tblLook w:firstColumn="1" w:firstRow="1" w:lastColumn="0" w:lastRow="0" w:noHBand="0" w:noVBand="1" w:val="04A0"/>
+              <w:tblLayout w:type="fixed"/>
+            </w:tblPr>
+            <w:tblGrid>
+              <w:gridCol w:w="1008"/>
+            </w:tblGrid>
+            <w:tr>
+              <w:trPr>
+                <w:cantSplit/>
+                <w:trHeight w:val="892" w:hRule="atLeast"/>
+              </w:trPr>
+              <w:tc>
+                <w:tcPr>
+                  <w:tcW w:type="dxa" w:w="1008"/>
+                  <w:tcBorders>
+                    <w:top w:val="single" w:sz="12" w:color="A3E635"/>
+                    <w:left w:val="single" w:sz="12" w:color="A3E635"/>
+                    <w:bottom w:val="single" w:sz="12" w:color="A3E635"/>
+                    <w:right w:val="single" w:sz="12" w:color="A3E635"/>
+                  </w:tcBorders>
+                  <w:tcMar>
+                    <w:top w:w="20" w:type="dxa"/>
+                    <w:left w:w="50" w:type="dxa"/>
+                    <w:bottom w:w="20" w:type="dxa"/>
+                    <w:right w:w="40" w:type="dxa"/>
+                  </w:tcMar>
+                  <w:vAlign w:val="center"/>
+                </w:tcPr>
+                <w:p>
+                  <w:pPr>
+                    <w:spacing w:after="0"/>
+                  </w:pPr>
+                  <w:r>
+                    <w:rPr>
+                      <w:rFonts w:ascii="Trade Gothic Next" w:hAnsi="Trade Gothic Next"/>
+                      <w:b/>
+                      <w:color w:val="55604F"/>
+                      <w:sz w:val="16"/>
+                      <w:u w:val="none"/>
+                    </w:rPr>
+                    <w:t>17</w:t>
+                  </w:r>
+                </w:p>
+                <w:p>
+                  <w:pPr>
+                    <w:spacing w:after="0"/>
+                    <w:jc w:val="center"/>
+                  </w:pPr>
+                  <w:r>
+                    <w:rPr>
+                      <w:rFonts w:ascii="Trade Gothic Next" w:hAnsi="Trade Gothic Next"/>
+                      <w:b/>
+                      <w:color w:val="14161B"/>
+                      <w:sz w:val="32"/>
+                      <w:u w:val="none"/>
+                    </w:rPr>
+                    <w:t>Cl</w:t>
+                  </w:r>
+                </w:p>
+              </w:tc>
+            </w:tr>
+          </w:tbl>
           <w:p>
             <w:pPr>
-              <w:spacing w:after="0"/>
-              <w:jc w:val="left"/>
+              <w:spacing w:before="0" w:after="0" w:line="20" w:lineRule="exact"/>
+            </w:pPr>
+          </w:p>
+          <w:p>
+            <w:pPr>
+              <w:spacing w:before="120" w:after="80"/>
             </w:pPr>
             <w:r>
               <w:rPr>
                 <w:rFonts w:ascii="Trade Gothic Next" w:hAnsi="Trade Gothic Next"/>
                 <w:b/>
                 <w:color w:val="14161B"/>
+                <w:sz w:val="18"/>
+                <w:u w:val="none"/>
+              </w:rPr>
+              <w:t xml:space="preserve">Charge  </w:t>
+            </w:r>
+            <w:r>
+              <w:rPr>
+                <w:rFonts w:ascii="Trade Gothic Next" w:hAnsi="Trade Gothic Next"/>
+                <w:b w:val="0"/>
+                <w:color w:val="14161B"/>
+                <w:sz w:val="20"/>
+                <w:u w:val="none"/>
+              </w:rPr>
+              <w:t>________</w:t>
+            </w:r>
+          </w:p>
+          <w:p>
+            <w:pPr>
+              <w:spacing w:after="0"/>
+            </w:pPr>
+            <w:r>
+              <w:rPr>
+                <w:rFonts w:ascii="Trade Gothic Next" w:hAnsi="Trade Gothic Next"/>
+                <w:b/>
+                <w:color w:val="14161B"/>
+                <w:sz w:val="18"/>
+                <w:u w:val="none"/>
+              </w:rPr>
+              <w:t xml:space="preserve">Circle  </w:t>
+            </w:r>
+            <w:r>
+              <w:rPr>
+                <w:rFonts w:ascii="Trade Gothic Next" w:hAnsi="Trade Gothic Next"/>
+                <w:b w:val="0"/>
+                <w:color w:val="14161B"/>
                 <w:sz w:val="21"/>
                 <w:u w:val="none"/>
               </w:rPr>
-              <w:t>Chlorine, Cl</w:t>
+              <w:t>cation</w:t>
             </w:r>
-          </w:p>
-        </w:tc>
-        <w:tc>
-          <w:tcPr>
-            <w:tcW w:type="dxa" w:w="2520"/>
-            <w:vAlign w:val="center"/>
-            <w:tcMar>
-              <w:top w:w="40" w:type="dxa"/>
-              <w:left w:w="60" w:type="dxa"/>
-              <w:bottom w:w="40" w:type="dxa"/>
-              <w:right w:w="60" w:type="dxa"/>
-            </w:tcMar>
-            <w:tcBorders>
-              <w:bottom w:val="single" w:sz="4" w:color="C8CDC2"/>
-            </w:tcBorders>
-          </w:tcPr>
-          <w:p>
-            <w:pPr>
-              <w:spacing w:after="0"/>
-              <w:jc w:val="left"/>
-            </w:pPr>
             <w:r>
               <w:rPr>
                 <w:rFonts w:ascii="Trade Gothic Next" w:hAnsi="Trade Gothic Next"/>
                 <w:b w:val="0"/>
                 <w:color w:val="55604F"/>
-                <w:sz w:val="17"/>
+                <w:sz w:val="18"/>
                 <w:u w:val="none"/>
               </w:rPr>
-              <w:t xml:space="preserve">charge  </w:t>
+              <w:t xml:space="preserve">   /   </w:t>
+            </w:r>
+            <w:r>
+              <w:rPr>
+                <w:rFonts w:ascii="Trade Gothic Next" w:hAnsi="Trade Gothic Next"/>
+                <w:b w:val="0"/>
+                <w:color w:val="14161B"/>
+                <w:sz w:val="21"/>
+                <w:u w:val="none"/>
+              </w:rPr>
+              <w:t>anion</w:t>
             </w:r>
           </w:p>
         </w:tc>

</xml_diff>

<commit_message>
Quiz: Matt's element tile format, aligned Part 2 rows, anti-slop pass (plain part headings, less bold, plainer directions)
Co-Authored-By: Claude Opus 5.5 <noreply@anthropic.com>
Claude-Session: https://claude.ai/code/session_01LaT1EarAMnh5opQoFahNzN
</commit_message>
<xml_diff>
--- a/output/chem-u02/Unit 2 Quiz A.docx
+++ b/output/chem-u02/Unit 2 Quiz A.docx
@@ -258,7 +258,7 @@
                 <w:sz w:val="19"/>
                 <w:u w:val="none"/>
               </w:rPr>
-              <w:t>Use your periodic table.  Circle one letter for each multiple-choice question.  Draw an arrow for every electron.</w:t>
+              <w:t>You may use a periodic table. For multiple choice, circle one letter. In an orbital diagram, each electron gets one arrow.</w:t>
             </w:r>
           </w:p>
         </w:tc>
@@ -266,12 +266,12 @@
     </w:tbl>
     <w:p>
       <w:pPr>
-        <w:spacing w:before="0" w:after="0" w:line="120" w:lineRule="exact"/>
+        <w:spacing w:before="0" w:after="0" w:line="140" w:lineRule="exact"/>
       </w:pPr>
       <w:r>
         <w:rPr>
           <w:rFonts w:ascii="Trade Gothic Next" w:hAnsi="Trade Gothic Next"/>
-          <w:sz w:val="8"/>
+          <w:sz w:val="10"/>
         </w:rPr>
       </w:r>
     </w:p>
@@ -291,12 +291,11 @@
           <w:tcPr>
             <w:tcW w:type="dxa" w:w="9072"/>
             <w:tcBorders>
-              <w:top w:val="single" w:sz="12" w:color="14161B"/>
-              <w:bottom w:val="single" w:sz="18" w:color="A3E635"/>
+              <w:bottom w:val="single" w:sz="10" w:color="14161B"/>
             </w:tcBorders>
             <w:vAlign w:val="center"/>
             <w:tcMar>
-              <w:top w:w="30" w:type="dxa"/>
+              <w:top w:w="0" w:type="dxa"/>
               <w:left w:w="0" w:type="dxa"/>
               <w:bottom w:w="30" w:type="dxa"/>
               <w:right w:w="60" w:type="dxa"/>
@@ -313,10 +312,10 @@
                 <w:rFonts w:ascii="Trade Gothic Next" w:hAnsi="Trade Gothic Next"/>
                 <w:b/>
                 <w:color w:val="14161B"/>
-                <w:sz w:val="18"/>
+                <w:sz w:val="20"/>
                 <w:u w:val="none"/>
               </w:rPr>
-              <w:t>PART 1  ·  MULTIPLE CHOICE</w:t>
+              <w:t>Part 1   Multiple choice</w:t>
             </w:r>
           </w:p>
         </w:tc>
@@ -324,15 +323,14 @@
           <w:tcPr>
             <w:tcW w:type="dxa" w:w="1728"/>
             <w:tcBorders>
-              <w:top w:val="single" w:sz="12" w:color="14161B"/>
-              <w:bottom w:val="single" w:sz="18" w:color="A3E635"/>
+              <w:bottom w:val="single" w:sz="10" w:color="14161B"/>
             </w:tcBorders>
             <w:vAlign w:val="center"/>
             <w:tcMar>
-              <w:top w:w="30" w:type="dxa"/>
+              <w:top w:w="0" w:type="dxa"/>
               <w:left w:w="60" w:type="dxa"/>
               <w:bottom w:w="30" w:type="dxa"/>
-              <w:right w:w="60" w:type="dxa"/>
+              <w:right w:w="0" w:type="dxa"/>
             </w:tcMar>
           </w:tcPr>
           <w:p>
@@ -344,17 +342,28 @@
             <w:r>
               <w:rPr>
                 <w:rFonts w:ascii="Trade Gothic Next" w:hAnsi="Trade Gothic Next"/>
-                <w:b/>
+                <w:b w:val="0"/>
                 <w:color w:val="55604F"/>
-                <w:sz w:val="17"/>
+                <w:sz w:val="18"/>
                 <w:u w:val="none"/>
               </w:rPr>
-              <w:t>3 pts</w:t>
+              <w:t>3 points</w:t>
             </w:r>
           </w:p>
         </w:tc>
       </w:tr>
     </w:tbl>
+    <w:p>
+      <w:pPr>
+        <w:spacing w:before="0" w:after="0" w:line="60" w:lineRule="exact"/>
+      </w:pPr>
+      <w:r>
+        <w:rPr>
+          <w:rFonts w:ascii="Trade Gothic Next" w:hAnsi="Trade Gothic Next"/>
+          <w:sz w:val="2"/>
+        </w:rPr>
+      </w:r>
+    </w:p>
     <w:tbl>
       <w:tblPr>
         <w:tblW w:type="auto" w:w="0"/>
@@ -423,7 +432,7 @@
             <w:r>
               <w:rPr>
                 <w:rFonts w:ascii="Trade Gothic Next" w:hAnsi="Trade Gothic Next"/>
-                <w:b/>
+                <w:b w:val="0"/>
                 <w:color w:val="14161B"/>
                 <w:sz w:val="21"/>
                 <w:u w:val="none"/>
@@ -666,7 +675,7 @@
             <w:r>
               <w:rPr>
                 <w:rFonts w:ascii="Trade Gothic Next" w:hAnsi="Trade Gothic Next"/>
-                <w:b/>
+                <w:b w:val="0"/>
                 <w:color w:val="14161B"/>
                 <w:sz w:val="21"/>
                 <w:u w:val="none"/>
@@ -676,7 +685,7 @@
             <w:r>
               <w:rPr>
                 <w:rFonts w:ascii="Trade Gothic Next" w:hAnsi="Trade Gothic Next"/>
-                <w:b/>
+                <w:b w:val="0"/>
                 <w:color w:val="14161B"/>
                 <w:sz w:val="21"/>
                 <w:u w:val="none"/>
@@ -687,7 +696,7 @@
             <w:r>
               <w:rPr>
                 <w:rFonts w:ascii="Trade Gothic Next" w:hAnsi="Trade Gothic Next"/>
-                <w:b/>
+                <w:b w:val="0"/>
                 <w:color w:val="14161B"/>
                 <w:sz w:val="21"/>
                 <w:u w:val="none"/>
@@ -1374,7 +1383,7 @@
             <w:r>
               <w:rPr>
                 <w:rFonts w:ascii="Trade Gothic Next" w:hAnsi="Trade Gothic Next"/>
-                <w:b/>
+                <w:b w:val="0"/>
                 <w:color w:val="14161B"/>
                 <w:sz w:val="21"/>
                 <w:u w:val="none"/>
@@ -1551,12 +1560,12 @@
     </w:tbl>
     <w:p>
       <w:pPr>
-        <w:spacing w:before="0" w:after="0" w:line="120" w:lineRule="exact"/>
+        <w:spacing w:before="0" w:after="0" w:line="140" w:lineRule="exact"/>
       </w:pPr>
       <w:r>
         <w:rPr>
           <w:rFonts w:ascii="Trade Gothic Next" w:hAnsi="Trade Gothic Next"/>
-          <w:sz w:val="8"/>
+          <w:sz w:val="10"/>
         </w:rPr>
       </w:r>
     </w:p>
@@ -1576,12 +1585,11 @@
           <w:tcPr>
             <w:tcW w:type="dxa" w:w="9072"/>
             <w:tcBorders>
-              <w:top w:val="single" w:sz="12" w:color="14161B"/>
-              <w:bottom w:val="single" w:sz="18" w:color="A3E635"/>
+              <w:bottom w:val="single" w:sz="10" w:color="14161B"/>
             </w:tcBorders>
             <w:vAlign w:val="center"/>
             <w:tcMar>
-              <w:top w:w="30" w:type="dxa"/>
+              <w:top w:w="0" w:type="dxa"/>
               <w:left w:w="0" w:type="dxa"/>
               <w:bottom w:w="30" w:type="dxa"/>
               <w:right w:w="60" w:type="dxa"/>
@@ -1598,10 +1606,10 @@
                 <w:rFonts w:ascii="Trade Gothic Next" w:hAnsi="Trade Gothic Next"/>
                 <w:b/>
                 <w:color w:val="14161B"/>
-                <w:sz w:val="18"/>
+                <w:sz w:val="20"/>
                 <w:u w:val="none"/>
               </w:rPr>
-              <w:t>PART 2  ·  LONGHAND CONFIGURATION  +  ORBITAL DIAGRAM</w:t>
+              <w:t>Part 2   Longhand configurations and orbital diagrams</w:t>
             </w:r>
           </w:p>
         </w:tc>
@@ -1609,15 +1617,14 @@
           <w:tcPr>
             <w:tcW w:type="dxa" w:w="1728"/>
             <w:tcBorders>
-              <w:top w:val="single" w:sz="12" w:color="14161B"/>
-              <w:bottom w:val="single" w:sz="18" w:color="A3E635"/>
+              <w:bottom w:val="single" w:sz="10" w:color="14161B"/>
             </w:tcBorders>
             <w:vAlign w:val="center"/>
             <w:tcMar>
-              <w:top w:w="30" w:type="dxa"/>
+              <w:top w:w="0" w:type="dxa"/>
               <w:left w:w="60" w:type="dxa"/>
               <w:bottom w:w="30" w:type="dxa"/>
-              <w:right w:w="60" w:type="dxa"/>
+              <w:right w:w="0" w:type="dxa"/>
             </w:tcMar>
           </w:tcPr>
           <w:p>
@@ -1629,12 +1636,12 @@
             <w:r>
               <w:rPr>
                 <w:rFonts w:ascii="Trade Gothic Next" w:hAnsi="Trade Gothic Next"/>
-                <w:b/>
+                <w:b w:val="0"/>
                 <w:color w:val="55604F"/>
-                <w:sz w:val="17"/>
+                <w:sz w:val="18"/>
                 <w:u w:val="none"/>
               </w:rPr>
-              <w:t>8 pts</w:t>
+              <w:t>8 points</w:t>
             </w:r>
           </w:p>
         </w:tc>
@@ -1660,16 +1667,18 @@
       </w:tblPr>
       <w:tblGrid>
         <w:gridCol w:w="648"/>
-        <w:gridCol w:w="1512"/>
-        <w:gridCol w:w="8640"/>
+        <w:gridCol w:w="1656"/>
+        <w:gridCol w:w="8496"/>
       </w:tblGrid>
       <w:tr>
         <w:trPr>
           <w:cantSplit/>
+          <w:trHeight w:val="576" w:hRule="atLeast"/>
         </w:trPr>
         <w:tc>
           <w:tcPr>
             <w:tcW w:type="dxa" w:w="648"/>
+            <w:vMerge w:val="restart"/>
             <w:vAlign w:val="center"/>
             <w:tcMar>
               <w:top w:w="40" w:type="dxa"/>
@@ -1697,265 +1706,207 @@
         </w:tc>
         <w:tc>
           <w:tcPr>
-            <w:tcW w:type="dxa" w:w="1512"/>
-            <w:vAlign w:val="center"/>
+            <w:tcW w:type="dxa" w:w="1656"/>
+            <w:vMerge w:val="restart"/>
+            <w:vAlign w:val="top"/>
             <w:tcMar>
-              <w:top w:w="40" w:type="dxa"/>
+              <w:top w:w="0" w:type="dxa"/>
               <w:left w:w="0" w:type="dxa"/>
-              <w:bottom w:w="40" w:type="dxa"/>
-              <w:right w:w="60" w:type="dxa"/>
+              <w:bottom w:w="0" w:type="dxa"/>
+              <w:right w:w="0" w:type="dxa"/>
             </w:tcMar>
           </w:tcPr>
           <w:p>
             <w:pPr>
               <w:spacing w:after="0"/>
               <w:jc w:val="left"/>
-              <w:spacing w:before="0" w:after="0" w:line="20" w:lineRule="exact"/>
             </w:pPr>
-          </w:p>
-          <w:tbl>
-            <w:tblPr>
-              <w:tblW w:type="auto" w:w="0"/>
-              <w:tblLayout w:type="fixed"/>
-              <w:tblLook w:firstColumn="1" w:firstRow="1" w:lastColumn="0" w:lastRow="0" w:noHBand="0" w:noVBand="1" w:val="04A0"/>
-              <w:tblLayout w:type="fixed"/>
-            </w:tblPr>
-            <w:tblGrid>
-              <w:gridCol w:w="1238"/>
-            </w:tblGrid>
-            <w:tr>
-              <w:trPr>
-                <w:cantSplit/>
-                <w:trHeight w:val="1238" w:hRule="atLeast"/>
-              </w:trPr>
-              <w:tc>
-                <w:tcPr>
-                  <w:tcW w:type="dxa" w:w="1238"/>
-                  <w:tcBorders>
-                    <w:top w:val="single" w:sz="12" w:color="A3E635"/>
-                    <w:left w:val="single" w:sz="12" w:color="A3E635"/>
-                    <w:bottom w:val="single" w:sz="12" w:color="A3E635"/>
-                    <w:right w:val="single" w:sz="12" w:color="A3E635"/>
-                  </w:tcBorders>
-                  <w:tcMar>
-                    <w:top w:w="20" w:type="dxa"/>
-                    <w:left w:w="50" w:type="dxa"/>
-                    <w:bottom w:w="20" w:type="dxa"/>
-                    <w:right w:w="40" w:type="dxa"/>
-                  </w:tcMar>
-                  <w:vAlign w:val="center"/>
-                </w:tcPr>
-                <w:p>
-                  <w:pPr>
-                    <w:spacing w:after="0"/>
-                  </w:pPr>
-                  <w:r>
-                    <w:rPr>
-                      <w:rFonts w:ascii="Trade Gothic Next" w:hAnsi="Trade Gothic Next"/>
-                      <w:b/>
-                      <w:color w:val="55604F"/>
-                      <w:sz w:val="16"/>
-                      <w:u w:val="none"/>
-                    </w:rPr>
-                    <w:t>34</w:t>
-                  </w:r>
-                </w:p>
-                <w:p>
-                  <w:pPr>
-                    <w:spacing w:after="0"/>
-                    <w:jc w:val="center"/>
-                  </w:pPr>
-                  <w:r>
-                    <w:rPr>
-                      <w:rFonts w:ascii="Trade Gothic Next" w:hAnsi="Trade Gothic Next"/>
-                      <w:b/>
-                      <w:color w:val="14161B"/>
-                      <w:sz w:val="40"/>
-                      <w:u w:val="none"/>
-                    </w:rPr>
-                    <w:t>Se</w:t>
-                  </w:r>
-                </w:p>
-                <w:p>
-                  <w:pPr>
-                    <w:spacing w:after="0"/>
-                    <w:jc w:val="center"/>
-                  </w:pPr>
-                  <w:r>
-                    <w:rPr>
-                      <w:rFonts w:ascii="Trade Gothic Next" w:hAnsi="Trade Gothic Next"/>
-                      <w:b w:val="0"/>
-                      <w:color w:val="55604F"/>
-                      <w:sz w:val="16"/>
-                      <w:u w:val="none"/>
-                    </w:rPr>
-                    <w:t>Selenium</w:t>
-                  </w:r>
-                </w:p>
-              </w:tc>
-            </w:tr>
-          </w:tbl>
-          <w:p>
-            <w:pPr>
-              <w:spacing w:before="0" w:after="0" w:line="20" w:lineRule="exact"/>
-            </w:pPr>
+            <w:r>
+              <w:drawing>
+                <wp:inline xmlns:a="http://schemas.openxmlformats.org/drawingml/2006/main" xmlns:pic="http://schemas.openxmlformats.org/drawingml/2006/picture">
+                  <wp:extent cx="914400" cy="914400"/>
+                  <wp:docPr id="1" name="Picture 1"/>
+                  <wp:cNvGraphicFramePr>
+                    <a:graphicFrameLocks noChangeAspect="1"/>
+                  </wp:cNvGraphicFramePr>
+                  <a:graphic>
+                    <a:graphicData uri="http://schemas.openxmlformats.org/drawingml/2006/picture">
+                      <pic:pic>
+                        <pic:nvPicPr>
+                          <pic:cNvPr id="0" name="tile_34.png"/>
+                          <pic:cNvPicPr/>
+                        </pic:nvPicPr>
+                        <pic:blipFill>
+                          <a:blip r:embed="rId9"/>
+                          <a:stretch>
+                            <a:fillRect/>
+                          </a:stretch>
+                        </pic:blipFill>
+                        <pic:spPr>
+                          <a:xfrm>
+                            <a:off x="0" y="0"/>
+                            <a:ext cx="914400" cy="914400"/>
+                          </a:xfrm>
+                          <a:prstGeom prst="rect"/>
+                        </pic:spPr>
+                      </pic:pic>
+                    </a:graphicData>
+                  </a:graphic>
+                </wp:inline>
+              </w:drawing>
+            </w:r>
           </w:p>
         </w:tc>
         <w:tc>
           <w:tcPr>
-            <w:tcW w:type="dxa" w:w="8640"/>
-            <w:vAlign w:val="center"/>
+            <w:tcW w:type="dxa" w:w="8496"/>
+            <w:vAlign w:val="bottom"/>
             <w:tcMar>
-              <w:top w:w="10" w:type="dxa"/>
-              <w:left w:w="60" w:type="dxa"/>
-              <w:bottom w:w="10" w:type="dxa"/>
+              <w:top w:w="0" w:type="dxa"/>
+              <w:left w:w="80" w:type="dxa"/>
+              <w:bottom w:w="20" w:type="dxa"/>
               <w:right w:w="60" w:type="dxa"/>
+            </w:tcMar>
+            <w:tcBorders>
+              <w:bottom w:val="single" w:sz="4" w:color="C8CDC2"/>
+            </w:tcBorders>
+          </w:tcPr>
+          <w:p>
+            <w:pPr>
+              <w:tabs>
+                <w:tab w:pos="1800" w:val="left"/>
+              </w:tabs>
+              <w:spacing w:after="0"/>
+              <w:jc w:val="left"/>
+            </w:pPr>
+            <w:r>
+              <w:rPr>
+                <w:rFonts w:ascii="Trade Gothic Next" w:hAnsi="Trade Gothic Next"/>
+                <w:b/>
+                <w:color w:val="14161B"/>
+                <w:sz w:val="18"/>
+                <w:u w:val="none"/>
+              </w:rPr>
+              <w:t>Configuration</w:t>
+            </w:r>
+            <w:r>
+              <w:rPr>
+                <w:rFonts w:ascii="Trade Gothic Next" w:hAnsi="Trade Gothic Next"/>
+                <w:b w:val="0"/>
+                <w:sz w:val="18"/>
+                <w:u w:val="none"/>
+              </w:rPr>
+              <w:tab/>
+            </w:r>
+          </w:p>
+        </w:tc>
+      </w:tr>
+      <w:tr>
+        <w:trPr>
+          <w:cantSplit/>
+          <w:trHeight w:val="115" w:hRule="atLeast"/>
+        </w:trPr>
+        <w:tc>
+          <w:tcPr>
+            <w:tcW w:type="dxa" w:w="648"/>
+            <w:vMerge/>
+          </w:tcPr>
+          <w:p/>
+        </w:tc>
+        <w:tc>
+          <w:tcPr>
+            <w:tcW w:type="dxa" w:w="1656"/>
+            <w:vMerge/>
+          </w:tcPr>
+          <w:p/>
+        </w:tc>
+        <w:tc>
+          <w:tcPr>
+            <w:tcW w:type="dxa" w:w="8496"/>
+            <w:tcMar>
+              <w:top w:w="0" w:type="dxa"/>
+              <w:left w:w="0" w:type="dxa"/>
+              <w:bottom w:w="0" w:type="dxa"/>
+              <w:right w:w="0" w:type="dxa"/>
             </w:tcMar>
           </w:tcPr>
           <w:p>
             <w:pPr>
               <w:spacing w:after="0"/>
-              <w:jc w:val="left"/>
-              <w:spacing w:before="0" w:after="0" w:line="20" w:lineRule="exact"/>
             </w:pPr>
+            <w:r>
+              <w:rPr>
+                <w:rFonts w:ascii="Trade Gothic Next" w:hAnsi="Trade Gothic Next"/>
+                <w:b w:val="0"/>
+                <w:sz w:val="4"/>
+                <w:u w:val="none"/>
+              </w:rPr>
+            </w:r>
           </w:p>
-          <w:tbl>
-            <w:tblPr>
-              <w:tblW w:type="auto" w:w="0"/>
-              <w:tblLayout w:type="fixed"/>
-              <w:tblLook w:firstColumn="1" w:firstRow="1" w:lastColumn="0" w:lastRow="0" w:noHBand="0" w:noVBand="1" w:val="04A0"/>
-              <w:tblLayout w:type="fixed"/>
-            </w:tblPr>
-            <w:tblGrid>
-              <w:gridCol w:w="2232"/>
-              <w:gridCol w:w="6264"/>
-            </w:tblGrid>
-            <w:tr>
-              <w:trPr>
-                <w:cantSplit/>
-                <w:trHeight w:val="518" w:hRule="atLeast"/>
-              </w:trPr>
-              <w:tc>
-                <w:tcPr>
-                  <w:tcW w:type="dxa" w:w="2232"/>
-                  <w:vAlign w:val="bottom"/>
-                  <w:tcMar>
-                    <w:top w:w="0" w:type="dxa"/>
-                    <w:left w:w="0" w:type="dxa"/>
-                    <w:bottom w:w="10" w:type="dxa"/>
-                    <w:right w:w="0" w:type="dxa"/>
-                  </w:tcMar>
-                </w:tcPr>
-                <w:p>
-                  <w:pPr>
-                    <w:spacing w:after="0"/>
-                  </w:pPr>
-                  <w:r>
-                    <w:rPr>
-                      <w:rFonts w:ascii="Trade Gothic Next" w:hAnsi="Trade Gothic Next"/>
-                      <w:b/>
-                      <w:color w:val="14161B"/>
-                      <w:sz w:val="18"/>
-                      <w:u w:val="none"/>
-                    </w:rPr>
-                    <w:t>Electron configuration</w:t>
-                  </w:r>
-                </w:p>
-              </w:tc>
-              <w:tc>
-                <w:tcPr>
-                  <w:tcW w:type="dxa" w:w="6264"/>
-                  <w:vAlign w:val="bottom"/>
-                  <w:tcMar>
-                    <w:top w:w="0" w:type="dxa"/>
-                    <w:left w:w="0" w:type="dxa"/>
-                    <w:bottom w:w="10" w:type="dxa"/>
-                    <w:right w:w="0" w:type="dxa"/>
-                  </w:tcMar>
-                  <w:tcBorders>
-                    <w:bottom w:val="single" w:sz="6" w:color="C8CDC2"/>
-                  </w:tcBorders>
-                </w:tcPr>
-                <w:p>
-                  <w:pPr>
-                    <w:spacing w:after="0"/>
-                  </w:pPr>
-                </w:p>
-              </w:tc>
-            </w:tr>
-          </w:tbl>
+        </w:tc>
+      </w:tr>
+      <w:tr>
+        <w:trPr>
+          <w:cantSplit/>
+          <w:trHeight w:val="748" w:hRule="atLeast"/>
+        </w:trPr>
+        <w:tc>
+          <w:tcPr>
+            <w:tcW w:type="dxa" w:w="648"/>
+            <w:vMerge/>
+          </w:tcPr>
+          <w:p/>
+        </w:tc>
+        <w:tc>
+          <w:tcPr>
+            <w:tcW w:type="dxa" w:w="1656"/>
+            <w:vMerge/>
+          </w:tcPr>
+          <w:p/>
+        </w:tc>
+        <w:tc>
+          <w:tcPr>
+            <w:tcW w:type="dxa" w:w="8496"/>
+            <w:tcBorders>
+              <w:top w:val="single" w:sz="6" w:color="C8CDC2"/>
+              <w:left w:val="single" w:sz="6" w:color="C8CDC2"/>
+              <w:bottom w:val="single" w:sz="6" w:color="C8CDC2"/>
+              <w:right w:val="single" w:sz="6" w:color="C8CDC2"/>
+            </w:tcBorders>
+            <w:vAlign w:val="top"/>
+            <w:tcMar>
+              <w:top w:w="30" w:type="dxa"/>
+              <w:left w:w="80" w:type="dxa"/>
+              <w:bottom w:w="20" w:type="dxa"/>
+              <w:right w:w="40" w:type="dxa"/>
+            </w:tcMar>
+          </w:tcPr>
           <w:p>
             <w:pPr>
-              <w:spacing w:before="0" w:after="0" w:line="20" w:lineRule="exact"/>
+              <w:spacing w:after="20"/>
             </w:pPr>
-          </w:p>
-          <w:tbl>
-            <w:tblPr>
-              <w:tblW w:type="auto" w:w="0"/>
-              <w:tblLayout w:type="fixed"/>
-              <w:tblLook w:firstColumn="1" w:firstRow="1" w:lastColumn="0" w:lastRow="0" w:noHBand="0" w:noVBand="1" w:val="04A0"/>
-              <w:tblLayout w:type="fixed"/>
-            </w:tblPr>
-            <w:tblGrid>
-              <w:gridCol w:w="8496"/>
-            </w:tblGrid>
-            <w:tr>
-              <w:trPr>
-                <w:cantSplit/>
-                <w:trHeight w:val="1036" w:hRule="atLeast"/>
-              </w:trPr>
-              <w:tc>
-                <w:tcPr>
-                  <w:tcW w:type="dxa" w:w="8496"/>
-                  <w:tcBorders>
-                    <w:top w:val="single" w:sz="6" w:color="C8CDC2"/>
-                    <w:left w:val="single" w:sz="6" w:color="C8CDC2"/>
-                    <w:bottom w:val="single" w:sz="6" w:color="C8CDC2"/>
-                    <w:right w:val="single" w:sz="6" w:color="C8CDC2"/>
-                  </w:tcBorders>
-                  <w:vAlign w:val="center"/>
-                  <w:tcMar>
-                    <w:top w:w="20" w:type="dxa"/>
-                    <w:left w:w="60" w:type="dxa"/>
-                    <w:bottom w:w="20" w:type="dxa"/>
-                    <w:right w:w="60" w:type="dxa"/>
-                  </w:tcMar>
-                </w:tcPr>
-                <w:p>
-                  <w:pPr>
-                    <w:spacing w:after="0"/>
-                    <w:jc w:val="left"/>
-                  </w:pPr>
-                  <w:r>
-                    <w:rPr>
-                      <w:rFonts w:ascii="Trade Gothic Next" w:hAnsi="Trade Gothic Next"/>
-                      <w:b/>
-                      <w:color w:val="55604F"/>
-                      <w:sz w:val="15"/>
-                      <w:u w:val="none"/>
-                    </w:rPr>
-                    <w:t>ORBITAL DIAGRAM</w:t>
-                  </w:r>
-                </w:p>
-              </w:tc>
-            </w:tr>
-          </w:tbl>
-          <w:p>
-            <w:pPr>
-              <w:spacing w:before="0" w:after="0" w:line="20" w:lineRule="exact"/>
-            </w:pPr>
+            <w:r>
+              <w:rPr>
+                <w:rFonts w:ascii="Trade Gothic Next" w:hAnsi="Trade Gothic Next"/>
+                <w:b w:val="0"/>
+                <w:color w:val="55604F"/>
+                <w:sz w:val="17"/>
+                <w:u w:val="none"/>
+              </w:rPr>
+              <w:t>Orbital diagram</w:t>
+            </w:r>
           </w:p>
         </w:tc>
       </w:tr>
     </w:tbl>
     <w:p>
       <w:pPr>
-        <w:spacing w:before="0" w:after="0" w:line="60" w:lineRule="exact"/>
+        <w:spacing w:before="0" w:after="0" w:line="160" w:lineRule="exact"/>
       </w:pPr>
       <w:r>
         <w:rPr>
           <w:rFonts w:ascii="Trade Gothic Next" w:hAnsi="Trade Gothic Next"/>
-          <w:sz w:val="2"/>
+          <w:sz w:val="12"/>
         </w:rPr>
       </w:r>
     </w:p>
@@ -1968,16 +1919,18 @@
       </w:tblPr>
       <w:tblGrid>
         <w:gridCol w:w="648"/>
-        <w:gridCol w:w="1512"/>
-        <w:gridCol w:w="8640"/>
+        <w:gridCol w:w="1656"/>
+        <w:gridCol w:w="8496"/>
       </w:tblGrid>
       <w:tr>
         <w:trPr>
           <w:cantSplit/>
+          <w:trHeight w:val="576" w:hRule="atLeast"/>
         </w:trPr>
         <w:tc>
           <w:tcPr>
             <w:tcW w:type="dxa" w:w="648"/>
+            <w:vMerge w:val="restart"/>
             <w:vAlign w:val="center"/>
             <w:tcMar>
               <w:top w:w="40" w:type="dxa"/>
@@ -2005,265 +1958,218 @@
         </w:tc>
         <w:tc>
           <w:tcPr>
-            <w:tcW w:type="dxa" w:w="1512"/>
-            <w:vAlign w:val="center"/>
+            <w:tcW w:type="dxa" w:w="1656"/>
+            <w:vMerge w:val="restart"/>
+            <w:vAlign w:val="top"/>
             <w:tcMar>
-              <w:top w:w="40" w:type="dxa"/>
+              <w:top w:w="0" w:type="dxa"/>
               <w:left w:w="0" w:type="dxa"/>
-              <w:bottom w:w="40" w:type="dxa"/>
-              <w:right w:w="60" w:type="dxa"/>
+              <w:bottom w:w="0" w:type="dxa"/>
+              <w:right w:w="0" w:type="dxa"/>
             </w:tcMar>
           </w:tcPr>
           <w:p>
             <w:pPr>
               <w:spacing w:after="0"/>
               <w:jc w:val="left"/>
-              <w:spacing w:before="0" w:after="0" w:line="20" w:lineRule="exact"/>
             </w:pPr>
-          </w:p>
-          <w:tbl>
-            <w:tblPr>
-              <w:tblW w:type="auto" w:w="0"/>
-              <w:tblLayout w:type="fixed"/>
-              <w:tblLook w:firstColumn="1" w:firstRow="1" w:lastColumn="0" w:lastRow="0" w:noHBand="0" w:noVBand="1" w:val="04A0"/>
-              <w:tblLayout w:type="fixed"/>
-            </w:tblPr>
-            <w:tblGrid>
-              <w:gridCol w:w="1238"/>
-            </w:tblGrid>
-            <w:tr>
-              <w:trPr>
-                <w:cantSplit/>
-                <w:trHeight w:val="1238" w:hRule="atLeast"/>
-              </w:trPr>
-              <w:tc>
-                <w:tcPr>
-                  <w:tcW w:type="dxa" w:w="1238"/>
-                  <w:tcBorders>
-                    <w:top w:val="single" w:sz="12" w:color="A3E635"/>
-                    <w:left w:val="single" w:sz="12" w:color="A3E635"/>
-                    <w:bottom w:val="single" w:sz="12" w:color="A3E635"/>
-                    <w:right w:val="single" w:sz="12" w:color="A3E635"/>
-                  </w:tcBorders>
-                  <w:tcMar>
-                    <w:top w:w="20" w:type="dxa"/>
-                    <w:left w:w="50" w:type="dxa"/>
-                    <w:bottom w:w="20" w:type="dxa"/>
-                    <w:right w:w="40" w:type="dxa"/>
-                  </w:tcMar>
-                  <w:vAlign w:val="center"/>
-                </w:tcPr>
-                <w:p>
-                  <w:pPr>
-                    <w:spacing w:after="0"/>
-                  </w:pPr>
-                  <w:r>
-                    <w:rPr>
-                      <w:rFonts w:ascii="Trade Gothic Next" w:hAnsi="Trade Gothic Next"/>
-                      <w:b/>
-                      <w:color w:val="55604F"/>
-                      <w:sz w:val="16"/>
-                      <w:u w:val="none"/>
-                    </w:rPr>
-                    <w:t>15</w:t>
-                  </w:r>
-                </w:p>
-                <w:p>
-                  <w:pPr>
-                    <w:spacing w:after="0"/>
-                    <w:jc w:val="center"/>
-                  </w:pPr>
-                  <w:r>
-                    <w:rPr>
-                      <w:rFonts w:ascii="Trade Gothic Next" w:hAnsi="Trade Gothic Next"/>
-                      <w:b/>
-                      <w:color w:val="14161B"/>
-                      <w:sz w:val="40"/>
-                      <w:u w:val="none"/>
-                    </w:rPr>
-                    <w:t>P</w:t>
-                  </w:r>
-                </w:p>
-                <w:p>
-                  <w:pPr>
-                    <w:spacing w:after="0"/>
-                    <w:jc w:val="center"/>
-                  </w:pPr>
-                  <w:r>
-                    <w:rPr>
-                      <w:rFonts w:ascii="Trade Gothic Next" w:hAnsi="Trade Gothic Next"/>
-                      <w:b w:val="0"/>
-                      <w:color w:val="55604F"/>
-                      <w:sz w:val="16"/>
-                      <w:u w:val="none"/>
-                    </w:rPr>
-                    <w:t>Phosphorus</w:t>
-                  </w:r>
-                </w:p>
-              </w:tc>
-            </w:tr>
-          </w:tbl>
-          <w:p>
-            <w:pPr>
-              <w:spacing w:before="0" w:after="0" w:line="20" w:lineRule="exact"/>
-            </w:pPr>
+            <w:r>
+              <w:drawing>
+                <wp:inline xmlns:a="http://schemas.openxmlformats.org/drawingml/2006/main" xmlns:pic="http://schemas.openxmlformats.org/drawingml/2006/picture">
+                  <wp:extent cx="914400" cy="914400"/>
+                  <wp:docPr id="2" name="Picture 2"/>
+                  <wp:cNvGraphicFramePr>
+                    <a:graphicFrameLocks noChangeAspect="1"/>
+                  </wp:cNvGraphicFramePr>
+                  <a:graphic>
+                    <a:graphicData uri="http://schemas.openxmlformats.org/drawingml/2006/picture">
+                      <pic:pic>
+                        <pic:nvPicPr>
+                          <pic:cNvPr id="0" name="tile_15.png"/>
+                          <pic:cNvPicPr/>
+                        </pic:nvPicPr>
+                        <pic:blipFill>
+                          <a:blip r:embed="rId10"/>
+                          <a:stretch>
+                            <a:fillRect/>
+                          </a:stretch>
+                        </pic:blipFill>
+                        <pic:spPr>
+                          <a:xfrm>
+                            <a:off x="0" y="0"/>
+                            <a:ext cx="914400" cy="914400"/>
+                          </a:xfrm>
+                          <a:prstGeom prst="rect"/>
+                        </pic:spPr>
+                      </pic:pic>
+                    </a:graphicData>
+                  </a:graphic>
+                </wp:inline>
+              </w:drawing>
+            </w:r>
           </w:p>
         </w:tc>
         <w:tc>
           <w:tcPr>
-            <w:tcW w:type="dxa" w:w="8640"/>
-            <w:vAlign w:val="center"/>
+            <w:tcW w:type="dxa" w:w="8496"/>
+            <w:vAlign w:val="bottom"/>
             <w:tcMar>
-              <w:top w:w="10" w:type="dxa"/>
-              <w:left w:w="60" w:type="dxa"/>
-              <w:bottom w:w="10" w:type="dxa"/>
+              <w:top w:w="0" w:type="dxa"/>
+              <w:left w:w="80" w:type="dxa"/>
+              <w:bottom w:w="20" w:type="dxa"/>
               <w:right w:w="60" w:type="dxa"/>
+            </w:tcMar>
+            <w:tcBorders>
+              <w:bottom w:val="single" w:sz="4" w:color="C8CDC2"/>
+            </w:tcBorders>
+          </w:tcPr>
+          <w:p>
+            <w:pPr>
+              <w:tabs>
+                <w:tab w:pos="1800" w:val="left"/>
+              </w:tabs>
+              <w:spacing w:after="0"/>
+              <w:jc w:val="left"/>
+            </w:pPr>
+            <w:r>
+              <w:rPr>
+                <w:rFonts w:ascii="Trade Gothic Next" w:hAnsi="Trade Gothic Next"/>
+                <w:b/>
+                <w:color w:val="14161B"/>
+                <w:sz w:val="18"/>
+                <w:u w:val="none"/>
+              </w:rPr>
+              <w:t>Configuration</w:t>
+            </w:r>
+            <w:r>
+              <w:rPr>
+                <w:rFonts w:ascii="Trade Gothic Next" w:hAnsi="Trade Gothic Next"/>
+                <w:b w:val="0"/>
+                <w:sz w:val="18"/>
+                <w:u w:val="none"/>
+              </w:rPr>
+              <w:tab/>
+            </w:r>
+          </w:p>
+        </w:tc>
+      </w:tr>
+      <w:tr>
+        <w:trPr>
+          <w:cantSplit/>
+          <w:trHeight w:val="115" w:hRule="atLeast"/>
+        </w:trPr>
+        <w:tc>
+          <w:tcPr>
+            <w:tcW w:type="dxa" w:w="648"/>
+            <w:vMerge/>
+          </w:tcPr>
+          <w:p/>
+        </w:tc>
+        <w:tc>
+          <w:tcPr>
+            <w:tcW w:type="dxa" w:w="1656"/>
+            <w:vMerge/>
+          </w:tcPr>
+          <w:p/>
+        </w:tc>
+        <w:tc>
+          <w:tcPr>
+            <w:tcW w:type="dxa" w:w="8496"/>
+            <w:tcMar>
+              <w:top w:w="0" w:type="dxa"/>
+              <w:left w:w="0" w:type="dxa"/>
+              <w:bottom w:w="0" w:type="dxa"/>
+              <w:right w:w="0" w:type="dxa"/>
             </w:tcMar>
           </w:tcPr>
           <w:p>
             <w:pPr>
               <w:spacing w:after="0"/>
-              <w:jc w:val="left"/>
-              <w:spacing w:before="0" w:after="0" w:line="20" w:lineRule="exact"/>
             </w:pPr>
+            <w:r>
+              <w:rPr>
+                <w:rFonts w:ascii="Trade Gothic Next" w:hAnsi="Trade Gothic Next"/>
+                <w:b w:val="0"/>
+                <w:sz w:val="4"/>
+                <w:u w:val="none"/>
+              </w:rPr>
+            </w:r>
           </w:p>
-          <w:tbl>
-            <w:tblPr>
-              <w:tblW w:type="auto" w:w="0"/>
-              <w:tblLayout w:type="fixed"/>
-              <w:tblLook w:firstColumn="1" w:firstRow="1" w:lastColumn="0" w:lastRow="0" w:noHBand="0" w:noVBand="1" w:val="04A0"/>
-              <w:tblLayout w:type="fixed"/>
-            </w:tblPr>
-            <w:tblGrid>
-              <w:gridCol w:w="2232"/>
-              <w:gridCol w:w="6264"/>
-            </w:tblGrid>
-            <w:tr>
-              <w:trPr>
-                <w:cantSplit/>
-                <w:trHeight w:val="518" w:hRule="atLeast"/>
-              </w:trPr>
-              <w:tc>
-                <w:tcPr>
-                  <w:tcW w:type="dxa" w:w="2232"/>
-                  <w:vAlign w:val="bottom"/>
-                  <w:tcMar>
-                    <w:top w:w="0" w:type="dxa"/>
-                    <w:left w:w="0" w:type="dxa"/>
-                    <w:bottom w:w="10" w:type="dxa"/>
-                    <w:right w:w="0" w:type="dxa"/>
-                  </w:tcMar>
-                </w:tcPr>
-                <w:p>
-                  <w:pPr>
-                    <w:spacing w:after="0"/>
-                  </w:pPr>
-                  <w:r>
-                    <w:rPr>
-                      <w:rFonts w:ascii="Trade Gothic Next" w:hAnsi="Trade Gothic Next"/>
-                      <w:b/>
-                      <w:color w:val="14161B"/>
-                      <w:sz w:val="18"/>
-                      <w:u w:val="none"/>
-                    </w:rPr>
-                    <w:t>Electron configuration</w:t>
-                  </w:r>
-                </w:p>
-              </w:tc>
-              <w:tc>
-                <w:tcPr>
-                  <w:tcW w:type="dxa" w:w="6264"/>
-                  <w:vAlign w:val="bottom"/>
-                  <w:tcMar>
-                    <w:top w:w="0" w:type="dxa"/>
-                    <w:left w:w="0" w:type="dxa"/>
-                    <w:bottom w:w="10" w:type="dxa"/>
-                    <w:right w:w="0" w:type="dxa"/>
-                  </w:tcMar>
-                  <w:tcBorders>
-                    <w:bottom w:val="single" w:sz="6" w:color="C8CDC2"/>
-                  </w:tcBorders>
-                </w:tcPr>
-                <w:p>
-                  <w:pPr>
-                    <w:spacing w:after="0"/>
-                  </w:pPr>
-                </w:p>
-              </w:tc>
-            </w:tr>
-          </w:tbl>
+        </w:tc>
+      </w:tr>
+      <w:tr>
+        <w:trPr>
+          <w:cantSplit/>
+          <w:trHeight w:val="748" w:hRule="atLeast"/>
+        </w:trPr>
+        <w:tc>
+          <w:tcPr>
+            <w:tcW w:type="dxa" w:w="648"/>
+            <w:vMerge/>
+          </w:tcPr>
+          <w:p/>
+        </w:tc>
+        <w:tc>
+          <w:tcPr>
+            <w:tcW w:type="dxa" w:w="1656"/>
+            <w:vMerge/>
+          </w:tcPr>
+          <w:p/>
+        </w:tc>
+        <w:tc>
+          <w:tcPr>
+            <w:tcW w:type="dxa" w:w="8496"/>
+            <w:tcBorders>
+              <w:top w:val="single" w:sz="6" w:color="C8CDC2"/>
+              <w:left w:val="single" w:sz="6" w:color="C8CDC2"/>
+              <w:bottom w:val="single" w:sz="6" w:color="C8CDC2"/>
+              <w:right w:val="single" w:sz="6" w:color="C8CDC2"/>
+            </w:tcBorders>
+            <w:vAlign w:val="top"/>
+            <w:tcMar>
+              <w:top w:w="30" w:type="dxa"/>
+              <w:left w:w="80" w:type="dxa"/>
+              <w:bottom w:w="20" w:type="dxa"/>
+              <w:right w:w="40" w:type="dxa"/>
+            </w:tcMar>
+          </w:tcPr>
           <w:p>
             <w:pPr>
-              <w:spacing w:before="0" w:after="0" w:line="20" w:lineRule="exact"/>
+              <w:spacing w:after="20"/>
             </w:pPr>
-          </w:p>
-          <w:tbl>
-            <w:tblPr>
-              <w:tblW w:type="auto" w:w="0"/>
-              <w:tblLayout w:type="fixed"/>
-              <w:tblLook w:firstColumn="1" w:firstRow="1" w:lastColumn="0" w:lastRow="0" w:noHBand="0" w:noVBand="1" w:val="04A0"/>
-              <w:tblLayout w:type="fixed"/>
-            </w:tblPr>
-            <w:tblGrid>
-              <w:gridCol w:w="8496"/>
-            </w:tblGrid>
-            <w:tr>
-              <w:trPr>
-                <w:cantSplit/>
-                <w:trHeight w:val="1036" w:hRule="atLeast"/>
-              </w:trPr>
-              <w:tc>
-                <w:tcPr>
-                  <w:tcW w:type="dxa" w:w="8496"/>
-                  <w:tcBorders>
-                    <w:top w:val="single" w:sz="6" w:color="C8CDC2"/>
-                    <w:left w:val="single" w:sz="6" w:color="C8CDC2"/>
-                    <w:bottom w:val="single" w:sz="6" w:color="C8CDC2"/>
-                    <w:right w:val="single" w:sz="6" w:color="C8CDC2"/>
-                  </w:tcBorders>
-                  <w:vAlign w:val="center"/>
-                  <w:tcMar>
-                    <w:top w:w="20" w:type="dxa"/>
-                    <w:left w:w="60" w:type="dxa"/>
-                    <w:bottom w:w="20" w:type="dxa"/>
-                    <w:right w:w="60" w:type="dxa"/>
-                  </w:tcMar>
-                </w:tcPr>
-                <w:p>
-                  <w:pPr>
-                    <w:spacing w:after="0"/>
-                    <w:jc w:val="left"/>
-                  </w:pPr>
-                  <w:r>
-                    <w:rPr>
-                      <w:rFonts w:ascii="Trade Gothic Next" w:hAnsi="Trade Gothic Next"/>
-                      <w:b/>
-                      <w:color w:val="55604F"/>
-                      <w:sz w:val="15"/>
-                      <w:u w:val="none"/>
-                    </w:rPr>
-                    <w:t>ORBITAL DIAGRAM</w:t>
-                  </w:r>
-                </w:p>
-              </w:tc>
-            </w:tr>
-          </w:tbl>
-          <w:p>
-            <w:pPr>
-              <w:spacing w:before="0" w:after="0" w:line="20" w:lineRule="exact"/>
-            </w:pPr>
+            <w:r>
+              <w:rPr>
+                <w:rFonts w:ascii="Trade Gothic Next" w:hAnsi="Trade Gothic Next"/>
+                <w:b w:val="0"/>
+                <w:color w:val="55604F"/>
+                <w:sz w:val="17"/>
+                <w:u w:val="none"/>
+              </w:rPr>
+              <w:t>Orbital diagram</w:t>
+            </w:r>
           </w:p>
         </w:tc>
       </w:tr>
     </w:tbl>
     <w:p>
       <w:pPr>
-        <w:spacing w:before="0" w:after="0" w:line="120" w:lineRule="exact"/>
+        <w:spacing w:before="0" w:after="0" w:line="160" w:lineRule="exact"/>
       </w:pPr>
       <w:r>
         <w:rPr>
           <w:rFonts w:ascii="Trade Gothic Next" w:hAnsi="Trade Gothic Next"/>
-          <w:sz w:val="8"/>
+          <w:sz w:val="12"/>
+        </w:rPr>
+      </w:r>
+    </w:p>
+    <w:p>
+      <w:pPr>
+        <w:spacing w:before="0" w:after="0" w:line="140" w:lineRule="exact"/>
+      </w:pPr>
+      <w:r>
+        <w:rPr>
+          <w:rFonts w:ascii="Trade Gothic Next" w:hAnsi="Trade Gothic Next"/>
+          <w:sz w:val="10"/>
         </w:rPr>
       </w:r>
     </w:p>
@@ -2283,12 +2189,11 @@
           <w:tcPr>
             <w:tcW w:type="dxa" w:w="9072"/>
             <w:tcBorders>
-              <w:top w:val="single" w:sz="12" w:color="14161B"/>
-              <w:bottom w:val="single" w:sz="18" w:color="A3E635"/>
+              <w:bottom w:val="single" w:sz="10" w:color="14161B"/>
             </w:tcBorders>
             <w:vAlign w:val="center"/>
             <w:tcMar>
-              <w:top w:w="30" w:type="dxa"/>
+              <w:top w:w="0" w:type="dxa"/>
               <w:left w:w="0" w:type="dxa"/>
               <w:bottom w:w="30" w:type="dxa"/>
               <w:right w:w="60" w:type="dxa"/>
@@ -2305,10 +2210,10 @@
                 <w:rFonts w:ascii="Trade Gothic Next" w:hAnsi="Trade Gothic Next"/>
                 <w:b/>
                 <w:color w:val="14161B"/>
-                <w:sz w:val="18"/>
+                <w:sz w:val="20"/>
                 <w:u w:val="none"/>
               </w:rPr>
-              <w:t>PART 3  ·  NOBLE-GAS SHORTHAND</w:t>
+              <w:t>Part 3   Noble-gas shorthand</w:t>
             </w:r>
           </w:p>
         </w:tc>
@@ -2316,15 +2221,14 @@
           <w:tcPr>
             <w:tcW w:type="dxa" w:w="1728"/>
             <w:tcBorders>
-              <w:top w:val="single" w:sz="12" w:color="14161B"/>
-              <w:bottom w:val="single" w:sz="18" w:color="A3E635"/>
+              <w:bottom w:val="single" w:sz="10" w:color="14161B"/>
             </w:tcBorders>
             <w:vAlign w:val="center"/>
             <w:tcMar>
-              <w:top w:w="30" w:type="dxa"/>
+              <w:top w:w="0" w:type="dxa"/>
               <w:left w:w="60" w:type="dxa"/>
               <w:bottom w:w="30" w:type="dxa"/>
-              <w:right w:w="60" w:type="dxa"/>
+              <w:right w:w="0" w:type="dxa"/>
             </w:tcMar>
           </w:tcPr>
           <w:p>
@@ -2336,12 +2240,12 @@
             <w:r>
               <w:rPr>
                 <w:rFonts w:ascii="Trade Gothic Next" w:hAnsi="Trade Gothic Next"/>
-                <w:b/>
+                <w:b w:val="0"/>
                 <w:color w:val="55604F"/>
-                <w:sz w:val="17"/>
+                <w:sz w:val="18"/>
                 <w:u w:val="none"/>
               </w:rPr>
-              <w:t>4 pts</w:t>
+              <w:t>4 points</w:t>
             </w:r>
           </w:p>
         </w:tc>
@@ -2367,12 +2271,16 @@
       </w:tblPr>
       <w:tblGrid>
         <w:gridCol w:w="648"/>
-        <w:gridCol w:w="1512"/>
-        <w:gridCol w:w="8640"/>
+        <w:gridCol w:w="1224"/>
+        <w:gridCol w:w="3528"/>
+        <w:gridCol w:w="648"/>
+        <w:gridCol w:w="1224"/>
+        <w:gridCol w:w="3528"/>
       </w:tblGrid>
       <w:tr>
         <w:trPr>
           <w:cantSplit/>
+          <w:trHeight w:val="1238" w:hRule="atLeast"/>
         </w:trPr>
         <w:tc>
           <w:tcPr>
@@ -2404,212 +2312,77 @@
         </w:tc>
         <w:tc>
           <w:tcPr>
-            <w:tcW w:type="dxa" w:w="1512"/>
+            <w:tcW w:type="dxa" w:w="1224"/>
             <w:vAlign w:val="center"/>
             <w:tcMar>
-              <w:top w:w="40" w:type="dxa"/>
+              <w:top w:w="0" w:type="dxa"/>
               <w:left w:w="0" w:type="dxa"/>
-              <w:bottom w:w="40" w:type="dxa"/>
-              <w:right w:w="60" w:type="dxa"/>
+              <w:bottom w:w="0" w:type="dxa"/>
+              <w:right w:w="0" w:type="dxa"/>
             </w:tcMar>
           </w:tcPr>
           <w:p>
             <w:pPr>
               <w:spacing w:after="0"/>
               <w:jc w:val="left"/>
-              <w:spacing w:before="0" w:after="0" w:line="20" w:lineRule="exact"/>
             </w:pPr>
-          </w:p>
-          <w:tbl>
-            <w:tblPr>
-              <w:tblW w:type="auto" w:w="0"/>
-              <w:tblLayout w:type="fixed"/>
-              <w:tblLook w:firstColumn="1" w:firstRow="1" w:lastColumn="0" w:lastRow="0" w:noHBand="0" w:noVBand="1" w:val="04A0"/>
-              <w:tblLayout w:type="fixed"/>
-            </w:tblPr>
-            <w:tblGrid>
-              <w:gridCol w:w="1008"/>
-            </w:tblGrid>
-            <w:tr>
-              <w:trPr>
-                <w:cantSplit/>
-                <w:trHeight w:val="892" w:hRule="atLeast"/>
-              </w:trPr>
-              <w:tc>
-                <w:tcPr>
-                  <w:tcW w:type="dxa" w:w="1008"/>
-                  <w:tcBorders>
-                    <w:top w:val="single" w:sz="12" w:color="A3E635"/>
-                    <w:left w:val="single" w:sz="12" w:color="A3E635"/>
-                    <w:bottom w:val="single" w:sz="12" w:color="A3E635"/>
-                    <w:right w:val="single" w:sz="12" w:color="A3E635"/>
-                  </w:tcBorders>
-                  <w:tcMar>
-                    <w:top w:w="20" w:type="dxa"/>
-                    <w:left w:w="50" w:type="dxa"/>
-                    <w:bottom w:w="20" w:type="dxa"/>
-                    <w:right w:w="40" w:type="dxa"/>
-                  </w:tcMar>
-                  <w:vAlign w:val="center"/>
-                </w:tcPr>
-                <w:p>
-                  <w:pPr>
-                    <w:spacing w:after="0"/>
-                  </w:pPr>
-                  <w:r>
-                    <w:rPr>
-                      <w:rFonts w:ascii="Trade Gothic Next" w:hAnsi="Trade Gothic Next"/>
-                      <w:b/>
-                      <w:color w:val="55604F"/>
-                      <w:sz w:val="16"/>
-                      <w:u w:val="none"/>
-                    </w:rPr>
-                    <w:t>26</w:t>
-                  </w:r>
-                </w:p>
-                <w:p>
-                  <w:pPr>
-                    <w:spacing w:after="0"/>
-                    <w:jc w:val="center"/>
-                  </w:pPr>
-                  <w:r>
-                    <w:rPr>
-                      <w:rFonts w:ascii="Trade Gothic Next" w:hAnsi="Trade Gothic Next"/>
-                      <w:b/>
-                      <w:color w:val="14161B"/>
-                      <w:sz w:val="32"/>
-                      <w:u w:val="none"/>
-                    </w:rPr>
-                    <w:t>Fe</w:t>
-                  </w:r>
-                </w:p>
-              </w:tc>
-            </w:tr>
-          </w:tbl>
-          <w:p>
-            <w:pPr>
-              <w:spacing w:before="0" w:after="0" w:line="20" w:lineRule="exact"/>
-            </w:pPr>
+            <w:r>
+              <w:drawing>
+                <wp:inline xmlns:a="http://schemas.openxmlformats.org/drawingml/2006/main" xmlns:pic="http://schemas.openxmlformats.org/drawingml/2006/picture">
+                  <wp:extent cx="658368" cy="658368"/>
+                  <wp:docPr id="3" name="Picture 3"/>
+                  <wp:cNvGraphicFramePr>
+                    <a:graphicFrameLocks noChangeAspect="1"/>
+                  </wp:cNvGraphicFramePr>
+                  <a:graphic>
+                    <a:graphicData uri="http://schemas.openxmlformats.org/drawingml/2006/picture">
+                      <pic:pic>
+                        <pic:nvPicPr>
+                          <pic:cNvPr id="0" name="tile_26.png"/>
+                          <pic:cNvPicPr/>
+                        </pic:nvPicPr>
+                        <pic:blipFill>
+                          <a:blip r:embed="rId11"/>
+                          <a:stretch>
+                            <a:fillRect/>
+                          </a:stretch>
+                        </pic:blipFill>
+                        <pic:spPr>
+                          <a:xfrm>
+                            <a:off x="0" y="0"/>
+                            <a:ext cx="658368" cy="658368"/>
+                          </a:xfrm>
+                          <a:prstGeom prst="rect"/>
+                        </pic:spPr>
+                      </pic:pic>
+                    </a:graphicData>
+                  </a:graphic>
+                </wp:inline>
+              </w:drawing>
+            </w:r>
           </w:p>
         </w:tc>
         <w:tc>
           <w:tcPr>
-            <w:tcW w:type="dxa" w:w="8640"/>
-            <w:vAlign w:val="center"/>
+            <w:tcW w:type="dxa" w:w="3528"/>
+            <w:vAlign w:val="bottom"/>
             <w:tcMar>
-              <w:top w:w="10" w:type="dxa"/>
-              <w:left w:w="60" w:type="dxa"/>
-              <w:bottom w:w="10" w:type="dxa"/>
+              <w:top w:w="0" w:type="dxa"/>
+              <w:left w:w="80" w:type="dxa"/>
+              <w:bottom w:w="40" w:type="dxa"/>
               <w:right w:w="60" w:type="dxa"/>
             </w:tcMar>
+            <w:tcBorders>
+              <w:bottom w:val="single" w:sz="6" w:color="C8CDC2"/>
+            </w:tcBorders>
           </w:tcPr>
           <w:p>
             <w:pPr>
               <w:spacing w:after="0"/>
               <w:jc w:val="left"/>
-              <w:spacing w:before="0" w:after="0" w:line="20" w:lineRule="exact"/>
-            </w:pPr>
-          </w:p>
-          <w:tbl>
-            <w:tblPr>
-              <w:tblW w:type="auto" w:w="0"/>
-              <w:tblLayout w:type="fixed"/>
-              <w:tblLook w:firstColumn="1" w:firstRow="1" w:lastColumn="0" w:lastRow="0" w:noHBand="0" w:noVBand="1" w:val="04A0"/>
-              <w:tblLayout w:type="fixed"/>
-            </w:tblPr>
-            <w:tblGrid>
-              <w:gridCol w:w="1440"/>
-              <w:gridCol w:w="7056"/>
-            </w:tblGrid>
-            <w:tr>
-              <w:trPr>
-                <w:cantSplit/>
-                <w:trHeight w:val="633" w:hRule="atLeast"/>
-              </w:trPr>
-              <w:tc>
-                <w:tcPr>
-                  <w:tcW w:type="dxa" w:w="1440"/>
-                  <w:vAlign w:val="bottom"/>
-                  <w:tcMar>
-                    <w:top w:w="0" w:type="dxa"/>
-                    <w:left w:w="0" w:type="dxa"/>
-                    <w:bottom w:w="10" w:type="dxa"/>
-                    <w:right w:w="0" w:type="dxa"/>
-                  </w:tcMar>
-                </w:tcPr>
-                <w:p>
-                  <w:pPr>
-                    <w:spacing w:after="0"/>
-                  </w:pPr>
-                  <w:r>
-                    <w:rPr>
-                      <w:rFonts w:ascii="Trade Gothic Next" w:hAnsi="Trade Gothic Next"/>
-                      <w:b/>
-                      <w:color w:val="14161B"/>
-                      <w:sz w:val="18"/>
-                      <w:u w:val="none"/>
-                    </w:rPr>
-                    <w:t>Shorthand</w:t>
-                  </w:r>
-                </w:p>
-              </w:tc>
-              <w:tc>
-                <w:tcPr>
-                  <w:tcW w:type="dxa" w:w="7056"/>
-                  <w:vAlign w:val="bottom"/>
-                  <w:tcMar>
-                    <w:top w:w="0" w:type="dxa"/>
-                    <w:left w:w="0" w:type="dxa"/>
-                    <w:bottom w:w="10" w:type="dxa"/>
-                    <w:right w:w="0" w:type="dxa"/>
-                  </w:tcMar>
-                  <w:tcBorders>
-                    <w:bottom w:val="single" w:sz="6" w:color="C8CDC2"/>
-                  </w:tcBorders>
-                </w:tcPr>
-                <w:p>
-                  <w:pPr>
-                    <w:spacing w:after="0"/>
-                  </w:pPr>
-                </w:p>
-              </w:tc>
-            </w:tr>
-          </w:tbl>
-          <w:p>
-            <w:pPr>
-              <w:spacing w:before="0" w:after="0" w:line="20" w:lineRule="exact"/>
             </w:pPr>
           </w:p>
         </w:tc>
-      </w:tr>
-    </w:tbl>
-    <w:p>
-      <w:pPr>
-        <w:spacing w:before="0" w:after="0" w:line="60" w:lineRule="exact"/>
-      </w:pPr>
-      <w:r>
-        <w:rPr>
-          <w:rFonts w:ascii="Trade Gothic Next" w:hAnsi="Trade Gothic Next"/>
-          <w:sz w:val="2"/>
-        </w:rPr>
-      </w:r>
-    </w:p>
-    <w:tbl>
-      <w:tblPr>
-        <w:tblW w:type="auto" w:w="0"/>
-        <w:tblLayout w:type="fixed"/>
-        <w:tblLook w:firstColumn="1" w:firstRow="1" w:lastColumn="0" w:lastRow="0" w:noHBand="0" w:noVBand="1" w:val="04A0"/>
-        <w:tblLayout w:type="fixed"/>
-      </w:tblPr>
-      <w:tblGrid>
-        <w:gridCol w:w="648"/>
-        <w:gridCol w:w="1512"/>
-        <w:gridCol w:w="8640"/>
-      </w:tblGrid>
-      <w:tr>
-        <w:trPr>
-          <w:cantSplit/>
-        </w:trPr>
         <w:tc>
           <w:tcPr>
             <w:tcW w:type="dxa" w:w="648"/>
@@ -2640,180 +2413,74 @@
         </w:tc>
         <w:tc>
           <w:tcPr>
-            <w:tcW w:type="dxa" w:w="1512"/>
+            <w:tcW w:type="dxa" w:w="1224"/>
             <w:vAlign w:val="center"/>
             <w:tcMar>
-              <w:top w:w="40" w:type="dxa"/>
+              <w:top w:w="0" w:type="dxa"/>
               <w:left w:w="0" w:type="dxa"/>
-              <w:bottom w:w="40" w:type="dxa"/>
-              <w:right w:w="60" w:type="dxa"/>
+              <w:bottom w:w="0" w:type="dxa"/>
+              <w:right w:w="0" w:type="dxa"/>
             </w:tcMar>
           </w:tcPr>
           <w:p>
             <w:pPr>
               <w:spacing w:after="0"/>
               <w:jc w:val="left"/>
-              <w:spacing w:before="0" w:after="0" w:line="20" w:lineRule="exact"/>
             </w:pPr>
-          </w:p>
-          <w:tbl>
-            <w:tblPr>
-              <w:tblW w:type="auto" w:w="0"/>
-              <w:tblLayout w:type="fixed"/>
-              <w:tblLook w:firstColumn="1" w:firstRow="1" w:lastColumn="0" w:lastRow="0" w:noHBand="0" w:noVBand="1" w:val="04A0"/>
-              <w:tblLayout w:type="fixed"/>
-            </w:tblPr>
-            <w:tblGrid>
-              <w:gridCol w:w="1008"/>
-            </w:tblGrid>
-            <w:tr>
-              <w:trPr>
-                <w:cantSplit/>
-                <w:trHeight w:val="892" w:hRule="atLeast"/>
-              </w:trPr>
-              <w:tc>
-                <w:tcPr>
-                  <w:tcW w:type="dxa" w:w="1008"/>
-                  <w:tcBorders>
-                    <w:top w:val="single" w:sz="12" w:color="A3E635"/>
-                    <w:left w:val="single" w:sz="12" w:color="A3E635"/>
-                    <w:bottom w:val="single" w:sz="12" w:color="A3E635"/>
-                    <w:right w:val="single" w:sz="12" w:color="A3E635"/>
-                  </w:tcBorders>
-                  <w:tcMar>
-                    <w:top w:w="20" w:type="dxa"/>
-                    <w:left w:w="50" w:type="dxa"/>
-                    <w:bottom w:w="20" w:type="dxa"/>
-                    <w:right w:w="40" w:type="dxa"/>
-                  </w:tcMar>
-                  <w:vAlign w:val="center"/>
-                </w:tcPr>
-                <w:p>
-                  <w:pPr>
-                    <w:spacing w:after="0"/>
-                  </w:pPr>
-                  <w:r>
-                    <w:rPr>
-                      <w:rFonts w:ascii="Trade Gothic Next" w:hAnsi="Trade Gothic Next"/>
-                      <w:b/>
-                      <w:color w:val="55604F"/>
-                      <w:sz w:val="16"/>
-                      <w:u w:val="none"/>
-                    </w:rPr>
-                    <w:t>50</w:t>
-                  </w:r>
-                </w:p>
-                <w:p>
-                  <w:pPr>
-                    <w:spacing w:after="0"/>
-                    <w:jc w:val="center"/>
-                  </w:pPr>
-                  <w:r>
-                    <w:rPr>
-                      <w:rFonts w:ascii="Trade Gothic Next" w:hAnsi="Trade Gothic Next"/>
-                      <w:b/>
-                      <w:color w:val="14161B"/>
-                      <w:sz w:val="32"/>
-                      <w:u w:val="none"/>
-                    </w:rPr>
-                    <w:t>Sn</w:t>
-                  </w:r>
-                </w:p>
-              </w:tc>
-            </w:tr>
-          </w:tbl>
-          <w:p>
-            <w:pPr>
-              <w:spacing w:before="0" w:after="0" w:line="20" w:lineRule="exact"/>
-            </w:pPr>
+            <w:r>
+              <w:drawing>
+                <wp:inline xmlns:a="http://schemas.openxmlformats.org/drawingml/2006/main" xmlns:pic="http://schemas.openxmlformats.org/drawingml/2006/picture">
+                  <wp:extent cx="658368" cy="658368"/>
+                  <wp:docPr id="4" name="Picture 4"/>
+                  <wp:cNvGraphicFramePr>
+                    <a:graphicFrameLocks noChangeAspect="1"/>
+                  </wp:cNvGraphicFramePr>
+                  <a:graphic>
+                    <a:graphicData uri="http://schemas.openxmlformats.org/drawingml/2006/picture">
+                      <pic:pic>
+                        <pic:nvPicPr>
+                          <pic:cNvPr id="0" name="tile_50.png"/>
+                          <pic:cNvPicPr/>
+                        </pic:nvPicPr>
+                        <pic:blipFill>
+                          <a:blip r:embed="rId12"/>
+                          <a:stretch>
+                            <a:fillRect/>
+                          </a:stretch>
+                        </pic:blipFill>
+                        <pic:spPr>
+                          <a:xfrm>
+                            <a:off x="0" y="0"/>
+                            <a:ext cx="658368" cy="658368"/>
+                          </a:xfrm>
+                          <a:prstGeom prst="rect"/>
+                        </pic:spPr>
+                      </pic:pic>
+                    </a:graphicData>
+                  </a:graphic>
+                </wp:inline>
+              </w:drawing>
+            </w:r>
           </w:p>
         </w:tc>
         <w:tc>
           <w:tcPr>
-            <w:tcW w:type="dxa" w:w="8640"/>
-            <w:vAlign w:val="center"/>
+            <w:tcW w:type="dxa" w:w="3528"/>
+            <w:vAlign w:val="bottom"/>
             <w:tcMar>
-              <w:top w:w="10" w:type="dxa"/>
-              <w:left w:w="60" w:type="dxa"/>
-              <w:bottom w:w="10" w:type="dxa"/>
+              <w:top w:w="0" w:type="dxa"/>
+              <w:left w:w="80" w:type="dxa"/>
+              <w:bottom w:w="40" w:type="dxa"/>
               <w:right w:w="60" w:type="dxa"/>
             </w:tcMar>
+            <w:tcBorders>
+              <w:bottom w:val="single" w:sz="6" w:color="C8CDC2"/>
+            </w:tcBorders>
           </w:tcPr>
           <w:p>
             <w:pPr>
               <w:spacing w:after="0"/>
               <w:jc w:val="left"/>
-              <w:spacing w:before="0" w:after="0" w:line="20" w:lineRule="exact"/>
-            </w:pPr>
-          </w:p>
-          <w:tbl>
-            <w:tblPr>
-              <w:tblW w:type="auto" w:w="0"/>
-              <w:tblLayout w:type="fixed"/>
-              <w:tblLook w:firstColumn="1" w:firstRow="1" w:lastColumn="0" w:lastRow="0" w:noHBand="0" w:noVBand="1" w:val="04A0"/>
-              <w:tblLayout w:type="fixed"/>
-            </w:tblPr>
-            <w:tblGrid>
-              <w:gridCol w:w="1440"/>
-              <w:gridCol w:w="7056"/>
-            </w:tblGrid>
-            <w:tr>
-              <w:trPr>
-                <w:cantSplit/>
-                <w:trHeight w:val="633" w:hRule="atLeast"/>
-              </w:trPr>
-              <w:tc>
-                <w:tcPr>
-                  <w:tcW w:type="dxa" w:w="1440"/>
-                  <w:vAlign w:val="bottom"/>
-                  <w:tcMar>
-                    <w:top w:w="0" w:type="dxa"/>
-                    <w:left w:w="0" w:type="dxa"/>
-                    <w:bottom w:w="10" w:type="dxa"/>
-                    <w:right w:w="0" w:type="dxa"/>
-                  </w:tcMar>
-                </w:tcPr>
-                <w:p>
-                  <w:pPr>
-                    <w:spacing w:after="0"/>
-                  </w:pPr>
-                  <w:r>
-                    <w:rPr>
-                      <w:rFonts w:ascii="Trade Gothic Next" w:hAnsi="Trade Gothic Next"/>
-                      <w:b/>
-                      <w:color w:val="14161B"/>
-                      <w:sz w:val="18"/>
-                      <w:u w:val="none"/>
-                    </w:rPr>
-                    <w:t>Shorthand</w:t>
-                  </w:r>
-                </w:p>
-              </w:tc>
-              <w:tc>
-                <w:tcPr>
-                  <w:tcW w:type="dxa" w:w="7056"/>
-                  <w:vAlign w:val="bottom"/>
-                  <w:tcMar>
-                    <w:top w:w="0" w:type="dxa"/>
-                    <w:left w:w="0" w:type="dxa"/>
-                    <w:bottom w:w="10" w:type="dxa"/>
-                    <w:right w:w="0" w:type="dxa"/>
-                  </w:tcMar>
-                  <w:tcBorders>
-                    <w:bottom w:val="single" w:sz="6" w:color="C8CDC2"/>
-                  </w:tcBorders>
-                </w:tcPr>
-                <w:p>
-                  <w:pPr>
-                    <w:spacing w:after="0"/>
-                  </w:pPr>
-                </w:p>
-              </w:tc>
-            </w:tr>
-          </w:tbl>
-          <w:p>
-            <w:pPr>
-              <w:spacing w:before="0" w:after="0" w:line="20" w:lineRule="exact"/>
             </w:pPr>
           </w:p>
         </w:tc>
@@ -2821,12 +2488,12 @@
     </w:tbl>
     <w:p>
       <w:pPr>
-        <w:spacing w:before="0" w:after="0" w:line="120" w:lineRule="exact"/>
+        <w:spacing w:before="0" w:after="0" w:line="140" w:lineRule="exact"/>
       </w:pPr>
       <w:r>
         <w:rPr>
           <w:rFonts w:ascii="Trade Gothic Next" w:hAnsi="Trade Gothic Next"/>
-          <w:sz w:val="8"/>
+          <w:sz w:val="10"/>
         </w:rPr>
       </w:r>
     </w:p>
@@ -2846,12 +2513,11 @@
           <w:tcPr>
             <w:tcW w:type="dxa" w:w="9072"/>
             <w:tcBorders>
-              <w:top w:val="single" w:sz="12" w:color="14161B"/>
-              <w:bottom w:val="single" w:sz="18" w:color="A3E635"/>
+              <w:bottom w:val="single" w:sz="10" w:color="14161B"/>
             </w:tcBorders>
             <w:vAlign w:val="center"/>
             <w:tcMar>
-              <w:top w:w="30" w:type="dxa"/>
+              <w:top w:w="0" w:type="dxa"/>
               <w:left w:w="0" w:type="dxa"/>
               <w:bottom w:w="30" w:type="dxa"/>
               <w:right w:w="60" w:type="dxa"/>
@@ -2868,10 +2534,10 @@
                 <w:rFonts w:ascii="Trade Gothic Next" w:hAnsi="Trade Gothic Next"/>
                 <w:b/>
                 <w:color w:val="14161B"/>
-                <w:sz w:val="18"/>
+                <w:sz w:val="20"/>
                 <w:u w:val="none"/>
               </w:rPr>
-              <w:t>PART 4  ·  IONS:  CHARGE, AND CATION OR ANION</w:t>
+              <w:t>Part 4   Ions: the charge, and cation or anion</w:t>
             </w:r>
           </w:p>
         </w:tc>
@@ -2879,15 +2545,14 @@
           <w:tcPr>
             <w:tcW w:type="dxa" w:w="1728"/>
             <w:tcBorders>
-              <w:top w:val="single" w:sz="12" w:color="14161B"/>
-              <w:bottom w:val="single" w:sz="18" w:color="A3E635"/>
+              <w:bottom w:val="single" w:sz="10" w:color="14161B"/>
             </w:tcBorders>
             <w:vAlign w:val="center"/>
             <w:tcMar>
-              <w:top w:w="30" w:type="dxa"/>
+              <w:top w:w="0" w:type="dxa"/>
               <w:left w:w="60" w:type="dxa"/>
               <w:bottom w:w="30" w:type="dxa"/>
-              <w:right w:w="60" w:type="dxa"/>
+              <w:right w:w="0" w:type="dxa"/>
             </w:tcMar>
           </w:tcPr>
           <w:p>
@@ -2899,12 +2564,12 @@
             <w:r>
               <w:rPr>
                 <w:rFonts w:ascii="Trade Gothic Next" w:hAnsi="Trade Gothic Next"/>
-                <w:b/>
+                <w:b w:val="0"/>
                 <w:color w:val="55604F"/>
-                <w:sz w:val="17"/>
+                <w:sz w:val="18"/>
                 <w:u w:val="none"/>
               </w:rPr>
-              <w:t>8 pts</w:t>
+              <w:t>8 points</w:t>
             </w:r>
           </w:p>
         </w:tc>
@@ -2941,24 +2606,17 @@
         <w:tc>
           <w:tcPr>
             <w:tcW w:type="dxa" w:w="2700"/>
-            <w:tcBorders>
-              <w:top w:val="single" w:sz="4" w:color="C8CDC2"/>
-              <w:left w:val="single" w:sz="4" w:color="C8CDC2"/>
-              <w:bottom w:val="single" w:sz="4" w:color="C8CDC2"/>
-              <w:right w:val="single" w:sz="4" w:color="C8CDC2"/>
-            </w:tcBorders>
-            <w:vAlign w:val="center"/>
+            <w:vAlign w:val="top"/>
             <w:tcMar>
-              <w:top w:w="40" w:type="dxa"/>
-              <w:left w:w="80" w:type="dxa"/>
-              <w:bottom w:w="60" w:type="dxa"/>
-              <w:right w:w="60" w:type="dxa"/>
+              <w:top w:w="20" w:type="dxa"/>
+              <w:left w:w="40" w:type="dxa"/>
+              <w:bottom w:w="40" w:type="dxa"/>
+              <w:right w:w="40" w:type="dxa"/>
             </w:tcMar>
           </w:tcPr>
           <w:p>
             <w:pPr>
-              <w:spacing w:after="0"/>
-              <w:jc w:val="left"/>
+              <w:spacing w:after="40"/>
             </w:pPr>
             <w:r>
               <w:rPr>
@@ -2971,87 +2629,55 @@
               <w:t>8</w:t>
             </w:r>
           </w:p>
-          <w:tbl>
-            <w:tblPr>
-              <w:tblW w:type="auto" w:w="0"/>
-              <w:tblLayout w:type="fixed"/>
-              <w:tblLook w:firstColumn="1" w:firstRow="1" w:lastColumn="0" w:lastRow="0" w:noHBand="0" w:noVBand="1" w:val="04A0"/>
-              <w:tblLayout w:type="fixed"/>
-            </w:tblPr>
-            <w:tblGrid>
-              <w:gridCol w:w="1008"/>
-            </w:tblGrid>
-            <w:tr>
-              <w:trPr>
-                <w:cantSplit/>
-                <w:trHeight w:val="892" w:hRule="atLeast"/>
-              </w:trPr>
-              <w:tc>
-                <w:tcPr>
-                  <w:tcW w:type="dxa" w:w="1008"/>
-                  <w:tcBorders>
-                    <w:top w:val="single" w:sz="12" w:color="A3E635"/>
-                    <w:left w:val="single" w:sz="12" w:color="A3E635"/>
-                    <w:bottom w:val="single" w:sz="12" w:color="A3E635"/>
-                    <w:right w:val="single" w:sz="12" w:color="A3E635"/>
-                  </w:tcBorders>
-                  <w:tcMar>
-                    <w:top w:w="20" w:type="dxa"/>
-                    <w:left w:w="50" w:type="dxa"/>
-                    <w:bottom w:w="20" w:type="dxa"/>
-                    <w:right w:w="40" w:type="dxa"/>
-                  </w:tcMar>
-                  <w:vAlign w:val="center"/>
-                </w:tcPr>
-                <w:p>
-                  <w:pPr>
-                    <w:spacing w:after="0"/>
-                  </w:pPr>
-                  <w:r>
-                    <w:rPr>
-                      <w:rFonts w:ascii="Trade Gothic Next" w:hAnsi="Trade Gothic Next"/>
-                      <w:b/>
-                      <w:color w:val="55604F"/>
-                      <w:sz w:val="16"/>
-                      <w:u w:val="none"/>
-                    </w:rPr>
-                    <w:t>12</w:t>
-                  </w:r>
-                </w:p>
-                <w:p>
-                  <w:pPr>
-                    <w:spacing w:after="0"/>
-                    <w:jc w:val="center"/>
-                  </w:pPr>
-                  <w:r>
-                    <w:rPr>
-                      <w:rFonts w:ascii="Trade Gothic Next" w:hAnsi="Trade Gothic Next"/>
-                      <w:b/>
-                      <w:color w:val="14161B"/>
-                      <w:sz w:val="32"/>
-                      <w:u w:val="none"/>
-                    </w:rPr>
-                    <w:t>Mg</w:t>
-                  </w:r>
-                </w:p>
-              </w:tc>
-            </w:tr>
-          </w:tbl>
           <w:p>
             <w:pPr>
-              <w:spacing w:before="0" w:after="0" w:line="20" w:lineRule="exact"/>
+              <w:spacing w:after="80"/>
             </w:pPr>
+            <w:r>
+              <w:drawing>
+                <wp:inline xmlns:a="http://schemas.openxmlformats.org/drawingml/2006/main" xmlns:pic="http://schemas.openxmlformats.org/drawingml/2006/picture">
+                  <wp:extent cx="731520" cy="731520"/>
+                  <wp:docPr id="5" name="Picture 5"/>
+                  <wp:cNvGraphicFramePr>
+                    <a:graphicFrameLocks noChangeAspect="1"/>
+                  </wp:cNvGraphicFramePr>
+                  <a:graphic>
+                    <a:graphicData uri="http://schemas.openxmlformats.org/drawingml/2006/picture">
+                      <pic:pic>
+                        <pic:nvPicPr>
+                          <pic:cNvPr id="0" name="tile_12.png"/>
+                          <pic:cNvPicPr/>
+                        </pic:nvPicPr>
+                        <pic:blipFill>
+                          <a:blip r:embed="rId13"/>
+                          <a:stretch>
+                            <a:fillRect/>
+                          </a:stretch>
+                        </pic:blipFill>
+                        <pic:spPr>
+                          <a:xfrm>
+                            <a:off x="0" y="0"/>
+                            <a:ext cx="731520" cy="731520"/>
+                          </a:xfrm>
+                          <a:prstGeom prst="rect"/>
+                        </pic:spPr>
+                      </pic:pic>
+                    </a:graphicData>
+                  </a:graphic>
+                </wp:inline>
+              </w:drawing>
+            </w:r>
           </w:p>
           <w:p>
             <w:pPr>
-              <w:spacing w:before="120" w:after="80"/>
+              <w:spacing w:after="100"/>
             </w:pPr>
             <w:r>
               <w:rPr>
                 <w:rFonts w:ascii="Trade Gothic Next" w:hAnsi="Trade Gothic Next"/>
-                <w:b/>
+                <w:b w:val="0"/>
                 <w:color w:val="14161B"/>
-                <w:sz w:val="18"/>
+                <w:sz w:val="19"/>
                 <w:u w:val="none"/>
               </w:rPr>
               <w:t xml:space="preserve">Charge  </w:t>
@@ -3064,23 +2690,13 @@
                 <w:sz w:val="20"/>
                 <w:u w:val="none"/>
               </w:rPr>
-              <w:t>________</w:t>
+              <w:t>_________</w:t>
             </w:r>
           </w:p>
           <w:p>
             <w:pPr>
               <w:spacing w:after="0"/>
             </w:pPr>
-            <w:r>
-              <w:rPr>
-                <w:rFonts w:ascii="Trade Gothic Next" w:hAnsi="Trade Gothic Next"/>
-                <w:b/>
-                <w:color w:val="14161B"/>
-                <w:sz w:val="18"/>
-                <w:u w:val="none"/>
-              </w:rPr>
-              <w:t xml:space="preserve">Circle  </w:t>
-            </w:r>
             <w:r>
               <w:rPr>
                 <w:rFonts w:ascii="Trade Gothic Next" w:hAnsi="Trade Gothic Next"/>
@@ -3099,7 +2715,7 @@
                 <w:sz w:val="18"/>
                 <w:u w:val="none"/>
               </w:rPr>
-              <w:t xml:space="preserve">   /   </w:t>
+              <w:t xml:space="preserve">   or   </w:t>
             </w:r>
             <w:r>
               <w:rPr>
@@ -3116,24 +2732,17 @@
         <w:tc>
           <w:tcPr>
             <w:tcW w:type="dxa" w:w="2700"/>
-            <w:tcBorders>
-              <w:top w:val="single" w:sz="4" w:color="C8CDC2"/>
-              <w:left w:val="single" w:sz="4" w:color="C8CDC2"/>
-              <w:bottom w:val="single" w:sz="4" w:color="C8CDC2"/>
-              <w:right w:val="single" w:sz="4" w:color="C8CDC2"/>
-            </w:tcBorders>
-            <w:vAlign w:val="center"/>
+            <w:vAlign w:val="top"/>
             <w:tcMar>
-              <w:top w:w="40" w:type="dxa"/>
-              <w:left w:w="80" w:type="dxa"/>
-              <w:bottom w:w="60" w:type="dxa"/>
-              <w:right w:w="60" w:type="dxa"/>
+              <w:top w:w="20" w:type="dxa"/>
+              <w:left w:w="40" w:type="dxa"/>
+              <w:bottom w:w="40" w:type="dxa"/>
+              <w:right w:w="40" w:type="dxa"/>
             </w:tcMar>
           </w:tcPr>
           <w:p>
             <w:pPr>
-              <w:spacing w:after="0"/>
-              <w:jc w:val="left"/>
+              <w:spacing w:after="40"/>
             </w:pPr>
             <w:r>
               <w:rPr>
@@ -3146,87 +2755,55 @@
               <w:t>9</w:t>
             </w:r>
           </w:p>
-          <w:tbl>
-            <w:tblPr>
-              <w:tblW w:type="auto" w:w="0"/>
-              <w:tblLayout w:type="fixed"/>
-              <w:tblLook w:firstColumn="1" w:firstRow="1" w:lastColumn="0" w:lastRow="0" w:noHBand="0" w:noVBand="1" w:val="04A0"/>
-              <w:tblLayout w:type="fixed"/>
-            </w:tblPr>
-            <w:tblGrid>
-              <w:gridCol w:w="1008"/>
-            </w:tblGrid>
-            <w:tr>
-              <w:trPr>
-                <w:cantSplit/>
-                <w:trHeight w:val="892" w:hRule="atLeast"/>
-              </w:trPr>
-              <w:tc>
-                <w:tcPr>
-                  <w:tcW w:type="dxa" w:w="1008"/>
-                  <w:tcBorders>
-                    <w:top w:val="single" w:sz="12" w:color="A3E635"/>
-                    <w:left w:val="single" w:sz="12" w:color="A3E635"/>
-                    <w:bottom w:val="single" w:sz="12" w:color="A3E635"/>
-                    <w:right w:val="single" w:sz="12" w:color="A3E635"/>
-                  </w:tcBorders>
-                  <w:tcMar>
-                    <w:top w:w="20" w:type="dxa"/>
-                    <w:left w:w="50" w:type="dxa"/>
-                    <w:bottom w:w="20" w:type="dxa"/>
-                    <w:right w:w="40" w:type="dxa"/>
-                  </w:tcMar>
-                  <w:vAlign w:val="center"/>
-                </w:tcPr>
-                <w:p>
-                  <w:pPr>
-                    <w:spacing w:after="0"/>
-                  </w:pPr>
-                  <w:r>
-                    <w:rPr>
-                      <w:rFonts w:ascii="Trade Gothic Next" w:hAnsi="Trade Gothic Next"/>
-                      <w:b/>
-                      <w:color w:val="55604F"/>
-                      <w:sz w:val="16"/>
-                      <w:u w:val="none"/>
-                    </w:rPr>
-                    <w:t>7</w:t>
-                  </w:r>
-                </w:p>
-                <w:p>
-                  <w:pPr>
-                    <w:spacing w:after="0"/>
-                    <w:jc w:val="center"/>
-                  </w:pPr>
-                  <w:r>
-                    <w:rPr>
-                      <w:rFonts w:ascii="Trade Gothic Next" w:hAnsi="Trade Gothic Next"/>
-                      <w:b/>
-                      <w:color w:val="14161B"/>
-                      <w:sz w:val="32"/>
-                      <w:u w:val="none"/>
-                    </w:rPr>
-                    <w:t>N</w:t>
-                  </w:r>
-                </w:p>
-              </w:tc>
-            </w:tr>
-          </w:tbl>
           <w:p>
             <w:pPr>
-              <w:spacing w:before="0" w:after="0" w:line="20" w:lineRule="exact"/>
+              <w:spacing w:after="80"/>
             </w:pPr>
+            <w:r>
+              <w:drawing>
+                <wp:inline xmlns:a="http://schemas.openxmlformats.org/drawingml/2006/main" xmlns:pic="http://schemas.openxmlformats.org/drawingml/2006/picture">
+                  <wp:extent cx="731520" cy="731520"/>
+                  <wp:docPr id="6" name="Picture 6"/>
+                  <wp:cNvGraphicFramePr>
+                    <a:graphicFrameLocks noChangeAspect="1"/>
+                  </wp:cNvGraphicFramePr>
+                  <a:graphic>
+                    <a:graphicData uri="http://schemas.openxmlformats.org/drawingml/2006/picture">
+                      <pic:pic>
+                        <pic:nvPicPr>
+                          <pic:cNvPr id="0" name="tile_7.png"/>
+                          <pic:cNvPicPr/>
+                        </pic:nvPicPr>
+                        <pic:blipFill>
+                          <a:blip r:embed="rId14"/>
+                          <a:stretch>
+                            <a:fillRect/>
+                          </a:stretch>
+                        </pic:blipFill>
+                        <pic:spPr>
+                          <a:xfrm>
+                            <a:off x="0" y="0"/>
+                            <a:ext cx="731520" cy="731520"/>
+                          </a:xfrm>
+                          <a:prstGeom prst="rect"/>
+                        </pic:spPr>
+                      </pic:pic>
+                    </a:graphicData>
+                  </a:graphic>
+                </wp:inline>
+              </w:drawing>
+            </w:r>
           </w:p>
           <w:p>
             <w:pPr>
-              <w:spacing w:before="120" w:after="80"/>
+              <w:spacing w:after="100"/>
             </w:pPr>
             <w:r>
               <w:rPr>
                 <w:rFonts w:ascii="Trade Gothic Next" w:hAnsi="Trade Gothic Next"/>
-                <w:b/>
+                <w:b w:val="0"/>
                 <w:color w:val="14161B"/>
-                <w:sz w:val="18"/>
+                <w:sz w:val="19"/>
                 <w:u w:val="none"/>
               </w:rPr>
               <w:t xml:space="preserve">Charge  </w:t>
@@ -3239,23 +2816,13 @@
                 <w:sz w:val="20"/>
                 <w:u w:val="none"/>
               </w:rPr>
-              <w:t>________</w:t>
+              <w:t>_________</w:t>
             </w:r>
           </w:p>
           <w:p>
             <w:pPr>
               <w:spacing w:after="0"/>
             </w:pPr>
-            <w:r>
-              <w:rPr>
-                <w:rFonts w:ascii="Trade Gothic Next" w:hAnsi="Trade Gothic Next"/>
-                <w:b/>
-                <w:color w:val="14161B"/>
-                <w:sz w:val="18"/>
-                <w:u w:val="none"/>
-              </w:rPr>
-              <w:t xml:space="preserve">Circle  </w:t>
-            </w:r>
             <w:r>
               <w:rPr>
                 <w:rFonts w:ascii="Trade Gothic Next" w:hAnsi="Trade Gothic Next"/>
@@ -3274,7 +2841,7 @@
                 <w:sz w:val="18"/>
                 <w:u w:val="none"/>
               </w:rPr>
-              <w:t xml:space="preserve">   /   </w:t>
+              <w:t xml:space="preserve">   or   </w:t>
             </w:r>
             <w:r>
               <w:rPr>
@@ -3291,24 +2858,17 @@
         <w:tc>
           <w:tcPr>
             <w:tcW w:type="dxa" w:w="2700"/>
-            <w:tcBorders>
-              <w:top w:val="single" w:sz="4" w:color="C8CDC2"/>
-              <w:left w:val="single" w:sz="4" w:color="C8CDC2"/>
-              <w:bottom w:val="single" w:sz="4" w:color="C8CDC2"/>
-              <w:right w:val="single" w:sz="4" w:color="C8CDC2"/>
-            </w:tcBorders>
-            <w:vAlign w:val="center"/>
+            <w:vAlign w:val="top"/>
             <w:tcMar>
-              <w:top w:w="40" w:type="dxa"/>
-              <w:left w:w="80" w:type="dxa"/>
-              <w:bottom w:w="60" w:type="dxa"/>
-              <w:right w:w="60" w:type="dxa"/>
+              <w:top w:w="20" w:type="dxa"/>
+              <w:left w:w="40" w:type="dxa"/>
+              <w:bottom w:w="40" w:type="dxa"/>
+              <w:right w:w="40" w:type="dxa"/>
             </w:tcMar>
           </w:tcPr>
           <w:p>
             <w:pPr>
-              <w:spacing w:after="0"/>
-              <w:jc w:val="left"/>
+              <w:spacing w:after="40"/>
             </w:pPr>
             <w:r>
               <w:rPr>
@@ -3321,87 +2881,55 @@
               <w:t>10</w:t>
             </w:r>
           </w:p>
-          <w:tbl>
-            <w:tblPr>
-              <w:tblW w:type="auto" w:w="0"/>
-              <w:tblLayout w:type="fixed"/>
-              <w:tblLook w:firstColumn="1" w:firstRow="1" w:lastColumn="0" w:lastRow="0" w:noHBand="0" w:noVBand="1" w:val="04A0"/>
-              <w:tblLayout w:type="fixed"/>
-            </w:tblPr>
-            <w:tblGrid>
-              <w:gridCol w:w="1008"/>
-            </w:tblGrid>
-            <w:tr>
-              <w:trPr>
-                <w:cantSplit/>
-                <w:trHeight w:val="892" w:hRule="atLeast"/>
-              </w:trPr>
-              <w:tc>
-                <w:tcPr>
-                  <w:tcW w:type="dxa" w:w="1008"/>
-                  <w:tcBorders>
-                    <w:top w:val="single" w:sz="12" w:color="A3E635"/>
-                    <w:left w:val="single" w:sz="12" w:color="A3E635"/>
-                    <w:bottom w:val="single" w:sz="12" w:color="A3E635"/>
-                    <w:right w:val="single" w:sz="12" w:color="A3E635"/>
-                  </w:tcBorders>
-                  <w:tcMar>
-                    <w:top w:w="20" w:type="dxa"/>
-                    <w:left w:w="50" w:type="dxa"/>
-                    <w:bottom w:w="20" w:type="dxa"/>
-                    <w:right w:w="40" w:type="dxa"/>
-                  </w:tcMar>
-                  <w:vAlign w:val="center"/>
-                </w:tcPr>
-                <w:p>
-                  <w:pPr>
-                    <w:spacing w:after="0"/>
-                  </w:pPr>
-                  <w:r>
-                    <w:rPr>
-                      <w:rFonts w:ascii="Trade Gothic Next" w:hAnsi="Trade Gothic Next"/>
-                      <w:b/>
-                      <w:color w:val="55604F"/>
-                      <w:sz w:val="16"/>
-                      <w:u w:val="none"/>
-                    </w:rPr>
-                    <w:t>13</w:t>
-                  </w:r>
-                </w:p>
-                <w:p>
-                  <w:pPr>
-                    <w:spacing w:after="0"/>
-                    <w:jc w:val="center"/>
-                  </w:pPr>
-                  <w:r>
-                    <w:rPr>
-                      <w:rFonts w:ascii="Trade Gothic Next" w:hAnsi="Trade Gothic Next"/>
-                      <w:b/>
-                      <w:color w:val="14161B"/>
-                      <w:sz w:val="32"/>
-                      <w:u w:val="none"/>
-                    </w:rPr>
-                    <w:t>Al</w:t>
-                  </w:r>
-                </w:p>
-              </w:tc>
-            </w:tr>
-          </w:tbl>
           <w:p>
             <w:pPr>
-              <w:spacing w:before="0" w:after="0" w:line="20" w:lineRule="exact"/>
+              <w:spacing w:after="80"/>
             </w:pPr>
+            <w:r>
+              <w:drawing>
+                <wp:inline xmlns:a="http://schemas.openxmlformats.org/drawingml/2006/main" xmlns:pic="http://schemas.openxmlformats.org/drawingml/2006/picture">
+                  <wp:extent cx="731520" cy="731520"/>
+                  <wp:docPr id="7" name="Picture 7"/>
+                  <wp:cNvGraphicFramePr>
+                    <a:graphicFrameLocks noChangeAspect="1"/>
+                  </wp:cNvGraphicFramePr>
+                  <a:graphic>
+                    <a:graphicData uri="http://schemas.openxmlformats.org/drawingml/2006/picture">
+                      <pic:pic>
+                        <pic:nvPicPr>
+                          <pic:cNvPr id="0" name="tile_13.png"/>
+                          <pic:cNvPicPr/>
+                        </pic:nvPicPr>
+                        <pic:blipFill>
+                          <a:blip r:embed="rId15"/>
+                          <a:stretch>
+                            <a:fillRect/>
+                          </a:stretch>
+                        </pic:blipFill>
+                        <pic:spPr>
+                          <a:xfrm>
+                            <a:off x="0" y="0"/>
+                            <a:ext cx="731520" cy="731520"/>
+                          </a:xfrm>
+                          <a:prstGeom prst="rect"/>
+                        </pic:spPr>
+                      </pic:pic>
+                    </a:graphicData>
+                  </a:graphic>
+                </wp:inline>
+              </w:drawing>
+            </w:r>
           </w:p>
           <w:p>
             <w:pPr>
-              <w:spacing w:before="120" w:after="80"/>
+              <w:spacing w:after="100"/>
             </w:pPr>
             <w:r>
               <w:rPr>
                 <w:rFonts w:ascii="Trade Gothic Next" w:hAnsi="Trade Gothic Next"/>
-                <w:b/>
+                <w:b w:val="0"/>
                 <w:color w:val="14161B"/>
-                <w:sz w:val="18"/>
+                <w:sz w:val="19"/>
                 <w:u w:val="none"/>
               </w:rPr>
               <w:t xml:space="preserve">Charge  </w:t>
@@ -3414,23 +2942,13 @@
                 <w:sz w:val="20"/>
                 <w:u w:val="none"/>
               </w:rPr>
-              <w:t>________</w:t>
+              <w:t>_________</w:t>
             </w:r>
           </w:p>
           <w:p>
             <w:pPr>
               <w:spacing w:after="0"/>
             </w:pPr>
-            <w:r>
-              <w:rPr>
-                <w:rFonts w:ascii="Trade Gothic Next" w:hAnsi="Trade Gothic Next"/>
-                <w:b/>
-                <w:color w:val="14161B"/>
-                <w:sz w:val="18"/>
-                <w:u w:val="none"/>
-              </w:rPr>
-              <w:t xml:space="preserve">Circle  </w:t>
-            </w:r>
             <w:r>
               <w:rPr>
                 <w:rFonts w:ascii="Trade Gothic Next" w:hAnsi="Trade Gothic Next"/>
@@ -3449,7 +2967,7 @@
                 <w:sz w:val="18"/>
                 <w:u w:val="none"/>
               </w:rPr>
-              <w:t xml:space="preserve">   /   </w:t>
+              <w:t xml:space="preserve">   or   </w:t>
             </w:r>
             <w:r>
               <w:rPr>
@@ -3466,24 +2984,17 @@
         <w:tc>
           <w:tcPr>
             <w:tcW w:type="dxa" w:w="2700"/>
-            <w:tcBorders>
-              <w:top w:val="single" w:sz="4" w:color="C8CDC2"/>
-              <w:left w:val="single" w:sz="4" w:color="C8CDC2"/>
-              <w:bottom w:val="single" w:sz="4" w:color="C8CDC2"/>
-              <w:right w:val="single" w:sz="4" w:color="C8CDC2"/>
-            </w:tcBorders>
-            <w:vAlign w:val="center"/>
+            <w:vAlign w:val="top"/>
             <w:tcMar>
-              <w:top w:w="40" w:type="dxa"/>
-              <w:left w:w="80" w:type="dxa"/>
-              <w:bottom w:w="60" w:type="dxa"/>
-              <w:right w:w="60" w:type="dxa"/>
+              <w:top w:w="20" w:type="dxa"/>
+              <w:left w:w="40" w:type="dxa"/>
+              <w:bottom w:w="40" w:type="dxa"/>
+              <w:right w:w="40" w:type="dxa"/>
             </w:tcMar>
           </w:tcPr>
           <w:p>
             <w:pPr>
-              <w:spacing w:after="0"/>
-              <w:jc w:val="left"/>
+              <w:spacing w:after="40"/>
             </w:pPr>
             <w:r>
               <w:rPr>
@@ -3496,87 +3007,55 @@
               <w:t>11</w:t>
             </w:r>
           </w:p>
-          <w:tbl>
-            <w:tblPr>
-              <w:tblW w:type="auto" w:w="0"/>
-              <w:tblLayout w:type="fixed"/>
-              <w:tblLook w:firstColumn="1" w:firstRow="1" w:lastColumn="0" w:lastRow="0" w:noHBand="0" w:noVBand="1" w:val="04A0"/>
-              <w:tblLayout w:type="fixed"/>
-            </w:tblPr>
-            <w:tblGrid>
-              <w:gridCol w:w="1008"/>
-            </w:tblGrid>
-            <w:tr>
-              <w:trPr>
-                <w:cantSplit/>
-                <w:trHeight w:val="892" w:hRule="atLeast"/>
-              </w:trPr>
-              <w:tc>
-                <w:tcPr>
-                  <w:tcW w:type="dxa" w:w="1008"/>
-                  <w:tcBorders>
-                    <w:top w:val="single" w:sz="12" w:color="A3E635"/>
-                    <w:left w:val="single" w:sz="12" w:color="A3E635"/>
-                    <w:bottom w:val="single" w:sz="12" w:color="A3E635"/>
-                    <w:right w:val="single" w:sz="12" w:color="A3E635"/>
-                  </w:tcBorders>
-                  <w:tcMar>
-                    <w:top w:w="20" w:type="dxa"/>
-                    <w:left w:w="50" w:type="dxa"/>
-                    <w:bottom w:w="20" w:type="dxa"/>
-                    <w:right w:w="40" w:type="dxa"/>
-                  </w:tcMar>
-                  <w:vAlign w:val="center"/>
-                </w:tcPr>
-                <w:p>
-                  <w:pPr>
-                    <w:spacing w:after="0"/>
-                  </w:pPr>
-                  <w:r>
-                    <w:rPr>
-                      <w:rFonts w:ascii="Trade Gothic Next" w:hAnsi="Trade Gothic Next"/>
-                      <w:b/>
-                      <w:color w:val="55604F"/>
-                      <w:sz w:val="16"/>
-                      <w:u w:val="none"/>
-                    </w:rPr>
-                    <w:t>17</w:t>
-                  </w:r>
-                </w:p>
-                <w:p>
-                  <w:pPr>
-                    <w:spacing w:after="0"/>
-                    <w:jc w:val="center"/>
-                  </w:pPr>
-                  <w:r>
-                    <w:rPr>
-                      <w:rFonts w:ascii="Trade Gothic Next" w:hAnsi="Trade Gothic Next"/>
-                      <w:b/>
-                      <w:color w:val="14161B"/>
-                      <w:sz w:val="32"/>
-                      <w:u w:val="none"/>
-                    </w:rPr>
-                    <w:t>Cl</w:t>
-                  </w:r>
-                </w:p>
-              </w:tc>
-            </w:tr>
-          </w:tbl>
           <w:p>
             <w:pPr>
-              <w:spacing w:before="0" w:after="0" w:line="20" w:lineRule="exact"/>
+              <w:spacing w:after="80"/>
             </w:pPr>
+            <w:r>
+              <w:drawing>
+                <wp:inline xmlns:a="http://schemas.openxmlformats.org/drawingml/2006/main" xmlns:pic="http://schemas.openxmlformats.org/drawingml/2006/picture">
+                  <wp:extent cx="731520" cy="731520"/>
+                  <wp:docPr id="8" name="Picture 8"/>
+                  <wp:cNvGraphicFramePr>
+                    <a:graphicFrameLocks noChangeAspect="1"/>
+                  </wp:cNvGraphicFramePr>
+                  <a:graphic>
+                    <a:graphicData uri="http://schemas.openxmlformats.org/drawingml/2006/picture">
+                      <pic:pic>
+                        <pic:nvPicPr>
+                          <pic:cNvPr id="0" name="tile_17.png"/>
+                          <pic:cNvPicPr/>
+                        </pic:nvPicPr>
+                        <pic:blipFill>
+                          <a:blip r:embed="rId16"/>
+                          <a:stretch>
+                            <a:fillRect/>
+                          </a:stretch>
+                        </pic:blipFill>
+                        <pic:spPr>
+                          <a:xfrm>
+                            <a:off x="0" y="0"/>
+                            <a:ext cx="731520" cy="731520"/>
+                          </a:xfrm>
+                          <a:prstGeom prst="rect"/>
+                        </pic:spPr>
+                      </pic:pic>
+                    </a:graphicData>
+                  </a:graphic>
+                </wp:inline>
+              </w:drawing>
+            </w:r>
           </w:p>
           <w:p>
             <w:pPr>
-              <w:spacing w:before="120" w:after="80"/>
+              <w:spacing w:after="100"/>
             </w:pPr>
             <w:r>
               <w:rPr>
                 <w:rFonts w:ascii="Trade Gothic Next" w:hAnsi="Trade Gothic Next"/>
-                <w:b/>
+                <w:b w:val="0"/>
                 <w:color w:val="14161B"/>
-                <w:sz w:val="18"/>
+                <w:sz w:val="19"/>
                 <w:u w:val="none"/>
               </w:rPr>
               <w:t xml:space="preserve">Charge  </w:t>
@@ -3589,23 +3068,13 @@
                 <w:sz w:val="20"/>
                 <w:u w:val="none"/>
               </w:rPr>
-              <w:t>________</w:t>
+              <w:t>_________</w:t>
             </w:r>
           </w:p>
           <w:p>
             <w:pPr>
               <w:spacing w:after="0"/>
             </w:pPr>
-            <w:r>
-              <w:rPr>
-                <w:rFonts w:ascii="Trade Gothic Next" w:hAnsi="Trade Gothic Next"/>
-                <w:b/>
-                <w:color w:val="14161B"/>
-                <w:sz w:val="18"/>
-                <w:u w:val="none"/>
-              </w:rPr>
-              <w:t xml:space="preserve">Circle  </w:t>
-            </w:r>
             <w:r>
               <w:rPr>
                 <w:rFonts w:ascii="Trade Gothic Next" w:hAnsi="Trade Gothic Next"/>
@@ -3624,7 +3093,7 @@
                 <w:sz w:val="18"/>
                 <w:u w:val="none"/>
               </w:rPr>
-              <w:t xml:space="preserve">   /   </w:t>
+              <w:t xml:space="preserve">   or   </w:t>
             </w:r>
             <w:r>
               <w:rPr>
@@ -3650,7 +3119,7 @@
       </w:pPr>
     </w:p>
     <w:sectPr>
-      <w:footerReference w:type="default" r:id="rId9"/>
+      <w:footerReference w:type="default" r:id="rId17"/>
       <w:pgSz w:w="12240" w:h="15840"/>
       <w:pgMar w:top="634" w:right="720" w:bottom="634" w:left="720" w:header="720" w:footer="720" w:gutter="0"/>
       <w:cols w:space="720"/>

</xml_diff>